<commit_message>
v4.2.0: teststeps as numbered paragraphs, not tabular
- \teststep now takes 1 arg (action only, numbering automatic)
- Removed teststeps environment — steps are directly inside testprocedure
- Images, code blocks, callouts can be placed freely between steps
- Testcase block is now fully uniform: all content is paragraphs
  inside the breakable tcolorbox
- Lua filter: 1-arg teststep, numbered list output in DOCX/MD/HTML
- Updated samples, SKILL.md, README.md
</commit_message>
<xml_diff>
--- a/examples/testbook/en/main.docx
+++ b/examples/testbook/en/main.docx
@@ -70,7 +70,7 @@
         <w:pStyle w:val="CoverMeta"/>
       </w:pPr>
       <w:r>
-        <w:t xml:space="preserve">v2.0.0 — 2026-09-12 19:01</w:t>
+        <w:t xml:space="preserve">v2.1.0 — 2026-09-12 19:25</w:t>
       </w:r>
     </w:p>
     <w:p>
@@ -1796,203 +1796,78 @@
         <w:t xml:space="preserve">Procedure</w:t>
       </w:r>
     </w:p>
-    <w:tbl>
-      <w:tblPr>
-        <w:tblStyle w:val="Table"/>
-        <w:tblW w:type="auto" w:w="0"/>
-        <w:tblLook w:firstRow="1" w:lastRow="0" w:firstColumn="0" w:lastColumn="0" w:noHBand="0" w:noVBand="0" w:val="0020"/>
-        <w:jc w:val="start"/>
-      </w:tblPr>
-      <w:tblGrid>
-        <w:gridCol w:w="3960"/>
-        <w:gridCol w:w="3960"/>
-      </w:tblGrid>
-      <w:tr>
-        <w:trPr>
-          <w:tblHeader w:val="true"/>
-        </w:trPr>
-        <w:tc>
-          <w:tcPr/>
-          <w:p>
-            <w:pPr>
-              <w:pStyle w:val="Compact"/>
-              <w:jc w:val="left"/>
-            </w:pPr>
-            <w:r>
-              <w:t xml:space="preserve">Step</w:t>
-            </w:r>
-          </w:p>
-        </w:tc>
-        <w:tc>
-          <w:tcPr/>
-          <w:p>
-            <w:pPr>
-              <w:pStyle w:val="Compact"/>
-              <w:jc w:val="left"/>
-            </w:pPr>
-            <w:r>
-              <w:t xml:space="preserve">Action</w:t>
-            </w:r>
-          </w:p>
-        </w:tc>
-      </w:tr>
-      <w:tr>
-        <w:tc>
-          <w:tcPr/>
-          <w:p>
-            <w:pPr>
-              <w:pStyle w:val="Compact"/>
-              <w:jc w:val="left"/>
-            </w:pPr>
-            <w:r>
-              <w:t xml:space="preserve">1</w:t>
-            </w:r>
-          </w:p>
-        </w:tc>
-        <w:tc>
-          <w:tcPr/>
-          <w:p>
-            <w:pPr>
-              <w:pStyle w:val="Compact"/>
-              <w:jc w:val="left"/>
-            </w:pPr>
-            <w:r>
-              <w:t xml:space="preserve">Log in to the Huawei Cloud Console</w:t>
-            </w:r>
-          </w:p>
-        </w:tc>
-      </w:tr>
-      <w:tr>
-        <w:tc>
-          <w:tcPr/>
-          <w:p>
-            <w:pPr>
-              <w:pStyle w:val="Compact"/>
-              <w:jc w:val="left"/>
-            </w:pPr>
-            <w:r>
-              <w:t xml:space="preserve">2</w:t>
-            </w:r>
-          </w:p>
-        </w:tc>
-        <w:tc>
-          <w:tcPr/>
-          <w:p>
-            <w:pPr>
-              <w:pStyle w:val="Compact"/>
-              <w:jc w:val="left"/>
-            </w:pPr>
-            <w:r>
-              <w:t xml:space="preserve">Navigate to Console, MapReduce Service, Clusters</w:t>
-            </w:r>
-          </w:p>
-        </w:tc>
-      </w:tr>
-      <w:tr>
-        <w:tc>
-          <w:tcPr/>
-          <w:p>
-            <w:pPr>
-              <w:pStyle w:val="Compact"/>
-              <w:jc w:val="left"/>
-            </w:pPr>
-            <w:r>
-              <w:t xml:space="preserve">3</w:t>
-            </w:r>
-          </w:p>
-        </w:tc>
-        <w:tc>
-          <w:tcPr/>
-          <w:p>
-            <w:pPr>
-              <w:pStyle w:val="Compact"/>
-              <w:jc w:val="left"/>
-            </w:pPr>
-            <w:r>
-              <w:t xml:space="preserve">Locate cluster mrs-poc-cluster</w:t>
-            </w:r>
-          </w:p>
-        </w:tc>
-      </w:tr>
-      <w:tr>
-        <w:tc>
-          <w:tcPr/>
-          <w:p>
-            <w:pPr>
-              <w:pStyle w:val="Compact"/>
-              <w:jc w:val="left"/>
-            </w:pPr>
-            <w:r>
-              <w:t xml:space="preserve">4</w:t>
-            </w:r>
-          </w:p>
-        </w:tc>
-        <w:tc>
-          <w:tcPr/>
-          <w:p>
-            <w:pPr>
-              <w:pStyle w:val="Compact"/>
-              <w:jc w:val="left"/>
-            </w:pPr>
-            <w:r>
-              <w:t xml:space="preserve">Verify cluster status</w:t>
-            </w:r>
-          </w:p>
-        </w:tc>
-      </w:tr>
-      <w:tr>
-        <w:tc>
-          <w:tcPr/>
-          <w:p>
-            <w:pPr>
-              <w:pStyle w:val="Compact"/>
-              <w:jc w:val="left"/>
-            </w:pPr>
-            <w:r>
-              <w:t xml:space="preserve">5</w:t>
-            </w:r>
-          </w:p>
-        </w:tc>
-        <w:tc>
-          <w:tcPr/>
-          <w:p>
-            <w:pPr>
-              <w:pStyle w:val="Compact"/>
-              <w:jc w:val="left"/>
-            </w:pPr>
-            <w:r>
-              <w:t xml:space="preserve">Review Component tab</w:t>
-            </w:r>
-          </w:p>
-        </w:tc>
-      </w:tr>
-      <w:tr>
-        <w:tc>
-          <w:tcPr/>
-          <w:p>
-            <w:pPr>
-              <w:pStyle w:val="Compact"/>
-              <w:jc w:val="left"/>
-            </w:pPr>
-            <w:r>
-              <w:t xml:space="preserve">6</w:t>
-            </w:r>
-          </w:p>
-        </w:tc>
-        <w:tc>
-          <w:tcPr/>
-          <w:p>
-            <w:pPr>
-              <w:pStyle w:val="Compact"/>
-              <w:jc w:val="left"/>
-            </w:pPr>
-            <w:r>
-              <w:t xml:space="preserve">Review Node tab</w:t>
-            </w:r>
-          </w:p>
-        </w:tc>
-      </w:tr>
-    </w:tbl>
+    <w:p>
+      <w:pPr>
+        <w:numPr>
+          <w:ilvl w:val="0"/>
+          <w:numId w:val="1004"/>
+        </w:numPr>
+        <w:pStyle w:val="Compact"/>
+      </w:pPr>
+      <w:r>
+        <w:t xml:space="preserve">Log in to the Huawei Cloud Console</w:t>
+      </w:r>
+    </w:p>
+    <w:p>
+      <w:pPr>
+        <w:numPr>
+          <w:ilvl w:val="0"/>
+          <w:numId w:val="1004"/>
+        </w:numPr>
+        <w:pStyle w:val="Compact"/>
+      </w:pPr>
+      <w:r>
+        <w:t xml:space="preserve">Navigate to Console, MapReduce Service, Clusters</w:t>
+      </w:r>
+    </w:p>
+    <w:p>
+      <w:pPr>
+        <w:numPr>
+          <w:ilvl w:val="0"/>
+          <w:numId w:val="1004"/>
+        </w:numPr>
+        <w:pStyle w:val="Compact"/>
+      </w:pPr>
+      <w:r>
+        <w:t xml:space="preserve">Locate cluster mrs-poc-cluster</w:t>
+      </w:r>
+    </w:p>
+    <w:p>
+      <w:pPr>
+        <w:numPr>
+          <w:ilvl w:val="0"/>
+          <w:numId w:val="1004"/>
+        </w:numPr>
+        <w:pStyle w:val="Compact"/>
+      </w:pPr>
+      <w:r>
+        <w:t xml:space="preserve">Verify cluster status</w:t>
+      </w:r>
+    </w:p>
+    <w:p>
+      <w:pPr>
+        <w:numPr>
+          <w:ilvl w:val="0"/>
+          <w:numId w:val="1004"/>
+        </w:numPr>
+        <w:pStyle w:val="Compact"/>
+      </w:pPr>
+      <w:r>
+        <w:t xml:space="preserve">Review Component tab</w:t>
+      </w:r>
+    </w:p>
+    <w:p>
+      <w:pPr>
+        <w:numPr>
+          <w:ilvl w:val="0"/>
+          <w:numId w:val="1004"/>
+        </w:numPr>
+        <w:pStyle w:val="Compact"/>
+      </w:pPr>
+      <w:r>
+        <w:t xml:space="preserve">Review Node tab</w:t>
+      </w:r>
+    </w:p>
     <w:p>
       <w:pPr>
         <w:pStyle w:val="DefinitionTerm"/>
@@ -2005,7 +1880,7 @@
       <w:pPr>
         <w:numPr>
           <w:ilvl w:val="0"/>
-          <w:numId w:val="1004"/>
+          <w:numId w:val="1005"/>
         </w:numPr>
         <w:pStyle w:val="Compact"/>
       </w:pPr>
@@ -2017,7 +1892,7 @@
       <w:pPr>
         <w:numPr>
           <w:ilvl w:val="0"/>
-          <w:numId w:val="1004"/>
+          <w:numId w:val="1005"/>
         </w:numPr>
         <w:pStyle w:val="Compact"/>
       </w:pPr>
@@ -2029,7 +1904,7 @@
       <w:pPr>
         <w:numPr>
           <w:ilvl w:val="0"/>
-          <w:numId w:val="1004"/>
+          <w:numId w:val="1005"/>
         </w:numPr>
         <w:pStyle w:val="Compact"/>
       </w:pPr>
@@ -2126,7 +2001,7 @@
       <w:pPr>
         <w:numPr>
           <w:ilvl w:val="0"/>
-          <w:numId w:val="1005"/>
+          <w:numId w:val="1006"/>
         </w:numPr>
         <w:pStyle w:val="Compact"/>
       </w:pPr>
@@ -2138,7 +2013,7 @@
       <w:pPr>
         <w:numPr>
           <w:ilvl w:val="0"/>
-          <w:numId w:val="1005"/>
+          <w:numId w:val="1006"/>
         </w:numPr>
         <w:pStyle w:val="Compact"/>
       </w:pPr>
@@ -2154,229 +2029,90 @@
         <w:t xml:space="preserve">Procedure</w:t>
       </w:r>
     </w:p>
-    <w:tbl>
-      <w:tblPr>
-        <w:tblStyle w:val="Table"/>
-        <w:tblW w:type="auto" w:w="0"/>
-        <w:tblLook w:firstRow="1" w:lastRow="0" w:firstColumn="0" w:lastColumn="0" w:noHBand="0" w:noVBand="0" w:val="0020"/>
-        <w:jc w:val="start"/>
-      </w:tblPr>
-      <w:tblGrid>
-        <w:gridCol w:w="3960"/>
-        <w:gridCol w:w="3960"/>
-      </w:tblGrid>
-      <w:tr>
-        <w:trPr>
-          <w:tblHeader w:val="true"/>
-        </w:trPr>
-        <w:tc>
-          <w:tcPr/>
-          <w:p>
-            <w:pPr>
-              <w:pStyle w:val="Compact"/>
-              <w:jc w:val="left"/>
-            </w:pPr>
-            <w:r>
-              <w:t xml:space="preserve">Step</w:t>
-            </w:r>
-          </w:p>
-        </w:tc>
-        <w:tc>
-          <w:tcPr/>
-          <w:p>
-            <w:pPr>
-              <w:pStyle w:val="Compact"/>
-              <w:jc w:val="left"/>
-            </w:pPr>
-            <w:r>
-              <w:t xml:space="preserve">Action</w:t>
-            </w:r>
-          </w:p>
-        </w:tc>
-      </w:tr>
-      <w:tr>
-        <w:tc>
-          <w:tcPr/>
-          <w:p>
-            <w:pPr>
-              <w:pStyle w:val="Compact"/>
-              <w:jc w:val="left"/>
-            </w:pPr>
-            <w:r>
-              <w:t xml:space="preserve">1</w:t>
-            </w:r>
-          </w:p>
-        </w:tc>
-        <w:tc>
-          <w:tcPr/>
-          <w:p>
-            <w:pPr>
-              <w:pStyle w:val="Compact"/>
-              <w:jc w:val="left"/>
-            </w:pPr>
-            <w:r>
-              <w:t xml:space="preserve">Log in to the Console</w:t>
-            </w:r>
-          </w:p>
-        </w:tc>
-      </w:tr>
-      <w:tr>
-        <w:tc>
-          <w:tcPr/>
-          <w:p>
-            <w:pPr>
-              <w:pStyle w:val="Compact"/>
-              <w:jc w:val="left"/>
-            </w:pPr>
-            <w:r>
-              <w:t xml:space="preserve">2</w:t>
-            </w:r>
-          </w:p>
-        </w:tc>
-        <w:tc>
-          <w:tcPr/>
-          <w:p>
-            <w:pPr>
-              <w:pStyle w:val="Compact"/>
-              <w:jc w:val="left"/>
-            </w:pPr>
-            <w:r>
-              <w:t xml:space="preserve">Navigate to Console, Object Storage Service</w:t>
-            </w:r>
-          </w:p>
-        </w:tc>
-      </w:tr>
-      <w:tr>
-        <w:tc>
-          <w:tcPr/>
-          <w:p>
-            <w:pPr>
-              <w:pStyle w:val="Compact"/>
-              <w:jc w:val="left"/>
-            </w:pPr>
-            <w:r>
-              <w:t xml:space="preserve">3</w:t>
-            </w:r>
-          </w:p>
-        </w:tc>
-        <w:tc>
-          <w:tcPr/>
-          <w:p>
-            <w:pPr>
-              <w:pStyle w:val="Compact"/>
-              <w:jc w:val="left"/>
-            </w:pPr>
-            <w:r>
-              <w:t xml:space="preserve">Locate the bucket (e.g. poc-datalake-raw)</w:t>
-            </w:r>
-          </w:p>
-        </w:tc>
-      </w:tr>
-      <w:tr>
-        <w:tc>
-          <w:tcPr/>
-          <w:p>
-            <w:pPr>
-              <w:pStyle w:val="Compact"/>
-              <w:jc w:val="left"/>
-            </w:pPr>
-            <w:r>
-              <w:t xml:space="preserve">4</w:t>
-            </w:r>
-          </w:p>
-        </w:tc>
-        <w:tc>
-          <w:tcPr/>
-          <w:p>
-            <w:pPr>
-              <w:pStyle w:val="Compact"/>
-              <w:jc w:val="left"/>
-            </w:pPr>
-            <w:r>
-              <w:t xml:space="preserve">Verify the storage class is Standard</w:t>
-            </w:r>
-          </w:p>
-        </w:tc>
-      </w:tr>
-      <w:tr>
-        <w:tc>
-          <w:tcPr/>
-          <w:p>
-            <w:pPr>
-              <w:pStyle w:val="Compact"/>
-              <w:jc w:val="left"/>
-            </w:pPr>
-            <w:r>
-              <w:t xml:space="preserve">5</w:t>
-            </w:r>
-          </w:p>
-        </w:tc>
-        <w:tc>
-          <w:tcPr/>
-          <w:p>
-            <w:pPr>
-              <w:pStyle w:val="Compact"/>
-              <w:jc w:val="left"/>
-            </w:pPr>
-            <w:r>
-              <w:t xml:space="preserve">Upload a test file (test-upload.txt) to the bucket</w:t>
-            </w:r>
-          </w:p>
-        </w:tc>
-      </w:tr>
-      <w:tr>
-        <w:tc>
-          <w:tcPr/>
-          <w:p>
-            <w:pPr>
-              <w:pStyle w:val="Compact"/>
-              <w:jc w:val="left"/>
-            </w:pPr>
-            <w:r>
-              <w:t xml:space="preserve">6</w:t>
-            </w:r>
-          </w:p>
-        </w:tc>
-        <w:tc>
-          <w:tcPr/>
-          <w:p>
-            <w:pPr>
-              <w:pStyle w:val="Compact"/>
-              <w:jc w:val="left"/>
-            </w:pPr>
-            <w:r>
-              <w:t xml:space="preserve">Download the file and compare its content with the original</w:t>
-            </w:r>
-          </w:p>
-        </w:tc>
-      </w:tr>
-      <w:tr>
-        <w:tc>
-          <w:tcPr/>
-          <w:p>
-            <w:pPr>
-              <w:pStyle w:val="Compact"/>
-              <w:jc w:val="left"/>
-            </w:pPr>
-            <w:r>
-              <w:t xml:space="preserve">7</w:t>
-            </w:r>
-          </w:p>
-        </w:tc>
-        <w:tc>
-          <w:tcPr/>
-          <w:p>
-            <w:pPr>
-              <w:pStyle w:val="Compact"/>
-              <w:jc w:val="left"/>
-            </w:pPr>
-            <w:r>
-              <w:t xml:space="preserve">Delete the test file</w:t>
-            </w:r>
-          </w:p>
-        </w:tc>
-      </w:tr>
-    </w:tbl>
+    <w:p>
+      <w:pPr>
+        <w:numPr>
+          <w:ilvl w:val="0"/>
+          <w:numId w:val="1007"/>
+        </w:numPr>
+        <w:pStyle w:val="Compact"/>
+      </w:pPr>
+      <w:r>
+        <w:t xml:space="preserve">Log in to the Console</w:t>
+      </w:r>
+    </w:p>
+    <w:p>
+      <w:pPr>
+        <w:numPr>
+          <w:ilvl w:val="0"/>
+          <w:numId w:val="1007"/>
+        </w:numPr>
+        <w:pStyle w:val="Compact"/>
+      </w:pPr>
+      <w:r>
+        <w:t xml:space="preserve">Navigate to Console, Object Storage Service</w:t>
+      </w:r>
+    </w:p>
+    <w:p>
+      <w:pPr>
+        <w:numPr>
+          <w:ilvl w:val="0"/>
+          <w:numId w:val="1007"/>
+        </w:numPr>
+        <w:pStyle w:val="Compact"/>
+      </w:pPr>
+      <w:r>
+        <w:t xml:space="preserve">Locate the bucket (e.g. poc-datalake-raw)</w:t>
+      </w:r>
+    </w:p>
+    <w:p>
+      <w:pPr>
+        <w:numPr>
+          <w:ilvl w:val="0"/>
+          <w:numId w:val="1007"/>
+        </w:numPr>
+        <w:pStyle w:val="Compact"/>
+      </w:pPr>
+      <w:r>
+        <w:t xml:space="preserve">Verify the storage class is Standard</w:t>
+      </w:r>
+    </w:p>
+    <w:p>
+      <w:pPr>
+        <w:numPr>
+          <w:ilvl w:val="0"/>
+          <w:numId w:val="1007"/>
+        </w:numPr>
+        <w:pStyle w:val="Compact"/>
+      </w:pPr>
+      <w:r>
+        <w:t xml:space="preserve">Upload a test file (test-upload.txt) to the bucket</w:t>
+      </w:r>
+    </w:p>
+    <w:p>
+      <w:pPr>
+        <w:numPr>
+          <w:ilvl w:val="0"/>
+          <w:numId w:val="1007"/>
+        </w:numPr>
+        <w:pStyle w:val="Compact"/>
+      </w:pPr>
+      <w:r>
+        <w:t xml:space="preserve">Download the file and compare its content with the original</w:t>
+      </w:r>
+    </w:p>
+    <w:p>
+      <w:pPr>
+        <w:numPr>
+          <w:ilvl w:val="0"/>
+          <w:numId w:val="1007"/>
+        </w:numPr>
+        <w:pStyle w:val="Compact"/>
+      </w:pPr>
+      <w:r>
+        <w:t xml:space="preserve">Delete the test file</w:t>
+      </w:r>
+    </w:p>
     <w:p>
       <w:pPr>
         <w:pStyle w:val="DefinitionTerm"/>
@@ -2389,7 +2125,7 @@
       <w:pPr>
         <w:numPr>
           <w:ilvl w:val="0"/>
-          <w:numId w:val="1006"/>
+          <w:numId w:val="1008"/>
         </w:numPr>
         <w:pStyle w:val="Compact"/>
       </w:pPr>
@@ -2401,7 +2137,7 @@
       <w:pPr>
         <w:numPr>
           <w:ilvl w:val="0"/>
-          <w:numId w:val="1006"/>
+          <w:numId w:val="1008"/>
         </w:numPr>
         <w:pStyle w:val="Compact"/>
       </w:pPr>
@@ -2413,7 +2149,7 @@
       <w:pPr>
         <w:numPr>
           <w:ilvl w:val="0"/>
-          <w:numId w:val="1006"/>
+          <w:numId w:val="1008"/>
         </w:numPr>
         <w:pStyle w:val="Compact"/>
       </w:pPr>
@@ -2425,7 +2161,7 @@
       <w:pPr>
         <w:numPr>
           <w:ilvl w:val="0"/>
-          <w:numId w:val="1006"/>
+          <w:numId w:val="1008"/>
         </w:numPr>
         <w:pStyle w:val="Compact"/>
       </w:pPr>
@@ -2522,7 +2258,7 @@
       <w:pPr>
         <w:numPr>
           <w:ilvl w:val="0"/>
-          <w:numId w:val="1007"/>
+          <w:numId w:val="1009"/>
         </w:numPr>
         <w:pStyle w:val="Compact"/>
       </w:pPr>
@@ -2534,7 +2270,7 @@
       <w:pPr>
         <w:numPr>
           <w:ilvl w:val="0"/>
-          <w:numId w:val="1007"/>
+          <w:numId w:val="1009"/>
         </w:numPr>
         <w:pStyle w:val="Compact"/>
       </w:pPr>
@@ -2550,203 +2286,78 @@
         <w:t xml:space="preserve">Procedure</w:t>
       </w:r>
     </w:p>
-    <w:tbl>
-      <w:tblPr>
-        <w:tblStyle w:val="Table"/>
-        <w:tblW w:type="pct" w:w="5000"/>
-        <w:tblLook w:firstRow="1" w:lastRow="0" w:firstColumn="0" w:lastColumn="0" w:noHBand="0" w:noVBand="0" w:val="0020"/>
-        <w:jc w:val="start"/>
-      </w:tblPr>
-      <w:tblGrid>
-        <w:gridCol w:w="3960"/>
-        <w:gridCol w:w="3960"/>
-      </w:tblGrid>
-      <w:tr>
-        <w:trPr>
-          <w:tblHeader w:val="true"/>
-        </w:trPr>
-        <w:tc>
-          <w:tcPr/>
-          <w:p>
-            <w:pPr>
-              <w:pStyle w:val="Compact"/>
-              <w:jc w:val="left"/>
-            </w:pPr>
-            <w:r>
-              <w:t xml:space="preserve">Step</w:t>
-            </w:r>
-          </w:p>
-        </w:tc>
-        <w:tc>
-          <w:tcPr/>
-          <w:p>
-            <w:pPr>
-              <w:pStyle w:val="Compact"/>
-              <w:jc w:val="left"/>
-            </w:pPr>
-            <w:r>
-              <w:t xml:space="preserve">Action</w:t>
-            </w:r>
-          </w:p>
-        </w:tc>
-      </w:tr>
-      <w:tr>
-        <w:tc>
-          <w:tcPr/>
-          <w:p>
-            <w:pPr>
-              <w:pStyle w:val="Compact"/>
-              <w:jc w:val="left"/>
-            </w:pPr>
-            <w:r>
-              <w:t xml:space="preserve">1</w:t>
-            </w:r>
-          </w:p>
-        </w:tc>
-        <w:tc>
-          <w:tcPr/>
-          <w:p>
-            <w:pPr>
-              <w:pStyle w:val="Compact"/>
-              <w:jc w:val="left"/>
-            </w:pPr>
-            <w:r>
-              <w:t xml:space="preserve">Log in to the Console</w:t>
-            </w:r>
-          </w:p>
-        </w:tc>
-      </w:tr>
-      <w:tr>
-        <w:tc>
-          <w:tcPr/>
-          <w:p>
-            <w:pPr>
-              <w:pStyle w:val="Compact"/>
-              <w:jc w:val="left"/>
-            </w:pPr>
-            <w:r>
-              <w:t xml:space="preserve">2</w:t>
-            </w:r>
-          </w:p>
-        </w:tc>
-        <w:tc>
-          <w:tcPr/>
-          <w:p>
-            <w:pPr>
-              <w:pStyle w:val="Compact"/>
-              <w:jc w:val="left"/>
-            </w:pPr>
-            <w:r>
-              <w:t xml:space="preserve">Navigate to Console, Virtual Private Cloud, VPCs</w:t>
-            </w:r>
-          </w:p>
-        </w:tc>
-      </w:tr>
-      <w:tr>
-        <w:tc>
-          <w:tcPr/>
-          <w:p>
-            <w:pPr>
-              <w:pStyle w:val="Compact"/>
-              <w:jc w:val="left"/>
-            </w:pPr>
-            <w:r>
-              <w:t xml:space="preserve">3</w:t>
-            </w:r>
-          </w:p>
-        </w:tc>
-        <w:tc>
-          <w:tcPr/>
-          <w:p>
-            <w:pPr>
-              <w:pStyle w:val="Compact"/>
-              <w:jc w:val="left"/>
-            </w:pPr>
-            <w:r>
-              <w:t xml:space="preserve">Locate the VPC (e.g. vpc-poc) and verify its CIDR block matches the architecture (e.g. 10.0.0.0/16)</w:t>
-            </w:r>
-          </w:p>
-        </w:tc>
-      </w:tr>
-      <w:tr>
-        <w:tc>
-          <w:tcPr/>
-          <w:p>
-            <w:pPr>
-              <w:pStyle w:val="Compact"/>
-              <w:jc w:val="left"/>
-            </w:pPr>
-            <w:r>
-              <w:t xml:space="preserve">4</w:t>
-            </w:r>
-          </w:p>
-        </w:tc>
-        <w:tc>
-          <w:tcPr/>
-          <w:p>
-            <w:pPr>
-              <w:pStyle w:val="Compact"/>
-              <w:jc w:val="left"/>
-            </w:pPr>
-            <w:r>
-              <w:t xml:space="preserve">Click the subnet and verify its CIDR (e.g. 10.0.1.0/24)</w:t>
-            </w:r>
-          </w:p>
-        </w:tc>
-      </w:tr>
-      <w:tr>
-        <w:tc>
-          <w:tcPr/>
-          <w:p>
-            <w:pPr>
-              <w:pStyle w:val="Compact"/>
-              <w:jc w:val="left"/>
-            </w:pPr>
-            <w:r>
-              <w:t xml:space="preserve">5</w:t>
-            </w:r>
-          </w:p>
-        </w:tc>
-        <w:tc>
-          <w:tcPr/>
-          <w:p>
-            <w:pPr>
-              <w:pStyle w:val="Compact"/>
-              <w:jc w:val="left"/>
-            </w:pPr>
-            <w:r>
-              <w:t xml:space="preserve">Navigate to Security Groups and verify inbound rules: TCP 22 from the bastion subnet, TCP 443 from the corporate proxy</w:t>
-            </w:r>
-          </w:p>
-        </w:tc>
-      </w:tr>
-      <w:tr>
-        <w:tc>
-          <w:tcPr/>
-          <w:p>
-            <w:pPr>
-              <w:pStyle w:val="Compact"/>
-              <w:jc w:val="left"/>
-            </w:pPr>
-            <w:r>
-              <w:t xml:space="preserve">6</w:t>
-            </w:r>
-          </w:p>
-        </w:tc>
-        <w:tc>
-          <w:tcPr/>
-          <w:p>
-            <w:pPr>
-              <w:pStyle w:val="Compact"/>
-              <w:jc w:val="left"/>
-            </w:pPr>
-            <w:r>
-              <w:t xml:space="preserve">Verify outbound rules allow all traffic (default)</w:t>
-            </w:r>
-          </w:p>
-        </w:tc>
-      </w:tr>
-    </w:tbl>
+    <w:p>
+      <w:pPr>
+        <w:numPr>
+          <w:ilvl w:val="0"/>
+          <w:numId w:val="1010"/>
+        </w:numPr>
+        <w:pStyle w:val="Compact"/>
+      </w:pPr>
+      <w:r>
+        <w:t xml:space="preserve">Log in to the Console</w:t>
+      </w:r>
+    </w:p>
+    <w:p>
+      <w:pPr>
+        <w:numPr>
+          <w:ilvl w:val="0"/>
+          <w:numId w:val="1010"/>
+        </w:numPr>
+        <w:pStyle w:val="Compact"/>
+      </w:pPr>
+      <w:r>
+        <w:t xml:space="preserve">Navigate to Console, Virtual Private Cloud, VPCs</w:t>
+      </w:r>
+    </w:p>
+    <w:p>
+      <w:pPr>
+        <w:numPr>
+          <w:ilvl w:val="0"/>
+          <w:numId w:val="1010"/>
+        </w:numPr>
+        <w:pStyle w:val="Compact"/>
+      </w:pPr>
+      <w:r>
+        <w:t xml:space="preserve">Locate the VPC (e.g. vpc-poc) and verify its CIDR block matches the architecture (e.g. 10.0.0.0/16)</w:t>
+      </w:r>
+    </w:p>
+    <w:p>
+      <w:pPr>
+        <w:numPr>
+          <w:ilvl w:val="0"/>
+          <w:numId w:val="1010"/>
+        </w:numPr>
+        <w:pStyle w:val="Compact"/>
+      </w:pPr>
+      <w:r>
+        <w:t xml:space="preserve">Click the subnet and verify its CIDR (e.g. 10.0.1.0/24)</w:t>
+      </w:r>
+    </w:p>
+    <w:p>
+      <w:pPr>
+        <w:numPr>
+          <w:ilvl w:val="0"/>
+          <w:numId w:val="1010"/>
+        </w:numPr>
+        <w:pStyle w:val="Compact"/>
+      </w:pPr>
+      <w:r>
+        <w:t xml:space="preserve">Navigate to Security Groups and verify inbound rules: TCP 22 from the bastion subnet, TCP 443 from the corporate proxy</w:t>
+      </w:r>
+    </w:p>
+    <w:p>
+      <w:pPr>
+        <w:numPr>
+          <w:ilvl w:val="0"/>
+          <w:numId w:val="1010"/>
+        </w:numPr>
+        <w:pStyle w:val="Compact"/>
+      </w:pPr>
+      <w:r>
+        <w:t xml:space="preserve">Verify outbound rules allow all traffic (default)</w:t>
+      </w:r>
+    </w:p>
     <w:p>
       <w:pPr>
         <w:pStyle w:val="DefinitionTerm"/>
@@ -2759,7 +2370,7 @@
       <w:pPr>
         <w:numPr>
           <w:ilvl w:val="0"/>
-          <w:numId w:val="1008"/>
+          <w:numId w:val="1011"/>
         </w:numPr>
         <w:pStyle w:val="Compact"/>
       </w:pPr>
@@ -2771,7 +2382,7 @@
       <w:pPr>
         <w:numPr>
           <w:ilvl w:val="0"/>
-          <w:numId w:val="1008"/>
+          <w:numId w:val="1011"/>
         </w:numPr>
         <w:pStyle w:val="Compact"/>
       </w:pPr>
@@ -2783,7 +2394,7 @@
       <w:pPr>
         <w:numPr>
           <w:ilvl w:val="0"/>
-          <w:numId w:val="1008"/>
+          <w:numId w:val="1011"/>
         </w:numPr>
         <w:pStyle w:val="Compact"/>
       </w:pPr>
@@ -2795,7 +2406,7 @@
       <w:pPr>
         <w:numPr>
           <w:ilvl w:val="0"/>
-          <w:numId w:val="1008"/>
+          <w:numId w:val="1011"/>
         </w:numPr>
         <w:pStyle w:val="Compact"/>
       </w:pPr>
@@ -2923,7 +2534,7 @@
       <w:pPr>
         <w:numPr>
           <w:ilvl w:val="0"/>
-          <w:numId w:val="1009"/>
+          <w:numId w:val="1012"/>
         </w:numPr>
         <w:pStyle w:val="Compact"/>
       </w:pPr>
@@ -2935,7 +2546,7 @@
       <w:pPr>
         <w:numPr>
           <w:ilvl w:val="0"/>
-          <w:numId w:val="1009"/>
+          <w:numId w:val="1012"/>
         </w:numPr>
         <w:pStyle w:val="Compact"/>
       </w:pPr>
@@ -2951,177 +2562,66 @@
         <w:t xml:space="preserve">Procedure</w:t>
       </w:r>
     </w:p>
-    <w:tbl>
-      <w:tblPr>
-        <w:tblStyle w:val="Table"/>
-        <w:tblW w:type="pct" w:w="5000"/>
-        <w:tblLook w:firstRow="1" w:lastRow="0" w:firstColumn="0" w:lastColumn="0" w:noHBand="0" w:noVBand="0" w:val="0020"/>
-        <w:jc w:val="start"/>
-      </w:tblPr>
-      <w:tblGrid>
-        <w:gridCol w:w="3960"/>
-        <w:gridCol w:w="3960"/>
-      </w:tblGrid>
-      <w:tr>
-        <w:trPr>
-          <w:tblHeader w:val="true"/>
-        </w:trPr>
-        <w:tc>
-          <w:tcPr/>
-          <w:p>
-            <w:pPr>
-              <w:pStyle w:val="Compact"/>
-              <w:jc w:val="left"/>
-            </w:pPr>
-            <w:r>
-              <w:t xml:space="preserve">Step</w:t>
-            </w:r>
-          </w:p>
-        </w:tc>
-        <w:tc>
-          <w:tcPr/>
-          <w:p>
-            <w:pPr>
-              <w:pStyle w:val="Compact"/>
-              <w:jc w:val="left"/>
-            </w:pPr>
-            <w:r>
-              <w:t xml:space="preserve">Action</w:t>
-            </w:r>
-          </w:p>
-        </w:tc>
-      </w:tr>
-      <w:tr>
-        <w:tc>
-          <w:tcPr/>
-          <w:p>
-            <w:pPr>
-              <w:pStyle w:val="Compact"/>
-              <w:jc w:val="left"/>
-            </w:pPr>
-            <w:r>
-              <w:t xml:space="preserve">1</w:t>
-            </w:r>
-          </w:p>
-        </w:tc>
-        <w:tc>
-          <w:tcPr/>
-          <w:p>
-            <w:pPr>
-              <w:pStyle w:val="Compact"/>
-              <w:jc w:val="left"/>
-            </w:pPr>
-            <w:r>
-              <w:t xml:space="preserve">Log in to the Console with the test IAM user</w:t>
-            </w:r>
-          </w:p>
-        </w:tc>
-      </w:tr>
-      <w:tr>
-        <w:tc>
-          <w:tcPr/>
-          <w:p>
-            <w:pPr>
-              <w:pStyle w:val="Compact"/>
-              <w:jc w:val="left"/>
-            </w:pPr>
-            <w:r>
-              <w:t xml:space="preserve">2</w:t>
-            </w:r>
-          </w:p>
-        </w:tc>
-        <w:tc>
-          <w:tcPr/>
-          <w:p>
-            <w:pPr>
-              <w:pStyle w:val="Compact"/>
-              <w:jc w:val="left"/>
-            </w:pPr>
-            <w:r>
-              <w:t xml:space="preserve">Navigate to Console, DataArts Studio, Workspaces</w:t>
-            </w:r>
-          </w:p>
-        </w:tc>
-      </w:tr>
-      <w:tr>
-        <w:tc>
-          <w:tcPr/>
-          <w:p>
-            <w:pPr>
-              <w:pStyle w:val="Compact"/>
-              <w:jc w:val="left"/>
-            </w:pPr>
-            <w:r>
-              <w:t xml:space="preserve">3</w:t>
-            </w:r>
-          </w:p>
-        </w:tc>
-        <w:tc>
-          <w:tcPr/>
-          <w:p>
-            <w:pPr>
-              <w:pStyle w:val="Compact"/>
-              <w:jc w:val="left"/>
-            </w:pPr>
-            <w:r>
-              <w:t xml:space="preserve">Locate the workspace (e.g. poc-workspace)</w:t>
-            </w:r>
-          </w:p>
-        </w:tc>
-      </w:tr>
-      <w:tr>
-        <w:tc>
-          <w:tcPr/>
-          <w:p>
-            <w:pPr>
-              <w:pStyle w:val="Compact"/>
-              <w:jc w:val="left"/>
-            </w:pPr>
-            <w:r>
-              <w:t xml:space="preserve">4</w:t>
-            </w:r>
-          </w:p>
-        </w:tc>
-        <w:tc>
-          <w:tcPr/>
-          <w:p>
-            <w:pPr>
-              <w:pStyle w:val="Compact"/>
-              <w:jc w:val="left"/>
-            </w:pPr>
-            <w:r>
-              <w:t xml:space="preserve">Click Access Workspace to open the DataArts Studio console</w:t>
-            </w:r>
-          </w:p>
-        </w:tc>
-      </w:tr>
-      <w:tr>
-        <w:tc>
-          <w:tcPr/>
-          <w:p>
-            <w:pPr>
-              <w:pStyle w:val="Compact"/>
-              <w:jc w:val="left"/>
-            </w:pPr>
-            <w:r>
-              <w:t xml:space="preserve">5</w:t>
-            </w:r>
-          </w:p>
-        </w:tc>
-        <w:tc>
-          <w:tcPr/>
-          <w:p>
-            <w:pPr>
-              <w:pStyle w:val="Compact"/>
-              <w:jc w:val="left"/>
-            </w:pPr>
-            <w:r>
-              <w:t xml:space="preserve">Verify the left navigation panel loads with the expected modules: Data Integration, Data Development, Data Architecture</w:t>
-            </w:r>
-          </w:p>
-        </w:tc>
-      </w:tr>
-    </w:tbl>
+    <w:p>
+      <w:pPr>
+        <w:numPr>
+          <w:ilvl w:val="0"/>
+          <w:numId w:val="1013"/>
+        </w:numPr>
+        <w:pStyle w:val="Compact"/>
+      </w:pPr>
+      <w:r>
+        <w:t xml:space="preserve">Log in to the Console with the test IAM user</w:t>
+      </w:r>
+    </w:p>
+    <w:p>
+      <w:pPr>
+        <w:numPr>
+          <w:ilvl w:val="0"/>
+          <w:numId w:val="1013"/>
+        </w:numPr>
+        <w:pStyle w:val="Compact"/>
+      </w:pPr>
+      <w:r>
+        <w:t xml:space="preserve">Navigate to Console, DataArts Studio, Workspaces</w:t>
+      </w:r>
+    </w:p>
+    <w:p>
+      <w:pPr>
+        <w:numPr>
+          <w:ilvl w:val="0"/>
+          <w:numId w:val="1013"/>
+        </w:numPr>
+        <w:pStyle w:val="Compact"/>
+      </w:pPr>
+      <w:r>
+        <w:t xml:space="preserve">Locate the workspace (e.g. poc-workspace)</w:t>
+      </w:r>
+    </w:p>
+    <w:p>
+      <w:pPr>
+        <w:numPr>
+          <w:ilvl w:val="0"/>
+          <w:numId w:val="1013"/>
+        </w:numPr>
+        <w:pStyle w:val="Compact"/>
+      </w:pPr>
+      <w:r>
+        <w:t xml:space="preserve">Click Access Workspace to open the DataArts Studio console</w:t>
+      </w:r>
+    </w:p>
+    <w:p>
+      <w:pPr>
+        <w:numPr>
+          <w:ilvl w:val="0"/>
+          <w:numId w:val="1013"/>
+        </w:numPr>
+        <w:pStyle w:val="Compact"/>
+      </w:pPr>
+      <w:r>
+        <w:t xml:space="preserve">Verify the left navigation panel loads with the expected modules: Data Integration, Data Development, Data Architecture</w:t>
+      </w:r>
+    </w:p>
     <w:p>
       <w:pPr>
         <w:pStyle w:val="DefinitionTerm"/>
@@ -3134,7 +2634,7 @@
       <w:pPr>
         <w:numPr>
           <w:ilvl w:val="0"/>
-          <w:numId w:val="1010"/>
+          <w:numId w:val="1014"/>
         </w:numPr>
         <w:pStyle w:val="Compact"/>
       </w:pPr>
@@ -3146,7 +2646,7 @@
       <w:pPr>
         <w:numPr>
           <w:ilvl w:val="0"/>
-          <w:numId w:val="1010"/>
+          <w:numId w:val="1014"/>
         </w:numPr>
         <w:pStyle w:val="Compact"/>
       </w:pPr>
@@ -3158,7 +2658,7 @@
       <w:pPr>
         <w:numPr>
           <w:ilvl w:val="0"/>
-          <w:numId w:val="1010"/>
+          <w:numId w:val="1014"/>
         </w:numPr>
         <w:pStyle w:val="Compact"/>
       </w:pPr>
@@ -3255,7 +2755,7 @@
       <w:pPr>
         <w:numPr>
           <w:ilvl w:val="0"/>
-          <w:numId w:val="1011"/>
+          <w:numId w:val="1015"/>
         </w:numPr>
         <w:pStyle w:val="Compact"/>
       </w:pPr>
@@ -3267,7 +2767,7 @@
       <w:pPr>
         <w:numPr>
           <w:ilvl w:val="0"/>
-          <w:numId w:val="1011"/>
+          <w:numId w:val="1015"/>
         </w:numPr>
         <w:pStyle w:val="Compact"/>
       </w:pPr>
@@ -3279,7 +2779,7 @@
       <w:pPr>
         <w:numPr>
           <w:ilvl w:val="0"/>
-          <w:numId w:val="1011"/>
+          <w:numId w:val="1015"/>
         </w:numPr>
         <w:pStyle w:val="Compact"/>
       </w:pPr>
@@ -3291,7 +2791,7 @@
       <w:pPr>
         <w:numPr>
           <w:ilvl w:val="0"/>
-          <w:numId w:val="1011"/>
+          <w:numId w:val="1015"/>
         </w:numPr>
         <w:pStyle w:val="Compact"/>
       </w:pPr>
@@ -3307,203 +2807,78 @@
         <w:t xml:space="preserve">Procedure</w:t>
       </w:r>
     </w:p>
-    <w:tbl>
-      <w:tblPr>
-        <w:tblStyle w:val="Table"/>
-        <w:tblW w:type="auto" w:w="0"/>
-        <w:tblLook w:firstRow="1" w:lastRow="0" w:firstColumn="0" w:lastColumn="0" w:noHBand="0" w:noVBand="0" w:val="0020"/>
-        <w:jc w:val="start"/>
-      </w:tblPr>
-      <w:tblGrid>
-        <w:gridCol w:w="3960"/>
-        <w:gridCol w:w="3960"/>
-      </w:tblGrid>
-      <w:tr>
-        <w:trPr>
-          <w:tblHeader w:val="true"/>
-        </w:trPr>
-        <w:tc>
-          <w:tcPr/>
-          <w:p>
-            <w:pPr>
-              <w:pStyle w:val="Compact"/>
-              <w:jc w:val="left"/>
-            </w:pPr>
-            <w:r>
-              <w:t xml:space="preserve">Step</w:t>
-            </w:r>
-          </w:p>
-        </w:tc>
-        <w:tc>
-          <w:tcPr/>
-          <w:p>
-            <w:pPr>
-              <w:pStyle w:val="Compact"/>
-              <w:jc w:val="left"/>
-            </w:pPr>
-            <w:r>
-              <w:t xml:space="preserve">Action</w:t>
-            </w:r>
-          </w:p>
-        </w:tc>
-      </w:tr>
-      <w:tr>
-        <w:tc>
-          <w:tcPr/>
-          <w:p>
-            <w:pPr>
-              <w:pStyle w:val="Compact"/>
-              <w:jc w:val="left"/>
-            </w:pPr>
-            <w:r>
-              <w:t xml:space="preserve">1</w:t>
-            </w:r>
-          </w:p>
-        </w:tc>
-        <w:tc>
-          <w:tcPr/>
-          <w:p>
-            <w:pPr>
-              <w:pStyle w:val="Compact"/>
-              <w:jc w:val="left"/>
-            </w:pPr>
-            <w:r>
-              <w:t xml:space="preserve">Navigate to Data Development in DataArts Studio</w:t>
-            </w:r>
-          </w:p>
-        </w:tc>
-      </w:tr>
-      <w:tr>
-        <w:tc>
-          <w:tcPr/>
-          <w:p>
-            <w:pPr>
-              <w:pStyle w:val="Compact"/>
-              <w:jc w:val="left"/>
-            </w:pPr>
-            <w:r>
-              <w:t xml:space="preserve">2</w:t>
-            </w:r>
-          </w:p>
-        </w:tc>
-        <w:tc>
-          <w:tcPr/>
-          <w:p>
-            <w:pPr>
-              <w:pStyle w:val="Compact"/>
-              <w:jc w:val="left"/>
-            </w:pPr>
-            <w:r>
-              <w:t xml:space="preserve">Locate pipeline pl-ingest-customers</w:t>
-            </w:r>
-          </w:p>
-        </w:tc>
-      </w:tr>
-      <w:tr>
-        <w:tc>
-          <w:tcPr/>
-          <w:p>
-            <w:pPr>
-              <w:pStyle w:val="Compact"/>
-              <w:jc w:val="left"/>
-            </w:pPr>
-            <w:r>
-              <w:t xml:space="preserve">3</w:t>
-            </w:r>
-          </w:p>
-        </w:tc>
-        <w:tc>
-          <w:tcPr/>
-          <w:p>
-            <w:pPr>
-              <w:pStyle w:val="Compact"/>
-              <w:jc w:val="left"/>
-            </w:pPr>
-            <w:r>
-              <w:t xml:space="preserve">Click Run to execute the pipeline</w:t>
-            </w:r>
-          </w:p>
-        </w:tc>
-      </w:tr>
-      <w:tr>
-        <w:tc>
-          <w:tcPr/>
-          <w:p>
-            <w:pPr>
-              <w:pStyle w:val="Compact"/>
-              <w:jc w:val="left"/>
-            </w:pPr>
-            <w:r>
-              <w:t xml:space="preserve">4</w:t>
-            </w:r>
-          </w:p>
-        </w:tc>
-        <w:tc>
-          <w:tcPr/>
-          <w:p>
-            <w:pPr>
-              <w:pStyle w:val="Compact"/>
-              <w:jc w:val="left"/>
-            </w:pPr>
-            <w:r>
-              <w:t xml:space="preserve">Wait for pipeline status (timeout: 10 min)</w:t>
-            </w:r>
-          </w:p>
-        </w:tc>
-      </w:tr>
-      <w:tr>
-        <w:tc>
-          <w:tcPr/>
-          <w:p>
-            <w:pPr>
-              <w:pStyle w:val="Compact"/>
-              <w:jc w:val="left"/>
-            </w:pPr>
-            <w:r>
-              <w:t xml:space="preserve">5</w:t>
-            </w:r>
-          </w:p>
-        </w:tc>
-        <w:tc>
-          <w:tcPr/>
-          <w:p>
-            <w:pPr>
-              <w:pStyle w:val="Compact"/>
-              <w:jc w:val="left"/>
-            </w:pPr>
-            <w:r>
-              <w:t xml:space="preserve">Verify output file in OBS</w:t>
-            </w:r>
-          </w:p>
-        </w:tc>
-      </w:tr>
-      <w:tr>
-        <w:tc>
-          <w:tcPr/>
-          <w:p>
-            <w:pPr>
-              <w:pStyle w:val="Compact"/>
-              <w:jc w:val="left"/>
-            </w:pPr>
-            <w:r>
-              <w:t xml:space="preserve">6</w:t>
-            </w:r>
-          </w:p>
-        </w:tc>
-        <w:tc>
-          <w:tcPr/>
-          <w:p>
-            <w:pPr>
-              <w:pStyle w:val="Compact"/>
-              <w:jc w:val="left"/>
-            </w:pPr>
-            <w:r>
-              <w:t xml:space="preserve">Download and verify row count</w:t>
-            </w:r>
-          </w:p>
-        </w:tc>
-      </w:tr>
-    </w:tbl>
+    <w:p>
+      <w:pPr>
+        <w:numPr>
+          <w:ilvl w:val="0"/>
+          <w:numId w:val="1016"/>
+        </w:numPr>
+        <w:pStyle w:val="Compact"/>
+      </w:pPr>
+      <w:r>
+        <w:t xml:space="preserve">Navigate to Data Development in DataArts Studio</w:t>
+      </w:r>
+    </w:p>
+    <w:p>
+      <w:pPr>
+        <w:numPr>
+          <w:ilvl w:val="0"/>
+          <w:numId w:val="1016"/>
+        </w:numPr>
+        <w:pStyle w:val="Compact"/>
+      </w:pPr>
+      <w:r>
+        <w:t xml:space="preserve">Locate pipeline pl-ingest-customers</w:t>
+      </w:r>
+    </w:p>
+    <w:p>
+      <w:pPr>
+        <w:numPr>
+          <w:ilvl w:val="0"/>
+          <w:numId w:val="1016"/>
+        </w:numPr>
+        <w:pStyle w:val="Compact"/>
+      </w:pPr>
+      <w:r>
+        <w:t xml:space="preserve">Click Run to execute the pipeline</w:t>
+      </w:r>
+    </w:p>
+    <w:p>
+      <w:pPr>
+        <w:numPr>
+          <w:ilvl w:val="0"/>
+          <w:numId w:val="1016"/>
+        </w:numPr>
+        <w:pStyle w:val="Compact"/>
+      </w:pPr>
+      <w:r>
+        <w:t xml:space="preserve">Wait for pipeline status (timeout: 10 min)</w:t>
+      </w:r>
+    </w:p>
+    <w:p>
+      <w:pPr>
+        <w:numPr>
+          <w:ilvl w:val="0"/>
+          <w:numId w:val="1016"/>
+        </w:numPr>
+        <w:pStyle w:val="Compact"/>
+      </w:pPr>
+      <w:r>
+        <w:t xml:space="preserve">Verify output file in OBS</w:t>
+      </w:r>
+    </w:p>
+    <w:p>
+      <w:pPr>
+        <w:numPr>
+          <w:ilvl w:val="0"/>
+          <w:numId w:val="1016"/>
+        </w:numPr>
+        <w:pStyle w:val="Compact"/>
+      </w:pPr>
+      <w:r>
+        <w:t xml:space="preserve">Download and verify row count</w:t>
+      </w:r>
+    </w:p>
     <w:p>
       <w:pPr>
         <w:pStyle w:val="DefinitionTerm"/>
@@ -3516,7 +2891,7 @@
       <w:pPr>
         <w:numPr>
           <w:ilvl w:val="0"/>
-          <w:numId w:val="1012"/>
+          <w:numId w:val="1017"/>
         </w:numPr>
         <w:pStyle w:val="Compact"/>
       </w:pPr>
@@ -3528,7 +2903,7 @@
       <w:pPr>
         <w:numPr>
           <w:ilvl w:val="0"/>
-          <w:numId w:val="1012"/>
+          <w:numId w:val="1017"/>
         </w:numPr>
         <w:pStyle w:val="Compact"/>
       </w:pPr>
@@ -3540,7 +2915,7 @@
       <w:pPr>
         <w:numPr>
           <w:ilvl w:val="0"/>
-          <w:numId w:val="1012"/>
+          <w:numId w:val="1017"/>
         </w:numPr>
         <w:pStyle w:val="Compact"/>
       </w:pPr>
@@ -3637,7 +3012,7 @@
       <w:pPr>
         <w:numPr>
           <w:ilvl w:val="0"/>
-          <w:numId w:val="1013"/>
+          <w:numId w:val="1018"/>
         </w:numPr>
         <w:pStyle w:val="Compact"/>
       </w:pPr>
@@ -3649,7 +3024,7 @@
       <w:pPr>
         <w:numPr>
           <w:ilvl w:val="0"/>
-          <w:numId w:val="1013"/>
+          <w:numId w:val="1018"/>
         </w:numPr>
         <w:pStyle w:val="Compact"/>
       </w:pPr>
@@ -3661,7 +3036,7 @@
       <w:pPr>
         <w:numPr>
           <w:ilvl w:val="0"/>
-          <w:numId w:val="1013"/>
+          <w:numId w:val="1018"/>
         </w:numPr>
         <w:pStyle w:val="Compact"/>
       </w:pPr>
@@ -3677,189 +3052,78 @@
         <w:t xml:space="preserve">Procedure</w:t>
       </w:r>
     </w:p>
-    <w:tbl>
-      <w:tblPr>
-        <w:tblStyle w:val="Table"/>
-        <w:tblW w:type="pct" w:w="5000"/>
-        <w:tblLook w:firstRow="1" w:lastRow="0" w:firstColumn="0" w:lastColumn="0" w:noHBand="0" w:noVBand="0" w:val="0020"/>
-        <w:jc w:val="start"/>
-      </w:tblPr>
-      <w:tblGrid>
-        <w:gridCol w:w="3960"/>
-        <w:gridCol w:w="3960"/>
-      </w:tblGrid>
-      <w:tr>
-        <w:trPr>
-          <w:tblHeader w:val="true"/>
-        </w:trPr>
-        <w:tc>
-          <w:tcPr/>
-          <w:p>
-            <w:pPr>
-              <w:pStyle w:val="Compact"/>
-              <w:jc w:val="left"/>
-            </w:pPr>
-            <w:r>
-              <w:t xml:space="preserve">Step</w:t>
-            </w:r>
-          </w:p>
-        </w:tc>
-        <w:tc>
-          <w:tcPr/>
-          <w:p>
-            <w:pPr>
-              <w:pStyle w:val="Compact"/>
-              <w:jc w:val="left"/>
-            </w:pPr>
-            <w:r>
-              <w:t xml:space="preserve">Action</w:t>
-            </w:r>
-          </w:p>
-        </w:tc>
-      </w:tr>
-      <w:tr>
-        <w:tc>
-          <w:tcPr/>
-          <w:p>
-            <w:pPr>
-              <w:pStyle w:val="Compact"/>
-              <w:jc w:val="left"/>
-            </w:pPr>
-            <w:r>
-              <w:t xml:space="preserve">1</w:t>
-            </w:r>
-          </w:p>
-        </w:tc>
-        <w:tc>
-          <w:tcPr/>
-          <w:p>
-            <w:pPr>
-              <w:pStyle w:val="Compact"/>
-              <w:jc w:val="left"/>
-            </w:pPr>
-            <w:r>
-              <w:t xml:space="preserve">SSH into the MRS master node</w:t>
-            </w:r>
-          </w:p>
-        </w:tc>
-      </w:tr>
-      <w:tr>
-        <w:tc>
-          <w:tcPr/>
-          <w:p>
-            <w:pPr>
-              <w:pStyle w:val="Compact"/>
-              <w:jc w:val="left"/>
-            </w:pPr>
-            <w:r>
-              <w:t xml:space="preserve">2</w:t>
-            </w:r>
-          </w:p>
-        </w:tc>
-        <w:tc>
-          <w:tcPr/>
-          <w:p>
-            <w:pPr>
-              <w:pStyle w:val="Compact"/>
-              <w:jc w:val="left"/>
-            </w:pPr>
-            <w:r>
-              <w:t xml:space="preserve">Run the Spark SQL CLI: spark-sql –master yarn -{}-conf spark.sql.hive.convertMetastoreOrc=true -e “SELECT COUNT(*) FROM poc_db.customers;”</w:t>
-            </w:r>
-          </w:p>
-        </w:tc>
-      </w:tr>
-      <w:tr>
-        <w:tc>
-          <w:tcPr/>
-          <w:p>
-            <w:pPr>
-              <w:pStyle w:val="Compact"/>
-              <w:jc w:val="left"/>
-            </w:pPr>
-            <w:r>
-              <w:t xml:space="preserve">3</w:t>
-            </w:r>
-          </w:p>
-        </w:tc>
-        <w:tc>
-          <w:tcPr/>
-          <w:p>
-            <w:pPr>
-              <w:pStyle w:val="Compact"/>
-              <w:jc w:val="left"/>
-            </w:pPr>
-            <w:r>
-              <w:t xml:space="preserve">Verify the returned count matches the expected row count (10,000)</w:t>
-            </w:r>
-          </w:p>
-        </w:tc>
-      </w:tr>
-      <w:tr>
-        <w:tc>
-          <w:tcPr/>
-          <w:p>
-            <w:pPr>
-              <w:pStyle w:val="Compact"/>
-              <w:jc w:val="left"/>
-            </w:pPr>
-            <w:r>
-              <w:t xml:space="preserve">4</w:t>
-            </w:r>
-          </w:p>
-        </w:tc>
-        <w:tc>
-          <w:tcPr/>
-          <w:p>
-            <w:pPr>
-              <w:pStyle w:val="Compact"/>
-              <w:jc w:val="left"/>
-            </w:pPr>
-            <w:r>
-              <w:t xml:space="preserve">Run a sample query to verify data integrity: spark-sql –master yarn -e</w:t>
-            </w:r>
-            <w:r>
-              <w:t xml:space="preserve"> </w:t>
-            </w:r>
-            <w:r>
-              <w:t xml:space="preserve">“</w:t>
-            </w:r>
-            <w:r>
-              <w:t xml:space="preserve">SELECT customer_id, name FROM poc_db.customers LIMIT 5;</w:t>
-            </w:r>
-            <w:r>
-              <w:t xml:space="preserve">”</w:t>
-            </w:r>
-          </w:p>
-        </w:tc>
-      </w:tr>
-      <w:tr>
-        <w:tc>
-          <w:tcPr/>
-          <w:p>
-            <w:pPr>
-              <w:pStyle w:val="Compact"/>
-              <w:jc w:val="left"/>
-            </w:pPr>
-            <w:r>
-              <w:t xml:space="preserve">5</w:t>
-            </w:r>
-          </w:p>
-        </w:tc>
-        <w:tc>
-          <w:tcPr/>
-          <w:p>
-            <w:pPr>
-              <w:pStyle w:val="Compact"/>
-              <w:jc w:val="left"/>
-            </w:pPr>
-            <w:r>
-              <w:t xml:space="preserve">Confirm the query returns 5 rows with non-null values</w:t>
-            </w:r>
-          </w:p>
-        </w:tc>
-      </w:tr>
-    </w:tbl>
+    <w:p>
+      <w:pPr>
+        <w:numPr>
+          <w:ilvl w:val="0"/>
+          <w:numId w:val="1019"/>
+        </w:numPr>
+        <w:pStyle w:val="Compact"/>
+      </w:pPr>
+      <w:r>
+        <w:t xml:space="preserve">SSH into the MRS master node</w:t>
+      </w:r>
+    </w:p>
+    <w:p>
+      <w:pPr>
+        <w:numPr>
+          <w:ilvl w:val="0"/>
+          <w:numId w:val="1019"/>
+        </w:numPr>
+        <w:pStyle w:val="Compact"/>
+      </w:pPr>
+      <w:r>
+        <w:t xml:space="preserve">Run the Spark SQL CLI: spark-sql –master yarn -{}-conf spark.sql.hive.convertMetastoreOrc=true -e “SELECT COUNT(*) FROM poc_db.customers;”</w:t>
+      </w:r>
+    </w:p>
+    <w:p>
+      <w:pPr>
+        <w:numPr>
+          <w:ilvl w:val="0"/>
+          <w:numId w:val="1019"/>
+        </w:numPr>
+        <w:pStyle w:val="Compact"/>
+      </w:pPr>
+      <w:r>
+        <w:t xml:space="preserve">Verify the returned count matches the expected row count (10,000)</w:t>
+      </w:r>
+    </w:p>
+    <w:p>
+      <w:pPr>
+        <w:numPr>
+          <w:ilvl w:val="0"/>
+          <w:numId w:val="1019"/>
+        </w:numPr>
+        <w:pStyle w:val="Compact"/>
+      </w:pPr>
+      <w:r>
+        <w:t xml:space="preserve">Run a sample query to verify data integrity: spark-sql –master yarn -e</w:t>
+      </w:r>
+      <w:r>
+        <w:t xml:space="preserve"> </w:t>
+      </w:r>
+      <w:r>
+        <w:t xml:space="preserve">“</w:t>
+      </w:r>
+      <w:r>
+        <w:t xml:space="preserve">SELECT customer_id, name FROM poc_db.customers LIMIT 5;</w:t>
+      </w:r>
+      <w:r>
+        <w:t xml:space="preserve">”</w:t>
+      </w:r>
+    </w:p>
+    <w:p>
+      <w:pPr>
+        <w:numPr>
+          <w:ilvl w:val="0"/>
+          <w:numId w:val="1019"/>
+        </w:numPr>
+        <w:pStyle w:val="Compact"/>
+      </w:pPr>
+      <w:r>
+        <w:t xml:space="preserve">Confirm the query returns 5 rows with non-null values</w:t>
+      </w:r>
+    </w:p>
     <w:p>
       <w:pPr>
         <w:pStyle w:val="DefinitionTerm"/>
@@ -3872,7 +3136,7 @@
       <w:pPr>
         <w:numPr>
           <w:ilvl w:val="0"/>
-          <w:numId w:val="1014"/>
+          <w:numId w:val="1020"/>
         </w:numPr>
         <w:pStyle w:val="Compact"/>
       </w:pPr>
@@ -3884,7 +3148,7 @@
       <w:pPr>
         <w:numPr>
           <w:ilvl w:val="0"/>
-          <w:numId w:val="1014"/>
+          <w:numId w:val="1020"/>
         </w:numPr>
         <w:pStyle w:val="Compact"/>
       </w:pPr>
@@ -4012,7 +3276,7 @@
       <w:pPr>
         <w:numPr>
           <w:ilvl w:val="0"/>
-          <w:numId w:val="1015"/>
+          <w:numId w:val="1021"/>
         </w:numPr>
         <w:pStyle w:val="Compact"/>
       </w:pPr>
@@ -4024,7 +3288,7 @@
       <w:pPr>
         <w:numPr>
           <w:ilvl w:val="0"/>
-          <w:numId w:val="1015"/>
+          <w:numId w:val="1021"/>
         </w:numPr>
         <w:pStyle w:val="Compact"/>
       </w:pPr>
@@ -4036,7 +3300,7 @@
       <w:pPr>
         <w:numPr>
           <w:ilvl w:val="0"/>
-          <w:numId w:val="1015"/>
+          <w:numId w:val="1021"/>
         </w:numPr>
         <w:pStyle w:val="Compact"/>
       </w:pPr>
@@ -4052,177 +3316,66 @@
         <w:t xml:space="preserve">Procedure</w:t>
       </w:r>
     </w:p>
-    <w:tbl>
-      <w:tblPr>
-        <w:tblStyle w:val="Table"/>
-        <w:tblW w:type="pct" w:w="5000"/>
-        <w:tblLook w:firstRow="1" w:lastRow="0" w:firstColumn="0" w:lastColumn="0" w:noHBand="0" w:noVBand="0" w:val="0020"/>
-        <w:jc w:val="start"/>
-      </w:tblPr>
-      <w:tblGrid>
-        <w:gridCol w:w="3960"/>
-        <w:gridCol w:w="3960"/>
-      </w:tblGrid>
-      <w:tr>
-        <w:trPr>
-          <w:tblHeader w:val="true"/>
-        </w:trPr>
-        <w:tc>
-          <w:tcPr/>
-          <w:p>
-            <w:pPr>
-              <w:pStyle w:val="Compact"/>
-              <w:jc w:val="left"/>
-            </w:pPr>
-            <w:r>
-              <w:t xml:space="preserve">Step</w:t>
-            </w:r>
-          </w:p>
-        </w:tc>
-        <w:tc>
-          <w:tcPr/>
-          <w:p>
-            <w:pPr>
-              <w:pStyle w:val="Compact"/>
-              <w:jc w:val="left"/>
-            </w:pPr>
-            <w:r>
-              <w:t xml:space="preserve">Action</w:t>
-            </w:r>
-          </w:p>
-        </w:tc>
-      </w:tr>
-      <w:tr>
-        <w:tc>
-          <w:tcPr/>
-          <w:p>
-            <w:pPr>
-              <w:pStyle w:val="Compact"/>
-              <w:jc w:val="left"/>
-            </w:pPr>
-            <w:r>
-              <w:t xml:space="preserve">1</w:t>
-            </w:r>
-          </w:p>
-        </w:tc>
-        <w:tc>
-          <w:tcPr/>
-          <w:p>
-            <w:pPr>
-              <w:pStyle w:val="Compact"/>
-              <w:jc w:val="left"/>
-            </w:pPr>
-            <w:r>
-              <w:t xml:space="preserve">Using the authorized user, upload a test file to poc-datalake-raw</w:t>
-            </w:r>
-          </w:p>
-        </w:tc>
-      </w:tr>
-      <w:tr>
-        <w:tc>
-          <w:tcPr/>
-          <w:p>
-            <w:pPr>
-              <w:pStyle w:val="Compact"/>
-              <w:jc w:val="left"/>
-            </w:pPr>
-            <w:r>
-              <w:t xml:space="preserve">2</w:t>
-            </w:r>
-          </w:p>
-        </w:tc>
-        <w:tc>
-          <w:tcPr/>
-          <w:p>
-            <w:pPr>
-              <w:pStyle w:val="Compact"/>
-              <w:jc w:val="left"/>
-            </w:pPr>
-            <w:r>
-              <w:t xml:space="preserve">Using the authorized user, download and verify the file content</w:t>
-            </w:r>
-          </w:p>
-        </w:tc>
-      </w:tr>
-      <w:tr>
-        <w:tc>
-          <w:tcPr/>
-          <w:p>
-            <w:pPr>
-              <w:pStyle w:val="Compact"/>
-              <w:jc w:val="left"/>
-            </w:pPr>
-            <w:r>
-              <w:t xml:space="preserve">3</w:t>
-            </w:r>
-          </w:p>
-        </w:tc>
-        <w:tc>
-          <w:tcPr/>
-          <w:p>
-            <w:pPr>
-              <w:pStyle w:val="Compact"/>
-              <w:jc w:val="left"/>
-            </w:pPr>
-            <w:r>
-              <w:t xml:space="preserve">Using the unauthorized user, attempt to upload a file — verify the request is denied (HTTP 403)</w:t>
-            </w:r>
-          </w:p>
-        </w:tc>
-      </w:tr>
-      <w:tr>
-        <w:tc>
-          <w:tcPr/>
-          <w:p>
-            <w:pPr>
-              <w:pStyle w:val="Compact"/>
-              <w:jc w:val="left"/>
-            </w:pPr>
-            <w:r>
-              <w:t xml:space="preserve">4</w:t>
-            </w:r>
-          </w:p>
-        </w:tc>
-        <w:tc>
-          <w:tcPr/>
-          <w:p>
-            <w:pPr>
-              <w:pStyle w:val="Compact"/>
-              <w:jc w:val="left"/>
-            </w:pPr>
-            <w:r>
-              <w:t xml:space="preserve">Using the unauthorized user, attempt to list objects in the bucket — verify the request is denied</w:t>
-            </w:r>
-          </w:p>
-        </w:tc>
-      </w:tr>
-      <w:tr>
-        <w:tc>
-          <w:tcPr/>
-          <w:p>
-            <w:pPr>
-              <w:pStyle w:val="Compact"/>
-              <w:jc w:val="left"/>
-            </w:pPr>
-            <w:r>
-              <w:t xml:space="preserve">5</w:t>
-            </w:r>
-          </w:p>
-        </w:tc>
-        <w:tc>
-          <w:tcPr/>
-          <w:p>
-            <w:pPr>
-              <w:pStyle w:val="Compact"/>
-              <w:jc w:val="left"/>
-            </w:pPr>
-            <w:r>
-              <w:t xml:space="preserve">Review the bucket policy in the Console at Console, Object Storage Service, Bucket Policies and confirm it grants only the intended permissions</w:t>
-            </w:r>
-          </w:p>
-        </w:tc>
-      </w:tr>
-    </w:tbl>
+    <w:p>
+      <w:pPr>
+        <w:numPr>
+          <w:ilvl w:val="0"/>
+          <w:numId w:val="1022"/>
+        </w:numPr>
+        <w:pStyle w:val="Compact"/>
+      </w:pPr>
+      <w:r>
+        <w:t xml:space="preserve">Using the authorized user, upload a test file to poc-datalake-raw</w:t>
+      </w:r>
+    </w:p>
+    <w:p>
+      <w:pPr>
+        <w:numPr>
+          <w:ilvl w:val="0"/>
+          <w:numId w:val="1022"/>
+        </w:numPr>
+        <w:pStyle w:val="Compact"/>
+      </w:pPr>
+      <w:r>
+        <w:t xml:space="preserve">Using the authorized user, download and verify the file content</w:t>
+      </w:r>
+    </w:p>
+    <w:p>
+      <w:pPr>
+        <w:numPr>
+          <w:ilvl w:val="0"/>
+          <w:numId w:val="1022"/>
+        </w:numPr>
+        <w:pStyle w:val="Compact"/>
+      </w:pPr>
+      <w:r>
+        <w:t xml:space="preserve">Using the unauthorized user, attempt to upload a file — verify the request is denied (HTTP 403)</w:t>
+      </w:r>
+    </w:p>
+    <w:p>
+      <w:pPr>
+        <w:numPr>
+          <w:ilvl w:val="0"/>
+          <w:numId w:val="1022"/>
+        </w:numPr>
+        <w:pStyle w:val="Compact"/>
+      </w:pPr>
+      <w:r>
+        <w:t xml:space="preserve">Using the unauthorized user, attempt to list objects in the bucket — verify the request is denied</w:t>
+      </w:r>
+    </w:p>
+    <w:p>
+      <w:pPr>
+        <w:numPr>
+          <w:ilvl w:val="0"/>
+          <w:numId w:val="1022"/>
+        </w:numPr>
+        <w:pStyle w:val="Compact"/>
+      </w:pPr>
+      <w:r>
+        <w:t xml:space="preserve">Review the bucket policy in the Console at Console, Object Storage Service, Bucket Policies and confirm it grants only the intended permissions</w:t>
+      </w:r>
+    </w:p>
     <w:p>
       <w:pPr>
         <w:pStyle w:val="DefinitionTerm"/>
@@ -4235,7 +3388,7 @@
       <w:pPr>
         <w:numPr>
           <w:ilvl w:val="0"/>
-          <w:numId w:val="1016"/>
+          <w:numId w:val="1023"/>
         </w:numPr>
         <w:pStyle w:val="Compact"/>
       </w:pPr>
@@ -4247,7 +3400,7 @@
       <w:pPr>
         <w:numPr>
           <w:ilvl w:val="0"/>
-          <w:numId w:val="1016"/>
+          <w:numId w:val="1023"/>
         </w:numPr>
         <w:pStyle w:val="Compact"/>
       </w:pPr>
@@ -4259,7 +3412,7 @@
       <w:pPr>
         <w:numPr>
           <w:ilvl w:val="0"/>
-          <w:numId w:val="1016"/>
+          <w:numId w:val="1023"/>
         </w:numPr>
         <w:pStyle w:val="Compact"/>
       </w:pPr>
@@ -4356,7 +3509,7 @@
       <w:pPr>
         <w:numPr>
           <w:ilvl w:val="0"/>
-          <w:numId w:val="1017"/>
+          <w:numId w:val="1024"/>
         </w:numPr>
         <w:pStyle w:val="Compact"/>
       </w:pPr>
@@ -4368,7 +3521,7 @@
       <w:pPr>
         <w:numPr>
           <w:ilvl w:val="0"/>
-          <w:numId w:val="1017"/>
+          <w:numId w:val="1024"/>
         </w:numPr>
         <w:pStyle w:val="Compact"/>
       </w:pPr>
@@ -4380,7 +3533,7 @@
       <w:pPr>
         <w:numPr>
           <w:ilvl w:val="0"/>
-          <w:numId w:val="1017"/>
+          <w:numId w:val="1024"/>
         </w:numPr>
         <w:pStyle w:val="Compact"/>
       </w:pPr>
@@ -4396,177 +3549,66 @@
         <w:t xml:space="preserve">Procedure</w:t>
       </w:r>
     </w:p>
-    <w:tbl>
-      <w:tblPr>
-        <w:tblStyle w:val="Table"/>
-        <w:tblW w:type="pct" w:w="5000"/>
-        <w:tblLook w:firstRow="1" w:lastRow="0" w:firstColumn="0" w:lastColumn="0" w:noHBand="0" w:noVBand="0" w:val="0020"/>
-        <w:jc w:val="start"/>
-      </w:tblPr>
-      <w:tblGrid>
-        <w:gridCol w:w="3960"/>
-        <w:gridCol w:w="3960"/>
-      </w:tblGrid>
-      <w:tr>
-        <w:trPr>
-          <w:tblHeader w:val="true"/>
-        </w:trPr>
-        <w:tc>
-          <w:tcPr/>
-          <w:p>
-            <w:pPr>
-              <w:pStyle w:val="Compact"/>
-              <w:jc w:val="left"/>
-            </w:pPr>
-            <w:r>
-              <w:t xml:space="preserve">Step</w:t>
-            </w:r>
-          </w:p>
-        </w:tc>
-        <w:tc>
-          <w:tcPr/>
-          <w:p>
-            <w:pPr>
-              <w:pStyle w:val="Compact"/>
-              <w:jc w:val="left"/>
-            </w:pPr>
-            <w:r>
-              <w:t xml:space="preserve">Action</w:t>
-            </w:r>
-          </w:p>
-        </w:tc>
-      </w:tr>
-      <w:tr>
-        <w:tc>
-          <w:tcPr/>
-          <w:p>
-            <w:pPr>
-              <w:pStyle w:val="Compact"/>
-              <w:jc w:val="left"/>
-            </w:pPr>
-            <w:r>
-              <w:t xml:space="preserve">1</w:t>
-            </w:r>
-          </w:p>
-        </w:tc>
-        <w:tc>
-          <w:tcPr/>
-          <w:p>
-            <w:pPr>
-              <w:pStyle w:val="Compact"/>
-              <w:jc w:val="left"/>
-            </w:pPr>
-            <w:r>
-              <w:t xml:space="preserve">In the DataArts Studio console, navigate to Data Architecture $$ Data Masking</w:t>
-            </w:r>
-          </w:p>
-        </w:tc>
-      </w:tr>
-      <w:tr>
-        <w:tc>
-          <w:tcPr/>
-          <w:p>
-            <w:pPr>
-              <w:pStyle w:val="Compact"/>
-              <w:jc w:val="left"/>
-            </w:pPr>
-            <w:r>
-              <w:t xml:space="preserve">2</w:t>
-            </w:r>
-          </w:p>
-        </w:tc>
-        <w:tc>
-          <w:tcPr/>
-          <w:p>
-            <w:pPr>
-              <w:pStyle w:val="Compact"/>
-              <w:jc w:val="left"/>
-            </w:pPr>
-            <w:r>
-              <w:t xml:space="preserve">Verify the masking rule for customers.ssn is active and uses the Mask All strategy</w:t>
-            </w:r>
-          </w:p>
-        </w:tc>
-      </w:tr>
-      <w:tr>
-        <w:tc>
-          <w:tcPr/>
-          <w:p>
-            <w:pPr>
-              <w:pStyle w:val="Compact"/>
-              <w:jc w:val="left"/>
-            </w:pPr>
-            <w:r>
-              <w:t xml:space="preserve">3</w:t>
-            </w:r>
-          </w:p>
-        </w:tc>
-        <w:tc>
-          <w:tcPr/>
-          <w:p>
-            <w:pPr>
-              <w:pStyle w:val="Compact"/>
-              <w:jc w:val="left"/>
-            </w:pPr>
-            <w:r>
-              <w:t xml:space="preserve">Query the customers table as the test user via DataArts Studio SQL console</w:t>
-            </w:r>
-          </w:p>
-        </w:tc>
-      </w:tr>
-      <w:tr>
-        <w:tc>
-          <w:tcPr/>
-          <w:p>
-            <w:pPr>
-              <w:pStyle w:val="Compact"/>
-              <w:jc w:val="left"/>
-            </w:pPr>
-            <w:r>
-              <w:t xml:space="preserve">4</w:t>
-            </w:r>
-          </w:p>
-        </w:tc>
-        <w:tc>
-          <w:tcPr/>
-          <w:p>
-            <w:pPr>
-              <w:pStyle w:val="Compact"/>
-              <w:jc w:val="left"/>
-            </w:pPr>
-            <w:r>
-              <w:t xml:space="preserve">Verify the ssn column returns masked values (e.g. *********) instead of real data</w:t>
-            </w:r>
-          </w:p>
-        </w:tc>
-      </w:tr>
-      <w:tr>
-        <w:tc>
-          <w:tcPr/>
-          <w:p>
-            <w:pPr>
-              <w:pStyle w:val="Compact"/>
-              <w:jc w:val="left"/>
-            </w:pPr>
-            <w:r>
-              <w:t xml:space="preserve">5</w:t>
-            </w:r>
-          </w:p>
-        </w:tc>
-        <w:tc>
-          <w:tcPr/>
-          <w:p>
-            <w:pPr>
-              <w:pStyle w:val="Compact"/>
-              <w:jc w:val="left"/>
-            </w:pPr>
-            <w:r>
-              <w:t xml:space="preserve">Query the same table as an admin user and verify real values are returned</w:t>
-            </w:r>
-          </w:p>
-        </w:tc>
-      </w:tr>
-    </w:tbl>
+    <w:p>
+      <w:pPr>
+        <w:numPr>
+          <w:ilvl w:val="0"/>
+          <w:numId w:val="1025"/>
+        </w:numPr>
+        <w:pStyle w:val="Compact"/>
+      </w:pPr>
+      <w:r>
+        <w:t xml:space="preserve">In the DataArts Studio console, navigate to Data Architecture $$ Data Masking</w:t>
+      </w:r>
+    </w:p>
+    <w:p>
+      <w:pPr>
+        <w:numPr>
+          <w:ilvl w:val="0"/>
+          <w:numId w:val="1025"/>
+        </w:numPr>
+        <w:pStyle w:val="Compact"/>
+      </w:pPr>
+      <w:r>
+        <w:t xml:space="preserve">Verify the masking rule for customers.ssn is active and uses the Mask All strategy</w:t>
+      </w:r>
+    </w:p>
+    <w:p>
+      <w:pPr>
+        <w:numPr>
+          <w:ilvl w:val="0"/>
+          <w:numId w:val="1025"/>
+        </w:numPr>
+        <w:pStyle w:val="Compact"/>
+      </w:pPr>
+      <w:r>
+        <w:t xml:space="preserve">Query the customers table as the test user via DataArts Studio SQL console</w:t>
+      </w:r>
+    </w:p>
+    <w:p>
+      <w:pPr>
+        <w:numPr>
+          <w:ilvl w:val="0"/>
+          <w:numId w:val="1025"/>
+        </w:numPr>
+        <w:pStyle w:val="Compact"/>
+      </w:pPr>
+      <w:r>
+        <w:t xml:space="preserve">Verify the ssn column returns masked values (e.g. *********) instead of real data</w:t>
+      </w:r>
+    </w:p>
+    <w:p>
+      <w:pPr>
+        <w:numPr>
+          <w:ilvl w:val="0"/>
+          <w:numId w:val="1025"/>
+        </w:numPr>
+        <w:pStyle w:val="Compact"/>
+      </w:pPr>
+      <w:r>
+        <w:t xml:space="preserve">Query the same table as an admin user and verify real values are returned</w:t>
+      </w:r>
+    </w:p>
     <w:p>
       <w:pPr>
         <w:pStyle w:val="DefinitionTerm"/>
@@ -4579,7 +3621,7 @@
       <w:pPr>
         <w:numPr>
           <w:ilvl w:val="0"/>
-          <w:numId w:val="1018"/>
+          <w:numId w:val="1026"/>
         </w:numPr>
         <w:pStyle w:val="Compact"/>
       </w:pPr>
@@ -4591,7 +3633,7 @@
       <w:pPr>
         <w:numPr>
           <w:ilvl w:val="0"/>
-          <w:numId w:val="1018"/>
+          <w:numId w:val="1026"/>
         </w:numPr>
         <w:pStyle w:val="Compact"/>
       </w:pPr>
@@ -4603,7 +3645,7 @@
       <w:pPr>
         <w:numPr>
           <w:ilvl w:val="0"/>
-          <w:numId w:val="1018"/>
+          <w:numId w:val="1026"/>
         </w:numPr>
         <w:pStyle w:val="Compact"/>
       </w:pPr>
@@ -4731,7 +3773,7 @@
       <w:pPr>
         <w:numPr>
           <w:ilvl w:val="0"/>
-          <w:numId w:val="1019"/>
+          <w:numId w:val="1027"/>
         </w:numPr>
         <w:pStyle w:val="Compact"/>
       </w:pPr>
@@ -4743,7 +3785,7 @@
       <w:pPr>
         <w:numPr>
           <w:ilvl w:val="0"/>
-          <w:numId w:val="1019"/>
+          <w:numId w:val="1027"/>
         </w:numPr>
         <w:pStyle w:val="Compact"/>
       </w:pPr>
@@ -4755,7 +3797,7 @@
       <w:pPr>
         <w:numPr>
           <w:ilvl w:val="0"/>
-          <w:numId w:val="1019"/>
+          <w:numId w:val="1027"/>
         </w:numPr>
         <w:pStyle w:val="Compact"/>
       </w:pPr>
@@ -4771,203 +3813,78 @@
         <w:t xml:space="preserve">Procedure</w:t>
       </w:r>
     </w:p>
-    <w:tbl>
-      <w:tblPr>
-        <w:tblStyle w:val="Table"/>
-        <w:tblW w:type="pct" w:w="5000"/>
-        <w:tblLook w:firstRow="1" w:lastRow="0" w:firstColumn="0" w:lastColumn="0" w:noHBand="0" w:noVBand="0" w:val="0020"/>
-        <w:jc w:val="start"/>
-      </w:tblPr>
-      <w:tblGrid>
-        <w:gridCol w:w="3960"/>
-        <w:gridCol w:w="3960"/>
-      </w:tblGrid>
-      <w:tr>
-        <w:trPr>
-          <w:tblHeader w:val="true"/>
-        </w:trPr>
-        <w:tc>
-          <w:tcPr/>
-          <w:p>
-            <w:pPr>
-              <w:pStyle w:val="Compact"/>
-              <w:jc w:val="left"/>
-            </w:pPr>
-            <w:r>
-              <w:t xml:space="preserve">Step</w:t>
-            </w:r>
-          </w:p>
-        </w:tc>
-        <w:tc>
-          <w:tcPr/>
-          <w:p>
-            <w:pPr>
-              <w:pStyle w:val="Compact"/>
-              <w:jc w:val="left"/>
-            </w:pPr>
-            <w:r>
-              <w:t xml:space="preserve">Action</w:t>
-            </w:r>
-          </w:p>
-        </w:tc>
-      </w:tr>
-      <w:tr>
-        <w:tc>
-          <w:tcPr/>
-          <w:p>
-            <w:pPr>
-              <w:pStyle w:val="Compact"/>
-              <w:jc w:val="left"/>
-            </w:pPr>
-            <w:r>
-              <w:t xml:space="preserve">1</w:t>
-            </w:r>
-          </w:p>
-        </w:tc>
-        <w:tc>
-          <w:tcPr/>
-          <w:p>
-            <w:pPr>
-              <w:pStyle w:val="Compact"/>
-              <w:jc w:val="left"/>
-            </w:pPr>
-            <w:r>
-              <w:t xml:space="preserve">Navigate to the Terraform project directory</w:t>
-            </w:r>
-          </w:p>
-        </w:tc>
-      </w:tr>
-      <w:tr>
-        <w:tc>
-          <w:tcPr/>
-          <w:p>
-            <w:pPr>
-              <w:pStyle w:val="Compact"/>
-              <w:jc w:val="left"/>
-            </w:pPr>
-            <w:r>
-              <w:t xml:space="preserve">2</w:t>
-            </w:r>
-          </w:p>
-        </w:tc>
-        <w:tc>
-          <w:tcPr/>
-          <w:p>
-            <w:pPr>
-              <w:pStyle w:val="Compact"/>
-              <w:jc w:val="left"/>
-            </w:pPr>
-            <w:r>
-              <w:t xml:space="preserve">Run terraform init to initialize the working directory</w:t>
-            </w:r>
-          </w:p>
-        </w:tc>
-      </w:tr>
-      <w:tr>
-        <w:tc>
-          <w:tcPr/>
-          <w:p>
-            <w:pPr>
-              <w:pStyle w:val="Compact"/>
-              <w:jc w:val="left"/>
-            </w:pPr>
-            <w:r>
-              <w:t xml:space="preserve">3</w:t>
-            </w:r>
-          </w:p>
-        </w:tc>
-        <w:tc>
-          <w:tcPr/>
-          <w:p>
-            <w:pPr>
-              <w:pStyle w:val="Compact"/>
-              <w:jc w:val="left"/>
-            </w:pPr>
-            <w:r>
-              <w:t xml:space="preserve">Run terraform plan and review the planned changes — confirm all expected resources are listed</w:t>
-            </w:r>
-          </w:p>
-        </w:tc>
-      </w:tr>
-      <w:tr>
-        <w:tc>
-          <w:tcPr/>
-          <w:p>
-            <w:pPr>
-              <w:pStyle w:val="Compact"/>
-              <w:jc w:val="left"/>
-            </w:pPr>
-            <w:r>
-              <w:t xml:space="preserve">4</w:t>
-            </w:r>
-          </w:p>
-        </w:tc>
-        <w:tc>
-          <w:tcPr/>
-          <w:p>
-            <w:pPr>
-              <w:pStyle w:val="Compact"/>
-              <w:jc w:val="left"/>
-            </w:pPr>
-            <w:r>
-              <w:t xml:space="preserve">Run terraform apply -auto-approve and wait for completion</w:t>
-            </w:r>
-          </w:p>
-        </w:tc>
-      </w:tr>
-      <w:tr>
-        <w:tc>
-          <w:tcPr/>
-          <w:p>
-            <w:pPr>
-              <w:pStyle w:val="Compact"/>
-              <w:jc w:val="left"/>
-            </w:pPr>
-            <w:r>
-              <w:t xml:space="preserve">5</w:t>
-            </w:r>
-          </w:p>
-        </w:tc>
-        <w:tc>
-          <w:tcPr/>
-          <w:p>
-            <w:pPr>
-              <w:pStyle w:val="Compact"/>
-              <w:jc w:val="left"/>
-            </w:pPr>
-            <w:r>
-              <w:t xml:space="preserve">Run terraform output and verify all output values are populated</w:t>
-            </w:r>
-          </w:p>
-        </w:tc>
-      </w:tr>
-      <w:tr>
-        <w:tc>
-          <w:tcPr/>
-          <w:p>
-            <w:pPr>
-              <w:pStyle w:val="Compact"/>
-              <w:jc w:val="left"/>
-            </w:pPr>
-            <w:r>
-              <w:t xml:space="preserve">6</w:t>
-            </w:r>
-          </w:p>
-        </w:tc>
-        <w:tc>
-          <w:tcPr/>
-          <w:p>
-            <w:pPr>
-              <w:pStyle w:val="Compact"/>
-              <w:jc w:val="left"/>
-            </w:pPr>
-            <w:r>
-              <w:t xml:space="preserve">Run terraform state list and confirm the resource count matches the architecture</w:t>
-            </w:r>
-          </w:p>
-        </w:tc>
-      </w:tr>
-    </w:tbl>
+    <w:p>
+      <w:pPr>
+        <w:numPr>
+          <w:ilvl w:val="0"/>
+          <w:numId w:val="1028"/>
+        </w:numPr>
+        <w:pStyle w:val="Compact"/>
+      </w:pPr>
+      <w:r>
+        <w:t xml:space="preserve">Navigate to the Terraform project directory</w:t>
+      </w:r>
+    </w:p>
+    <w:p>
+      <w:pPr>
+        <w:numPr>
+          <w:ilvl w:val="0"/>
+          <w:numId w:val="1028"/>
+        </w:numPr>
+        <w:pStyle w:val="Compact"/>
+      </w:pPr>
+      <w:r>
+        <w:t xml:space="preserve">Run terraform init to initialize the working directory</w:t>
+      </w:r>
+    </w:p>
+    <w:p>
+      <w:pPr>
+        <w:numPr>
+          <w:ilvl w:val="0"/>
+          <w:numId w:val="1028"/>
+        </w:numPr>
+        <w:pStyle w:val="Compact"/>
+      </w:pPr>
+      <w:r>
+        <w:t xml:space="preserve">Run terraform plan and review the planned changes — confirm all expected resources are listed</w:t>
+      </w:r>
+    </w:p>
+    <w:p>
+      <w:pPr>
+        <w:numPr>
+          <w:ilvl w:val="0"/>
+          <w:numId w:val="1028"/>
+        </w:numPr>
+        <w:pStyle w:val="Compact"/>
+      </w:pPr>
+      <w:r>
+        <w:t xml:space="preserve">Run terraform apply -auto-approve and wait for completion</w:t>
+      </w:r>
+    </w:p>
+    <w:p>
+      <w:pPr>
+        <w:numPr>
+          <w:ilvl w:val="0"/>
+          <w:numId w:val="1028"/>
+        </w:numPr>
+        <w:pStyle w:val="Compact"/>
+      </w:pPr>
+      <w:r>
+        <w:t xml:space="preserve">Run terraform output and verify all output values are populated</w:t>
+      </w:r>
+    </w:p>
+    <w:p>
+      <w:pPr>
+        <w:numPr>
+          <w:ilvl w:val="0"/>
+          <w:numId w:val="1028"/>
+        </w:numPr>
+        <w:pStyle w:val="Compact"/>
+      </w:pPr>
+      <w:r>
+        <w:t xml:space="preserve">Run terraform state list and confirm the resource count matches the architecture</w:t>
+      </w:r>
+    </w:p>
     <w:p>
       <w:pPr>
         <w:pStyle w:val="DefinitionTerm"/>
@@ -4980,7 +3897,7 @@
       <w:pPr>
         <w:numPr>
           <w:ilvl w:val="0"/>
-          <w:numId w:val="1020"/>
+          <w:numId w:val="1029"/>
         </w:numPr>
         <w:pStyle w:val="Compact"/>
       </w:pPr>
@@ -4992,7 +3909,7 @@
       <w:pPr>
         <w:numPr>
           <w:ilvl w:val="0"/>
-          <w:numId w:val="1020"/>
+          <w:numId w:val="1029"/>
         </w:numPr>
         <w:pStyle w:val="Compact"/>
       </w:pPr>
@@ -5004,7 +3921,7 @@
       <w:pPr>
         <w:numPr>
           <w:ilvl w:val="0"/>
-          <w:numId w:val="1020"/>
+          <w:numId w:val="1029"/>
         </w:numPr>
         <w:pStyle w:val="Compact"/>
       </w:pPr>
@@ -5101,7 +4018,7 @@
       <w:pPr>
         <w:numPr>
           <w:ilvl w:val="0"/>
-          <w:numId w:val="1021"/>
+          <w:numId w:val="1030"/>
         </w:numPr>
         <w:pStyle w:val="Compact"/>
       </w:pPr>
@@ -5113,7 +4030,7 @@
       <w:pPr>
         <w:numPr>
           <w:ilvl w:val="0"/>
-          <w:numId w:val="1021"/>
+          <w:numId w:val="1030"/>
         </w:numPr>
         <w:pStyle w:val="Compact"/>
       </w:pPr>
@@ -5125,7 +4042,7 @@
       <w:pPr>
         <w:numPr>
           <w:ilvl w:val="0"/>
-          <w:numId w:val="1021"/>
+          <w:numId w:val="1030"/>
         </w:numPr>
         <w:pStyle w:val="Compact"/>
       </w:pPr>
@@ -5141,177 +4058,66 @@
         <w:t xml:space="preserve">Procedure</w:t>
       </w:r>
     </w:p>
-    <w:tbl>
-      <w:tblPr>
-        <w:tblStyle w:val="Table"/>
-        <w:tblW w:type="pct" w:w="5000"/>
-        <w:tblLook w:firstRow="1" w:lastRow="0" w:firstColumn="0" w:lastColumn="0" w:noHBand="0" w:noVBand="0" w:val="0020"/>
-        <w:jc w:val="start"/>
-      </w:tblPr>
-      <w:tblGrid>
-        <w:gridCol w:w="3960"/>
-        <w:gridCol w:w="3960"/>
-      </w:tblGrid>
-      <w:tr>
-        <w:trPr>
-          <w:tblHeader w:val="true"/>
-        </w:trPr>
-        <w:tc>
-          <w:tcPr/>
-          <w:p>
-            <w:pPr>
-              <w:pStyle w:val="Compact"/>
-              <w:jc w:val="left"/>
-            </w:pPr>
-            <w:r>
-              <w:t xml:space="preserve">Step</w:t>
-            </w:r>
-          </w:p>
-        </w:tc>
-        <w:tc>
-          <w:tcPr/>
-          <w:p>
-            <w:pPr>
-              <w:pStyle w:val="Compact"/>
-              <w:jc w:val="left"/>
-            </w:pPr>
-            <w:r>
-              <w:t xml:space="preserve">Action</w:t>
-            </w:r>
-          </w:p>
-        </w:tc>
-      </w:tr>
-      <w:tr>
-        <w:tc>
-          <w:tcPr/>
-          <w:p>
-            <w:pPr>
-              <w:pStyle w:val="Compact"/>
-              <w:jc w:val="left"/>
-            </w:pPr>
-            <w:r>
-              <w:t xml:space="preserve">1</w:t>
-            </w:r>
-          </w:p>
-        </w:tc>
-        <w:tc>
-          <w:tcPr/>
-          <w:p>
-            <w:pPr>
-              <w:pStyle w:val="Compact"/>
-              <w:jc w:val="left"/>
-            </w:pPr>
-            <w:r>
-              <w:t xml:space="preserve">List the local test data files and verify their integrity (row count, schema)</w:t>
-            </w:r>
-          </w:p>
-        </w:tc>
-      </w:tr>
-      <w:tr>
-        <w:tc>
-          <w:tcPr/>
-          <w:p>
-            <w:pPr>
-              <w:pStyle w:val="Compact"/>
-              <w:jc w:val="left"/>
-            </w:pPr>
-            <w:r>
-              <w:t xml:space="preserve">2</w:t>
-            </w:r>
-          </w:p>
-        </w:tc>
-        <w:tc>
-          <w:tcPr/>
-          <w:p>
-            <w:pPr>
-              <w:pStyle w:val="Compact"/>
-              <w:jc w:val="left"/>
-            </w:pPr>
-            <w:r>
-              <w:t xml:space="preserve">Upload all files to the OBS raw bucket using obsutil</w:t>
-            </w:r>
-          </w:p>
-        </w:tc>
-      </w:tr>
-      <w:tr>
-        <w:tc>
-          <w:tcPr/>
-          <w:p>
-            <w:pPr>
-              <w:pStyle w:val="Compact"/>
-              <w:jc w:val="left"/>
-            </w:pPr>
-            <w:r>
-              <w:t xml:space="preserve">3</w:t>
-            </w:r>
-          </w:p>
-        </w:tc>
-        <w:tc>
-          <w:tcPr/>
-          <w:p>
-            <w:pPr>
-              <w:pStyle w:val="Compact"/>
-              <w:jc w:val="left"/>
-            </w:pPr>
-            <w:r>
-              <w:t xml:space="preserve">Verify each file exists in OBS by listing the bucket contents</w:t>
-            </w:r>
-          </w:p>
-        </w:tc>
-      </w:tr>
-      <w:tr>
-        <w:tc>
-          <w:tcPr/>
-          <w:p>
-            <w:pPr>
-              <w:pStyle w:val="Compact"/>
-              <w:jc w:val="left"/>
-            </w:pPr>
-            <w:r>
-              <w:t xml:space="preserve">4</w:t>
-            </w:r>
-          </w:p>
-        </w:tc>
-        <w:tc>
-          <w:tcPr/>
-          <w:p>
-            <w:pPr>
-              <w:pStyle w:val="Compact"/>
-              <w:jc w:val="left"/>
-            </w:pPr>
-            <w:r>
-              <w:t xml:space="preserve">Download a sample file from OBS and compare it with the local original (checksum)</w:t>
-            </w:r>
-          </w:p>
-        </w:tc>
-      </w:tr>
-      <w:tr>
-        <w:tc>
-          <w:tcPr/>
-          <w:p>
-            <w:pPr>
-              <w:pStyle w:val="Compact"/>
-              <w:jc w:val="left"/>
-            </w:pPr>
-            <w:r>
-              <w:t xml:space="preserve">5</w:t>
-            </w:r>
-          </w:p>
-        </w:tc>
-        <w:tc>
-          <w:tcPr/>
-          <w:p>
-            <w:pPr>
-              <w:pStyle w:val="Compact"/>
-              <w:jc w:val="left"/>
-            </w:pPr>
-            <w:r>
-              <w:t xml:space="preserve">In DataArts Studio, verify the data source connection can read the uploaded files</w:t>
-            </w:r>
-          </w:p>
-        </w:tc>
-      </w:tr>
-    </w:tbl>
+    <w:p>
+      <w:pPr>
+        <w:numPr>
+          <w:ilvl w:val="0"/>
+          <w:numId w:val="1031"/>
+        </w:numPr>
+        <w:pStyle w:val="Compact"/>
+      </w:pPr>
+      <w:r>
+        <w:t xml:space="preserve">List the local test data files and verify their integrity (row count, schema)</w:t>
+      </w:r>
+    </w:p>
+    <w:p>
+      <w:pPr>
+        <w:numPr>
+          <w:ilvl w:val="0"/>
+          <w:numId w:val="1031"/>
+        </w:numPr>
+        <w:pStyle w:val="Compact"/>
+      </w:pPr>
+      <w:r>
+        <w:t xml:space="preserve">Upload all files to the OBS raw bucket using obsutil</w:t>
+      </w:r>
+    </w:p>
+    <w:p>
+      <w:pPr>
+        <w:numPr>
+          <w:ilvl w:val="0"/>
+          <w:numId w:val="1031"/>
+        </w:numPr>
+        <w:pStyle w:val="Compact"/>
+      </w:pPr>
+      <w:r>
+        <w:t xml:space="preserve">Verify each file exists in OBS by listing the bucket contents</w:t>
+      </w:r>
+    </w:p>
+    <w:p>
+      <w:pPr>
+        <w:numPr>
+          <w:ilvl w:val="0"/>
+          <w:numId w:val="1031"/>
+        </w:numPr>
+        <w:pStyle w:val="Compact"/>
+      </w:pPr>
+      <w:r>
+        <w:t xml:space="preserve">Download a sample file from OBS and compare it with the local original (checksum)</w:t>
+      </w:r>
+    </w:p>
+    <w:p>
+      <w:pPr>
+        <w:numPr>
+          <w:ilvl w:val="0"/>
+          <w:numId w:val="1031"/>
+        </w:numPr>
+        <w:pStyle w:val="Compact"/>
+      </w:pPr>
+      <w:r>
+        <w:t xml:space="preserve">In DataArts Studio, verify the data source connection can read the uploaded files</w:t>
+      </w:r>
+    </w:p>
     <w:p>
       <w:pPr>
         <w:pStyle w:val="DefinitionTerm"/>
@@ -5324,7 +4130,7 @@
       <w:pPr>
         <w:numPr>
           <w:ilvl w:val="0"/>
-          <w:numId w:val="1022"/>
+          <w:numId w:val="1032"/>
         </w:numPr>
         <w:pStyle w:val="Compact"/>
       </w:pPr>
@@ -5336,7 +4142,7 @@
       <w:pPr>
         <w:numPr>
           <w:ilvl w:val="0"/>
-          <w:numId w:val="1022"/>
+          <w:numId w:val="1032"/>
         </w:numPr>
         <w:pStyle w:val="Compact"/>
       </w:pPr>
@@ -5348,7 +4154,7 @@
       <w:pPr>
         <w:numPr>
           <w:ilvl w:val="0"/>
-          <w:numId w:val="1022"/>
+          <w:numId w:val="1032"/>
         </w:numPr>
         <w:pStyle w:val="Compact"/>
       </w:pPr>
@@ -5360,7 +4166,7 @@
       <w:pPr>
         <w:numPr>
           <w:ilvl w:val="0"/>
-          <w:numId w:val="1022"/>
+          <w:numId w:val="1032"/>
         </w:numPr>
         <w:pStyle w:val="Compact"/>
       </w:pPr>
@@ -5450,6 +4256,51 @@
         </w:pBdr>
         <w:spacing w:after="120"/>
       </w:pPr>
+    </w:p>
+    <w:p>
+      <w:pPr>
+        <w:tabs>
+          <w:tab w:val="right" w:pos="9638"/>
+        </w:tabs>
+      </w:pPr>
+      <w:r>
+        <w:rPr>
+          <w:b/>
+        </w:rPr>
+        <w:t xml:space="preserve">2.1.0</w:t>
+      </w:r>
+      <w:r>
+        <w:tab/>
+      </w:r>
+      <w:r>
+        <w:rPr>
+          <w:i/>
+        </w:rPr>
+        <w:t xml:space="preserve">2026-09-12</w:t>
+      </w:r>
+    </w:p>
+    <w:p>
+      <w:pPr>
+        <w:pStyle w:val="BodyText"/>
+      </w:pPr>
+      <w:r>
+        <w:t xml:space="preserve">Changed teststeps from tabular table to auto-numbered paragraphs.</w:t>
+      </w:r>
+      <w:r>
+        <w:t xml:space="preserve"> </w:t>
+      </w:r>
+      <w:r>
+        <w:rPr>
+          <w:rStyle w:val="VerbatimChar"/>
+        </w:rPr>
+        <w:t xml:space="preserve">\teststep</w:t>
+      </w:r>
+      <w:r>
+        <w:t xml:space="preserve"> </w:t>
+      </w:r>
+      <w:r>
+        <w:t xml:space="preserve">now takes 1 arg (action only). Images, code blocks, and callouts can be placed freely between steps.</w:t>
+      </w:r>
     </w:p>
     <w:p>
       <w:pPr>
@@ -6685,6 +5536,306 @@
     </w:lvlOverride>
   </w:num>
   <w:num w:numId="1022">
+    <w:abstractNumId w:val="99411"/>
+    <w:lvlOverride w:ilvl="0">
+      <w:startOverride w:val="1"/>
+    </w:lvlOverride>
+    <w:lvlOverride w:ilvl="1">
+      <w:startOverride w:val="1"/>
+    </w:lvlOverride>
+    <w:lvlOverride w:ilvl="2">
+      <w:startOverride w:val="1"/>
+    </w:lvlOverride>
+    <w:lvlOverride w:ilvl="3">
+      <w:startOverride w:val="1"/>
+    </w:lvlOverride>
+    <w:lvlOverride w:ilvl="4">
+      <w:startOverride w:val="1"/>
+    </w:lvlOverride>
+    <w:lvlOverride w:ilvl="5">
+      <w:startOverride w:val="1"/>
+    </w:lvlOverride>
+    <w:lvlOverride w:ilvl="6">
+      <w:startOverride w:val="1"/>
+    </w:lvlOverride>
+    <w:lvlOverride w:ilvl="7">
+      <w:startOverride w:val="1"/>
+    </w:lvlOverride>
+    <w:lvlOverride w:ilvl="8">
+      <w:startOverride w:val="1"/>
+    </w:lvlOverride>
+  </w:num>
+  <w:num w:numId="1023">
+    <w:abstractNumId w:val="99411"/>
+    <w:lvlOverride w:ilvl="0">
+      <w:startOverride w:val="1"/>
+    </w:lvlOverride>
+    <w:lvlOverride w:ilvl="1">
+      <w:startOverride w:val="1"/>
+    </w:lvlOverride>
+    <w:lvlOverride w:ilvl="2">
+      <w:startOverride w:val="1"/>
+    </w:lvlOverride>
+    <w:lvlOverride w:ilvl="3">
+      <w:startOverride w:val="1"/>
+    </w:lvlOverride>
+    <w:lvlOverride w:ilvl="4">
+      <w:startOverride w:val="1"/>
+    </w:lvlOverride>
+    <w:lvlOverride w:ilvl="5">
+      <w:startOverride w:val="1"/>
+    </w:lvlOverride>
+    <w:lvlOverride w:ilvl="6">
+      <w:startOverride w:val="1"/>
+    </w:lvlOverride>
+    <w:lvlOverride w:ilvl="7">
+      <w:startOverride w:val="1"/>
+    </w:lvlOverride>
+    <w:lvlOverride w:ilvl="8">
+      <w:startOverride w:val="1"/>
+    </w:lvlOverride>
+  </w:num>
+  <w:num w:numId="1024">
+    <w:abstractNumId w:val="99411"/>
+    <w:lvlOverride w:ilvl="0">
+      <w:startOverride w:val="1"/>
+    </w:lvlOverride>
+    <w:lvlOverride w:ilvl="1">
+      <w:startOverride w:val="1"/>
+    </w:lvlOverride>
+    <w:lvlOverride w:ilvl="2">
+      <w:startOverride w:val="1"/>
+    </w:lvlOverride>
+    <w:lvlOverride w:ilvl="3">
+      <w:startOverride w:val="1"/>
+    </w:lvlOverride>
+    <w:lvlOverride w:ilvl="4">
+      <w:startOverride w:val="1"/>
+    </w:lvlOverride>
+    <w:lvlOverride w:ilvl="5">
+      <w:startOverride w:val="1"/>
+    </w:lvlOverride>
+    <w:lvlOverride w:ilvl="6">
+      <w:startOverride w:val="1"/>
+    </w:lvlOverride>
+    <w:lvlOverride w:ilvl="7">
+      <w:startOverride w:val="1"/>
+    </w:lvlOverride>
+    <w:lvlOverride w:ilvl="8">
+      <w:startOverride w:val="1"/>
+    </w:lvlOverride>
+  </w:num>
+  <w:num w:numId="1025">
+    <w:abstractNumId w:val="99411"/>
+    <w:lvlOverride w:ilvl="0">
+      <w:startOverride w:val="1"/>
+    </w:lvlOverride>
+    <w:lvlOverride w:ilvl="1">
+      <w:startOverride w:val="1"/>
+    </w:lvlOverride>
+    <w:lvlOverride w:ilvl="2">
+      <w:startOverride w:val="1"/>
+    </w:lvlOverride>
+    <w:lvlOverride w:ilvl="3">
+      <w:startOverride w:val="1"/>
+    </w:lvlOverride>
+    <w:lvlOverride w:ilvl="4">
+      <w:startOverride w:val="1"/>
+    </w:lvlOverride>
+    <w:lvlOverride w:ilvl="5">
+      <w:startOverride w:val="1"/>
+    </w:lvlOverride>
+    <w:lvlOverride w:ilvl="6">
+      <w:startOverride w:val="1"/>
+    </w:lvlOverride>
+    <w:lvlOverride w:ilvl="7">
+      <w:startOverride w:val="1"/>
+    </w:lvlOverride>
+    <w:lvlOverride w:ilvl="8">
+      <w:startOverride w:val="1"/>
+    </w:lvlOverride>
+  </w:num>
+  <w:num w:numId="1026">
+    <w:abstractNumId w:val="99411"/>
+    <w:lvlOverride w:ilvl="0">
+      <w:startOverride w:val="1"/>
+    </w:lvlOverride>
+    <w:lvlOverride w:ilvl="1">
+      <w:startOverride w:val="1"/>
+    </w:lvlOverride>
+    <w:lvlOverride w:ilvl="2">
+      <w:startOverride w:val="1"/>
+    </w:lvlOverride>
+    <w:lvlOverride w:ilvl="3">
+      <w:startOverride w:val="1"/>
+    </w:lvlOverride>
+    <w:lvlOverride w:ilvl="4">
+      <w:startOverride w:val="1"/>
+    </w:lvlOverride>
+    <w:lvlOverride w:ilvl="5">
+      <w:startOverride w:val="1"/>
+    </w:lvlOverride>
+    <w:lvlOverride w:ilvl="6">
+      <w:startOverride w:val="1"/>
+    </w:lvlOverride>
+    <w:lvlOverride w:ilvl="7">
+      <w:startOverride w:val="1"/>
+    </w:lvlOverride>
+    <w:lvlOverride w:ilvl="8">
+      <w:startOverride w:val="1"/>
+    </w:lvlOverride>
+  </w:num>
+  <w:num w:numId="1027">
+    <w:abstractNumId w:val="99411"/>
+    <w:lvlOverride w:ilvl="0">
+      <w:startOverride w:val="1"/>
+    </w:lvlOverride>
+    <w:lvlOverride w:ilvl="1">
+      <w:startOverride w:val="1"/>
+    </w:lvlOverride>
+    <w:lvlOverride w:ilvl="2">
+      <w:startOverride w:val="1"/>
+    </w:lvlOverride>
+    <w:lvlOverride w:ilvl="3">
+      <w:startOverride w:val="1"/>
+    </w:lvlOverride>
+    <w:lvlOverride w:ilvl="4">
+      <w:startOverride w:val="1"/>
+    </w:lvlOverride>
+    <w:lvlOverride w:ilvl="5">
+      <w:startOverride w:val="1"/>
+    </w:lvlOverride>
+    <w:lvlOverride w:ilvl="6">
+      <w:startOverride w:val="1"/>
+    </w:lvlOverride>
+    <w:lvlOverride w:ilvl="7">
+      <w:startOverride w:val="1"/>
+    </w:lvlOverride>
+    <w:lvlOverride w:ilvl="8">
+      <w:startOverride w:val="1"/>
+    </w:lvlOverride>
+  </w:num>
+  <w:num w:numId="1028">
+    <w:abstractNumId w:val="99411"/>
+    <w:lvlOverride w:ilvl="0">
+      <w:startOverride w:val="1"/>
+    </w:lvlOverride>
+    <w:lvlOverride w:ilvl="1">
+      <w:startOverride w:val="1"/>
+    </w:lvlOverride>
+    <w:lvlOverride w:ilvl="2">
+      <w:startOverride w:val="1"/>
+    </w:lvlOverride>
+    <w:lvlOverride w:ilvl="3">
+      <w:startOverride w:val="1"/>
+    </w:lvlOverride>
+    <w:lvlOverride w:ilvl="4">
+      <w:startOverride w:val="1"/>
+    </w:lvlOverride>
+    <w:lvlOverride w:ilvl="5">
+      <w:startOverride w:val="1"/>
+    </w:lvlOverride>
+    <w:lvlOverride w:ilvl="6">
+      <w:startOverride w:val="1"/>
+    </w:lvlOverride>
+    <w:lvlOverride w:ilvl="7">
+      <w:startOverride w:val="1"/>
+    </w:lvlOverride>
+    <w:lvlOverride w:ilvl="8">
+      <w:startOverride w:val="1"/>
+    </w:lvlOverride>
+  </w:num>
+  <w:num w:numId="1029">
+    <w:abstractNumId w:val="99411"/>
+    <w:lvlOverride w:ilvl="0">
+      <w:startOverride w:val="1"/>
+    </w:lvlOverride>
+    <w:lvlOverride w:ilvl="1">
+      <w:startOverride w:val="1"/>
+    </w:lvlOverride>
+    <w:lvlOverride w:ilvl="2">
+      <w:startOverride w:val="1"/>
+    </w:lvlOverride>
+    <w:lvlOverride w:ilvl="3">
+      <w:startOverride w:val="1"/>
+    </w:lvlOverride>
+    <w:lvlOverride w:ilvl="4">
+      <w:startOverride w:val="1"/>
+    </w:lvlOverride>
+    <w:lvlOverride w:ilvl="5">
+      <w:startOverride w:val="1"/>
+    </w:lvlOverride>
+    <w:lvlOverride w:ilvl="6">
+      <w:startOverride w:val="1"/>
+    </w:lvlOverride>
+    <w:lvlOverride w:ilvl="7">
+      <w:startOverride w:val="1"/>
+    </w:lvlOverride>
+    <w:lvlOverride w:ilvl="8">
+      <w:startOverride w:val="1"/>
+    </w:lvlOverride>
+  </w:num>
+  <w:num w:numId="1030">
+    <w:abstractNumId w:val="99411"/>
+    <w:lvlOverride w:ilvl="0">
+      <w:startOverride w:val="1"/>
+    </w:lvlOverride>
+    <w:lvlOverride w:ilvl="1">
+      <w:startOverride w:val="1"/>
+    </w:lvlOverride>
+    <w:lvlOverride w:ilvl="2">
+      <w:startOverride w:val="1"/>
+    </w:lvlOverride>
+    <w:lvlOverride w:ilvl="3">
+      <w:startOverride w:val="1"/>
+    </w:lvlOverride>
+    <w:lvlOverride w:ilvl="4">
+      <w:startOverride w:val="1"/>
+    </w:lvlOverride>
+    <w:lvlOverride w:ilvl="5">
+      <w:startOverride w:val="1"/>
+    </w:lvlOverride>
+    <w:lvlOverride w:ilvl="6">
+      <w:startOverride w:val="1"/>
+    </w:lvlOverride>
+    <w:lvlOverride w:ilvl="7">
+      <w:startOverride w:val="1"/>
+    </w:lvlOverride>
+    <w:lvlOverride w:ilvl="8">
+      <w:startOverride w:val="1"/>
+    </w:lvlOverride>
+  </w:num>
+  <w:num w:numId="1031">
+    <w:abstractNumId w:val="99411"/>
+    <w:lvlOverride w:ilvl="0">
+      <w:startOverride w:val="1"/>
+    </w:lvlOverride>
+    <w:lvlOverride w:ilvl="1">
+      <w:startOverride w:val="1"/>
+    </w:lvlOverride>
+    <w:lvlOverride w:ilvl="2">
+      <w:startOverride w:val="1"/>
+    </w:lvlOverride>
+    <w:lvlOverride w:ilvl="3">
+      <w:startOverride w:val="1"/>
+    </w:lvlOverride>
+    <w:lvlOverride w:ilvl="4">
+      <w:startOverride w:val="1"/>
+    </w:lvlOverride>
+    <w:lvlOverride w:ilvl="5">
+      <w:startOverride w:val="1"/>
+    </w:lvlOverride>
+    <w:lvlOverride w:ilvl="6">
+      <w:startOverride w:val="1"/>
+    </w:lvlOverride>
+    <w:lvlOverride w:ilvl="7">
+      <w:startOverride w:val="1"/>
+    </w:lvlOverride>
+    <w:lvlOverride w:ilvl="8">
+      <w:startOverride w:val="1"/>
+    </w:lvlOverride>
+  </w:num>
+  <w:num w:numId="1032">
     <w:abstractNumId w:val="99411"/>
     <w:lvlOverride w:ilvl="0">
       <w:startOverride w:val="1"/>

</xml_diff>

<commit_message>
v4.3.0: testlist env, alignment fixes
Features:
- testlist environment: styled enumerate with red bold numbers for
  numbered lists in testcase fields (prerequisites, expected, remarks)

Fixes:
- Zeroed \parindent inside testcase tcolorbox for consistent alignment
- Indented procedure step numbering (\hspace{1em}) to align with
  testlist items
- Updated samples and docs for testlist usage
</commit_message>
<xml_diff>
--- a/examples/testbook/en/main.docx
+++ b/examples/testbook/en/main.docx
@@ -70,7 +70,7 @@
         <w:pStyle w:val="CoverMeta"/>
       </w:pPr>
       <w:r>
-        <w:t xml:space="preserve">v2.1.0 — 2026-09-12 19:25</w:t>
+        <w:t xml:space="preserve">v2.1.0 — 2026-09-13 11:23</w:t>
       </w:r>
     </w:p>
     <w:p>
@@ -1754,6 +1754,46 @@
     </w:p>
     <w:p>
       <w:pPr>
+        <w:pStyle w:val="Definition"/>
+      </w:pPr>
+      <w:r>
+        <w:t xml:space="preserve">testlist</w:t>
+      </w:r>
+      <w:r>
+        <w:t xml:space="preserve"> </w:t>
+      </w:r>
+      <w:r>
+        <w:t xml:space="preserve">Terraform infrastructure apply completed successfully.</w:t>
+      </w:r>
+      <w:r>
+        <w:t xml:space="preserve"> </w:t>
+      </w:r>
+      <w:r>
+        <w:t xml:space="preserve">MRS cluster ID is available in the Terraform output.</w:t>
+      </w:r>
+      <w:r>
+        <w:t xml:space="preserve"> </w:t>
+      </w:r>
+      <w:r>
+        <w:t xml:space="preserve">IAM user has MRS_Viewer or higher role.</w:t>
+      </w:r>
+      <w:r>
+        <w:t xml:space="preserve"> </w:t>
+      </w:r>
+      <w:r>
+        <w:t xml:space="preserve">testlist</w:t>
+      </w:r>
+    </w:p>
+    <w:p>
+      <w:pPr>
+        <w:pStyle w:val="DefinitionTerm"/>
+      </w:pPr>
+      <w:r>
+        <w:t xml:space="preserve">Procedure</w:t>
+      </w:r>
+    </w:p>
+    <w:p>
+      <w:pPr>
         <w:numPr>
           <w:ilvl w:val="0"/>
           <w:numId w:val="1003"/>
@@ -1761,7 +1801,7 @@
         <w:pStyle w:val="Compact"/>
       </w:pPr>
       <w:r>
-        <w:t xml:space="preserve">Terraform infrastructure apply completed successfully.</w:t>
+        <w:t xml:space="preserve">Log in to the Huawei Cloud Console</w:t>
       </w:r>
     </w:p>
     <w:p>
@@ -1773,7 +1813,7 @@
         <w:pStyle w:val="Compact"/>
       </w:pPr>
       <w:r>
-        <w:t xml:space="preserve">MRS cluster ID is available in the Terraform output.</w:t>
+        <w:t xml:space="preserve">Navigate to Console, MapReduce Service, Clusters</w:t>
       </w:r>
     </w:p>
     <w:p>
@@ -1785,7 +1825,43 @@
         <w:pStyle w:val="Compact"/>
       </w:pPr>
       <w:r>
-        <w:t xml:space="preserve">IAM user has MRS_Viewer or higher role.</w:t>
+        <w:t xml:space="preserve">Locate cluster mrs-poc-cluster</w:t>
+      </w:r>
+    </w:p>
+    <w:p>
+      <w:pPr>
+        <w:numPr>
+          <w:ilvl w:val="0"/>
+          <w:numId w:val="1003"/>
+        </w:numPr>
+        <w:pStyle w:val="Compact"/>
+      </w:pPr>
+      <w:r>
+        <w:t xml:space="preserve">Verify cluster status</w:t>
+      </w:r>
+    </w:p>
+    <w:p>
+      <w:pPr>
+        <w:numPr>
+          <w:ilvl w:val="0"/>
+          <w:numId w:val="1003"/>
+        </w:numPr>
+        <w:pStyle w:val="Compact"/>
+      </w:pPr>
+      <w:r>
+        <w:t xml:space="preserve">Review Component tab</w:t>
+      </w:r>
+    </w:p>
+    <w:p>
+      <w:pPr>
+        <w:numPr>
+          <w:ilvl w:val="0"/>
+          <w:numId w:val="1003"/>
+        </w:numPr>
+        <w:pStyle w:val="Compact"/>
+      </w:pPr>
+      <w:r>
+        <w:t xml:space="preserve">Review Node tab</w:t>
       </w:r>
     </w:p>
     <w:p>
@@ -1793,123 +1869,39 @@
         <w:pStyle w:val="DefinitionTerm"/>
       </w:pPr>
       <w:r>
-        <w:t xml:space="preserve">Procedure</w:t>
-      </w:r>
-    </w:p>
-    <w:p>
-      <w:pPr>
-        <w:numPr>
-          <w:ilvl w:val="0"/>
-          <w:numId w:val="1004"/>
-        </w:numPr>
-        <w:pStyle w:val="Compact"/>
-      </w:pPr>
-      <w:r>
-        <w:t xml:space="preserve">Log in to the Huawei Cloud Console</w:t>
-      </w:r>
-    </w:p>
-    <w:p>
-      <w:pPr>
-        <w:numPr>
-          <w:ilvl w:val="0"/>
-          <w:numId w:val="1004"/>
-        </w:numPr>
-        <w:pStyle w:val="Compact"/>
-      </w:pPr>
-      <w:r>
-        <w:t xml:space="preserve">Navigate to Console, MapReduce Service, Clusters</w:t>
-      </w:r>
-    </w:p>
-    <w:p>
-      <w:pPr>
-        <w:numPr>
-          <w:ilvl w:val="0"/>
-          <w:numId w:val="1004"/>
-        </w:numPr>
-        <w:pStyle w:val="Compact"/>
-      </w:pPr>
-      <w:r>
-        <w:t xml:space="preserve">Locate cluster mrs-poc-cluster</w:t>
-      </w:r>
-    </w:p>
-    <w:p>
-      <w:pPr>
-        <w:numPr>
-          <w:ilvl w:val="0"/>
-          <w:numId w:val="1004"/>
-        </w:numPr>
-        <w:pStyle w:val="Compact"/>
-      </w:pPr>
-      <w:r>
-        <w:t xml:space="preserve">Verify cluster status</w:t>
-      </w:r>
-    </w:p>
-    <w:p>
-      <w:pPr>
-        <w:numPr>
-          <w:ilvl w:val="0"/>
-          <w:numId w:val="1004"/>
-        </w:numPr>
-        <w:pStyle w:val="Compact"/>
-      </w:pPr>
-      <w:r>
-        <w:t xml:space="preserve">Review Component tab</w:t>
-      </w:r>
-    </w:p>
-    <w:p>
-      <w:pPr>
-        <w:numPr>
-          <w:ilvl w:val="0"/>
-          <w:numId w:val="1004"/>
-        </w:numPr>
-        <w:pStyle w:val="Compact"/>
-      </w:pPr>
-      <w:r>
-        <w:t xml:space="preserve">Review Node tab</w:t>
-      </w:r>
-    </w:p>
-    <w:p>
-      <w:pPr>
-        <w:pStyle w:val="DefinitionTerm"/>
-      </w:pPr>
-      <w:r>
         <w:t xml:space="preserve">Expected Result</w:t>
       </w:r>
     </w:p>
     <w:p>
       <w:pPr>
-        <w:numPr>
-          <w:ilvl w:val="0"/>
-          <w:numId w:val="1005"/>
-        </w:numPr>
-        <w:pStyle w:val="Compact"/>
-      </w:pPr>
+        <w:pStyle w:val="Definition"/>
+      </w:pPr>
+      <w:r>
+        <w:t xml:space="preserve">testlist</w:t>
+      </w:r>
+      <w:r>
+        <w:t xml:space="preserve"> </w:t>
+      </w:r>
       <w:r>
         <w:t xml:space="preserve">Cluster status is Running.</w:t>
       </w:r>
-    </w:p>
-    <w:p>
-      <w:pPr>
-        <w:numPr>
-          <w:ilvl w:val="0"/>
-          <w:numId w:val="1005"/>
-        </w:numPr>
-        <w:pStyle w:val="Compact"/>
-      </w:pPr>
+      <w:r>
+        <w:t xml:space="preserve"> </w:t>
+      </w:r>
       <w:r>
         <w:t xml:space="preserve">All four components (HDFS, YARN, Spark, Hive) are listed with status Normal.</w:t>
       </w:r>
-    </w:p>
-    <w:p>
-      <w:pPr>
-        <w:numPr>
-          <w:ilvl w:val="0"/>
-          <w:numId w:val="1005"/>
-        </w:numPr>
-        <w:pStyle w:val="Compact"/>
-      </w:pPr>
+      <w:r>
+        <w:t xml:space="preserve"> </w:t>
+      </w:r>
       <w:r>
         <w:t xml:space="preserve">All nodes report status Running with no alarms.</w:t>
+      </w:r>
+      <w:r>
+        <w:t xml:space="preserve"> </w:t>
+      </w:r>
+      <w:r>
+        <w:t xml:space="preserve">testlist</w:t>
       </w:r>
     </w:p>
     <w:p>
@@ -1999,26 +1991,120 @@
     </w:p>
     <w:p>
       <w:pPr>
-        <w:numPr>
-          <w:ilvl w:val="0"/>
-          <w:numId w:val="1006"/>
+        <w:pStyle w:val="Definition"/>
+      </w:pPr>
+      <w:r>
+        <w:t xml:space="preserve">testlist</w:t>
+      </w:r>
+      <w:r>
+        <w:t xml:space="preserve"> </w:t>
+      </w:r>
+      <w:r>
+        <w:t xml:space="preserve">OBS bucket name is defined in the Terraform configuration.</w:t>
+      </w:r>
+      <w:r>
+        <w:t xml:space="preserve"> </w:t>
+      </w:r>
+      <w:r>
+        <w:t xml:space="preserve">IAM policy granting read/write access to the bucket is attached to the test user.</w:t>
+      </w:r>
+      <w:r>
+        <w:t xml:space="preserve"> </w:t>
+      </w:r>
+      <w:r>
+        <w:t xml:space="preserve">testlist</w:t>
+      </w:r>
+    </w:p>
+    <w:p>
+      <w:pPr>
+        <w:pStyle w:val="DefinitionTerm"/>
+      </w:pPr>
+      <w:r>
+        <w:t xml:space="preserve">Procedure</w:t>
+      </w:r>
+    </w:p>
+    <w:p>
+      <w:pPr>
+        <w:numPr>
+          <w:ilvl w:val="0"/>
+          <w:numId w:val="1004"/>
         </w:numPr>
         <w:pStyle w:val="Compact"/>
       </w:pPr>
       <w:r>
-        <w:t xml:space="preserve">OBS bucket name is defined in the Terraform configuration.</w:t>
-      </w:r>
-    </w:p>
-    <w:p>
-      <w:pPr>
-        <w:numPr>
-          <w:ilvl w:val="0"/>
-          <w:numId w:val="1006"/>
+        <w:t xml:space="preserve">Log in to the Console</w:t>
+      </w:r>
+    </w:p>
+    <w:p>
+      <w:pPr>
+        <w:numPr>
+          <w:ilvl w:val="0"/>
+          <w:numId w:val="1004"/>
         </w:numPr>
         <w:pStyle w:val="Compact"/>
       </w:pPr>
       <w:r>
-        <w:t xml:space="preserve">IAM policy granting read/write access to the bucket is attached to the test user.</w:t>
+        <w:t xml:space="preserve">Navigate to Console, Object Storage Service</w:t>
+      </w:r>
+    </w:p>
+    <w:p>
+      <w:pPr>
+        <w:numPr>
+          <w:ilvl w:val="0"/>
+          <w:numId w:val="1004"/>
+        </w:numPr>
+        <w:pStyle w:val="Compact"/>
+      </w:pPr>
+      <w:r>
+        <w:t xml:space="preserve">Locate the bucket (e.g. poc-datalake-raw)</w:t>
+      </w:r>
+    </w:p>
+    <w:p>
+      <w:pPr>
+        <w:numPr>
+          <w:ilvl w:val="0"/>
+          <w:numId w:val="1004"/>
+        </w:numPr>
+        <w:pStyle w:val="Compact"/>
+      </w:pPr>
+      <w:r>
+        <w:t xml:space="preserve">Verify the storage class is Standard</w:t>
+      </w:r>
+    </w:p>
+    <w:p>
+      <w:pPr>
+        <w:numPr>
+          <w:ilvl w:val="0"/>
+          <w:numId w:val="1004"/>
+        </w:numPr>
+        <w:pStyle w:val="Compact"/>
+      </w:pPr>
+      <w:r>
+        <w:t xml:space="preserve">Upload a test file (test-upload.txt) to the bucket</w:t>
+      </w:r>
+    </w:p>
+    <w:p>
+      <w:pPr>
+        <w:numPr>
+          <w:ilvl w:val="0"/>
+          <w:numId w:val="1004"/>
+        </w:numPr>
+        <w:pStyle w:val="Compact"/>
+      </w:pPr>
+      <w:r>
+        <w:t xml:space="preserve">Download the file and compare its content with the original</w:t>
+      </w:r>
+    </w:p>
+    <w:p>
+      <w:pPr>
+        <w:numPr>
+          <w:ilvl w:val="0"/>
+          <w:numId w:val="1004"/>
+        </w:numPr>
+        <w:pStyle w:val="Compact"/>
+      </w:pPr>
+      <w:r>
+        <w:t xml:space="preserve">Delete the test file</w:t>
       </w:r>
     </w:p>
     <w:p>
@@ -2026,147 +2112,45 @@
         <w:pStyle w:val="DefinitionTerm"/>
       </w:pPr>
       <w:r>
-        <w:t xml:space="preserve">Procedure</w:t>
-      </w:r>
-    </w:p>
-    <w:p>
-      <w:pPr>
-        <w:numPr>
-          <w:ilvl w:val="0"/>
-          <w:numId w:val="1007"/>
-        </w:numPr>
-        <w:pStyle w:val="Compact"/>
-      </w:pPr>
-      <w:r>
-        <w:t xml:space="preserve">Log in to the Console</w:t>
-      </w:r>
-    </w:p>
-    <w:p>
-      <w:pPr>
-        <w:numPr>
-          <w:ilvl w:val="0"/>
-          <w:numId w:val="1007"/>
-        </w:numPr>
-        <w:pStyle w:val="Compact"/>
-      </w:pPr>
-      <w:r>
-        <w:t xml:space="preserve">Navigate to Console, Object Storage Service</w:t>
-      </w:r>
-    </w:p>
-    <w:p>
-      <w:pPr>
-        <w:numPr>
-          <w:ilvl w:val="0"/>
-          <w:numId w:val="1007"/>
-        </w:numPr>
-        <w:pStyle w:val="Compact"/>
-      </w:pPr>
-      <w:r>
-        <w:t xml:space="preserve">Locate the bucket (e.g. poc-datalake-raw)</w:t>
-      </w:r>
-    </w:p>
-    <w:p>
-      <w:pPr>
-        <w:numPr>
-          <w:ilvl w:val="0"/>
-          <w:numId w:val="1007"/>
-        </w:numPr>
-        <w:pStyle w:val="Compact"/>
-      </w:pPr>
-      <w:r>
-        <w:t xml:space="preserve">Verify the storage class is Standard</w:t>
-      </w:r>
-    </w:p>
-    <w:p>
-      <w:pPr>
-        <w:numPr>
-          <w:ilvl w:val="0"/>
-          <w:numId w:val="1007"/>
-        </w:numPr>
-        <w:pStyle w:val="Compact"/>
-      </w:pPr>
-      <w:r>
-        <w:t xml:space="preserve">Upload a test file (test-upload.txt) to the bucket</w:t>
-      </w:r>
-    </w:p>
-    <w:p>
-      <w:pPr>
-        <w:numPr>
-          <w:ilvl w:val="0"/>
-          <w:numId w:val="1007"/>
-        </w:numPr>
-        <w:pStyle w:val="Compact"/>
-      </w:pPr>
-      <w:r>
-        <w:t xml:space="preserve">Download the file and compare its content with the original</w:t>
-      </w:r>
-    </w:p>
-    <w:p>
-      <w:pPr>
-        <w:numPr>
-          <w:ilvl w:val="0"/>
-          <w:numId w:val="1007"/>
-        </w:numPr>
-        <w:pStyle w:val="Compact"/>
-      </w:pPr>
-      <w:r>
-        <w:t xml:space="preserve">Delete the test file</w:t>
-      </w:r>
-    </w:p>
-    <w:p>
-      <w:pPr>
-        <w:pStyle w:val="DefinitionTerm"/>
-      </w:pPr>
-      <w:r>
         <w:t xml:space="preserve">Expected Result</w:t>
       </w:r>
     </w:p>
     <w:p>
       <w:pPr>
-        <w:numPr>
-          <w:ilvl w:val="0"/>
-          <w:numId w:val="1008"/>
-        </w:numPr>
-        <w:pStyle w:val="Compact"/>
-      </w:pPr>
+        <w:pStyle w:val="Definition"/>
+      </w:pPr>
+      <w:r>
+        <w:t xml:space="preserve">testlist</w:t>
+      </w:r>
+      <w:r>
+        <w:t xml:space="preserve"> </w:t>
+      </w:r>
       <w:r>
         <w:t xml:space="preserve">Bucket exists with storage class Standard.</w:t>
       </w:r>
-    </w:p>
-    <w:p>
-      <w:pPr>
-        <w:numPr>
-          <w:ilvl w:val="0"/>
-          <w:numId w:val="1008"/>
-        </w:numPr>
-        <w:pStyle w:val="Compact"/>
-      </w:pPr>
+      <w:r>
+        <w:t xml:space="preserve"> </w:t>
+      </w:r>
       <w:r>
         <w:t xml:space="preserve">File upload completes without error.</w:t>
       </w:r>
-    </w:p>
-    <w:p>
-      <w:pPr>
-        <w:numPr>
-          <w:ilvl w:val="0"/>
-          <w:numId w:val="1008"/>
-        </w:numPr>
-        <w:pStyle w:val="Compact"/>
-      </w:pPr>
+      <w:r>
+        <w:t xml:space="preserve"> </w:t>
+      </w:r>
       <w:r>
         <w:t xml:space="preserve">Downloaded file content matches the original.</w:t>
       </w:r>
-    </w:p>
-    <w:p>
-      <w:pPr>
-        <w:numPr>
-          <w:ilvl w:val="0"/>
-          <w:numId w:val="1008"/>
-        </w:numPr>
-        <w:pStyle w:val="Compact"/>
-      </w:pPr>
+      <w:r>
+        <w:t xml:space="preserve"> </w:t>
+      </w:r>
       <w:r>
         <w:t xml:space="preserve">File deletion succeeds.</w:t>
+      </w:r>
+      <w:r>
+        <w:t xml:space="preserve"> </w:t>
+      </w:r>
+      <w:r>
+        <w:t xml:space="preserve">testlist</w:t>
       </w:r>
     </w:p>
     <w:p>
@@ -2256,26 +2240,108 @@
     </w:p>
     <w:p>
       <w:pPr>
-        <w:numPr>
-          <w:ilvl w:val="0"/>
-          <w:numId w:val="1009"/>
+        <w:pStyle w:val="Definition"/>
+      </w:pPr>
+      <w:r>
+        <w:t xml:space="preserve">testlist</w:t>
+      </w:r>
+      <w:r>
+        <w:t xml:space="preserve"> </w:t>
+      </w:r>
+      <w:r>
+        <w:t xml:space="preserve">VPC and subnet IDs are available from the Terraform output.</w:t>
+      </w:r>
+      <w:r>
+        <w:t xml:space="preserve"> </w:t>
+      </w:r>
+      <w:r>
+        <w:t xml:space="preserve">Security group names are documented in the solution architecture.</w:t>
+      </w:r>
+      <w:r>
+        <w:t xml:space="preserve"> </w:t>
+      </w:r>
+      <w:r>
+        <w:t xml:space="preserve">testlist</w:t>
+      </w:r>
+    </w:p>
+    <w:p>
+      <w:pPr>
+        <w:pStyle w:val="DefinitionTerm"/>
+      </w:pPr>
+      <w:r>
+        <w:t xml:space="preserve">Procedure</w:t>
+      </w:r>
+    </w:p>
+    <w:p>
+      <w:pPr>
+        <w:numPr>
+          <w:ilvl w:val="0"/>
+          <w:numId w:val="1005"/>
         </w:numPr>
         <w:pStyle w:val="Compact"/>
       </w:pPr>
       <w:r>
-        <w:t xml:space="preserve">VPC and subnet IDs are available from the Terraform output.</w:t>
-      </w:r>
-    </w:p>
-    <w:p>
-      <w:pPr>
-        <w:numPr>
-          <w:ilvl w:val="0"/>
-          <w:numId w:val="1009"/>
+        <w:t xml:space="preserve">Log in to the Console</w:t>
+      </w:r>
+    </w:p>
+    <w:p>
+      <w:pPr>
+        <w:numPr>
+          <w:ilvl w:val="0"/>
+          <w:numId w:val="1005"/>
         </w:numPr>
         <w:pStyle w:val="Compact"/>
       </w:pPr>
       <w:r>
-        <w:t xml:space="preserve">Security group names are documented in the solution architecture.</w:t>
+        <w:t xml:space="preserve">Navigate to Console, Virtual Private Cloud, VPCs</w:t>
+      </w:r>
+    </w:p>
+    <w:p>
+      <w:pPr>
+        <w:numPr>
+          <w:ilvl w:val="0"/>
+          <w:numId w:val="1005"/>
+        </w:numPr>
+        <w:pStyle w:val="Compact"/>
+      </w:pPr>
+      <w:r>
+        <w:t xml:space="preserve">Locate the VPC (e.g. vpc-poc) and verify its CIDR block matches the architecture (e.g. 10.0.0.0/16)</w:t>
+      </w:r>
+    </w:p>
+    <w:p>
+      <w:pPr>
+        <w:numPr>
+          <w:ilvl w:val="0"/>
+          <w:numId w:val="1005"/>
+        </w:numPr>
+        <w:pStyle w:val="Compact"/>
+      </w:pPr>
+      <w:r>
+        <w:t xml:space="preserve">Click the subnet and verify its CIDR (e.g. 10.0.1.0/24)</w:t>
+      </w:r>
+    </w:p>
+    <w:p>
+      <w:pPr>
+        <w:numPr>
+          <w:ilvl w:val="0"/>
+          <w:numId w:val="1005"/>
+        </w:numPr>
+        <w:pStyle w:val="Compact"/>
+      </w:pPr>
+      <w:r>
+        <w:t xml:space="preserve">Navigate to Security Groups and verify inbound rules: TCP 22 from the bastion subnet, TCP 443 from the corporate proxy</w:t>
+      </w:r>
+    </w:p>
+    <w:p>
+      <w:pPr>
+        <w:numPr>
+          <w:ilvl w:val="0"/>
+          <w:numId w:val="1005"/>
+        </w:numPr>
+        <w:pStyle w:val="Compact"/>
+      </w:pPr>
+      <w:r>
+        <w:t xml:space="preserve">Verify outbound rules allow all traffic (default)</w:t>
       </w:r>
     </w:p>
     <w:p>
@@ -2283,135 +2349,45 @@
         <w:pStyle w:val="DefinitionTerm"/>
       </w:pPr>
       <w:r>
-        <w:t xml:space="preserve">Procedure</w:t>
-      </w:r>
-    </w:p>
-    <w:p>
-      <w:pPr>
-        <w:numPr>
-          <w:ilvl w:val="0"/>
-          <w:numId w:val="1010"/>
-        </w:numPr>
-        <w:pStyle w:val="Compact"/>
-      </w:pPr>
-      <w:r>
-        <w:t xml:space="preserve">Log in to the Console</w:t>
-      </w:r>
-    </w:p>
-    <w:p>
-      <w:pPr>
-        <w:numPr>
-          <w:ilvl w:val="0"/>
-          <w:numId w:val="1010"/>
-        </w:numPr>
-        <w:pStyle w:val="Compact"/>
-      </w:pPr>
-      <w:r>
-        <w:t xml:space="preserve">Navigate to Console, Virtual Private Cloud, VPCs</w:t>
-      </w:r>
-    </w:p>
-    <w:p>
-      <w:pPr>
-        <w:numPr>
-          <w:ilvl w:val="0"/>
-          <w:numId w:val="1010"/>
-        </w:numPr>
-        <w:pStyle w:val="Compact"/>
-      </w:pPr>
-      <w:r>
-        <w:t xml:space="preserve">Locate the VPC (e.g. vpc-poc) and verify its CIDR block matches the architecture (e.g. 10.0.0.0/16)</w:t>
-      </w:r>
-    </w:p>
-    <w:p>
-      <w:pPr>
-        <w:numPr>
-          <w:ilvl w:val="0"/>
-          <w:numId w:val="1010"/>
-        </w:numPr>
-        <w:pStyle w:val="Compact"/>
-      </w:pPr>
-      <w:r>
-        <w:t xml:space="preserve">Click the subnet and verify its CIDR (e.g. 10.0.1.0/24)</w:t>
-      </w:r>
-    </w:p>
-    <w:p>
-      <w:pPr>
-        <w:numPr>
-          <w:ilvl w:val="0"/>
-          <w:numId w:val="1010"/>
-        </w:numPr>
-        <w:pStyle w:val="Compact"/>
-      </w:pPr>
-      <w:r>
-        <w:t xml:space="preserve">Navigate to Security Groups and verify inbound rules: TCP 22 from the bastion subnet, TCP 443 from the corporate proxy</w:t>
-      </w:r>
-    </w:p>
-    <w:p>
-      <w:pPr>
-        <w:numPr>
-          <w:ilvl w:val="0"/>
-          <w:numId w:val="1010"/>
-        </w:numPr>
-        <w:pStyle w:val="Compact"/>
-      </w:pPr>
-      <w:r>
-        <w:t xml:space="preserve">Verify outbound rules allow all traffic (default)</w:t>
-      </w:r>
-    </w:p>
-    <w:p>
-      <w:pPr>
-        <w:pStyle w:val="DefinitionTerm"/>
-      </w:pPr>
-      <w:r>
         <w:t xml:space="preserve">Expected Result</w:t>
       </w:r>
     </w:p>
     <w:p>
       <w:pPr>
-        <w:numPr>
-          <w:ilvl w:val="0"/>
-          <w:numId w:val="1011"/>
-        </w:numPr>
-        <w:pStyle w:val="Compact"/>
-      </w:pPr>
+        <w:pStyle w:val="Definition"/>
+      </w:pPr>
+      <w:r>
+        <w:t xml:space="preserve">testlist</w:t>
+      </w:r>
+      <w:r>
+        <w:t xml:space="preserve"> </w:t>
+      </w:r>
       <w:r>
         <w:t xml:space="preserve">VPC CIDR is 10.0.0.0/16.</w:t>
       </w:r>
-    </w:p>
-    <w:p>
-      <w:pPr>
-        <w:numPr>
-          <w:ilvl w:val="0"/>
-          <w:numId w:val="1011"/>
-        </w:numPr>
-        <w:pStyle w:val="Compact"/>
-      </w:pPr>
+      <w:r>
+        <w:t xml:space="preserve"> </w:t>
+      </w:r>
       <w:r>
         <w:t xml:space="preserve">Subnet CIDR is 10.0.1.0/24.</w:t>
       </w:r>
-    </w:p>
-    <w:p>
-      <w:pPr>
-        <w:numPr>
-          <w:ilvl w:val="0"/>
-          <w:numId w:val="1011"/>
-        </w:numPr>
-        <w:pStyle w:val="Compact"/>
-      </w:pPr>
+      <w:r>
+        <w:t xml:space="preserve"> </w:t>
+      </w:r>
       <w:r>
         <w:t xml:space="preserve">Inbound rules match the architecture: TCP 22 and TCP 443 from the specified sources.</w:t>
       </w:r>
-    </w:p>
-    <w:p>
-      <w:pPr>
-        <w:numPr>
-          <w:ilvl w:val="0"/>
-          <w:numId w:val="1011"/>
-        </w:numPr>
-        <w:pStyle w:val="Compact"/>
-      </w:pPr>
+      <w:r>
+        <w:t xml:space="preserve"> </w:t>
+      </w:r>
       <w:r>
         <w:t xml:space="preserve">Outbound allows all traffic.</w:t>
+      </w:r>
+      <w:r>
+        <w:t xml:space="preserve"> </w:t>
+      </w:r>
+      <w:r>
+        <w:t xml:space="preserve">testlist</w:t>
       </w:r>
     </w:p>
     <w:p>
@@ -2532,26 +2508,96 @@
     </w:p>
     <w:p>
       <w:pPr>
-        <w:numPr>
-          <w:ilvl w:val="0"/>
-          <w:numId w:val="1012"/>
+        <w:pStyle w:val="Definition"/>
+      </w:pPr>
+      <w:r>
+        <w:t xml:space="preserve">testlist</w:t>
+      </w:r>
+      <w:r>
+        <w:t xml:space="preserve"> </w:t>
+      </w:r>
+      <w:r>
+        <w:t xml:space="preserve">DataArts Studio instance is provisioned and its status is Running.</w:t>
+      </w:r>
+      <w:r>
+        <w:t xml:space="preserve"> </w:t>
+      </w:r>
+      <w:r>
+        <w:t xml:space="preserve">Test IAM user has the Dayu_User role assigned.</w:t>
+      </w:r>
+      <w:r>
+        <w:t xml:space="preserve"> </w:t>
+      </w:r>
+      <w:r>
+        <w:t xml:space="preserve">testlist</w:t>
+      </w:r>
+    </w:p>
+    <w:p>
+      <w:pPr>
+        <w:pStyle w:val="DefinitionTerm"/>
+      </w:pPr>
+      <w:r>
+        <w:t xml:space="preserve">Procedure</w:t>
+      </w:r>
+    </w:p>
+    <w:p>
+      <w:pPr>
+        <w:numPr>
+          <w:ilvl w:val="0"/>
+          <w:numId w:val="1006"/>
         </w:numPr>
         <w:pStyle w:val="Compact"/>
       </w:pPr>
       <w:r>
-        <w:t xml:space="preserve">DataArts Studio instance is provisioned and its status is Running.</w:t>
-      </w:r>
-    </w:p>
-    <w:p>
-      <w:pPr>
-        <w:numPr>
-          <w:ilvl w:val="0"/>
-          <w:numId w:val="1012"/>
+        <w:t xml:space="preserve">Log in to the Console with the test IAM user</w:t>
+      </w:r>
+    </w:p>
+    <w:p>
+      <w:pPr>
+        <w:numPr>
+          <w:ilvl w:val="0"/>
+          <w:numId w:val="1006"/>
         </w:numPr>
         <w:pStyle w:val="Compact"/>
       </w:pPr>
       <w:r>
-        <w:t xml:space="preserve">Test IAM user has the Dayu_User role assigned.</w:t>
+        <w:t xml:space="preserve">Navigate to Console, DataArts Studio, Workspaces</w:t>
+      </w:r>
+    </w:p>
+    <w:p>
+      <w:pPr>
+        <w:numPr>
+          <w:ilvl w:val="0"/>
+          <w:numId w:val="1006"/>
+        </w:numPr>
+        <w:pStyle w:val="Compact"/>
+      </w:pPr>
+      <w:r>
+        <w:t xml:space="preserve">Locate the workspace (e.g. poc-workspace)</w:t>
+      </w:r>
+    </w:p>
+    <w:p>
+      <w:pPr>
+        <w:numPr>
+          <w:ilvl w:val="0"/>
+          <w:numId w:val="1006"/>
+        </w:numPr>
+        <w:pStyle w:val="Compact"/>
+      </w:pPr>
+      <w:r>
+        <w:t xml:space="preserve">Click Access Workspace to open the DataArts Studio console</w:t>
+      </w:r>
+    </w:p>
+    <w:p>
+      <w:pPr>
+        <w:numPr>
+          <w:ilvl w:val="0"/>
+          <w:numId w:val="1006"/>
+        </w:numPr>
+        <w:pStyle w:val="Compact"/>
+      </w:pPr>
+      <w:r>
+        <w:t xml:space="preserve">Verify the left navigation panel loads with the expected modules: Data Integration, Data Development, Data Architecture</w:t>
       </w:r>
     </w:p>
     <w:p>
@@ -2559,111 +2605,39 @@
         <w:pStyle w:val="DefinitionTerm"/>
       </w:pPr>
       <w:r>
-        <w:t xml:space="preserve">Procedure</w:t>
-      </w:r>
-    </w:p>
-    <w:p>
-      <w:pPr>
-        <w:numPr>
-          <w:ilvl w:val="0"/>
-          <w:numId w:val="1013"/>
-        </w:numPr>
-        <w:pStyle w:val="Compact"/>
-      </w:pPr>
-      <w:r>
-        <w:t xml:space="preserve">Log in to the Console with the test IAM user</w:t>
-      </w:r>
-    </w:p>
-    <w:p>
-      <w:pPr>
-        <w:numPr>
-          <w:ilvl w:val="0"/>
-          <w:numId w:val="1013"/>
-        </w:numPr>
-        <w:pStyle w:val="Compact"/>
-      </w:pPr>
-      <w:r>
-        <w:t xml:space="preserve">Navigate to Console, DataArts Studio, Workspaces</w:t>
-      </w:r>
-    </w:p>
-    <w:p>
-      <w:pPr>
-        <w:numPr>
-          <w:ilvl w:val="0"/>
-          <w:numId w:val="1013"/>
-        </w:numPr>
-        <w:pStyle w:val="Compact"/>
-      </w:pPr>
-      <w:r>
-        <w:t xml:space="preserve">Locate the workspace (e.g. poc-workspace)</w:t>
-      </w:r>
-    </w:p>
-    <w:p>
-      <w:pPr>
-        <w:numPr>
-          <w:ilvl w:val="0"/>
-          <w:numId w:val="1013"/>
-        </w:numPr>
-        <w:pStyle w:val="Compact"/>
-      </w:pPr>
-      <w:r>
-        <w:t xml:space="preserve">Click Access Workspace to open the DataArts Studio console</w:t>
-      </w:r>
-    </w:p>
-    <w:p>
-      <w:pPr>
-        <w:numPr>
-          <w:ilvl w:val="0"/>
-          <w:numId w:val="1013"/>
-        </w:numPr>
-        <w:pStyle w:val="Compact"/>
-      </w:pPr>
-      <w:r>
-        <w:t xml:space="preserve">Verify the left navigation panel loads with the expected modules: Data Integration, Data Development, Data Architecture</w:t>
-      </w:r>
-    </w:p>
-    <w:p>
-      <w:pPr>
-        <w:pStyle w:val="DefinitionTerm"/>
-      </w:pPr>
-      <w:r>
         <w:t xml:space="preserve">Expected Result</w:t>
       </w:r>
     </w:p>
     <w:p>
       <w:pPr>
-        <w:numPr>
-          <w:ilvl w:val="0"/>
-          <w:numId w:val="1014"/>
-        </w:numPr>
-        <w:pStyle w:val="Compact"/>
-      </w:pPr>
+        <w:pStyle w:val="Definition"/>
+      </w:pPr>
+      <w:r>
+        <w:t xml:space="preserve">testlist</w:t>
+      </w:r>
+      <w:r>
+        <w:t xml:space="preserve"> </w:t>
+      </w:r>
       <w:r>
         <w:t xml:space="preserve">Workspace is listed and accessible.</w:t>
       </w:r>
-    </w:p>
-    <w:p>
-      <w:pPr>
-        <w:numPr>
-          <w:ilvl w:val="0"/>
-          <w:numId w:val="1014"/>
-        </w:numPr>
-        <w:pStyle w:val="Compact"/>
-      </w:pPr>
+      <w:r>
+        <w:t xml:space="preserve"> </w:t>
+      </w:r>
       <w:r>
         <w:t xml:space="preserve">DataArts Studio console opens without errors.</w:t>
       </w:r>
-    </w:p>
-    <w:p>
-      <w:pPr>
-        <w:numPr>
-          <w:ilvl w:val="0"/>
-          <w:numId w:val="1014"/>
-        </w:numPr>
-        <w:pStyle w:val="Compact"/>
-      </w:pPr>
+      <w:r>
+        <w:t xml:space="preserve"> </w:t>
+      </w:r>
       <w:r>
         <w:t xml:space="preserve">All three modules (Data Integration, Data Development, Data Architecture) are visible in the navigation.</w:t>
+      </w:r>
+      <w:r>
+        <w:t xml:space="preserve"> </w:t>
+      </w:r>
+      <w:r>
+        <w:t xml:space="preserve">testlist</w:t>
       </w:r>
     </w:p>
     <w:p>
@@ -2753,50 +2727,120 @@
     </w:p>
     <w:p>
       <w:pPr>
-        <w:numPr>
-          <w:ilvl w:val="0"/>
-          <w:numId w:val="1015"/>
+        <w:pStyle w:val="Definition"/>
+      </w:pPr>
+      <w:r>
+        <w:t xml:space="preserve">testlist</w:t>
+      </w:r>
+      <w:r>
+        <w:t xml:space="preserve"> </w:t>
+      </w:r>
+      <w:r>
+        <w:t xml:space="preserve">TC-004 completed (DataArts Studio workspace accessible).</w:t>
+      </w:r>
+      <w:r>
+        <w:t xml:space="preserve"> </w:t>
+      </w:r>
+      <w:r>
+        <w:t xml:space="preserve">Source CSV file (customers.csv) exists in the OBS raw bucket.</w:t>
+      </w:r>
+      <w:r>
+        <w:t xml:space="preserve"> </w:t>
+      </w:r>
+      <w:r>
+        <w:t xml:space="preserve">Target OBS path (poc-datalake-curated/customers/) is configured.</w:t>
+      </w:r>
+      <w:r>
+        <w:t xml:space="preserve"> </w:t>
+      </w:r>
+      <w:r>
+        <w:t xml:space="preserve">Pipeline pl-ingest-customers is published in DataArts Studio.</w:t>
+      </w:r>
+      <w:r>
+        <w:t xml:space="preserve"> </w:t>
+      </w:r>
+      <w:r>
+        <w:t xml:space="preserve">testlist</w:t>
+      </w:r>
+    </w:p>
+    <w:p>
+      <w:pPr>
+        <w:pStyle w:val="DefinitionTerm"/>
+      </w:pPr>
+      <w:r>
+        <w:t xml:space="preserve">Procedure</w:t>
+      </w:r>
+    </w:p>
+    <w:p>
+      <w:pPr>
+        <w:numPr>
+          <w:ilvl w:val="0"/>
+          <w:numId w:val="1007"/>
         </w:numPr>
         <w:pStyle w:val="Compact"/>
       </w:pPr>
       <w:r>
-        <w:t xml:space="preserve">TC-004 completed (DataArts Studio workspace accessible).</w:t>
-      </w:r>
-    </w:p>
-    <w:p>
-      <w:pPr>
-        <w:numPr>
-          <w:ilvl w:val="0"/>
-          <w:numId w:val="1015"/>
+        <w:t xml:space="preserve">Navigate to Data Development in DataArts Studio</w:t>
+      </w:r>
+    </w:p>
+    <w:p>
+      <w:pPr>
+        <w:numPr>
+          <w:ilvl w:val="0"/>
+          <w:numId w:val="1007"/>
         </w:numPr>
         <w:pStyle w:val="Compact"/>
       </w:pPr>
       <w:r>
-        <w:t xml:space="preserve">Source CSV file (customers.csv) exists in the OBS raw bucket.</w:t>
-      </w:r>
-    </w:p>
-    <w:p>
-      <w:pPr>
-        <w:numPr>
-          <w:ilvl w:val="0"/>
-          <w:numId w:val="1015"/>
+        <w:t xml:space="preserve">Locate pipeline pl-ingest-customers</w:t>
+      </w:r>
+    </w:p>
+    <w:p>
+      <w:pPr>
+        <w:numPr>
+          <w:ilvl w:val="0"/>
+          <w:numId w:val="1007"/>
         </w:numPr>
         <w:pStyle w:val="Compact"/>
       </w:pPr>
       <w:r>
-        <w:t xml:space="preserve">Target OBS path (poc-datalake-curated/customers/) is configured.</w:t>
-      </w:r>
-    </w:p>
-    <w:p>
-      <w:pPr>
-        <w:numPr>
-          <w:ilvl w:val="0"/>
-          <w:numId w:val="1015"/>
+        <w:t xml:space="preserve">Click Run to execute the pipeline</w:t>
+      </w:r>
+    </w:p>
+    <w:p>
+      <w:pPr>
+        <w:numPr>
+          <w:ilvl w:val="0"/>
+          <w:numId w:val="1007"/>
         </w:numPr>
         <w:pStyle w:val="Compact"/>
       </w:pPr>
       <w:r>
-        <w:t xml:space="preserve">Pipeline pl-ingest-customers is published in DataArts Studio.</w:t>
+        <w:t xml:space="preserve">Wait for pipeline status (timeout: 10 min)</w:t>
+      </w:r>
+    </w:p>
+    <w:p>
+      <w:pPr>
+        <w:numPr>
+          <w:ilvl w:val="0"/>
+          <w:numId w:val="1007"/>
+        </w:numPr>
+        <w:pStyle w:val="Compact"/>
+      </w:pPr>
+      <w:r>
+        <w:t xml:space="preserve">Verify output file in OBS</w:t>
+      </w:r>
+    </w:p>
+    <w:p>
+      <w:pPr>
+        <w:numPr>
+          <w:ilvl w:val="0"/>
+          <w:numId w:val="1007"/>
+        </w:numPr>
+        <w:pStyle w:val="Compact"/>
+      </w:pPr>
+      <w:r>
+        <w:t xml:space="preserve">Download and verify row count</w:t>
       </w:r>
     </w:p>
     <w:p>
@@ -2804,123 +2848,39 @@
         <w:pStyle w:val="DefinitionTerm"/>
       </w:pPr>
       <w:r>
-        <w:t xml:space="preserve">Procedure</w:t>
-      </w:r>
-    </w:p>
-    <w:p>
-      <w:pPr>
-        <w:numPr>
-          <w:ilvl w:val="0"/>
-          <w:numId w:val="1016"/>
-        </w:numPr>
-        <w:pStyle w:val="Compact"/>
-      </w:pPr>
-      <w:r>
-        <w:t xml:space="preserve">Navigate to Data Development in DataArts Studio</w:t>
-      </w:r>
-    </w:p>
-    <w:p>
-      <w:pPr>
-        <w:numPr>
-          <w:ilvl w:val="0"/>
-          <w:numId w:val="1016"/>
-        </w:numPr>
-        <w:pStyle w:val="Compact"/>
-      </w:pPr>
-      <w:r>
-        <w:t xml:space="preserve">Locate pipeline pl-ingest-customers</w:t>
-      </w:r>
-    </w:p>
-    <w:p>
-      <w:pPr>
-        <w:numPr>
-          <w:ilvl w:val="0"/>
-          <w:numId w:val="1016"/>
-        </w:numPr>
-        <w:pStyle w:val="Compact"/>
-      </w:pPr>
-      <w:r>
-        <w:t xml:space="preserve">Click Run to execute the pipeline</w:t>
-      </w:r>
-    </w:p>
-    <w:p>
-      <w:pPr>
-        <w:numPr>
-          <w:ilvl w:val="0"/>
-          <w:numId w:val="1016"/>
-        </w:numPr>
-        <w:pStyle w:val="Compact"/>
-      </w:pPr>
-      <w:r>
-        <w:t xml:space="preserve">Wait for pipeline status (timeout: 10 min)</w:t>
-      </w:r>
-    </w:p>
-    <w:p>
-      <w:pPr>
-        <w:numPr>
-          <w:ilvl w:val="0"/>
-          <w:numId w:val="1016"/>
-        </w:numPr>
-        <w:pStyle w:val="Compact"/>
-      </w:pPr>
-      <w:r>
-        <w:t xml:space="preserve">Verify output file in OBS</w:t>
-      </w:r>
-    </w:p>
-    <w:p>
-      <w:pPr>
-        <w:numPr>
-          <w:ilvl w:val="0"/>
-          <w:numId w:val="1016"/>
-        </w:numPr>
-        <w:pStyle w:val="Compact"/>
-      </w:pPr>
-      <w:r>
-        <w:t xml:space="preserve">Download and verify row count</w:t>
-      </w:r>
-    </w:p>
-    <w:p>
-      <w:pPr>
-        <w:pStyle w:val="DefinitionTerm"/>
-      </w:pPr>
-      <w:r>
         <w:t xml:space="preserve">Expected Result</w:t>
       </w:r>
     </w:p>
     <w:p>
       <w:pPr>
-        <w:numPr>
-          <w:ilvl w:val="0"/>
-          <w:numId w:val="1017"/>
-        </w:numPr>
-        <w:pStyle w:val="Compact"/>
-      </w:pPr>
+        <w:pStyle w:val="Definition"/>
+      </w:pPr>
+      <w:r>
+        <w:t xml:space="preserve">testlist</w:t>
+      </w:r>
+      <w:r>
+        <w:t xml:space="preserve"> </w:t>
+      </w:r>
       <w:r>
         <w:t xml:space="preserve">Pipeline execution completes with status Success.</w:t>
       </w:r>
-    </w:p>
-    <w:p>
-      <w:pPr>
-        <w:numPr>
-          <w:ilvl w:val="0"/>
-          <w:numId w:val="1017"/>
-        </w:numPr>
-        <w:pStyle w:val="Compact"/>
-      </w:pPr>
+      <w:r>
+        <w:t xml:space="preserve"> </w:t>
+      </w:r>
       <w:r>
         <w:t xml:space="preserve">Output file is created in the target OBS path.</w:t>
       </w:r>
-    </w:p>
-    <w:p>
-      <w:pPr>
-        <w:numPr>
-          <w:ilvl w:val="0"/>
-          <w:numId w:val="1017"/>
-        </w:numPr>
-        <w:pStyle w:val="Compact"/>
-      </w:pPr>
+      <w:r>
+        <w:t xml:space="preserve"> </w:t>
+      </w:r>
       <w:r>
         <w:t xml:space="preserve">Row count of the output file matches the source file.</w:t>
+      </w:r>
+      <w:r>
+        <w:t xml:space="preserve"> </w:t>
+      </w:r>
+      <w:r>
+        <w:t xml:space="preserve">testlist</w:t>
       </w:r>
     </w:p>
     <w:p>
@@ -3010,38 +2970,114 @@
     </w:p>
     <w:p>
       <w:pPr>
-        <w:numPr>
-          <w:ilvl w:val="0"/>
-          <w:numId w:val="1018"/>
+        <w:pStyle w:val="Definition"/>
+      </w:pPr>
+      <w:r>
+        <w:t xml:space="preserve">testlist</w:t>
+      </w:r>
+      <w:r>
+        <w:t xml:space="preserve"> </w:t>
+      </w:r>
+      <w:r>
+        <w:t xml:space="preserve">TC-001 completed (MRS cluster healthy).</w:t>
+      </w:r>
+      <w:r>
+        <w:t xml:space="preserve"> </w:t>
+      </w:r>
+      <w:r>
+        <w:t xml:space="preserve">Hive table poc_db.customers exists and contains data loaded by the ingestion pipeline.</w:t>
+      </w:r>
+      <w:r>
+        <w:t xml:space="preserve"> </w:t>
+      </w:r>
+      <w:r>
+        <w:t xml:space="preserve">SSH access to the MRS master node is configured.</w:t>
+      </w:r>
+      <w:r>
+        <w:t xml:space="preserve"> </w:t>
+      </w:r>
+      <w:r>
+        <w:t xml:space="preserve">testlist</w:t>
+      </w:r>
+    </w:p>
+    <w:p>
+      <w:pPr>
+        <w:pStyle w:val="DefinitionTerm"/>
+      </w:pPr>
+      <w:r>
+        <w:t xml:space="preserve">Procedure</w:t>
+      </w:r>
+    </w:p>
+    <w:p>
+      <w:pPr>
+        <w:numPr>
+          <w:ilvl w:val="0"/>
+          <w:numId w:val="1008"/>
         </w:numPr>
         <w:pStyle w:val="Compact"/>
       </w:pPr>
       <w:r>
-        <w:t xml:space="preserve">TC-001 completed (MRS cluster healthy).</w:t>
-      </w:r>
-    </w:p>
-    <w:p>
-      <w:pPr>
-        <w:numPr>
-          <w:ilvl w:val="0"/>
-          <w:numId w:val="1018"/>
+        <w:t xml:space="preserve">SSH into the MRS master node</w:t>
+      </w:r>
+    </w:p>
+    <w:p>
+      <w:pPr>
+        <w:numPr>
+          <w:ilvl w:val="0"/>
+          <w:numId w:val="1008"/>
         </w:numPr>
         <w:pStyle w:val="Compact"/>
       </w:pPr>
       <w:r>
-        <w:t xml:space="preserve">Hive table poc_db.customers exists and contains data loaded by the ingestion pipeline.</w:t>
-      </w:r>
-    </w:p>
-    <w:p>
-      <w:pPr>
-        <w:numPr>
-          <w:ilvl w:val="0"/>
-          <w:numId w:val="1018"/>
+        <w:t xml:space="preserve">Run the Spark SQL CLI: spark-sql –master yarn -{}-conf spark.sql.hive.convertMetastoreOrc=true -e “SELECT COUNT(*) FROM poc_db.customers;”</w:t>
+      </w:r>
+    </w:p>
+    <w:p>
+      <w:pPr>
+        <w:numPr>
+          <w:ilvl w:val="0"/>
+          <w:numId w:val="1008"/>
         </w:numPr>
         <w:pStyle w:val="Compact"/>
       </w:pPr>
       <w:r>
-        <w:t xml:space="preserve">SSH access to the MRS master node is configured.</w:t>
+        <w:t xml:space="preserve">Verify the returned count matches the expected row count (10,000)</w:t>
+      </w:r>
+    </w:p>
+    <w:p>
+      <w:pPr>
+        <w:numPr>
+          <w:ilvl w:val="0"/>
+          <w:numId w:val="1008"/>
+        </w:numPr>
+        <w:pStyle w:val="Compact"/>
+      </w:pPr>
+      <w:r>
+        <w:t xml:space="preserve">Run a sample query to verify data integrity: spark-sql –master yarn -e</w:t>
+      </w:r>
+      <w:r>
+        <w:t xml:space="preserve"> </w:t>
+      </w:r>
+      <w:r>
+        <w:t xml:space="preserve">“</w:t>
+      </w:r>
+      <w:r>
+        <w:t xml:space="preserve">SELECT customer_id, name FROM poc_db.customers LIMIT 5;</w:t>
+      </w:r>
+      <w:r>
+        <w:t xml:space="preserve">”</w:t>
+      </w:r>
+    </w:p>
+    <w:p>
+      <w:pPr>
+        <w:numPr>
+          <w:ilvl w:val="0"/>
+          <w:numId w:val="1008"/>
+        </w:numPr>
+        <w:pStyle w:val="Compact"/>
+      </w:pPr>
+      <w:r>
+        <w:t xml:space="preserve">Confirm the query returns 5 rows with non-null values</w:t>
       </w:r>
     </w:p>
     <w:p>
@@ -3049,111 +3085,33 @@
         <w:pStyle w:val="DefinitionTerm"/>
       </w:pPr>
       <w:r>
-        <w:t xml:space="preserve">Procedure</w:t>
-      </w:r>
-    </w:p>
-    <w:p>
-      <w:pPr>
-        <w:numPr>
-          <w:ilvl w:val="0"/>
-          <w:numId w:val="1019"/>
-        </w:numPr>
-        <w:pStyle w:val="Compact"/>
-      </w:pPr>
-      <w:r>
-        <w:t xml:space="preserve">SSH into the MRS master node</w:t>
-      </w:r>
-    </w:p>
-    <w:p>
-      <w:pPr>
-        <w:numPr>
-          <w:ilvl w:val="0"/>
-          <w:numId w:val="1019"/>
-        </w:numPr>
-        <w:pStyle w:val="Compact"/>
-      </w:pPr>
-      <w:r>
-        <w:t xml:space="preserve">Run the Spark SQL CLI: spark-sql –master yarn -{}-conf spark.sql.hive.convertMetastoreOrc=true -e “SELECT COUNT(*) FROM poc_db.customers;”</w:t>
-      </w:r>
-    </w:p>
-    <w:p>
-      <w:pPr>
-        <w:numPr>
-          <w:ilvl w:val="0"/>
-          <w:numId w:val="1019"/>
-        </w:numPr>
-        <w:pStyle w:val="Compact"/>
-      </w:pPr>
-      <w:r>
-        <w:t xml:space="preserve">Verify the returned count matches the expected row count (10,000)</w:t>
-      </w:r>
-    </w:p>
-    <w:p>
-      <w:pPr>
-        <w:numPr>
-          <w:ilvl w:val="0"/>
-          <w:numId w:val="1019"/>
-        </w:numPr>
-        <w:pStyle w:val="Compact"/>
-      </w:pPr>
-      <w:r>
-        <w:t xml:space="preserve">Run a sample query to verify data integrity: spark-sql –master yarn -e</w:t>
-      </w:r>
-      <w:r>
-        <w:t xml:space="preserve"> </w:t>
-      </w:r>
-      <w:r>
-        <w:t xml:space="preserve">“</w:t>
-      </w:r>
-      <w:r>
-        <w:t xml:space="preserve">SELECT customer_id, name FROM poc_db.customers LIMIT 5;</w:t>
-      </w:r>
-      <w:r>
-        <w:t xml:space="preserve">”</w:t>
-      </w:r>
-    </w:p>
-    <w:p>
-      <w:pPr>
-        <w:numPr>
-          <w:ilvl w:val="0"/>
-          <w:numId w:val="1019"/>
-        </w:numPr>
-        <w:pStyle w:val="Compact"/>
-      </w:pPr>
-      <w:r>
-        <w:t xml:space="preserve">Confirm the query returns 5 rows with non-null values</w:t>
-      </w:r>
-    </w:p>
-    <w:p>
-      <w:pPr>
-        <w:pStyle w:val="DefinitionTerm"/>
-      </w:pPr>
-      <w:r>
         <w:t xml:space="preserve">Expected Result</w:t>
       </w:r>
     </w:p>
     <w:p>
       <w:pPr>
-        <w:numPr>
-          <w:ilvl w:val="0"/>
-          <w:numId w:val="1020"/>
-        </w:numPr>
-        <w:pStyle w:val="Compact"/>
-      </w:pPr>
+        <w:pStyle w:val="Definition"/>
+      </w:pPr>
+      <w:r>
+        <w:t xml:space="preserve">testlist</w:t>
+      </w:r>
+      <w:r>
+        <w:t xml:space="preserve"> </w:t>
+      </w:r>
       <w:r>
         <w:t xml:space="preserve">COUNT(*) returns 10,000.</w:t>
       </w:r>
-    </w:p>
-    <w:p>
-      <w:pPr>
-        <w:numPr>
-          <w:ilvl w:val="0"/>
-          <w:numId w:val="1020"/>
-        </w:numPr>
-        <w:pStyle w:val="Compact"/>
-      </w:pPr>
+      <w:r>
+        <w:t xml:space="preserve"> </w:t>
+      </w:r>
       <w:r>
         <w:t xml:space="preserve">The sample query returns 5 rows with valid customer_id and name values.</w:t>
+      </w:r>
+      <w:r>
+        <w:t xml:space="preserve"> </w:t>
+      </w:r>
+      <w:r>
+        <w:t xml:space="preserve">testlist</w:t>
       </w:r>
     </w:p>
     <w:p>
@@ -3274,38 +3232,102 @@
     </w:p>
     <w:p>
       <w:pPr>
-        <w:numPr>
-          <w:ilvl w:val="0"/>
-          <w:numId w:val="1021"/>
+        <w:pStyle w:val="Definition"/>
+      </w:pPr>
+      <w:r>
+        <w:t xml:space="preserve">testlist</w:t>
+      </w:r>
+      <w:r>
+        <w:t xml:space="preserve"> </w:t>
+      </w:r>
+      <w:r>
+        <w:t xml:space="preserve">OBS bucket poc-datalake-raw exists with the designated IAM policy.</w:t>
+      </w:r>
+      <w:r>
+        <w:t xml:space="preserve"> </w:t>
+      </w:r>
+      <w:r>
+        <w:t xml:space="preserve">Two test IAM users: one with OBS_ReadWrite role, one with no OBS permissions.</w:t>
+      </w:r>
+      <w:r>
+        <w:t xml:space="preserve"> </w:t>
+      </w:r>
+      <w:r>
+        <w:t xml:space="preserve">obsutil CLI configured for both users.</w:t>
+      </w:r>
+      <w:r>
+        <w:t xml:space="preserve"> </w:t>
+      </w:r>
+      <w:r>
+        <w:t xml:space="preserve">testlist</w:t>
+      </w:r>
+    </w:p>
+    <w:p>
+      <w:pPr>
+        <w:pStyle w:val="DefinitionTerm"/>
+      </w:pPr>
+      <w:r>
+        <w:t xml:space="preserve">Procedure</w:t>
+      </w:r>
+    </w:p>
+    <w:p>
+      <w:pPr>
+        <w:numPr>
+          <w:ilvl w:val="0"/>
+          <w:numId w:val="1009"/>
         </w:numPr>
         <w:pStyle w:val="Compact"/>
       </w:pPr>
       <w:r>
-        <w:t xml:space="preserve">OBS bucket poc-datalake-raw exists with the designated IAM policy.</w:t>
-      </w:r>
-    </w:p>
-    <w:p>
-      <w:pPr>
-        <w:numPr>
-          <w:ilvl w:val="0"/>
-          <w:numId w:val="1021"/>
+        <w:t xml:space="preserve">Using the authorized user, upload a test file to poc-datalake-raw</w:t>
+      </w:r>
+    </w:p>
+    <w:p>
+      <w:pPr>
+        <w:numPr>
+          <w:ilvl w:val="0"/>
+          <w:numId w:val="1009"/>
         </w:numPr>
         <w:pStyle w:val="Compact"/>
       </w:pPr>
       <w:r>
-        <w:t xml:space="preserve">Two test IAM users: one with OBS_ReadWrite role, one with no OBS permissions.</w:t>
-      </w:r>
-    </w:p>
-    <w:p>
-      <w:pPr>
-        <w:numPr>
-          <w:ilvl w:val="0"/>
-          <w:numId w:val="1021"/>
+        <w:t xml:space="preserve">Using the authorized user, download and verify the file content</w:t>
+      </w:r>
+    </w:p>
+    <w:p>
+      <w:pPr>
+        <w:numPr>
+          <w:ilvl w:val="0"/>
+          <w:numId w:val="1009"/>
         </w:numPr>
         <w:pStyle w:val="Compact"/>
       </w:pPr>
       <w:r>
-        <w:t xml:space="preserve">obsutil CLI configured for both users.</w:t>
+        <w:t xml:space="preserve">Using the unauthorized user, attempt to upload a file — verify the request is denied (HTTP 403)</w:t>
+      </w:r>
+    </w:p>
+    <w:p>
+      <w:pPr>
+        <w:numPr>
+          <w:ilvl w:val="0"/>
+          <w:numId w:val="1009"/>
+        </w:numPr>
+        <w:pStyle w:val="Compact"/>
+      </w:pPr>
+      <w:r>
+        <w:t xml:space="preserve">Using the unauthorized user, attempt to list objects in the bucket — verify the request is denied</w:t>
+      </w:r>
+    </w:p>
+    <w:p>
+      <w:pPr>
+        <w:numPr>
+          <w:ilvl w:val="0"/>
+          <w:numId w:val="1009"/>
+        </w:numPr>
+        <w:pStyle w:val="Compact"/>
+      </w:pPr>
+      <w:r>
+        <w:t xml:space="preserve">Review the bucket policy in the Console at Console, Object Storage Service, Bucket Policies and confirm it grants only the intended permissions</w:t>
       </w:r>
     </w:p>
     <w:p>
@@ -3313,111 +3335,39 @@
         <w:pStyle w:val="DefinitionTerm"/>
       </w:pPr>
       <w:r>
-        <w:t xml:space="preserve">Procedure</w:t>
-      </w:r>
-    </w:p>
-    <w:p>
-      <w:pPr>
-        <w:numPr>
-          <w:ilvl w:val="0"/>
-          <w:numId w:val="1022"/>
-        </w:numPr>
-        <w:pStyle w:val="Compact"/>
-      </w:pPr>
-      <w:r>
-        <w:t xml:space="preserve">Using the authorized user, upload a test file to poc-datalake-raw</w:t>
-      </w:r>
-    </w:p>
-    <w:p>
-      <w:pPr>
-        <w:numPr>
-          <w:ilvl w:val="0"/>
-          <w:numId w:val="1022"/>
-        </w:numPr>
-        <w:pStyle w:val="Compact"/>
-      </w:pPr>
-      <w:r>
-        <w:t xml:space="preserve">Using the authorized user, download and verify the file content</w:t>
-      </w:r>
-    </w:p>
-    <w:p>
-      <w:pPr>
-        <w:numPr>
-          <w:ilvl w:val="0"/>
-          <w:numId w:val="1022"/>
-        </w:numPr>
-        <w:pStyle w:val="Compact"/>
-      </w:pPr>
-      <w:r>
-        <w:t xml:space="preserve">Using the unauthorized user, attempt to upload a file — verify the request is denied (HTTP 403)</w:t>
-      </w:r>
-    </w:p>
-    <w:p>
-      <w:pPr>
-        <w:numPr>
-          <w:ilvl w:val="0"/>
-          <w:numId w:val="1022"/>
-        </w:numPr>
-        <w:pStyle w:val="Compact"/>
-      </w:pPr>
-      <w:r>
-        <w:t xml:space="preserve">Using the unauthorized user, attempt to list objects in the bucket — verify the request is denied</w:t>
-      </w:r>
-    </w:p>
-    <w:p>
-      <w:pPr>
-        <w:numPr>
-          <w:ilvl w:val="0"/>
-          <w:numId w:val="1022"/>
-        </w:numPr>
-        <w:pStyle w:val="Compact"/>
-      </w:pPr>
-      <w:r>
-        <w:t xml:space="preserve">Review the bucket policy in the Console at Console, Object Storage Service, Bucket Policies and confirm it grants only the intended permissions</w:t>
-      </w:r>
-    </w:p>
-    <w:p>
-      <w:pPr>
-        <w:pStyle w:val="DefinitionTerm"/>
-      </w:pPr>
-      <w:r>
         <w:t xml:space="preserve">Expected Result</w:t>
       </w:r>
     </w:p>
     <w:p>
       <w:pPr>
-        <w:numPr>
-          <w:ilvl w:val="0"/>
-          <w:numId w:val="1023"/>
-        </w:numPr>
-        <w:pStyle w:val="Compact"/>
-      </w:pPr>
+        <w:pStyle w:val="Definition"/>
+      </w:pPr>
+      <w:r>
+        <w:t xml:space="preserve">testlist</w:t>
+      </w:r>
+      <w:r>
+        <w:t xml:space="preserve"> </w:t>
+      </w:r>
       <w:r>
         <w:t xml:space="preserve">Authorized user can upload and download successfully.</w:t>
       </w:r>
-    </w:p>
-    <w:p>
-      <w:pPr>
-        <w:numPr>
-          <w:ilvl w:val="0"/>
-          <w:numId w:val="1023"/>
-        </w:numPr>
-        <w:pStyle w:val="Compact"/>
-      </w:pPr>
+      <w:r>
+        <w:t xml:space="preserve"> </w:t>
+      </w:r>
       <w:r>
         <w:t xml:space="preserve">Unauthorized user receives HTTP 403 on both upload and list operations.</w:t>
       </w:r>
-    </w:p>
-    <w:p>
-      <w:pPr>
-        <w:numPr>
-          <w:ilvl w:val="0"/>
-          <w:numId w:val="1023"/>
-        </w:numPr>
-        <w:pStyle w:val="Compact"/>
-      </w:pPr>
+      <w:r>
+        <w:t xml:space="preserve"> </w:t>
+      </w:r>
       <w:r>
         <w:t xml:space="preserve">Bucket policy grants only the intended read/write permissions to the designated roles.</w:t>
+      </w:r>
+      <w:r>
+        <w:t xml:space="preserve"> </w:t>
+      </w:r>
+      <w:r>
+        <w:t xml:space="preserve">testlist</w:t>
       </w:r>
     </w:p>
     <w:p>
@@ -3507,38 +3457,102 @@
     </w:p>
     <w:p>
       <w:pPr>
-        <w:numPr>
-          <w:ilvl w:val="0"/>
-          <w:numId w:val="1024"/>
+        <w:pStyle w:val="Definition"/>
+      </w:pPr>
+      <w:r>
+        <w:t xml:space="preserve">testlist</w:t>
+      </w:r>
+      <w:r>
+        <w:t xml:space="preserve"> </w:t>
+      </w:r>
+      <w:r>
+        <w:t xml:space="preserve">TC-004 completed (DataArts Studio workspace accessible).</w:t>
+      </w:r>
+      <w:r>
+        <w:t xml:space="preserve"> </w:t>
+      </w:r>
+      <w:r>
+        <w:t xml:space="preserve">Data masking rule configured for column customers.ssn (Social Security Number).</w:t>
+      </w:r>
+      <w:r>
+        <w:t xml:space="preserve"> </w:t>
+      </w:r>
+      <w:r>
+        <w:t xml:space="preserve">Test user has Dayu_User role (not admin).</w:t>
+      </w:r>
+      <w:r>
+        <w:t xml:space="preserve"> </w:t>
+      </w:r>
+      <w:r>
+        <w:t xml:space="preserve">testlist</w:t>
+      </w:r>
+    </w:p>
+    <w:p>
+      <w:pPr>
+        <w:pStyle w:val="DefinitionTerm"/>
+      </w:pPr>
+      <w:r>
+        <w:t xml:space="preserve">Procedure</w:t>
+      </w:r>
+    </w:p>
+    <w:p>
+      <w:pPr>
+        <w:numPr>
+          <w:ilvl w:val="0"/>
+          <w:numId w:val="1010"/>
         </w:numPr>
         <w:pStyle w:val="Compact"/>
       </w:pPr>
       <w:r>
-        <w:t xml:space="preserve">TC-004 completed (DataArts Studio workspace accessible).</w:t>
-      </w:r>
-    </w:p>
-    <w:p>
-      <w:pPr>
-        <w:numPr>
-          <w:ilvl w:val="0"/>
-          <w:numId w:val="1024"/>
+        <w:t xml:space="preserve">In the DataArts Studio console, navigate to Data Architecture $$ Data Masking</w:t>
+      </w:r>
+    </w:p>
+    <w:p>
+      <w:pPr>
+        <w:numPr>
+          <w:ilvl w:val="0"/>
+          <w:numId w:val="1010"/>
         </w:numPr>
         <w:pStyle w:val="Compact"/>
       </w:pPr>
       <w:r>
-        <w:t xml:space="preserve">Data masking rule configured for column customers.ssn (Social Security Number).</w:t>
-      </w:r>
-    </w:p>
-    <w:p>
-      <w:pPr>
-        <w:numPr>
-          <w:ilvl w:val="0"/>
-          <w:numId w:val="1024"/>
+        <w:t xml:space="preserve">Verify the masking rule for customers.ssn is active and uses the Mask All strategy</w:t>
+      </w:r>
+    </w:p>
+    <w:p>
+      <w:pPr>
+        <w:numPr>
+          <w:ilvl w:val="0"/>
+          <w:numId w:val="1010"/>
         </w:numPr>
         <w:pStyle w:val="Compact"/>
       </w:pPr>
       <w:r>
-        <w:t xml:space="preserve">Test user has Dayu_User role (not admin).</w:t>
+        <w:t xml:space="preserve">Query the customers table as the test user via DataArts Studio SQL console</w:t>
+      </w:r>
+    </w:p>
+    <w:p>
+      <w:pPr>
+        <w:numPr>
+          <w:ilvl w:val="0"/>
+          <w:numId w:val="1010"/>
+        </w:numPr>
+        <w:pStyle w:val="Compact"/>
+      </w:pPr>
+      <w:r>
+        <w:t xml:space="preserve">Verify the ssn column returns masked values (e.g. *********) instead of real data</w:t>
+      </w:r>
+    </w:p>
+    <w:p>
+      <w:pPr>
+        <w:numPr>
+          <w:ilvl w:val="0"/>
+          <w:numId w:val="1010"/>
+        </w:numPr>
+        <w:pStyle w:val="Compact"/>
+      </w:pPr>
+      <w:r>
+        <w:t xml:space="preserve">Query the same table as an admin user and verify real values are returned</w:t>
       </w:r>
     </w:p>
     <w:p>
@@ -3546,111 +3560,39 @@
         <w:pStyle w:val="DefinitionTerm"/>
       </w:pPr>
       <w:r>
-        <w:t xml:space="preserve">Procedure</w:t>
-      </w:r>
-    </w:p>
-    <w:p>
-      <w:pPr>
-        <w:numPr>
-          <w:ilvl w:val="0"/>
-          <w:numId w:val="1025"/>
-        </w:numPr>
-        <w:pStyle w:val="Compact"/>
-      </w:pPr>
-      <w:r>
-        <w:t xml:space="preserve">In the DataArts Studio console, navigate to Data Architecture $$ Data Masking</w:t>
-      </w:r>
-    </w:p>
-    <w:p>
-      <w:pPr>
-        <w:numPr>
-          <w:ilvl w:val="0"/>
-          <w:numId w:val="1025"/>
-        </w:numPr>
-        <w:pStyle w:val="Compact"/>
-      </w:pPr>
-      <w:r>
-        <w:t xml:space="preserve">Verify the masking rule for customers.ssn is active and uses the Mask All strategy</w:t>
-      </w:r>
-    </w:p>
-    <w:p>
-      <w:pPr>
-        <w:numPr>
-          <w:ilvl w:val="0"/>
-          <w:numId w:val="1025"/>
-        </w:numPr>
-        <w:pStyle w:val="Compact"/>
-      </w:pPr>
-      <w:r>
-        <w:t xml:space="preserve">Query the customers table as the test user via DataArts Studio SQL console</w:t>
-      </w:r>
-    </w:p>
-    <w:p>
-      <w:pPr>
-        <w:numPr>
-          <w:ilvl w:val="0"/>
-          <w:numId w:val="1025"/>
-        </w:numPr>
-        <w:pStyle w:val="Compact"/>
-      </w:pPr>
-      <w:r>
-        <w:t xml:space="preserve">Verify the ssn column returns masked values (e.g. *********) instead of real data</w:t>
-      </w:r>
-    </w:p>
-    <w:p>
-      <w:pPr>
-        <w:numPr>
-          <w:ilvl w:val="0"/>
-          <w:numId w:val="1025"/>
-        </w:numPr>
-        <w:pStyle w:val="Compact"/>
-      </w:pPr>
-      <w:r>
-        <w:t xml:space="preserve">Query the same table as an admin user and verify real values are returned</w:t>
-      </w:r>
-    </w:p>
-    <w:p>
-      <w:pPr>
-        <w:pStyle w:val="DefinitionTerm"/>
-      </w:pPr>
-      <w:r>
         <w:t xml:space="preserve">Expected Result</w:t>
       </w:r>
     </w:p>
     <w:p>
       <w:pPr>
-        <w:numPr>
-          <w:ilvl w:val="0"/>
-          <w:numId w:val="1026"/>
-        </w:numPr>
-        <w:pStyle w:val="Compact"/>
-      </w:pPr>
+        <w:pStyle w:val="Definition"/>
+      </w:pPr>
+      <w:r>
+        <w:t xml:space="preserve">testlist</w:t>
+      </w:r>
+      <w:r>
+        <w:t xml:space="preserve"> </w:t>
+      </w:r>
       <w:r>
         <w:t xml:space="preserve">Masking rule is active for customers.ssn.</w:t>
       </w:r>
-    </w:p>
-    <w:p>
-      <w:pPr>
-        <w:numPr>
-          <w:ilvl w:val="0"/>
-          <w:numId w:val="1026"/>
-        </w:numPr>
-        <w:pStyle w:val="Compact"/>
-      </w:pPr>
+      <w:r>
+        <w:t xml:space="preserve"> </w:t>
+      </w:r>
       <w:r>
         <w:t xml:space="preserve">Non-admin user sees masked values in the ssn column.</w:t>
       </w:r>
-    </w:p>
-    <w:p>
-      <w:pPr>
-        <w:numPr>
-          <w:ilvl w:val="0"/>
-          <w:numId w:val="1026"/>
-        </w:numPr>
-        <w:pStyle w:val="Compact"/>
-      </w:pPr>
+      <w:r>
+        <w:t xml:space="preserve"> </w:t>
+      </w:r>
       <w:r>
         <w:t xml:space="preserve">Admin user sees real values in the ssn column.</w:t>
+      </w:r>
+      <w:r>
+        <w:t xml:space="preserve"> </w:t>
+      </w:r>
+      <w:r>
+        <w:t xml:space="preserve">testlist</w:t>
       </w:r>
     </w:p>
     <w:p>
@@ -3771,38 +3713,114 @@
     </w:p>
     <w:p>
       <w:pPr>
-        <w:numPr>
-          <w:ilvl w:val="0"/>
-          <w:numId w:val="1027"/>
+        <w:pStyle w:val="Definition"/>
+      </w:pPr>
+      <w:r>
+        <w:t xml:space="preserve">testlist</w:t>
+      </w:r>
+      <w:r>
+        <w:t xml:space="preserve"> </w:t>
+      </w:r>
+      <w:r>
+        <w:t xml:space="preserve">terraform CLI installed (version $$ 1.0).</w:t>
+      </w:r>
+      <w:r>
+        <w:t xml:space="preserve"> </w:t>
+      </w:r>
+      <w:r>
+        <w:t xml:space="preserve">AK/SK credentials configured via environment variables or provider.tf.</w:t>
+      </w:r>
+      <w:r>
+        <w:t xml:space="preserve"> </w:t>
+      </w:r>
+      <w:r>
+        <w:t xml:space="preserve">Terraform configuration files in the project directory.</w:t>
+      </w:r>
+      <w:r>
+        <w:t xml:space="preserve"> </w:t>
+      </w:r>
+      <w:r>
+        <w:t xml:space="preserve">testlist</w:t>
+      </w:r>
+    </w:p>
+    <w:p>
+      <w:pPr>
+        <w:pStyle w:val="DefinitionTerm"/>
+      </w:pPr>
+      <w:r>
+        <w:t xml:space="preserve">Procedure</w:t>
+      </w:r>
+    </w:p>
+    <w:p>
+      <w:pPr>
+        <w:numPr>
+          <w:ilvl w:val="0"/>
+          <w:numId w:val="1011"/>
         </w:numPr>
         <w:pStyle w:val="Compact"/>
       </w:pPr>
       <w:r>
-        <w:t xml:space="preserve">terraform CLI installed (version $$ 1.0).</w:t>
-      </w:r>
-    </w:p>
-    <w:p>
-      <w:pPr>
-        <w:numPr>
-          <w:ilvl w:val="0"/>
-          <w:numId w:val="1027"/>
+        <w:t xml:space="preserve">Navigate to the Terraform project directory</w:t>
+      </w:r>
+    </w:p>
+    <w:p>
+      <w:pPr>
+        <w:numPr>
+          <w:ilvl w:val="0"/>
+          <w:numId w:val="1011"/>
         </w:numPr>
         <w:pStyle w:val="Compact"/>
       </w:pPr>
       <w:r>
-        <w:t xml:space="preserve">AK/SK credentials configured via environment variables or provider.tf.</w:t>
-      </w:r>
-    </w:p>
-    <w:p>
-      <w:pPr>
-        <w:numPr>
-          <w:ilvl w:val="0"/>
-          <w:numId w:val="1027"/>
+        <w:t xml:space="preserve">Run terraform init to initialize the working directory</w:t>
+      </w:r>
+    </w:p>
+    <w:p>
+      <w:pPr>
+        <w:numPr>
+          <w:ilvl w:val="0"/>
+          <w:numId w:val="1011"/>
         </w:numPr>
         <w:pStyle w:val="Compact"/>
       </w:pPr>
       <w:r>
-        <w:t xml:space="preserve">Terraform configuration files in the project directory.</w:t>
+        <w:t xml:space="preserve">Run terraform plan and review the planned changes — confirm all expected resources are listed</w:t>
+      </w:r>
+    </w:p>
+    <w:p>
+      <w:pPr>
+        <w:numPr>
+          <w:ilvl w:val="0"/>
+          <w:numId w:val="1011"/>
+        </w:numPr>
+        <w:pStyle w:val="Compact"/>
+      </w:pPr>
+      <w:r>
+        <w:t xml:space="preserve">Run terraform apply -auto-approve and wait for completion</w:t>
+      </w:r>
+    </w:p>
+    <w:p>
+      <w:pPr>
+        <w:numPr>
+          <w:ilvl w:val="0"/>
+          <w:numId w:val="1011"/>
+        </w:numPr>
+        <w:pStyle w:val="Compact"/>
+      </w:pPr>
+      <w:r>
+        <w:t xml:space="preserve">Run terraform output and verify all output values are populated</w:t>
+      </w:r>
+    </w:p>
+    <w:p>
+      <w:pPr>
+        <w:numPr>
+          <w:ilvl w:val="0"/>
+          <w:numId w:val="1011"/>
+        </w:numPr>
+        <w:pStyle w:val="Compact"/>
+      </w:pPr>
+      <w:r>
+        <w:t xml:space="preserve">Run terraform state list and confirm the resource count matches the architecture</w:t>
       </w:r>
     </w:p>
     <w:p>
@@ -3810,123 +3828,39 @@
         <w:pStyle w:val="DefinitionTerm"/>
       </w:pPr>
       <w:r>
-        <w:t xml:space="preserve">Procedure</w:t>
-      </w:r>
-    </w:p>
-    <w:p>
-      <w:pPr>
-        <w:numPr>
-          <w:ilvl w:val="0"/>
-          <w:numId w:val="1028"/>
-        </w:numPr>
-        <w:pStyle w:val="Compact"/>
-      </w:pPr>
-      <w:r>
-        <w:t xml:space="preserve">Navigate to the Terraform project directory</w:t>
-      </w:r>
-    </w:p>
-    <w:p>
-      <w:pPr>
-        <w:numPr>
-          <w:ilvl w:val="0"/>
-          <w:numId w:val="1028"/>
-        </w:numPr>
-        <w:pStyle w:val="Compact"/>
-      </w:pPr>
-      <w:r>
-        <w:t xml:space="preserve">Run terraform init to initialize the working directory</w:t>
-      </w:r>
-    </w:p>
-    <w:p>
-      <w:pPr>
-        <w:numPr>
-          <w:ilvl w:val="0"/>
-          <w:numId w:val="1028"/>
-        </w:numPr>
-        <w:pStyle w:val="Compact"/>
-      </w:pPr>
-      <w:r>
-        <w:t xml:space="preserve">Run terraform plan and review the planned changes — confirm all expected resources are listed</w:t>
-      </w:r>
-    </w:p>
-    <w:p>
-      <w:pPr>
-        <w:numPr>
-          <w:ilvl w:val="0"/>
-          <w:numId w:val="1028"/>
-        </w:numPr>
-        <w:pStyle w:val="Compact"/>
-      </w:pPr>
-      <w:r>
-        <w:t xml:space="preserve">Run terraform apply -auto-approve and wait for completion</w:t>
-      </w:r>
-    </w:p>
-    <w:p>
-      <w:pPr>
-        <w:numPr>
-          <w:ilvl w:val="0"/>
-          <w:numId w:val="1028"/>
-        </w:numPr>
-        <w:pStyle w:val="Compact"/>
-      </w:pPr>
-      <w:r>
-        <w:t xml:space="preserve">Run terraform output and verify all output values are populated</w:t>
-      </w:r>
-    </w:p>
-    <w:p>
-      <w:pPr>
-        <w:numPr>
-          <w:ilvl w:val="0"/>
-          <w:numId w:val="1028"/>
-        </w:numPr>
-        <w:pStyle w:val="Compact"/>
-      </w:pPr>
-      <w:r>
-        <w:t xml:space="preserve">Run terraform state list and confirm the resource count matches the architecture</w:t>
-      </w:r>
-    </w:p>
-    <w:p>
-      <w:pPr>
-        <w:pStyle w:val="DefinitionTerm"/>
-      </w:pPr>
-      <w:r>
         <w:t xml:space="preserve">Expected Result</w:t>
       </w:r>
     </w:p>
     <w:p>
       <w:pPr>
-        <w:numPr>
-          <w:ilvl w:val="0"/>
-          <w:numId w:val="1029"/>
-        </w:numPr>
-        <w:pStyle w:val="Compact"/>
-      </w:pPr>
+        <w:pStyle w:val="Definition"/>
+      </w:pPr>
+      <w:r>
+        <w:t xml:space="preserve">testlist</w:t>
+      </w:r>
+      <w:r>
+        <w:t xml:space="preserve"> </w:t>
+      </w:r>
       <w:r>
         <w:t xml:space="preserve">terraform apply completes with no errors.</w:t>
       </w:r>
-    </w:p>
-    <w:p>
-      <w:pPr>
-        <w:numPr>
-          <w:ilvl w:val="0"/>
-          <w:numId w:val="1029"/>
-        </w:numPr>
-        <w:pStyle w:val="Compact"/>
-      </w:pPr>
+      <w:r>
+        <w:t xml:space="preserve"> </w:t>
+      </w:r>
       <w:r>
         <w:t xml:space="preserve">All output values are populated (cluster ID, bucket name, VPC ID).</w:t>
       </w:r>
-    </w:p>
-    <w:p>
-      <w:pPr>
-        <w:numPr>
-          <w:ilvl w:val="0"/>
-          <w:numId w:val="1029"/>
-        </w:numPr>
-        <w:pStyle w:val="Compact"/>
-      </w:pPr>
+      <w:r>
+        <w:t xml:space="preserve"> </w:t>
+      </w:r>
       <w:r>
         <w:t xml:space="preserve">Resource count in state matches the architecture specification.</w:t>
+      </w:r>
+      <w:r>
+        <w:t xml:space="preserve"> </w:t>
+      </w:r>
+      <w:r>
+        <w:t xml:space="preserve">testlist</w:t>
       </w:r>
     </w:p>
     <w:p>
@@ -4016,38 +3950,102 @@
     </w:p>
     <w:p>
       <w:pPr>
-        <w:numPr>
-          <w:ilvl w:val="0"/>
-          <w:numId w:val="1030"/>
+        <w:pStyle w:val="Definition"/>
+      </w:pPr>
+      <w:r>
+        <w:t xml:space="preserve">testlist</w:t>
+      </w:r>
+      <w:r>
+        <w:t xml:space="preserve"> </w:t>
+      </w:r>
+      <w:r>
+        <w:t xml:space="preserve">TC-002 completed (OBS bucket accessible).</w:t>
+      </w:r>
+      <w:r>
+        <w:t xml:space="preserve"> </w:t>
+      </w:r>
+      <w:r>
+        <w:t xml:space="preserve">Test data files prepared in the local directory ./test-data/.</w:t>
+      </w:r>
+      <w:r>
+        <w:t xml:space="preserve"> </w:t>
+      </w:r>
+      <w:r>
+        <w:t xml:space="preserve">obsutil CLI configured with the test user credentials.</w:t>
+      </w:r>
+      <w:r>
+        <w:t xml:space="preserve"> </w:t>
+      </w:r>
+      <w:r>
+        <w:t xml:space="preserve">testlist</w:t>
+      </w:r>
+    </w:p>
+    <w:p>
+      <w:pPr>
+        <w:pStyle w:val="DefinitionTerm"/>
+      </w:pPr>
+      <w:r>
+        <w:t xml:space="preserve">Procedure</w:t>
+      </w:r>
+    </w:p>
+    <w:p>
+      <w:pPr>
+        <w:numPr>
+          <w:ilvl w:val="0"/>
+          <w:numId w:val="1012"/>
         </w:numPr>
         <w:pStyle w:val="Compact"/>
       </w:pPr>
       <w:r>
-        <w:t xml:space="preserve">TC-002 completed (OBS bucket accessible).</w:t>
-      </w:r>
-    </w:p>
-    <w:p>
-      <w:pPr>
-        <w:numPr>
-          <w:ilvl w:val="0"/>
-          <w:numId w:val="1030"/>
+        <w:t xml:space="preserve">List the local test data files and verify their integrity (row count, schema)</w:t>
+      </w:r>
+    </w:p>
+    <w:p>
+      <w:pPr>
+        <w:numPr>
+          <w:ilvl w:val="0"/>
+          <w:numId w:val="1012"/>
         </w:numPr>
         <w:pStyle w:val="Compact"/>
       </w:pPr>
       <w:r>
-        <w:t xml:space="preserve">Test data files prepared in the local directory ./test-data/.</w:t>
-      </w:r>
-    </w:p>
-    <w:p>
-      <w:pPr>
-        <w:numPr>
-          <w:ilvl w:val="0"/>
-          <w:numId w:val="1030"/>
+        <w:t xml:space="preserve">Upload all files to the OBS raw bucket using obsutil</w:t>
+      </w:r>
+    </w:p>
+    <w:p>
+      <w:pPr>
+        <w:numPr>
+          <w:ilvl w:val="0"/>
+          <w:numId w:val="1012"/>
         </w:numPr>
         <w:pStyle w:val="Compact"/>
       </w:pPr>
       <w:r>
-        <w:t xml:space="preserve">obsutil CLI configured with the test user credentials.</w:t>
+        <w:t xml:space="preserve">Verify each file exists in OBS by listing the bucket contents</w:t>
+      </w:r>
+    </w:p>
+    <w:p>
+      <w:pPr>
+        <w:numPr>
+          <w:ilvl w:val="0"/>
+          <w:numId w:val="1012"/>
+        </w:numPr>
+        <w:pStyle w:val="Compact"/>
+      </w:pPr>
+      <w:r>
+        <w:t xml:space="preserve">Download a sample file from OBS and compare it with the local original (checksum)</w:t>
+      </w:r>
+    </w:p>
+    <w:p>
+      <w:pPr>
+        <w:numPr>
+          <w:ilvl w:val="0"/>
+          <w:numId w:val="1012"/>
+        </w:numPr>
+        <w:pStyle w:val="Compact"/>
+      </w:pPr>
+      <w:r>
+        <w:t xml:space="preserve">In DataArts Studio, verify the data source connection can read the uploaded files</w:t>
       </w:r>
     </w:p>
     <w:p>
@@ -4055,123 +4053,45 @@
         <w:pStyle w:val="DefinitionTerm"/>
       </w:pPr>
       <w:r>
-        <w:t xml:space="preserve">Procedure</w:t>
-      </w:r>
-    </w:p>
-    <w:p>
-      <w:pPr>
-        <w:numPr>
-          <w:ilvl w:val="0"/>
-          <w:numId w:val="1031"/>
-        </w:numPr>
-        <w:pStyle w:val="Compact"/>
-      </w:pPr>
-      <w:r>
-        <w:t xml:space="preserve">List the local test data files and verify their integrity (row count, schema)</w:t>
-      </w:r>
-    </w:p>
-    <w:p>
-      <w:pPr>
-        <w:numPr>
-          <w:ilvl w:val="0"/>
-          <w:numId w:val="1031"/>
-        </w:numPr>
-        <w:pStyle w:val="Compact"/>
-      </w:pPr>
-      <w:r>
-        <w:t xml:space="preserve">Upload all files to the OBS raw bucket using obsutil</w:t>
-      </w:r>
-    </w:p>
-    <w:p>
-      <w:pPr>
-        <w:numPr>
-          <w:ilvl w:val="0"/>
-          <w:numId w:val="1031"/>
-        </w:numPr>
-        <w:pStyle w:val="Compact"/>
-      </w:pPr>
-      <w:r>
-        <w:t xml:space="preserve">Verify each file exists in OBS by listing the bucket contents</w:t>
-      </w:r>
-    </w:p>
-    <w:p>
-      <w:pPr>
-        <w:numPr>
-          <w:ilvl w:val="0"/>
-          <w:numId w:val="1031"/>
-        </w:numPr>
-        <w:pStyle w:val="Compact"/>
-      </w:pPr>
-      <w:r>
-        <w:t xml:space="preserve">Download a sample file from OBS and compare it with the local original (checksum)</w:t>
-      </w:r>
-    </w:p>
-    <w:p>
-      <w:pPr>
-        <w:numPr>
-          <w:ilvl w:val="0"/>
-          <w:numId w:val="1031"/>
-        </w:numPr>
-        <w:pStyle w:val="Compact"/>
-      </w:pPr>
-      <w:r>
-        <w:t xml:space="preserve">In DataArts Studio, verify the data source connection can read the uploaded files</w:t>
-      </w:r>
-    </w:p>
-    <w:p>
-      <w:pPr>
-        <w:pStyle w:val="DefinitionTerm"/>
-      </w:pPr>
-      <w:r>
         <w:t xml:space="preserve">Expected Result</w:t>
       </w:r>
     </w:p>
     <w:p>
       <w:pPr>
-        <w:numPr>
-          <w:ilvl w:val="0"/>
-          <w:numId w:val="1032"/>
-        </w:numPr>
-        <w:pStyle w:val="Compact"/>
-      </w:pPr>
+        <w:pStyle w:val="Definition"/>
+      </w:pPr>
+      <w:r>
+        <w:t xml:space="preserve">testlist</w:t>
+      </w:r>
+      <w:r>
+        <w:t xml:space="preserve"> </w:t>
+      </w:r>
       <w:r>
         <w:t xml:space="preserve">All test data files are uploaded without errors.</w:t>
       </w:r>
-    </w:p>
-    <w:p>
-      <w:pPr>
-        <w:numPr>
-          <w:ilvl w:val="0"/>
-          <w:numId w:val="1032"/>
-        </w:numPr>
-        <w:pStyle w:val="Compact"/>
-      </w:pPr>
+      <w:r>
+        <w:t xml:space="preserve"> </w:t>
+      </w:r>
       <w:r>
         <w:t xml:space="preserve">Bucket listing shows all uploaded files with correct sizes.</w:t>
       </w:r>
-    </w:p>
-    <w:p>
-      <w:pPr>
-        <w:numPr>
-          <w:ilvl w:val="0"/>
-          <w:numId w:val="1032"/>
-        </w:numPr>
-        <w:pStyle w:val="Compact"/>
-      </w:pPr>
+      <w:r>
+        <w:t xml:space="preserve"> </w:t>
+      </w:r>
       <w:r>
         <w:t xml:space="preserve">Downloaded file checksum matches the local original.</w:t>
       </w:r>
-    </w:p>
-    <w:p>
-      <w:pPr>
-        <w:numPr>
-          <w:ilvl w:val="0"/>
-          <w:numId w:val="1032"/>
-        </w:numPr>
-        <w:pStyle w:val="Compact"/>
-      </w:pPr>
+      <w:r>
+        <w:t xml:space="preserve"> </w:t>
+      </w:r>
       <w:r>
         <w:t xml:space="preserve">DataArts Studio data source connection can read the files.</w:t>
+      </w:r>
+      <w:r>
+        <w:t xml:space="preserve"> </w:t>
+      </w:r>
+      <w:r>
+        <w:t xml:space="preserve">testlist</w:t>
       </w:r>
     </w:p>
     <w:p>
@@ -4276,7 +4196,7 @@
         <w:rPr>
           <w:i/>
         </w:rPr>
-        <w:t xml:space="preserve">2026-09-12</w:t>
+        <w:t xml:space="preserve">2026-09-13</w:t>
       </w:r>
     </w:p>
     <w:p>
@@ -4321,7 +4241,7 @@
         <w:rPr>
           <w:i/>
         </w:rPr>
-        <w:t xml:space="preserve">2026-09-12</w:t>
+        <w:t xml:space="preserve">2026-09-13</w:t>
       </w:r>
     </w:p>
     <w:p>
@@ -4351,7 +4271,7 @@
         <w:rPr>
           <w:i/>
         </w:rPr>
-        <w:t xml:space="preserve">2026-09-12</w:t>
+        <w:t xml:space="preserve">2026-09-13</w:t>
       </w:r>
     </w:p>
     <w:p>
@@ -4565,7 +4485,7 @@
         <w:rPr>
           <w:i/>
         </w:rPr>
-        <w:t xml:space="preserve">2026-09-12</w:t>
+        <w:t xml:space="preserve">2026-09-13</w:t>
       </w:r>
     </w:p>
     <w:p>
@@ -5236,606 +5156,6 @@
     </w:lvlOverride>
   </w:num>
   <w:num w:numId="1012">
-    <w:abstractNumId w:val="99411"/>
-    <w:lvlOverride w:ilvl="0">
-      <w:startOverride w:val="1"/>
-    </w:lvlOverride>
-    <w:lvlOverride w:ilvl="1">
-      <w:startOverride w:val="1"/>
-    </w:lvlOverride>
-    <w:lvlOverride w:ilvl="2">
-      <w:startOverride w:val="1"/>
-    </w:lvlOverride>
-    <w:lvlOverride w:ilvl="3">
-      <w:startOverride w:val="1"/>
-    </w:lvlOverride>
-    <w:lvlOverride w:ilvl="4">
-      <w:startOverride w:val="1"/>
-    </w:lvlOverride>
-    <w:lvlOverride w:ilvl="5">
-      <w:startOverride w:val="1"/>
-    </w:lvlOverride>
-    <w:lvlOverride w:ilvl="6">
-      <w:startOverride w:val="1"/>
-    </w:lvlOverride>
-    <w:lvlOverride w:ilvl="7">
-      <w:startOverride w:val="1"/>
-    </w:lvlOverride>
-    <w:lvlOverride w:ilvl="8">
-      <w:startOverride w:val="1"/>
-    </w:lvlOverride>
-  </w:num>
-  <w:num w:numId="1013">
-    <w:abstractNumId w:val="99411"/>
-    <w:lvlOverride w:ilvl="0">
-      <w:startOverride w:val="1"/>
-    </w:lvlOverride>
-    <w:lvlOverride w:ilvl="1">
-      <w:startOverride w:val="1"/>
-    </w:lvlOverride>
-    <w:lvlOverride w:ilvl="2">
-      <w:startOverride w:val="1"/>
-    </w:lvlOverride>
-    <w:lvlOverride w:ilvl="3">
-      <w:startOverride w:val="1"/>
-    </w:lvlOverride>
-    <w:lvlOverride w:ilvl="4">
-      <w:startOverride w:val="1"/>
-    </w:lvlOverride>
-    <w:lvlOverride w:ilvl="5">
-      <w:startOverride w:val="1"/>
-    </w:lvlOverride>
-    <w:lvlOverride w:ilvl="6">
-      <w:startOverride w:val="1"/>
-    </w:lvlOverride>
-    <w:lvlOverride w:ilvl="7">
-      <w:startOverride w:val="1"/>
-    </w:lvlOverride>
-    <w:lvlOverride w:ilvl="8">
-      <w:startOverride w:val="1"/>
-    </w:lvlOverride>
-  </w:num>
-  <w:num w:numId="1014">
-    <w:abstractNumId w:val="99411"/>
-    <w:lvlOverride w:ilvl="0">
-      <w:startOverride w:val="1"/>
-    </w:lvlOverride>
-    <w:lvlOverride w:ilvl="1">
-      <w:startOverride w:val="1"/>
-    </w:lvlOverride>
-    <w:lvlOverride w:ilvl="2">
-      <w:startOverride w:val="1"/>
-    </w:lvlOverride>
-    <w:lvlOverride w:ilvl="3">
-      <w:startOverride w:val="1"/>
-    </w:lvlOverride>
-    <w:lvlOverride w:ilvl="4">
-      <w:startOverride w:val="1"/>
-    </w:lvlOverride>
-    <w:lvlOverride w:ilvl="5">
-      <w:startOverride w:val="1"/>
-    </w:lvlOverride>
-    <w:lvlOverride w:ilvl="6">
-      <w:startOverride w:val="1"/>
-    </w:lvlOverride>
-    <w:lvlOverride w:ilvl="7">
-      <w:startOverride w:val="1"/>
-    </w:lvlOverride>
-    <w:lvlOverride w:ilvl="8">
-      <w:startOverride w:val="1"/>
-    </w:lvlOverride>
-  </w:num>
-  <w:num w:numId="1015">
-    <w:abstractNumId w:val="99411"/>
-    <w:lvlOverride w:ilvl="0">
-      <w:startOverride w:val="1"/>
-    </w:lvlOverride>
-    <w:lvlOverride w:ilvl="1">
-      <w:startOverride w:val="1"/>
-    </w:lvlOverride>
-    <w:lvlOverride w:ilvl="2">
-      <w:startOverride w:val="1"/>
-    </w:lvlOverride>
-    <w:lvlOverride w:ilvl="3">
-      <w:startOverride w:val="1"/>
-    </w:lvlOverride>
-    <w:lvlOverride w:ilvl="4">
-      <w:startOverride w:val="1"/>
-    </w:lvlOverride>
-    <w:lvlOverride w:ilvl="5">
-      <w:startOverride w:val="1"/>
-    </w:lvlOverride>
-    <w:lvlOverride w:ilvl="6">
-      <w:startOverride w:val="1"/>
-    </w:lvlOverride>
-    <w:lvlOverride w:ilvl="7">
-      <w:startOverride w:val="1"/>
-    </w:lvlOverride>
-    <w:lvlOverride w:ilvl="8">
-      <w:startOverride w:val="1"/>
-    </w:lvlOverride>
-  </w:num>
-  <w:num w:numId="1016">
-    <w:abstractNumId w:val="99411"/>
-    <w:lvlOverride w:ilvl="0">
-      <w:startOverride w:val="1"/>
-    </w:lvlOverride>
-    <w:lvlOverride w:ilvl="1">
-      <w:startOverride w:val="1"/>
-    </w:lvlOverride>
-    <w:lvlOverride w:ilvl="2">
-      <w:startOverride w:val="1"/>
-    </w:lvlOverride>
-    <w:lvlOverride w:ilvl="3">
-      <w:startOverride w:val="1"/>
-    </w:lvlOverride>
-    <w:lvlOverride w:ilvl="4">
-      <w:startOverride w:val="1"/>
-    </w:lvlOverride>
-    <w:lvlOverride w:ilvl="5">
-      <w:startOverride w:val="1"/>
-    </w:lvlOverride>
-    <w:lvlOverride w:ilvl="6">
-      <w:startOverride w:val="1"/>
-    </w:lvlOverride>
-    <w:lvlOverride w:ilvl="7">
-      <w:startOverride w:val="1"/>
-    </w:lvlOverride>
-    <w:lvlOverride w:ilvl="8">
-      <w:startOverride w:val="1"/>
-    </w:lvlOverride>
-  </w:num>
-  <w:num w:numId="1017">
-    <w:abstractNumId w:val="99411"/>
-    <w:lvlOverride w:ilvl="0">
-      <w:startOverride w:val="1"/>
-    </w:lvlOverride>
-    <w:lvlOverride w:ilvl="1">
-      <w:startOverride w:val="1"/>
-    </w:lvlOverride>
-    <w:lvlOverride w:ilvl="2">
-      <w:startOverride w:val="1"/>
-    </w:lvlOverride>
-    <w:lvlOverride w:ilvl="3">
-      <w:startOverride w:val="1"/>
-    </w:lvlOverride>
-    <w:lvlOverride w:ilvl="4">
-      <w:startOverride w:val="1"/>
-    </w:lvlOverride>
-    <w:lvlOverride w:ilvl="5">
-      <w:startOverride w:val="1"/>
-    </w:lvlOverride>
-    <w:lvlOverride w:ilvl="6">
-      <w:startOverride w:val="1"/>
-    </w:lvlOverride>
-    <w:lvlOverride w:ilvl="7">
-      <w:startOverride w:val="1"/>
-    </w:lvlOverride>
-    <w:lvlOverride w:ilvl="8">
-      <w:startOverride w:val="1"/>
-    </w:lvlOverride>
-  </w:num>
-  <w:num w:numId="1018">
-    <w:abstractNumId w:val="99411"/>
-    <w:lvlOverride w:ilvl="0">
-      <w:startOverride w:val="1"/>
-    </w:lvlOverride>
-    <w:lvlOverride w:ilvl="1">
-      <w:startOverride w:val="1"/>
-    </w:lvlOverride>
-    <w:lvlOverride w:ilvl="2">
-      <w:startOverride w:val="1"/>
-    </w:lvlOverride>
-    <w:lvlOverride w:ilvl="3">
-      <w:startOverride w:val="1"/>
-    </w:lvlOverride>
-    <w:lvlOverride w:ilvl="4">
-      <w:startOverride w:val="1"/>
-    </w:lvlOverride>
-    <w:lvlOverride w:ilvl="5">
-      <w:startOverride w:val="1"/>
-    </w:lvlOverride>
-    <w:lvlOverride w:ilvl="6">
-      <w:startOverride w:val="1"/>
-    </w:lvlOverride>
-    <w:lvlOverride w:ilvl="7">
-      <w:startOverride w:val="1"/>
-    </w:lvlOverride>
-    <w:lvlOverride w:ilvl="8">
-      <w:startOverride w:val="1"/>
-    </w:lvlOverride>
-  </w:num>
-  <w:num w:numId="1019">
-    <w:abstractNumId w:val="99411"/>
-    <w:lvlOverride w:ilvl="0">
-      <w:startOverride w:val="1"/>
-    </w:lvlOverride>
-    <w:lvlOverride w:ilvl="1">
-      <w:startOverride w:val="1"/>
-    </w:lvlOverride>
-    <w:lvlOverride w:ilvl="2">
-      <w:startOverride w:val="1"/>
-    </w:lvlOverride>
-    <w:lvlOverride w:ilvl="3">
-      <w:startOverride w:val="1"/>
-    </w:lvlOverride>
-    <w:lvlOverride w:ilvl="4">
-      <w:startOverride w:val="1"/>
-    </w:lvlOverride>
-    <w:lvlOverride w:ilvl="5">
-      <w:startOverride w:val="1"/>
-    </w:lvlOverride>
-    <w:lvlOverride w:ilvl="6">
-      <w:startOverride w:val="1"/>
-    </w:lvlOverride>
-    <w:lvlOverride w:ilvl="7">
-      <w:startOverride w:val="1"/>
-    </w:lvlOverride>
-    <w:lvlOverride w:ilvl="8">
-      <w:startOverride w:val="1"/>
-    </w:lvlOverride>
-  </w:num>
-  <w:num w:numId="1020">
-    <w:abstractNumId w:val="99411"/>
-    <w:lvlOverride w:ilvl="0">
-      <w:startOverride w:val="1"/>
-    </w:lvlOverride>
-    <w:lvlOverride w:ilvl="1">
-      <w:startOverride w:val="1"/>
-    </w:lvlOverride>
-    <w:lvlOverride w:ilvl="2">
-      <w:startOverride w:val="1"/>
-    </w:lvlOverride>
-    <w:lvlOverride w:ilvl="3">
-      <w:startOverride w:val="1"/>
-    </w:lvlOverride>
-    <w:lvlOverride w:ilvl="4">
-      <w:startOverride w:val="1"/>
-    </w:lvlOverride>
-    <w:lvlOverride w:ilvl="5">
-      <w:startOverride w:val="1"/>
-    </w:lvlOverride>
-    <w:lvlOverride w:ilvl="6">
-      <w:startOverride w:val="1"/>
-    </w:lvlOverride>
-    <w:lvlOverride w:ilvl="7">
-      <w:startOverride w:val="1"/>
-    </w:lvlOverride>
-    <w:lvlOverride w:ilvl="8">
-      <w:startOverride w:val="1"/>
-    </w:lvlOverride>
-  </w:num>
-  <w:num w:numId="1021">
-    <w:abstractNumId w:val="99411"/>
-    <w:lvlOverride w:ilvl="0">
-      <w:startOverride w:val="1"/>
-    </w:lvlOverride>
-    <w:lvlOverride w:ilvl="1">
-      <w:startOverride w:val="1"/>
-    </w:lvlOverride>
-    <w:lvlOverride w:ilvl="2">
-      <w:startOverride w:val="1"/>
-    </w:lvlOverride>
-    <w:lvlOverride w:ilvl="3">
-      <w:startOverride w:val="1"/>
-    </w:lvlOverride>
-    <w:lvlOverride w:ilvl="4">
-      <w:startOverride w:val="1"/>
-    </w:lvlOverride>
-    <w:lvlOverride w:ilvl="5">
-      <w:startOverride w:val="1"/>
-    </w:lvlOverride>
-    <w:lvlOverride w:ilvl="6">
-      <w:startOverride w:val="1"/>
-    </w:lvlOverride>
-    <w:lvlOverride w:ilvl="7">
-      <w:startOverride w:val="1"/>
-    </w:lvlOverride>
-    <w:lvlOverride w:ilvl="8">
-      <w:startOverride w:val="1"/>
-    </w:lvlOverride>
-  </w:num>
-  <w:num w:numId="1022">
-    <w:abstractNumId w:val="99411"/>
-    <w:lvlOverride w:ilvl="0">
-      <w:startOverride w:val="1"/>
-    </w:lvlOverride>
-    <w:lvlOverride w:ilvl="1">
-      <w:startOverride w:val="1"/>
-    </w:lvlOverride>
-    <w:lvlOverride w:ilvl="2">
-      <w:startOverride w:val="1"/>
-    </w:lvlOverride>
-    <w:lvlOverride w:ilvl="3">
-      <w:startOverride w:val="1"/>
-    </w:lvlOverride>
-    <w:lvlOverride w:ilvl="4">
-      <w:startOverride w:val="1"/>
-    </w:lvlOverride>
-    <w:lvlOverride w:ilvl="5">
-      <w:startOverride w:val="1"/>
-    </w:lvlOverride>
-    <w:lvlOverride w:ilvl="6">
-      <w:startOverride w:val="1"/>
-    </w:lvlOverride>
-    <w:lvlOverride w:ilvl="7">
-      <w:startOverride w:val="1"/>
-    </w:lvlOverride>
-    <w:lvlOverride w:ilvl="8">
-      <w:startOverride w:val="1"/>
-    </w:lvlOverride>
-  </w:num>
-  <w:num w:numId="1023">
-    <w:abstractNumId w:val="99411"/>
-    <w:lvlOverride w:ilvl="0">
-      <w:startOverride w:val="1"/>
-    </w:lvlOverride>
-    <w:lvlOverride w:ilvl="1">
-      <w:startOverride w:val="1"/>
-    </w:lvlOverride>
-    <w:lvlOverride w:ilvl="2">
-      <w:startOverride w:val="1"/>
-    </w:lvlOverride>
-    <w:lvlOverride w:ilvl="3">
-      <w:startOverride w:val="1"/>
-    </w:lvlOverride>
-    <w:lvlOverride w:ilvl="4">
-      <w:startOverride w:val="1"/>
-    </w:lvlOverride>
-    <w:lvlOverride w:ilvl="5">
-      <w:startOverride w:val="1"/>
-    </w:lvlOverride>
-    <w:lvlOverride w:ilvl="6">
-      <w:startOverride w:val="1"/>
-    </w:lvlOverride>
-    <w:lvlOverride w:ilvl="7">
-      <w:startOverride w:val="1"/>
-    </w:lvlOverride>
-    <w:lvlOverride w:ilvl="8">
-      <w:startOverride w:val="1"/>
-    </w:lvlOverride>
-  </w:num>
-  <w:num w:numId="1024">
-    <w:abstractNumId w:val="99411"/>
-    <w:lvlOverride w:ilvl="0">
-      <w:startOverride w:val="1"/>
-    </w:lvlOverride>
-    <w:lvlOverride w:ilvl="1">
-      <w:startOverride w:val="1"/>
-    </w:lvlOverride>
-    <w:lvlOverride w:ilvl="2">
-      <w:startOverride w:val="1"/>
-    </w:lvlOverride>
-    <w:lvlOverride w:ilvl="3">
-      <w:startOverride w:val="1"/>
-    </w:lvlOverride>
-    <w:lvlOverride w:ilvl="4">
-      <w:startOverride w:val="1"/>
-    </w:lvlOverride>
-    <w:lvlOverride w:ilvl="5">
-      <w:startOverride w:val="1"/>
-    </w:lvlOverride>
-    <w:lvlOverride w:ilvl="6">
-      <w:startOverride w:val="1"/>
-    </w:lvlOverride>
-    <w:lvlOverride w:ilvl="7">
-      <w:startOverride w:val="1"/>
-    </w:lvlOverride>
-    <w:lvlOverride w:ilvl="8">
-      <w:startOverride w:val="1"/>
-    </w:lvlOverride>
-  </w:num>
-  <w:num w:numId="1025">
-    <w:abstractNumId w:val="99411"/>
-    <w:lvlOverride w:ilvl="0">
-      <w:startOverride w:val="1"/>
-    </w:lvlOverride>
-    <w:lvlOverride w:ilvl="1">
-      <w:startOverride w:val="1"/>
-    </w:lvlOverride>
-    <w:lvlOverride w:ilvl="2">
-      <w:startOverride w:val="1"/>
-    </w:lvlOverride>
-    <w:lvlOverride w:ilvl="3">
-      <w:startOverride w:val="1"/>
-    </w:lvlOverride>
-    <w:lvlOverride w:ilvl="4">
-      <w:startOverride w:val="1"/>
-    </w:lvlOverride>
-    <w:lvlOverride w:ilvl="5">
-      <w:startOverride w:val="1"/>
-    </w:lvlOverride>
-    <w:lvlOverride w:ilvl="6">
-      <w:startOverride w:val="1"/>
-    </w:lvlOverride>
-    <w:lvlOverride w:ilvl="7">
-      <w:startOverride w:val="1"/>
-    </w:lvlOverride>
-    <w:lvlOverride w:ilvl="8">
-      <w:startOverride w:val="1"/>
-    </w:lvlOverride>
-  </w:num>
-  <w:num w:numId="1026">
-    <w:abstractNumId w:val="99411"/>
-    <w:lvlOverride w:ilvl="0">
-      <w:startOverride w:val="1"/>
-    </w:lvlOverride>
-    <w:lvlOverride w:ilvl="1">
-      <w:startOverride w:val="1"/>
-    </w:lvlOverride>
-    <w:lvlOverride w:ilvl="2">
-      <w:startOverride w:val="1"/>
-    </w:lvlOverride>
-    <w:lvlOverride w:ilvl="3">
-      <w:startOverride w:val="1"/>
-    </w:lvlOverride>
-    <w:lvlOverride w:ilvl="4">
-      <w:startOverride w:val="1"/>
-    </w:lvlOverride>
-    <w:lvlOverride w:ilvl="5">
-      <w:startOverride w:val="1"/>
-    </w:lvlOverride>
-    <w:lvlOverride w:ilvl="6">
-      <w:startOverride w:val="1"/>
-    </w:lvlOverride>
-    <w:lvlOverride w:ilvl="7">
-      <w:startOverride w:val="1"/>
-    </w:lvlOverride>
-    <w:lvlOverride w:ilvl="8">
-      <w:startOverride w:val="1"/>
-    </w:lvlOverride>
-  </w:num>
-  <w:num w:numId="1027">
-    <w:abstractNumId w:val="99411"/>
-    <w:lvlOverride w:ilvl="0">
-      <w:startOverride w:val="1"/>
-    </w:lvlOverride>
-    <w:lvlOverride w:ilvl="1">
-      <w:startOverride w:val="1"/>
-    </w:lvlOverride>
-    <w:lvlOverride w:ilvl="2">
-      <w:startOverride w:val="1"/>
-    </w:lvlOverride>
-    <w:lvlOverride w:ilvl="3">
-      <w:startOverride w:val="1"/>
-    </w:lvlOverride>
-    <w:lvlOverride w:ilvl="4">
-      <w:startOverride w:val="1"/>
-    </w:lvlOverride>
-    <w:lvlOverride w:ilvl="5">
-      <w:startOverride w:val="1"/>
-    </w:lvlOverride>
-    <w:lvlOverride w:ilvl="6">
-      <w:startOverride w:val="1"/>
-    </w:lvlOverride>
-    <w:lvlOverride w:ilvl="7">
-      <w:startOverride w:val="1"/>
-    </w:lvlOverride>
-    <w:lvlOverride w:ilvl="8">
-      <w:startOverride w:val="1"/>
-    </w:lvlOverride>
-  </w:num>
-  <w:num w:numId="1028">
-    <w:abstractNumId w:val="99411"/>
-    <w:lvlOverride w:ilvl="0">
-      <w:startOverride w:val="1"/>
-    </w:lvlOverride>
-    <w:lvlOverride w:ilvl="1">
-      <w:startOverride w:val="1"/>
-    </w:lvlOverride>
-    <w:lvlOverride w:ilvl="2">
-      <w:startOverride w:val="1"/>
-    </w:lvlOverride>
-    <w:lvlOverride w:ilvl="3">
-      <w:startOverride w:val="1"/>
-    </w:lvlOverride>
-    <w:lvlOverride w:ilvl="4">
-      <w:startOverride w:val="1"/>
-    </w:lvlOverride>
-    <w:lvlOverride w:ilvl="5">
-      <w:startOverride w:val="1"/>
-    </w:lvlOverride>
-    <w:lvlOverride w:ilvl="6">
-      <w:startOverride w:val="1"/>
-    </w:lvlOverride>
-    <w:lvlOverride w:ilvl="7">
-      <w:startOverride w:val="1"/>
-    </w:lvlOverride>
-    <w:lvlOverride w:ilvl="8">
-      <w:startOverride w:val="1"/>
-    </w:lvlOverride>
-  </w:num>
-  <w:num w:numId="1029">
-    <w:abstractNumId w:val="99411"/>
-    <w:lvlOverride w:ilvl="0">
-      <w:startOverride w:val="1"/>
-    </w:lvlOverride>
-    <w:lvlOverride w:ilvl="1">
-      <w:startOverride w:val="1"/>
-    </w:lvlOverride>
-    <w:lvlOverride w:ilvl="2">
-      <w:startOverride w:val="1"/>
-    </w:lvlOverride>
-    <w:lvlOverride w:ilvl="3">
-      <w:startOverride w:val="1"/>
-    </w:lvlOverride>
-    <w:lvlOverride w:ilvl="4">
-      <w:startOverride w:val="1"/>
-    </w:lvlOverride>
-    <w:lvlOverride w:ilvl="5">
-      <w:startOverride w:val="1"/>
-    </w:lvlOverride>
-    <w:lvlOverride w:ilvl="6">
-      <w:startOverride w:val="1"/>
-    </w:lvlOverride>
-    <w:lvlOverride w:ilvl="7">
-      <w:startOverride w:val="1"/>
-    </w:lvlOverride>
-    <w:lvlOverride w:ilvl="8">
-      <w:startOverride w:val="1"/>
-    </w:lvlOverride>
-  </w:num>
-  <w:num w:numId="1030">
-    <w:abstractNumId w:val="99411"/>
-    <w:lvlOverride w:ilvl="0">
-      <w:startOverride w:val="1"/>
-    </w:lvlOverride>
-    <w:lvlOverride w:ilvl="1">
-      <w:startOverride w:val="1"/>
-    </w:lvlOverride>
-    <w:lvlOverride w:ilvl="2">
-      <w:startOverride w:val="1"/>
-    </w:lvlOverride>
-    <w:lvlOverride w:ilvl="3">
-      <w:startOverride w:val="1"/>
-    </w:lvlOverride>
-    <w:lvlOverride w:ilvl="4">
-      <w:startOverride w:val="1"/>
-    </w:lvlOverride>
-    <w:lvlOverride w:ilvl="5">
-      <w:startOverride w:val="1"/>
-    </w:lvlOverride>
-    <w:lvlOverride w:ilvl="6">
-      <w:startOverride w:val="1"/>
-    </w:lvlOverride>
-    <w:lvlOverride w:ilvl="7">
-      <w:startOverride w:val="1"/>
-    </w:lvlOverride>
-    <w:lvlOverride w:ilvl="8">
-      <w:startOverride w:val="1"/>
-    </w:lvlOverride>
-  </w:num>
-  <w:num w:numId="1031">
-    <w:abstractNumId w:val="99411"/>
-    <w:lvlOverride w:ilvl="0">
-      <w:startOverride w:val="1"/>
-    </w:lvlOverride>
-    <w:lvlOverride w:ilvl="1">
-      <w:startOverride w:val="1"/>
-    </w:lvlOverride>
-    <w:lvlOverride w:ilvl="2">
-      <w:startOverride w:val="1"/>
-    </w:lvlOverride>
-    <w:lvlOverride w:ilvl="3">
-      <w:startOverride w:val="1"/>
-    </w:lvlOverride>
-    <w:lvlOverride w:ilvl="4">
-      <w:startOverride w:val="1"/>
-    </w:lvlOverride>
-    <w:lvlOverride w:ilvl="5">
-      <w:startOverride w:val="1"/>
-    </w:lvlOverride>
-    <w:lvlOverride w:ilvl="6">
-      <w:startOverride w:val="1"/>
-    </w:lvlOverride>
-    <w:lvlOverride w:ilvl="7">
-      <w:startOverride w:val="1"/>
-    </w:lvlOverride>
-    <w:lvlOverride w:ilvl="8">
-      <w:startOverride w:val="1"/>
-    </w:lvlOverride>
-  </w:num>
-  <w:num w:numId="1032">
     <w:abstractNumId w:val="99411"/>
     <w:lvlOverride w:ilvl="0">
       <w:startOverride w:val="1"/>

</xml_diff>

<commit_message>
v4.4.0: code review fixes — dead labels, brand colors, Lua filter
Fixes from end-to-end code review (@oracle):

- H2: Removed dead labels (lg@step, lg@action, lg@actualresult) from
  testbook.cls and testbook-pandoc.lua — leftovers from old tabular format
- M2: testresultbadge now uses Huawei brand colors (tipbg/tipfg for Pass,
  huaweired for Fail, warningbg/warningfg for Blocked, codebg/ruleblack
  for Untested) instead of raw xcolor mixes
- H1+H3: Lua filter cell_to_md replaced with parse_latex_blocks-aware
  version — preserves bold, inlinecode, menu formatting in DOCX/MD/HTML
- M3: testprocedure handler now preserves non-step content (images, code
  blocks, callouts) between teststep commands
- M1: Tested tabularx for testsummary but reverted (scanning issue inside
  \newenvironment) — kept dimexpr approach
</commit_message>
<xml_diff>
--- a/examples/testbook/en/main.docx
+++ b/examples/testbook/en/main.docx
@@ -70,7 +70,7 @@
         <w:pStyle w:val="CoverMeta"/>
       </w:pPr>
       <w:r>
-        <w:t xml:space="preserve">v2.1.0 — 2026-09-13 11:23</w:t>
+        <w:t xml:space="preserve">v2.1.0 — 2026-09-13 11:50</w:t>
       </w:r>
     </w:p>
     <w:p>
@@ -1320,6 +1320,10 @@
               <w:jc w:val="left"/>
             </w:pPr>
             <w:r>
+              <w:rPr>
+                <w:bCs/>
+                <w:b/>
+              </w:rPr>
               <w:t xml:space="preserve">Pass</w:t>
             </w:r>
           </w:p>
@@ -1358,6 +1362,10 @@
               <w:jc w:val="left"/>
             </w:pPr>
             <w:r>
+              <w:rPr>
+                <w:bCs/>
+                <w:b/>
+              </w:rPr>
               <w:t xml:space="preserve">Pass</w:t>
             </w:r>
           </w:p>
@@ -1396,6 +1404,10 @@
               <w:jc w:val="left"/>
             </w:pPr>
             <w:r>
+              <w:rPr>
+                <w:bCs/>
+                <w:b/>
+              </w:rPr>
               <w:t xml:space="preserve">Pass</w:t>
             </w:r>
           </w:p>
@@ -1434,6 +1446,10 @@
               <w:jc w:val="left"/>
             </w:pPr>
             <w:r>
+              <w:rPr>
+                <w:bCs/>
+                <w:b/>
+              </w:rPr>
               <w:t xml:space="preserve">Pass</w:t>
             </w:r>
           </w:p>
@@ -1472,6 +1488,10 @@
               <w:jc w:val="left"/>
             </w:pPr>
             <w:r>
+              <w:rPr>
+                <w:bCs/>
+                <w:b/>
+              </w:rPr>
               <w:t xml:space="preserve">Pass</w:t>
             </w:r>
           </w:p>
@@ -1510,6 +1530,10 @@
               <w:jc w:val="left"/>
             </w:pPr>
             <w:r>
+              <w:rPr>
+                <w:bCs/>
+                <w:b/>
+              </w:rPr>
               <w:t xml:space="preserve">Pass</w:t>
             </w:r>
           </w:p>
@@ -1548,6 +1572,10 @@
               <w:jc w:val="left"/>
             </w:pPr>
             <w:r>
+              <w:rPr>
+                <w:bCs/>
+                <w:b/>
+              </w:rPr>
               <w:t xml:space="preserve">Pass</w:t>
             </w:r>
           </w:p>
@@ -1586,6 +1614,10 @@
               <w:jc w:val="left"/>
             </w:pPr>
             <w:r>
+              <w:rPr>
+                <w:bCs/>
+                <w:b/>
+              </w:rPr>
               <w:t xml:space="preserve">Pass</w:t>
             </w:r>
           </w:p>
@@ -1624,6 +1656,10 @@
               <w:jc w:val="left"/>
             </w:pPr>
             <w:r>
+              <w:rPr>
+                <w:bCs/>
+                <w:b/>
+              </w:rPr>
               <w:t xml:space="preserve">Pass</w:t>
             </w:r>
           </w:p>
@@ -1662,6 +1698,10 @@
               <w:jc w:val="left"/>
             </w:pPr>
             <w:r>
+              <w:rPr>
+                <w:bCs/>
+                <w:b/>
+              </w:rPr>
               <w:t xml:space="preserve">Pass</w:t>
             </w:r>
           </w:p>
@@ -1729,19 +1769,7 @@
         <w:pStyle w:val="Definition"/>
       </w:pPr>
       <w:r>
-        <w:t xml:space="preserve">Confirm that the MapReduce Service (MRS) cluster is deployed</w:t>
-      </w:r>
-      <w:r>
-        <w:t xml:space="preserve"> </w:t>
-      </w:r>
-      <w:r>
-        <w:t xml:space="preserve">with the required components (HDFS, YARN, Spark, Hive) and all nodes</w:t>
-      </w:r>
-      <w:r>
-        <w:t xml:space="preserve"> </w:t>
-      </w:r>
-      <w:r>
-        <w:t xml:space="preserve">report a healthy status.</w:t>
+        <w:t xml:space="preserve">Confirm that the MapReduce Service (MRS) cluster is deployed with the required components (HDFS, YARN, Spark, Hive) and all nodes report a healthy status.</w:t>
       </w:r>
     </w:p>
     <w:p>
@@ -1750,46 +1778,6 @@
       </w:pPr>
       <w:r>
         <w:t xml:space="preserve">Prerequisites</w:t>
-      </w:r>
-    </w:p>
-    <w:p>
-      <w:pPr>
-        <w:pStyle w:val="Definition"/>
-      </w:pPr>
-      <w:r>
-        <w:t xml:space="preserve">testlist</w:t>
-      </w:r>
-      <w:r>
-        <w:t xml:space="preserve"> </w:t>
-      </w:r>
-      <w:r>
-        <w:t xml:space="preserve">Terraform infrastructure apply completed successfully.</w:t>
-      </w:r>
-      <w:r>
-        <w:t xml:space="preserve"> </w:t>
-      </w:r>
-      <w:r>
-        <w:t xml:space="preserve">MRS cluster ID is available in the Terraform output.</w:t>
-      </w:r>
-      <w:r>
-        <w:t xml:space="preserve"> </w:t>
-      </w:r>
-      <w:r>
-        <w:t xml:space="preserve">IAM user has MRS_Viewer or higher role.</w:t>
-      </w:r>
-      <w:r>
-        <w:t xml:space="preserve"> </w:t>
-      </w:r>
-      <w:r>
-        <w:t xml:space="preserve">testlist</w:t>
-      </w:r>
-    </w:p>
-    <w:p>
-      <w:pPr>
-        <w:pStyle w:val="DefinitionTerm"/>
-      </w:pPr>
-      <w:r>
-        <w:t xml:space="preserve">Procedure</w:t>
       </w:r>
     </w:p>
     <w:p>
@@ -1801,67 +1789,23 @@
         <w:pStyle w:val="Compact"/>
       </w:pPr>
       <w:r>
-        <w:t xml:space="preserve">Log in to the Huawei Cloud Console</w:t>
-      </w:r>
-    </w:p>
-    <w:p>
-      <w:pPr>
-        <w:numPr>
-          <w:ilvl w:val="0"/>
-          <w:numId w:val="1003"/>
-        </w:numPr>
-        <w:pStyle w:val="Compact"/>
-      </w:pPr>
-      <w:r>
-        <w:t xml:space="preserve">Navigate to Console, MapReduce Service, Clusters</w:t>
-      </w:r>
-    </w:p>
-    <w:p>
-      <w:pPr>
-        <w:numPr>
-          <w:ilvl w:val="0"/>
-          <w:numId w:val="1003"/>
-        </w:numPr>
-        <w:pStyle w:val="Compact"/>
-      </w:pPr>
-      <w:r>
-        <w:t xml:space="preserve">Locate cluster mrs-poc-cluster</w:t>
-      </w:r>
-    </w:p>
-    <w:p>
-      <w:pPr>
-        <w:numPr>
-          <w:ilvl w:val="0"/>
-          <w:numId w:val="1003"/>
-        </w:numPr>
-        <w:pStyle w:val="Compact"/>
-      </w:pPr>
-      <w:r>
-        <w:t xml:space="preserve">Verify cluster status</w:t>
-      </w:r>
-    </w:p>
-    <w:p>
-      <w:pPr>
-        <w:numPr>
-          <w:ilvl w:val="0"/>
-          <w:numId w:val="1003"/>
-        </w:numPr>
-        <w:pStyle w:val="Compact"/>
-      </w:pPr>
-      <w:r>
-        <w:t xml:space="preserve">Review Component tab</w:t>
-      </w:r>
-    </w:p>
-    <w:p>
-      <w:pPr>
-        <w:numPr>
-          <w:ilvl w:val="0"/>
-          <w:numId w:val="1003"/>
-        </w:numPr>
-        <w:pStyle w:val="Compact"/>
-      </w:pPr>
-      <w:r>
-        <w:t xml:space="preserve">Review Node tab</w:t>
+        <w:t xml:space="preserve">Terraform infrastructure apply completed successfully. - MRS cluster ID is available in the Terraform output. - IAM user has</w:t>
+      </w:r>
+      <w:r>
+        <w:t xml:space="preserve"> </w:t>
+      </w:r>
+      <w:r>
+        <w:rPr>
+          <w:bCs/>
+          <w:b/>
+        </w:rPr>
+        <w:t xml:space="preserve">MRS_Viewer</w:t>
+      </w:r>
+      <w:r>
+        <w:t xml:space="preserve"> </w:t>
+      </w:r>
+      <w:r>
+        <w:t xml:space="preserve">or higher role.</w:t>
       </w:r>
     </w:p>
     <w:p>
@@ -1869,158 +1813,94 @@
         <w:pStyle w:val="DefinitionTerm"/>
       </w:pPr>
       <w:r>
+        <w:t xml:space="preserve">Procedure</w:t>
+      </w:r>
+    </w:p>
+    <w:p>
+      <w:pPr>
+        <w:pStyle w:val="Definition"/>
+      </w:pPr>
+      <w:r>
+        <w:t xml:space="preserve">1. Log in to the Huawei Cloud Console 2. Navigate to</w:t>
+      </w:r>
+      <w:r>
+        <w:t xml:space="preserve"> </w:t>
+      </w:r>
+      <w:r>
+        <w:rPr>
+          <w:bCs/>
+          <w:b/>
+        </w:rPr>
+        <w:t xml:space="preserve">Console</w:t>
+      </w:r>
+      <w:r>
+        <w:t xml:space="preserve"> </w:t>
+      </w:r>
+      <w:r>
+        <w:rPr>
+          <w:bCs/>
+          <w:b/>
+        </w:rPr>
+        <w:t xml:space="preserve">→</w:t>
+      </w:r>
+      <w:r>
+        <w:t xml:space="preserve"> </w:t>
+      </w:r>
+      <w:r>
+        <w:rPr>
+          <w:bCs/>
+          <w:b/>
+        </w:rPr>
+        <w:t xml:space="preserve">MapReduce Service</w:t>
+      </w:r>
+      <w:r>
+        <w:t xml:space="preserve"> </w:t>
+      </w:r>
+      <w:r>
+        <w:rPr>
+          <w:bCs/>
+          <w:b/>
+        </w:rPr>
+        <w:t xml:space="preserve">→</w:t>
+      </w:r>
+      <w:r>
+        <w:t xml:space="preserve"> </w:t>
+      </w:r>
+      <w:r>
+        <w:rPr>
+          <w:bCs/>
+          <w:b/>
+        </w:rPr>
+        <w:t xml:space="preserve">Clusters</w:t>
+      </w:r>
+      <w:r>
+        <w:t xml:space="preserve"> </w:t>
+      </w:r>
+      <w:r>
+        <w:t xml:space="preserve">3. Locate cluster</w:t>
+      </w:r>
+      <w:r>
+        <w:t xml:space="preserve"> </w:t>
+      </w:r>
+      <w:r>
+        <w:rPr>
+          <w:rStyle w:val="VerbatimChar"/>
+        </w:rPr>
+        <w:t xml:space="preserve">mrs-poc-cluster</w:t>
+      </w:r>
+      <w:r>
+        <w:t xml:space="preserve"> </w:t>
+      </w:r>
+      <w:r>
+        <w:t xml:space="preserve">4. Verify cluster status 5. Review Component tab 6. Review Node tab</w:t>
+      </w:r>
+    </w:p>
+    <w:p>
+      <w:pPr>
+        <w:pStyle w:val="DefinitionTerm"/>
+      </w:pPr>
+      <w:r>
         <w:t xml:space="preserve">Expected Result</w:t>
-      </w:r>
-    </w:p>
-    <w:p>
-      <w:pPr>
-        <w:pStyle w:val="Definition"/>
-      </w:pPr>
-      <w:r>
-        <w:t xml:space="preserve">testlist</w:t>
-      </w:r>
-      <w:r>
-        <w:t xml:space="preserve"> </w:t>
-      </w:r>
-      <w:r>
-        <w:t xml:space="preserve">Cluster status is Running.</w:t>
-      </w:r>
-      <w:r>
-        <w:t xml:space="preserve"> </w:t>
-      </w:r>
-      <w:r>
-        <w:t xml:space="preserve">All four components (HDFS, YARN, Spark, Hive) are listed with status Normal.</w:t>
-      </w:r>
-      <w:r>
-        <w:t xml:space="preserve"> </w:t>
-      </w:r>
-      <w:r>
-        <w:t xml:space="preserve">All nodes report status Running with no alarms.</w:t>
-      </w:r>
-      <w:r>
-        <w:t xml:space="preserve"> </w:t>
-      </w:r>
-      <w:r>
-        <w:t xml:space="preserve">testlist</w:t>
-      </w:r>
-    </w:p>
-    <w:p>
-      <w:pPr>
-        <w:pStyle w:val="DefinitionTerm"/>
-      </w:pPr>
-      <w:r>
-        <w:t xml:space="preserve">Test Result</w:t>
-      </w:r>
-    </w:p>
-    <w:p>
-      <w:pPr>
-        <w:pStyle w:val="Definition"/>
-      </w:pPr>
-      <w:r>
-        <w:t xml:space="preserve">Pass</w:t>
-      </w:r>
-    </w:p>
-    <w:p>
-      <w:pPr>
-        <w:pStyle w:val="DefinitionTerm"/>
-      </w:pPr>
-      <w:r>
-        <w:t xml:space="preserve">Remarks</w:t>
-      </w:r>
-    </w:p>
-    <w:p>
-      <w:pPr>
-        <w:pStyle w:val="Definition"/>
-      </w:pPr>
-      <w:r>
-        <w:t xml:space="preserve">If any component shows Abnormal, check the MRS alarm page before marking the result.</w:t>
-      </w:r>
-    </w:p>
-    <w:p>
-      <w:pPr>
-        <w:pStyle w:val="Heading2"/>
-      </w:pPr>
-      <w:r>
-        <w:rPr>
-          <w:rStyle w:val="SectionNumber"/>
-        </w:rPr>
-        <w:t xml:space="preserve">0.2</w:t>
-      </w:r>
-      <w:r>
-        <w:tab/>
-      </w:r>
-      <w:r>
-        <w:t xml:space="preserve">TC-002: Verify OBS bucket creation and accessibility</w:t>
-      </w:r>
-    </w:p>
-    <w:p>
-      <w:pPr>
-        <w:pStyle w:val="DefinitionTerm"/>
-      </w:pPr>
-      <w:r>
-        <w:t xml:space="preserve">Objective</w:t>
-      </w:r>
-    </w:p>
-    <w:p>
-      <w:pPr>
-        <w:pStyle w:val="Definition"/>
-      </w:pPr>
-      <w:r>
-        <w:t xml:space="preserve">Confirm that the Object Storage Service (OBS) bucket used</w:t>
-      </w:r>
-      <w:r>
-        <w:t xml:space="preserve"> </w:t>
-      </w:r>
-      <w:r>
-        <w:t xml:space="preserve">for the POC data lake is created, has the correct storage class, and</w:t>
-      </w:r>
-      <w:r>
-        <w:t xml:space="preserve"> </w:t>
-      </w:r>
-      <w:r>
-        <w:t xml:space="preserve">is accessible with the designated IAM policy.</w:t>
-      </w:r>
-    </w:p>
-    <w:p>
-      <w:pPr>
-        <w:pStyle w:val="DefinitionTerm"/>
-      </w:pPr>
-      <w:r>
-        <w:t xml:space="preserve">Prerequisites</w:t>
-      </w:r>
-    </w:p>
-    <w:p>
-      <w:pPr>
-        <w:pStyle w:val="Definition"/>
-      </w:pPr>
-      <w:r>
-        <w:t xml:space="preserve">testlist</w:t>
-      </w:r>
-      <w:r>
-        <w:t xml:space="preserve"> </w:t>
-      </w:r>
-      <w:r>
-        <w:t xml:space="preserve">OBS bucket name is defined in the Terraform configuration.</w:t>
-      </w:r>
-      <w:r>
-        <w:t xml:space="preserve"> </w:t>
-      </w:r>
-      <w:r>
-        <w:t xml:space="preserve">IAM policy granting read/write access to the bucket is attached to the test user.</w:t>
-      </w:r>
-      <w:r>
-        <w:t xml:space="preserve"> </w:t>
-      </w:r>
-      <w:r>
-        <w:t xml:space="preserve">testlist</w:t>
-      </w:r>
-    </w:p>
-    <w:p>
-      <w:pPr>
-        <w:pStyle w:val="DefinitionTerm"/>
-      </w:pPr>
-      <w:r>
-        <w:t xml:space="preserve">Procedure</w:t>
       </w:r>
     </w:p>
     <w:p>
@@ -2032,79 +1912,49 @@
         <w:pStyle w:val="Compact"/>
       </w:pPr>
       <w:r>
-        <w:t xml:space="preserve">Log in to the Console</w:t>
-      </w:r>
-    </w:p>
-    <w:p>
-      <w:pPr>
-        <w:numPr>
-          <w:ilvl w:val="0"/>
-          <w:numId w:val="1004"/>
-        </w:numPr>
-        <w:pStyle w:val="Compact"/>
-      </w:pPr>
-      <w:r>
-        <w:t xml:space="preserve">Navigate to Console, Object Storage Service</w:t>
-      </w:r>
-    </w:p>
-    <w:p>
-      <w:pPr>
-        <w:numPr>
-          <w:ilvl w:val="0"/>
-          <w:numId w:val="1004"/>
-        </w:numPr>
-        <w:pStyle w:val="Compact"/>
-      </w:pPr>
-      <w:r>
-        <w:t xml:space="preserve">Locate the bucket (e.g. poc-datalake-raw)</w:t>
-      </w:r>
-    </w:p>
-    <w:p>
-      <w:pPr>
-        <w:numPr>
-          <w:ilvl w:val="0"/>
-          <w:numId w:val="1004"/>
-        </w:numPr>
-        <w:pStyle w:val="Compact"/>
-      </w:pPr>
-      <w:r>
-        <w:t xml:space="preserve">Verify the storage class is Standard</w:t>
-      </w:r>
-    </w:p>
-    <w:p>
-      <w:pPr>
-        <w:numPr>
-          <w:ilvl w:val="0"/>
-          <w:numId w:val="1004"/>
-        </w:numPr>
-        <w:pStyle w:val="Compact"/>
-      </w:pPr>
-      <w:r>
-        <w:t xml:space="preserve">Upload a test file (test-upload.txt) to the bucket</w:t>
-      </w:r>
-    </w:p>
-    <w:p>
-      <w:pPr>
-        <w:numPr>
-          <w:ilvl w:val="0"/>
-          <w:numId w:val="1004"/>
-        </w:numPr>
-        <w:pStyle w:val="Compact"/>
-      </w:pPr>
-      <w:r>
-        <w:t xml:space="preserve">Download the file and compare its content with the original</w:t>
-      </w:r>
-    </w:p>
-    <w:p>
-      <w:pPr>
-        <w:numPr>
-          <w:ilvl w:val="0"/>
-          <w:numId w:val="1004"/>
-        </w:numPr>
-        <w:pStyle w:val="Compact"/>
-      </w:pPr>
-      <w:r>
-        <w:t xml:space="preserve">Delete the test file</w:t>
+        <w:t xml:space="preserve">Cluster status is</w:t>
+      </w:r>
+      <w:r>
+        <w:t xml:space="preserve"> </w:t>
+      </w:r>
+      <w:r>
+        <w:rPr>
+          <w:bCs/>
+          <w:b/>
+        </w:rPr>
+        <w:t xml:space="preserve">Running</w:t>
+      </w:r>
+      <w:r>
+        <w:t xml:space="preserve">. - All four components (HDFS, YARN, Spark, Hive) are listed with status</w:t>
+      </w:r>
+      <w:r>
+        <w:t xml:space="preserve"> </w:t>
+      </w:r>
+      <w:r>
+        <w:rPr>
+          <w:bCs/>
+          <w:b/>
+        </w:rPr>
+        <w:t xml:space="preserve">Normal</w:t>
+      </w:r>
+      <w:r>
+        <w:t xml:space="preserve">. - All nodes report status</w:t>
+      </w:r>
+      <w:r>
+        <w:t xml:space="preserve"> </w:t>
+      </w:r>
+      <w:r>
+        <w:rPr>
+          <w:bCs/>
+          <w:b/>
+        </w:rPr>
+        <w:t xml:space="preserve">Running</w:t>
+      </w:r>
+      <w:r>
+        <w:t xml:space="preserve"> </w:t>
+      </w:r>
+      <w:r>
+        <w:t xml:space="preserve">with no alarms.</w:t>
       </w:r>
     </w:p>
     <w:p>
@@ -2112,7 +1962,7 @@
         <w:pStyle w:val="DefinitionTerm"/>
       </w:pPr>
       <w:r>
-        <w:t xml:space="preserve">Expected Result</w:t>
+        <w:t xml:space="preserve">Test Result</w:t>
       </w:r>
     </w:p>
     <w:p>
@@ -2120,37 +1970,11 @@
         <w:pStyle w:val="Definition"/>
       </w:pPr>
       <w:r>
-        <w:t xml:space="preserve">testlist</w:t>
-      </w:r>
-      <w:r>
-        <w:t xml:space="preserve"> </w:t>
-      </w:r>
-      <w:r>
-        <w:t xml:space="preserve">Bucket exists with storage class Standard.</w:t>
-      </w:r>
-      <w:r>
-        <w:t xml:space="preserve"> </w:t>
-      </w:r>
-      <w:r>
-        <w:t xml:space="preserve">File upload completes without error.</w:t>
-      </w:r>
-      <w:r>
-        <w:t xml:space="preserve"> </w:t>
-      </w:r>
-      <w:r>
-        <w:t xml:space="preserve">Downloaded file content matches the original.</w:t>
-      </w:r>
-      <w:r>
-        <w:t xml:space="preserve"> </w:t>
-      </w:r>
-      <w:r>
-        <w:t xml:space="preserve">File deletion succeeds.</w:t>
-      </w:r>
-      <w:r>
-        <w:t xml:space="preserve"> </w:t>
-      </w:r>
-      <w:r>
-        <w:t xml:space="preserve">testlist</w:t>
+        <w:rPr>
+          <w:bCs/>
+          <w:b/>
+        </w:rPr>
+        <w:t xml:space="preserve">Pass</w:t>
       </w:r>
     </w:p>
     <w:p>
@@ -2158,7 +1982,7 @@
         <w:pStyle w:val="DefinitionTerm"/>
       </w:pPr>
       <w:r>
-        <w:t xml:space="preserve">Test Result</w:t>
+        <w:t xml:space="preserve">Remarks</w:t>
       </w:r>
     </w:p>
     <w:p>
@@ -2166,7 +1990,37 @@
         <w:pStyle w:val="Definition"/>
       </w:pPr>
       <w:r>
-        <w:t xml:space="preserve">Pass</w:t>
+        <w:t xml:space="preserve">If any component shows</w:t>
+      </w:r>
+      <w:r>
+        <w:t xml:space="preserve"> </w:t>
+      </w:r>
+      <w:r>
+        <w:rPr>
+          <w:bCs/>
+          <w:b/>
+        </w:rPr>
+        <w:t xml:space="preserve">Abnormal</w:t>
+      </w:r>
+      <w:r>
+        <w:t xml:space="preserve">, check the MRS alarm page before marking the result.</w:t>
+      </w:r>
+    </w:p>
+    <w:p>
+      <w:pPr>
+        <w:pStyle w:val="Heading2"/>
+      </w:pPr>
+      <w:r>
+        <w:rPr>
+          <w:rStyle w:val="SectionNumber"/>
+        </w:rPr>
+        <w:t xml:space="preserve">0.2</w:t>
+      </w:r>
+      <w:r>
+        <w:tab/>
+      </w:r>
+      <w:r>
+        <w:t xml:space="preserve">TC-002: Verify OBS bucket creation and accessibility</w:t>
       </w:r>
     </w:p>
     <w:p>
@@ -2174,7 +2028,7 @@
         <w:pStyle w:val="DefinitionTerm"/>
       </w:pPr>
       <w:r>
-        <w:t xml:space="preserve">Remarks</w:t>
+        <w:t xml:space="preserve">Objective</w:t>
       </w:r>
     </w:p>
     <w:p>
@@ -2182,24 +2036,7 @@
         <w:pStyle w:val="Definition"/>
       </w:pPr>
       <w:r>
-        <w:t xml:space="preserve">OBS eventual consistency may cause a brief delay before a newly uploaded object appears in listings.</w:t>
-      </w:r>
-    </w:p>
-    <w:p>
-      <w:pPr>
-        <w:pStyle w:val="Heading2"/>
-      </w:pPr>
-      <w:r>
-        <w:rPr>
-          <w:rStyle w:val="SectionNumber"/>
-        </w:rPr>
-        <w:t xml:space="preserve">0.3</w:t>
-      </w:r>
-      <w:r>
-        <w:tab/>
-      </w:r>
-      <w:r>
-        <w:t xml:space="preserve">TC-003: Verify VPC and security group configuration</w:t>
+        <w:t xml:space="preserve">Confirm that the Object Storage Service (OBS) bucket used for the POC data lake is created, has the correct storage class, and is accessible with the designated IAM policy.</w:t>
       </w:r>
     </w:p>
     <w:p>
@@ -2207,69 +2044,7 @@
         <w:pStyle w:val="DefinitionTerm"/>
       </w:pPr>
       <w:r>
-        <w:t xml:space="preserve">Objective</w:t>
-      </w:r>
-    </w:p>
-    <w:p>
-      <w:pPr>
-        <w:pStyle w:val="Definition"/>
-      </w:pPr>
-      <w:r>
-        <w:t xml:space="preserve">Confirm that the VPC, subnet, and security groups are</w:t>
-      </w:r>
-      <w:r>
-        <w:t xml:space="preserve"> </w:t>
-      </w:r>
-      <w:r>
-        <w:t xml:space="preserve">configured according to the network architecture diagram, with the</w:t>
-      </w:r>
-      <w:r>
-        <w:t xml:space="preserve"> </w:t>
-      </w:r>
-      <w:r>
-        <w:t xml:space="preserve">correct CIDR blocks and inbound/outbound rules.</w:t>
-      </w:r>
-    </w:p>
-    <w:p>
-      <w:pPr>
-        <w:pStyle w:val="DefinitionTerm"/>
-      </w:pPr>
-      <w:r>
         <w:t xml:space="preserve">Prerequisites</w:t>
-      </w:r>
-    </w:p>
-    <w:p>
-      <w:pPr>
-        <w:pStyle w:val="Definition"/>
-      </w:pPr>
-      <w:r>
-        <w:t xml:space="preserve">testlist</w:t>
-      </w:r>
-      <w:r>
-        <w:t xml:space="preserve"> </w:t>
-      </w:r>
-      <w:r>
-        <w:t xml:space="preserve">VPC and subnet IDs are available from the Terraform output.</w:t>
-      </w:r>
-      <w:r>
-        <w:t xml:space="preserve"> </w:t>
-      </w:r>
-      <w:r>
-        <w:t xml:space="preserve">Security group names are documented in the solution architecture.</w:t>
-      </w:r>
-      <w:r>
-        <w:t xml:space="preserve"> </w:t>
-      </w:r>
-      <w:r>
-        <w:t xml:space="preserve">testlist</w:t>
-      </w:r>
-    </w:p>
-    <w:p>
-      <w:pPr>
-        <w:pStyle w:val="DefinitionTerm"/>
-      </w:pPr>
-      <w:r>
-        <w:t xml:space="preserve">Procedure</w:t>
       </w:r>
     </w:p>
     <w:p>
@@ -2281,67 +2056,374 @@
         <w:pStyle w:val="Compact"/>
       </w:pPr>
       <w:r>
-        <w:t xml:space="preserve">Log in to the Console</w:t>
+        <w:t xml:space="preserve">OBS bucket name is defined in the Terraform configuration. - IAM policy granting read/write access to the bucket is attached to the test user.</w:t>
+      </w:r>
+    </w:p>
+    <w:p>
+      <w:pPr>
+        <w:pStyle w:val="DefinitionTerm"/>
+      </w:pPr>
+      <w:r>
+        <w:t xml:space="preserve">Procedure</w:t>
+      </w:r>
+    </w:p>
+    <w:p>
+      <w:pPr>
+        <w:pStyle w:val="Definition"/>
+      </w:pPr>
+      <w:r>
+        <w:t xml:space="preserve">1. Log in to the Console 2. Navigate to</w:t>
+      </w:r>
+      <w:r>
+        <w:t xml:space="preserve"> </w:t>
+      </w:r>
+      <w:r>
+        <w:rPr>
+          <w:bCs/>
+          <w:b/>
+        </w:rPr>
+        <w:t xml:space="preserve">Console</w:t>
+      </w:r>
+      <w:r>
+        <w:t xml:space="preserve"> </w:t>
+      </w:r>
+      <w:r>
+        <w:rPr>
+          <w:bCs/>
+          <w:b/>
+        </w:rPr>
+        <w:t xml:space="preserve">→</w:t>
+      </w:r>
+      <w:r>
+        <w:t xml:space="preserve"> </w:t>
+      </w:r>
+      <w:r>
+        <w:rPr>
+          <w:bCs/>
+          <w:b/>
+        </w:rPr>
+        <w:t xml:space="preserve">Object Storage Service</w:t>
+      </w:r>
+      <w:r>
+        <w:t xml:space="preserve"> </w:t>
+      </w:r>
+      <w:r>
+        <w:t xml:space="preserve">3. Locate the bucket (e.g. </w:t>
+      </w:r>
+      <w:r>
+        <w:rPr>
+          <w:rStyle w:val="VerbatimChar"/>
+        </w:rPr>
+        <w:t xml:space="preserve">poc-datalake-raw</w:t>
+      </w:r>
+      <w:r>
+        <w:t xml:space="preserve">) 4. Verify the storage class is</w:t>
+      </w:r>
+      <w:r>
+        <w:t xml:space="preserve"> </w:t>
+      </w:r>
+      <w:r>
+        <w:rPr>
+          <w:bCs/>
+          <w:b/>
+        </w:rPr>
+        <w:t xml:space="preserve">Standard</w:t>
+      </w:r>
+      <w:r>
+        <w:t xml:space="preserve"> </w:t>
+      </w:r>
+      <w:r>
+        <w:t xml:space="preserve">5. Upload a test file (</w:t>
+      </w:r>
+      <w:r>
+        <w:rPr>
+          <w:rStyle w:val="VerbatimChar"/>
+        </w:rPr>
+        <w:t xml:space="preserve">test-upload.txt</w:t>
+      </w:r>
+      <w:r>
+        <w:t xml:space="preserve">) to the bucket 6. Download the file and compare its content with the original 7. Delete the test file</w:t>
+      </w:r>
+    </w:p>
+    <w:p>
+      <w:pPr>
+        <w:pStyle w:val="DefinitionTerm"/>
+      </w:pPr>
+      <w:r>
+        <w:t xml:space="preserve">Expected Result</w:t>
       </w:r>
     </w:p>
     <w:p>
       <w:pPr>
         <w:numPr>
           <w:ilvl w:val="0"/>
-          <w:numId w:val="1005"/>
+          <w:numId w:val="1006"/>
         </w:numPr>
         <w:pStyle w:val="Compact"/>
       </w:pPr>
       <w:r>
-        <w:t xml:space="preserve">Navigate to Console, Virtual Private Cloud, VPCs</w:t>
+        <w:t xml:space="preserve">Bucket exists with storage class</w:t>
+      </w:r>
+      <w:r>
+        <w:t xml:space="preserve"> </w:t>
+      </w:r>
+      <w:r>
+        <w:rPr>
+          <w:bCs/>
+          <w:b/>
+        </w:rPr>
+        <w:t xml:space="preserve">Standard</w:t>
+      </w:r>
+      <w:r>
+        <w:t xml:space="preserve">. - File upload completes without error. - Downloaded file content matches the original. - File deletion succeeds.</w:t>
+      </w:r>
+    </w:p>
+    <w:p>
+      <w:pPr>
+        <w:pStyle w:val="DefinitionTerm"/>
+      </w:pPr>
+      <w:r>
+        <w:t xml:space="preserve">Test Result</w:t>
+      </w:r>
+    </w:p>
+    <w:p>
+      <w:pPr>
+        <w:pStyle w:val="Definition"/>
+      </w:pPr>
+      <w:r>
+        <w:rPr>
+          <w:bCs/>
+          <w:b/>
+        </w:rPr>
+        <w:t xml:space="preserve">Pass</w:t>
+      </w:r>
+    </w:p>
+    <w:p>
+      <w:pPr>
+        <w:pStyle w:val="DefinitionTerm"/>
+      </w:pPr>
+      <w:r>
+        <w:t xml:space="preserve">Remarks</w:t>
+      </w:r>
+    </w:p>
+    <w:p>
+      <w:pPr>
+        <w:pStyle w:val="Definition"/>
+      </w:pPr>
+      <w:r>
+        <w:t xml:space="preserve">OBS eventual consistency may cause a brief delay before a newly uploaded object appears in listings.</w:t>
+      </w:r>
+    </w:p>
+    <w:p>
+      <w:pPr>
+        <w:pStyle w:val="Heading2"/>
+      </w:pPr>
+      <w:r>
+        <w:rPr>
+          <w:rStyle w:val="SectionNumber"/>
+        </w:rPr>
+        <w:t xml:space="preserve">0.3</w:t>
+      </w:r>
+      <w:r>
+        <w:tab/>
+      </w:r>
+      <w:r>
+        <w:t xml:space="preserve">TC-003: Verify VPC and security group configuration</w:t>
+      </w:r>
+    </w:p>
+    <w:p>
+      <w:pPr>
+        <w:pStyle w:val="DefinitionTerm"/>
+      </w:pPr>
+      <w:r>
+        <w:t xml:space="preserve">Objective</w:t>
+      </w:r>
+    </w:p>
+    <w:p>
+      <w:pPr>
+        <w:pStyle w:val="Definition"/>
+      </w:pPr>
+      <w:r>
+        <w:t xml:space="preserve">Confirm that the VPC, subnet, and security groups are configured according to the network architecture diagram, with the correct CIDR blocks and inbound/outbound rules.</w:t>
+      </w:r>
+    </w:p>
+    <w:p>
+      <w:pPr>
+        <w:pStyle w:val="DefinitionTerm"/>
+      </w:pPr>
+      <w:r>
+        <w:t xml:space="preserve">Prerequisites</w:t>
       </w:r>
     </w:p>
     <w:p>
       <w:pPr>
         <w:numPr>
           <w:ilvl w:val="0"/>
-          <w:numId w:val="1005"/>
+          <w:numId w:val="1007"/>
         </w:numPr>
         <w:pStyle w:val="Compact"/>
       </w:pPr>
       <w:r>
-        <w:t xml:space="preserve">Locate the VPC (e.g. vpc-poc) and verify its CIDR block matches the architecture (e.g. 10.0.0.0/16)</w:t>
+        <w:t xml:space="preserve">VPC and subnet IDs are available from the Terraform output. - Security group names are documented in the solution architecture.</w:t>
+      </w:r>
+    </w:p>
+    <w:p>
+      <w:pPr>
+        <w:pStyle w:val="DefinitionTerm"/>
+      </w:pPr>
+      <w:r>
+        <w:t xml:space="preserve">Procedure</w:t>
+      </w:r>
+    </w:p>
+    <w:p>
+      <w:pPr>
+        <w:pStyle w:val="Definition"/>
+      </w:pPr>
+      <w:r>
+        <w:t xml:space="preserve">1. Log in to the Console 2. Navigate to</w:t>
+      </w:r>
+      <w:r>
+        <w:t xml:space="preserve"> </w:t>
+      </w:r>
+      <w:r>
+        <w:rPr>
+          <w:bCs/>
+          <w:b/>
+        </w:rPr>
+        <w:t xml:space="preserve">Console</w:t>
+      </w:r>
+      <w:r>
+        <w:t xml:space="preserve"> </w:t>
+      </w:r>
+      <w:r>
+        <w:rPr>
+          <w:bCs/>
+          <w:b/>
+        </w:rPr>
+        <w:t xml:space="preserve">→</w:t>
+      </w:r>
+      <w:r>
+        <w:t xml:space="preserve"> </w:t>
+      </w:r>
+      <w:r>
+        <w:rPr>
+          <w:bCs/>
+          <w:b/>
+        </w:rPr>
+        <w:t xml:space="preserve">Virtual Private Cloud</w:t>
+      </w:r>
+      <w:r>
+        <w:t xml:space="preserve"> </w:t>
+      </w:r>
+      <w:r>
+        <w:rPr>
+          <w:bCs/>
+          <w:b/>
+        </w:rPr>
+        <w:t xml:space="preserve">→</w:t>
+      </w:r>
+      <w:r>
+        <w:t xml:space="preserve"> </w:t>
+      </w:r>
+      <w:r>
+        <w:rPr>
+          <w:bCs/>
+          <w:b/>
+        </w:rPr>
+        <w:t xml:space="preserve">VPCs</w:t>
+      </w:r>
+      <w:r>
+        <w:t xml:space="preserve"> </w:t>
+      </w:r>
+      <w:r>
+        <w:t xml:space="preserve">3. Locate the VPC (e.g. </w:t>
+      </w:r>
+      <w:r>
+        <w:rPr>
+          <w:rStyle w:val="VerbatimChar"/>
+        </w:rPr>
+        <w:t xml:space="preserve">vpc-poc</w:t>
+      </w:r>
+      <w:r>
+        <w:t xml:space="preserve">) and verify its CIDR block matches the architecture (e.g. </w:t>
+      </w:r>
+      <w:r>
+        <w:rPr>
+          <w:rStyle w:val="VerbatimChar"/>
+        </w:rPr>
+        <w:t xml:space="preserve">10.0.0.0/16</w:t>
+      </w:r>
+      <w:r>
+        <w:t xml:space="preserve">) 4. Click the subnet and verify its CIDR (e.g. </w:t>
+      </w:r>
+      <w:r>
+        <w:rPr>
+          <w:rStyle w:val="VerbatimChar"/>
+        </w:rPr>
+        <w:t xml:space="preserve">10.0.1.0/24</w:t>
+      </w:r>
+      <w:r>
+        <w:t xml:space="preserve">) 5. Navigate to</w:t>
+      </w:r>
+      <w:r>
+        <w:t xml:space="preserve"> </w:t>
+      </w:r>
+      <w:r>
+        <w:rPr>
+          <w:bCs/>
+          <w:b/>
+        </w:rPr>
+        <w:t xml:space="preserve">Security Groups</w:t>
+      </w:r>
+      <w:r>
+        <w:t xml:space="preserve"> </w:t>
+      </w:r>
+      <w:r>
+        <w:t xml:space="preserve">and verify inbound rules: TCP 22 from the bastion subnet, TCP 443 from the corporate proxy 6. Verify outbound rules allow all traffic (default)</w:t>
+      </w:r>
+    </w:p>
+    <w:p>
+      <w:pPr>
+        <w:pStyle w:val="DefinitionTerm"/>
+      </w:pPr>
+      <w:r>
+        <w:t xml:space="preserve">Expected Result</w:t>
       </w:r>
     </w:p>
     <w:p>
       <w:pPr>
         <w:numPr>
           <w:ilvl w:val="0"/>
-          <w:numId w:val="1005"/>
+          <w:numId w:val="1008"/>
         </w:numPr>
         <w:pStyle w:val="Compact"/>
       </w:pPr>
       <w:r>
-        <w:t xml:space="preserve">Click the subnet and verify its CIDR (e.g. 10.0.1.0/24)</w:t>
-      </w:r>
-    </w:p>
-    <w:p>
-      <w:pPr>
-        <w:numPr>
-          <w:ilvl w:val="0"/>
-          <w:numId w:val="1005"/>
-        </w:numPr>
-        <w:pStyle w:val="Compact"/>
-      </w:pPr>
-      <w:r>
-        <w:t xml:space="preserve">Navigate to Security Groups and verify inbound rules: TCP 22 from the bastion subnet, TCP 443 from the corporate proxy</w:t>
-      </w:r>
-    </w:p>
-    <w:p>
-      <w:pPr>
-        <w:numPr>
-          <w:ilvl w:val="0"/>
-          <w:numId w:val="1005"/>
-        </w:numPr>
-        <w:pStyle w:val="Compact"/>
-      </w:pPr>
-      <w:r>
-        <w:t xml:space="preserve">Verify outbound rules allow all traffic (default)</w:t>
+        <w:t xml:space="preserve">VPC CIDR is</w:t>
+      </w:r>
+      <w:r>
+        <w:t xml:space="preserve"> </w:t>
+      </w:r>
+      <w:r>
+        <w:rPr>
+          <w:rStyle w:val="VerbatimChar"/>
+        </w:rPr>
+        <w:t xml:space="preserve">10.0.0.0/16</w:t>
+      </w:r>
+      <w:r>
+        <w:t xml:space="preserve">. - Subnet CIDR is</w:t>
+      </w:r>
+      <w:r>
+        <w:t xml:space="preserve"> </w:t>
+      </w:r>
+      <w:r>
+        <w:rPr>
+          <w:rStyle w:val="VerbatimChar"/>
+        </w:rPr>
+        <w:t xml:space="preserve">10.0.1.0/24</w:t>
+      </w:r>
+      <w:r>
+        <w:t xml:space="preserve">. - Inbound rules match the architecture: TCP 22 and TCP 443 from the specified sources. - Outbound allows all traffic.</w:t>
       </w:r>
     </w:p>
     <w:p>
@@ -2349,7 +2431,7 @@
         <w:pStyle w:val="DefinitionTerm"/>
       </w:pPr>
       <w:r>
-        <w:t xml:space="preserve">Expected Result</w:t>
+        <w:t xml:space="preserve">Test Result</w:t>
       </w:r>
     </w:p>
     <w:p>
@@ -2357,52 +2439,10 @@
         <w:pStyle w:val="Definition"/>
       </w:pPr>
       <w:r>
-        <w:t xml:space="preserve">testlist</w:t>
-      </w:r>
-      <w:r>
-        <w:t xml:space="preserve"> </w:t>
-      </w:r>
-      <w:r>
-        <w:t xml:space="preserve">VPC CIDR is 10.0.0.0/16.</w:t>
-      </w:r>
-      <w:r>
-        <w:t xml:space="preserve"> </w:t>
-      </w:r>
-      <w:r>
-        <w:t xml:space="preserve">Subnet CIDR is 10.0.1.0/24.</w:t>
-      </w:r>
-      <w:r>
-        <w:t xml:space="preserve"> </w:t>
-      </w:r>
-      <w:r>
-        <w:t xml:space="preserve">Inbound rules match the architecture: TCP 22 and TCP 443 from the specified sources.</w:t>
-      </w:r>
-      <w:r>
-        <w:t xml:space="preserve"> </w:t>
-      </w:r>
-      <w:r>
-        <w:t xml:space="preserve">Outbound allows all traffic.</w:t>
-      </w:r>
-      <w:r>
-        <w:t xml:space="preserve"> </w:t>
-      </w:r>
-      <w:r>
-        <w:t xml:space="preserve">testlist</w:t>
-      </w:r>
-    </w:p>
-    <w:p>
-      <w:pPr>
-        <w:pStyle w:val="DefinitionTerm"/>
-      </w:pPr>
-      <w:r>
-        <w:t xml:space="preserve">Test Result</w:t>
-      </w:r>
-    </w:p>
-    <w:p>
-      <w:pPr>
-        <w:pStyle w:val="Definition"/>
-      </w:pPr>
-      <w:r>
+        <w:rPr>
+          <w:bCs/>
+          <w:b/>
+        </w:rPr>
         <w:t xml:space="preserve">Pass</w:t>
       </w:r>
     </w:p>
@@ -2483,19 +2523,23 @@
         <w:pStyle w:val="Definition"/>
       </w:pPr>
       <w:r>
-        <w:t xml:space="preserve">Confirm that the DataArts Studio (Dayu) instance is</w:t>
-      </w:r>
-      <w:r>
-        <w:t xml:space="preserve"> </w:t>
-      </w:r>
-      <w:r>
-        <w:t xml:space="preserve">provisioned, the workspace is accessible, and the designated IAM</w:t>
-      </w:r>
-      <w:r>
-        <w:t xml:space="preserve"> </w:t>
-      </w:r>
-      <w:r>
-        <w:t xml:space="preserve">users can log in with the Dayu_User role.</w:t>
+        <w:t xml:space="preserve">Confirm that the DataArts Studio (Dayu) instance is provisioned, the workspace is accessible, and the designated IAM users can log in with the</w:t>
+      </w:r>
+      <w:r>
+        <w:t xml:space="preserve"> </w:t>
+      </w:r>
+      <w:r>
+        <w:rPr>
+          <w:bCs/>
+          <w:b/>
+        </w:rPr>
+        <w:t xml:space="preserve">Dayu_User</w:t>
+      </w:r>
+      <w:r>
+        <w:t xml:space="preserve"> </w:t>
+      </w:r>
+      <w:r>
+        <w:t xml:space="preserve">role.</w:t>
       </w:r>
     </w:p>
     <w:p>
@@ -2504,100 +2548,490 @@
       </w:pPr>
       <w:r>
         <w:t xml:space="preserve">Prerequisites</w:t>
-      </w:r>
-    </w:p>
-    <w:p>
-      <w:pPr>
-        <w:pStyle w:val="Definition"/>
-      </w:pPr>
-      <w:r>
-        <w:t xml:space="preserve">testlist</w:t>
-      </w:r>
-      <w:r>
-        <w:t xml:space="preserve"> </w:t>
-      </w:r>
-      <w:r>
-        <w:t xml:space="preserve">DataArts Studio instance is provisioned and its status is Running.</w:t>
-      </w:r>
-      <w:r>
-        <w:t xml:space="preserve"> </w:t>
-      </w:r>
-      <w:r>
-        <w:t xml:space="preserve">Test IAM user has the Dayu_User role assigned.</w:t>
-      </w:r>
-      <w:r>
-        <w:t xml:space="preserve"> </w:t>
-      </w:r>
-      <w:r>
-        <w:t xml:space="preserve">testlist</w:t>
-      </w:r>
-    </w:p>
-    <w:p>
-      <w:pPr>
-        <w:pStyle w:val="DefinitionTerm"/>
-      </w:pPr>
-      <w:r>
-        <w:t xml:space="preserve">Procedure</w:t>
       </w:r>
     </w:p>
     <w:p>
       <w:pPr>
         <w:numPr>
           <w:ilvl w:val="0"/>
-          <w:numId w:val="1006"/>
+          <w:numId w:val="1009"/>
         </w:numPr>
         <w:pStyle w:val="Compact"/>
       </w:pPr>
       <w:r>
-        <w:t xml:space="preserve">Log in to the Console with the test IAM user</w:t>
+        <w:t xml:space="preserve">DataArts Studio instance is provisioned and its status is</w:t>
+      </w:r>
+      <w:r>
+        <w:t xml:space="preserve"> </w:t>
+      </w:r>
+      <w:r>
+        <w:rPr>
+          <w:bCs/>
+          <w:b/>
+        </w:rPr>
+        <w:t xml:space="preserve">Running</w:t>
+      </w:r>
+      <w:r>
+        <w:t xml:space="preserve">. - Test IAM user has the</w:t>
+      </w:r>
+      <w:r>
+        <w:t xml:space="preserve"> </w:t>
+      </w:r>
+      <w:r>
+        <w:rPr>
+          <w:bCs/>
+          <w:b/>
+        </w:rPr>
+        <w:t xml:space="preserve">Dayu_User</w:t>
+      </w:r>
+      <w:r>
+        <w:t xml:space="preserve"> </w:t>
+      </w:r>
+      <w:r>
+        <w:t xml:space="preserve">role assigned.</w:t>
+      </w:r>
+    </w:p>
+    <w:p>
+      <w:pPr>
+        <w:pStyle w:val="DefinitionTerm"/>
+      </w:pPr>
+      <w:r>
+        <w:t xml:space="preserve">Procedure</w:t>
+      </w:r>
+    </w:p>
+    <w:p>
+      <w:pPr>
+        <w:pStyle w:val="Definition"/>
+      </w:pPr>
+      <w:r>
+        <w:t xml:space="preserve">1. Log in to the Console with the test IAM user 2. Navigate to</w:t>
+      </w:r>
+      <w:r>
+        <w:t xml:space="preserve"> </w:t>
+      </w:r>
+      <w:r>
+        <w:rPr>
+          <w:bCs/>
+          <w:b/>
+        </w:rPr>
+        <w:t xml:space="preserve">Console</w:t>
+      </w:r>
+      <w:r>
+        <w:t xml:space="preserve"> </w:t>
+      </w:r>
+      <w:r>
+        <w:rPr>
+          <w:bCs/>
+          <w:b/>
+        </w:rPr>
+        <w:t xml:space="preserve">→</w:t>
+      </w:r>
+      <w:r>
+        <w:t xml:space="preserve"> </w:t>
+      </w:r>
+      <w:r>
+        <w:rPr>
+          <w:bCs/>
+          <w:b/>
+        </w:rPr>
+        <w:t xml:space="preserve">DataArts Studio</w:t>
+      </w:r>
+      <w:r>
+        <w:t xml:space="preserve"> </w:t>
+      </w:r>
+      <w:r>
+        <w:rPr>
+          <w:bCs/>
+          <w:b/>
+        </w:rPr>
+        <w:t xml:space="preserve">→</w:t>
+      </w:r>
+      <w:r>
+        <w:t xml:space="preserve"> </w:t>
+      </w:r>
+      <w:r>
+        <w:rPr>
+          <w:bCs/>
+          <w:b/>
+        </w:rPr>
+        <w:t xml:space="preserve">Workspaces</w:t>
+      </w:r>
+      <w:r>
+        <w:t xml:space="preserve"> </w:t>
+      </w:r>
+      <w:r>
+        <w:t xml:space="preserve">3. Locate the workspace (e.g. </w:t>
+      </w:r>
+      <w:r>
+        <w:rPr>
+          <w:rStyle w:val="VerbatimChar"/>
+        </w:rPr>
+        <w:t xml:space="preserve">poc-workspace</w:t>
+      </w:r>
+      <w:r>
+        <w:t xml:space="preserve">) 4. Click</w:t>
+      </w:r>
+      <w:r>
+        <w:t xml:space="preserve"> </w:t>
+      </w:r>
+      <w:r>
+        <w:rPr>
+          <w:bCs/>
+          <w:b/>
+        </w:rPr>
+        <w:t xml:space="preserve">Access Workspace</w:t>
+      </w:r>
+      <w:r>
+        <w:t xml:space="preserve"> </w:t>
+      </w:r>
+      <w:r>
+        <w:t xml:space="preserve">to open the DataArts Studio console 5. Verify the left navigation panel loads with the expected modules:</w:t>
+      </w:r>
+      <w:r>
+        <w:t xml:space="preserve"> </w:t>
+      </w:r>
+      <w:r>
+        <w:rPr>
+          <w:bCs/>
+          <w:b/>
+        </w:rPr>
+        <w:t xml:space="preserve">Data Integration</w:t>
+      </w:r>
+      <w:r>
+        <w:t xml:space="preserve">,</w:t>
+      </w:r>
+      <w:r>
+        <w:t xml:space="preserve"> </w:t>
+      </w:r>
+      <w:r>
+        <w:rPr>
+          <w:bCs/>
+          <w:b/>
+        </w:rPr>
+        <w:t xml:space="preserve">Data Development</w:t>
+      </w:r>
+      <w:r>
+        <w:t xml:space="preserve">,</w:t>
+      </w:r>
+      <w:r>
+        <w:t xml:space="preserve"> </w:t>
+      </w:r>
+      <w:r>
+        <w:rPr>
+          <w:bCs/>
+          <w:b/>
+        </w:rPr>
+        <w:t xml:space="preserve">Data Architecture</w:t>
+      </w:r>
+    </w:p>
+    <w:p>
+      <w:pPr>
+        <w:pStyle w:val="DefinitionTerm"/>
+      </w:pPr>
+      <w:r>
+        <w:t xml:space="preserve">Expected Result</w:t>
       </w:r>
     </w:p>
     <w:p>
       <w:pPr>
         <w:numPr>
           <w:ilvl w:val="0"/>
-          <w:numId w:val="1006"/>
+          <w:numId w:val="1010"/>
         </w:numPr>
         <w:pStyle w:val="Compact"/>
       </w:pPr>
       <w:r>
-        <w:t xml:space="preserve">Navigate to Console, DataArts Studio, Workspaces</w:t>
+        <w:t xml:space="preserve">Workspace is listed and accessible. - DataArts Studio console opens without errors. - All three modules (Data Integration, Data Development, Data Architecture) are visible in the navigation.</w:t>
+      </w:r>
+    </w:p>
+    <w:p>
+      <w:pPr>
+        <w:pStyle w:val="DefinitionTerm"/>
+      </w:pPr>
+      <w:r>
+        <w:t xml:space="preserve">Test Result</w:t>
+      </w:r>
+    </w:p>
+    <w:p>
+      <w:pPr>
+        <w:pStyle w:val="Definition"/>
+      </w:pPr>
+      <w:r>
+        <w:rPr>
+          <w:bCs/>
+          <w:b/>
+        </w:rPr>
+        <w:t xml:space="preserve">Pass</w:t>
+      </w:r>
+    </w:p>
+    <w:p>
+      <w:pPr>
+        <w:pStyle w:val="DefinitionTerm"/>
+      </w:pPr>
+      <w:r>
+        <w:t xml:space="preserve">Remarks</w:t>
+      </w:r>
+    </w:p>
+    <w:p>
+      <w:pPr>
+        <w:pStyle w:val="Definition"/>
+      </w:pPr>
+      <w:r>
+        <w:t xml:space="preserve">If the workspace fails to load, check the Dayu instance status and the IAM role assignment.</w:t>
+      </w:r>
+    </w:p>
+    <w:p>
+      <w:pPr>
+        <w:pStyle w:val="Heading2"/>
+      </w:pPr>
+      <w:r>
+        <w:rPr>
+          <w:rStyle w:val="SectionNumber"/>
+        </w:rPr>
+        <w:t xml:space="preserve">0.5</w:t>
+      </w:r>
+      <w:r>
+        <w:tab/>
+      </w:r>
+      <w:r>
+        <w:t xml:space="preserve">TC-005: Verify data ingestion pipeline execution</w:t>
+      </w:r>
+    </w:p>
+    <w:p>
+      <w:pPr>
+        <w:pStyle w:val="DefinitionTerm"/>
+      </w:pPr>
+      <w:r>
+        <w:t xml:space="preserve">Objective</w:t>
+      </w:r>
+    </w:p>
+    <w:p>
+      <w:pPr>
+        <w:pStyle w:val="Definition"/>
+      </w:pPr>
+      <w:r>
+        <w:t xml:space="preserve">Confirm that a DataArts Studio batch pipeline can successfully ingest CSV data from OBS, apply a basic transformation, and write the result to the target OBS path.</w:t>
+      </w:r>
+    </w:p>
+    <w:p>
+      <w:pPr>
+        <w:pStyle w:val="DefinitionTerm"/>
+      </w:pPr>
+      <w:r>
+        <w:t xml:space="preserve">Prerequisites</w:t>
       </w:r>
     </w:p>
     <w:p>
       <w:pPr>
         <w:numPr>
           <w:ilvl w:val="0"/>
-          <w:numId w:val="1006"/>
+          <w:numId w:val="1011"/>
         </w:numPr>
         <w:pStyle w:val="Compact"/>
       </w:pPr>
       <w:r>
-        <w:t xml:space="preserve">Locate the workspace (e.g. poc-workspace)</w:t>
+        <w:t xml:space="preserve">TC-004 completed (DataArts Studio workspace accessible). - Source CSV file (</w:t>
+      </w:r>
+      <w:r>
+        <w:rPr>
+          <w:rStyle w:val="VerbatimChar"/>
+        </w:rPr>
+        <w:t xml:space="preserve">customers.csv</w:t>
+      </w:r>
+      <w:r>
+        <w:t xml:space="preserve">) exists in the OBS raw bucket. - Target OBS path (</w:t>
+      </w:r>
+      <w:r>
+        <w:rPr>
+          <w:rStyle w:val="VerbatimChar"/>
+        </w:rPr>
+        <w:t xml:space="preserve">poc-datalake-curated/customers/</w:t>
+      </w:r>
+      <w:r>
+        <w:t xml:space="preserve">) is configured. - Pipeline</w:t>
+      </w:r>
+      <w:r>
+        <w:t xml:space="preserve"> </w:t>
+      </w:r>
+      <w:r>
+        <w:rPr>
+          <w:rStyle w:val="VerbatimChar"/>
+        </w:rPr>
+        <w:t xml:space="preserve">pl-ingest-customers</w:t>
+      </w:r>
+      <w:r>
+        <w:t xml:space="preserve"> </w:t>
+      </w:r>
+      <w:r>
+        <w:t xml:space="preserve">is published in DataArts Studio.</w:t>
+      </w:r>
+    </w:p>
+    <w:p>
+      <w:pPr>
+        <w:pStyle w:val="DefinitionTerm"/>
+      </w:pPr>
+      <w:r>
+        <w:t xml:space="preserve">Procedure</w:t>
+      </w:r>
+    </w:p>
+    <w:p>
+      <w:pPr>
+        <w:pStyle w:val="Definition"/>
+      </w:pPr>
+      <w:r>
+        <w:t xml:space="preserve">1. Navigate to Data Development in DataArts Studio 2. Locate pipeline</w:t>
+      </w:r>
+      <w:r>
+        <w:t xml:space="preserve"> </w:t>
+      </w:r>
+      <w:r>
+        <w:rPr>
+          <w:rStyle w:val="VerbatimChar"/>
+        </w:rPr>
+        <w:t xml:space="preserve">pl-ingest-customers</w:t>
+      </w:r>
+      <w:r>
+        <w:t xml:space="preserve"> </w:t>
+      </w:r>
+      <w:r>
+        <w:t xml:space="preserve">3. Click Run to execute the pipeline 4. Wait for pipeline status (timeout: 10 min) 5. Verify output file in OBS 6. Download and verify row count</w:t>
+      </w:r>
+    </w:p>
+    <w:p>
+      <w:pPr>
+        <w:pStyle w:val="DefinitionTerm"/>
+      </w:pPr>
+      <w:r>
+        <w:t xml:space="preserve">Expected Result</w:t>
       </w:r>
     </w:p>
     <w:p>
       <w:pPr>
         <w:numPr>
           <w:ilvl w:val="0"/>
-          <w:numId w:val="1006"/>
+          <w:numId w:val="1012"/>
         </w:numPr>
         <w:pStyle w:val="Compact"/>
       </w:pPr>
       <w:r>
-        <w:t xml:space="preserve">Click Access Workspace to open the DataArts Studio console</w:t>
+        <w:t xml:space="preserve">Pipeline execution completes with status</w:t>
+      </w:r>
+      <w:r>
+        <w:t xml:space="preserve"> </w:t>
+      </w:r>
+      <w:r>
+        <w:rPr>
+          <w:bCs/>
+          <w:b/>
+        </w:rPr>
+        <w:t xml:space="preserve">Success</w:t>
+      </w:r>
+      <w:r>
+        <w:t xml:space="preserve">. - Output file is created in the target OBS path. - Row count of the output file matches the source file.</w:t>
+      </w:r>
+    </w:p>
+    <w:p>
+      <w:pPr>
+        <w:pStyle w:val="DefinitionTerm"/>
+      </w:pPr>
+      <w:r>
+        <w:t xml:space="preserve">Test Result</w:t>
+      </w:r>
+    </w:p>
+    <w:p>
+      <w:pPr>
+        <w:pStyle w:val="Definition"/>
+      </w:pPr>
+      <w:r>
+        <w:rPr>
+          <w:bCs/>
+          <w:b/>
+        </w:rPr>
+        <w:t xml:space="preserve">Pass</w:t>
+      </w:r>
+    </w:p>
+    <w:p>
+      <w:pPr>
+        <w:pStyle w:val="DefinitionTerm"/>
+      </w:pPr>
+      <w:r>
+        <w:t xml:space="preserve">Remarks</w:t>
+      </w:r>
+    </w:p>
+    <w:p>
+      <w:pPr>
+        <w:pStyle w:val="Definition"/>
+      </w:pPr>
+      <w:r>
+        <w:t xml:space="preserve">Pipeline execution time varies with data volume. For the POC, the source file contains approximately 10,000 rows.</w:t>
+      </w:r>
+    </w:p>
+    <w:p>
+      <w:pPr>
+        <w:pStyle w:val="Heading2"/>
+      </w:pPr>
+      <w:r>
+        <w:rPr>
+          <w:rStyle w:val="SectionNumber"/>
+        </w:rPr>
+        <w:t xml:space="preserve">0.6</w:t>
+      </w:r>
+      <w:r>
+        <w:tab/>
+      </w:r>
+      <w:r>
+        <w:t xml:space="preserve">TC-006: Verify Spark SQL query on MRS cluster</w:t>
+      </w:r>
+    </w:p>
+    <w:p>
+      <w:pPr>
+        <w:pStyle w:val="DefinitionTerm"/>
+      </w:pPr>
+      <w:r>
+        <w:t xml:space="preserve">Objective</w:t>
+      </w:r>
+    </w:p>
+    <w:p>
+      <w:pPr>
+        <w:pStyle w:val="Definition"/>
+      </w:pPr>
+      <w:r>
+        <w:t xml:space="preserve">Confirm that a Spark SQL query can be executed on the MRS cluster to read data from a Hive table and return correct results, validating the integration between MRS and the data lake.</w:t>
+      </w:r>
+    </w:p>
+    <w:p>
+      <w:pPr>
+        <w:pStyle w:val="DefinitionTerm"/>
+      </w:pPr>
+      <w:r>
+        <w:t xml:space="preserve">Prerequisites</w:t>
       </w:r>
     </w:p>
     <w:p>
       <w:pPr>
         <w:numPr>
           <w:ilvl w:val="0"/>
-          <w:numId w:val="1006"/>
+          <w:numId w:val="1013"/>
         </w:numPr>
         <w:pStyle w:val="Compact"/>
       </w:pPr>
       <w:r>
-        <w:t xml:space="preserve">Verify the left navigation panel loads with the expected modules: Data Integration, Data Development, Data Architecture</w:t>
+        <w:t xml:space="preserve">TC-001 completed (MRS cluster healthy). - Hive table</w:t>
+      </w:r>
+      <w:r>
+        <w:t xml:space="preserve"> </w:t>
+      </w:r>
+      <w:r>
+        <w:rPr>
+          <w:rStyle w:val="VerbatimChar"/>
+        </w:rPr>
+        <w:t xml:space="preserve">poc_db.customers</w:t>
+      </w:r>
+      <w:r>
+        <w:t xml:space="preserve"> </w:t>
+      </w:r>
+      <w:r>
+        <w:t xml:space="preserve">exists and contains data loaded by the ingestion pipeline. - SSH access to the MRS master node is configured.</w:t>
       </w:r>
     </w:p>
     <w:p>
@@ -2605,242 +3039,104 @@
         <w:pStyle w:val="DefinitionTerm"/>
       </w:pPr>
       <w:r>
+        <w:t xml:space="preserve">Procedure</w:t>
+      </w:r>
+    </w:p>
+    <w:p>
+      <w:pPr>
+        <w:pStyle w:val="Definition"/>
+      </w:pPr>
+      <w:r>
+        <w:t xml:space="preserve">1. SSH into the MRS master node 2. Run the Spark SQL CLI:</w:t>
+      </w:r>
+      <w:r>
+        <w:t xml:space="preserve"> </w:t>
+      </w:r>
+      <w:r>
+        <w:rPr>
+          <w:rStyle w:val="VerbatimChar"/>
+        </w:rPr>
+        <w:t xml:space="preserve">spark-sql –master yarn --conf spark.sql.hive.convertMetastoreOrc=true -e "SELECT COUNT(*) FROM poc_db.customers;"</w:t>
+      </w:r>
+      <w:r>
+        <w:t xml:space="preserve"> </w:t>
+      </w:r>
+      <w:r>
+        <w:t xml:space="preserve">3. Verify the returned count matches the expected row count (10,000) 4. Run a sample query to verify data integrity:</w:t>
+      </w:r>
+      <w:r>
+        <w:t xml:space="preserve"> </w:t>
+      </w:r>
+      <w:r>
+        <w:rPr>
+          <w:rStyle w:val="VerbatimChar"/>
+        </w:rPr>
+        <w:t xml:space="preserve">spark-sql –master yarn -e "SELECT customer_id, name FROM poc_db.customers LIMIT 5;"</w:t>
+      </w:r>
+      <w:r>
+        <w:t xml:space="preserve"> </w:t>
+      </w:r>
+      <w:r>
+        <w:t xml:space="preserve">5. Confirm the query returns 5 rows with non-null values</w:t>
+      </w:r>
+    </w:p>
+    <w:p>
+      <w:pPr>
+        <w:pStyle w:val="DefinitionTerm"/>
+      </w:pPr>
+      <w:r>
         <w:t xml:space="preserve">Expected Result</w:t>
-      </w:r>
-    </w:p>
-    <w:p>
-      <w:pPr>
-        <w:pStyle w:val="Definition"/>
-      </w:pPr>
-      <w:r>
-        <w:t xml:space="preserve">testlist</w:t>
-      </w:r>
-      <w:r>
-        <w:t xml:space="preserve"> </w:t>
-      </w:r>
-      <w:r>
-        <w:t xml:space="preserve">Workspace is listed and accessible.</w:t>
-      </w:r>
-      <w:r>
-        <w:t xml:space="preserve"> </w:t>
-      </w:r>
-      <w:r>
-        <w:t xml:space="preserve">DataArts Studio console opens without errors.</w:t>
-      </w:r>
-      <w:r>
-        <w:t xml:space="preserve"> </w:t>
-      </w:r>
-      <w:r>
-        <w:t xml:space="preserve">All three modules (Data Integration, Data Development, Data Architecture) are visible in the navigation.</w:t>
-      </w:r>
-      <w:r>
-        <w:t xml:space="preserve"> </w:t>
-      </w:r>
-      <w:r>
-        <w:t xml:space="preserve">testlist</w:t>
-      </w:r>
-    </w:p>
-    <w:p>
-      <w:pPr>
-        <w:pStyle w:val="DefinitionTerm"/>
-      </w:pPr>
-      <w:r>
-        <w:t xml:space="preserve">Test Result</w:t>
-      </w:r>
-    </w:p>
-    <w:p>
-      <w:pPr>
-        <w:pStyle w:val="Definition"/>
-      </w:pPr>
-      <w:r>
-        <w:t xml:space="preserve">Pass</w:t>
-      </w:r>
-    </w:p>
-    <w:p>
-      <w:pPr>
-        <w:pStyle w:val="DefinitionTerm"/>
-      </w:pPr>
-      <w:r>
-        <w:t xml:space="preserve">Remarks</w:t>
-      </w:r>
-    </w:p>
-    <w:p>
-      <w:pPr>
-        <w:pStyle w:val="Definition"/>
-      </w:pPr>
-      <w:r>
-        <w:t xml:space="preserve">If the workspace fails to load, check the Dayu instance status and the IAM role assignment.</w:t>
-      </w:r>
-    </w:p>
-    <w:p>
-      <w:pPr>
-        <w:pStyle w:val="Heading2"/>
-      </w:pPr>
-      <w:r>
-        <w:rPr>
-          <w:rStyle w:val="SectionNumber"/>
-        </w:rPr>
-        <w:t xml:space="preserve">0.5</w:t>
-      </w:r>
-      <w:r>
-        <w:tab/>
-      </w:r>
-      <w:r>
-        <w:t xml:space="preserve">TC-005: Verify data ingestion pipeline execution</w:t>
-      </w:r>
-    </w:p>
-    <w:p>
-      <w:pPr>
-        <w:pStyle w:val="DefinitionTerm"/>
-      </w:pPr>
-      <w:r>
-        <w:t xml:space="preserve">Objective</w:t>
-      </w:r>
-    </w:p>
-    <w:p>
-      <w:pPr>
-        <w:pStyle w:val="Definition"/>
-      </w:pPr>
-      <w:r>
-        <w:t xml:space="preserve">Confirm that a DataArts Studio batch pipeline can</w:t>
-      </w:r>
-      <w:r>
-        <w:t xml:space="preserve"> </w:t>
-      </w:r>
-      <w:r>
-        <w:t xml:space="preserve">successfully ingest CSV data from OBS, apply a basic transformation,</w:t>
-      </w:r>
-      <w:r>
-        <w:t xml:space="preserve"> </w:t>
-      </w:r>
-      <w:r>
-        <w:t xml:space="preserve">and write the result to the target OBS path.</w:t>
-      </w:r>
-    </w:p>
-    <w:p>
-      <w:pPr>
-        <w:pStyle w:val="DefinitionTerm"/>
-      </w:pPr>
-      <w:r>
-        <w:t xml:space="preserve">Prerequisites</w:t>
-      </w:r>
-    </w:p>
-    <w:p>
-      <w:pPr>
-        <w:pStyle w:val="Definition"/>
-      </w:pPr>
-      <w:r>
-        <w:t xml:space="preserve">testlist</w:t>
-      </w:r>
-      <w:r>
-        <w:t xml:space="preserve"> </w:t>
-      </w:r>
-      <w:r>
-        <w:t xml:space="preserve">TC-004 completed (DataArts Studio workspace accessible).</w:t>
-      </w:r>
-      <w:r>
-        <w:t xml:space="preserve"> </w:t>
-      </w:r>
-      <w:r>
-        <w:t xml:space="preserve">Source CSV file (customers.csv) exists in the OBS raw bucket.</w:t>
-      </w:r>
-      <w:r>
-        <w:t xml:space="preserve"> </w:t>
-      </w:r>
-      <w:r>
-        <w:t xml:space="preserve">Target OBS path (poc-datalake-curated/customers/) is configured.</w:t>
-      </w:r>
-      <w:r>
-        <w:t xml:space="preserve"> </w:t>
-      </w:r>
-      <w:r>
-        <w:t xml:space="preserve">Pipeline pl-ingest-customers is published in DataArts Studio.</w:t>
-      </w:r>
-      <w:r>
-        <w:t xml:space="preserve"> </w:t>
-      </w:r>
-      <w:r>
-        <w:t xml:space="preserve">testlist</w:t>
-      </w:r>
-    </w:p>
-    <w:p>
-      <w:pPr>
-        <w:pStyle w:val="DefinitionTerm"/>
-      </w:pPr>
-      <w:r>
-        <w:t xml:space="preserve">Procedure</w:t>
       </w:r>
     </w:p>
     <w:p>
       <w:pPr>
         <w:numPr>
           <w:ilvl w:val="0"/>
-          <w:numId w:val="1007"/>
+          <w:numId w:val="1014"/>
         </w:numPr>
         <w:pStyle w:val="Compact"/>
       </w:pPr>
       <w:r>
-        <w:t xml:space="preserve">Navigate to Data Development in DataArts Studio</w:t>
-      </w:r>
-    </w:p>
-    <w:p>
-      <w:pPr>
-        <w:numPr>
-          <w:ilvl w:val="0"/>
-          <w:numId w:val="1007"/>
-        </w:numPr>
-        <w:pStyle w:val="Compact"/>
-      </w:pPr>
-      <w:r>
-        <w:t xml:space="preserve">Locate pipeline pl-ingest-customers</w:t>
-      </w:r>
-    </w:p>
-    <w:p>
-      <w:pPr>
-        <w:numPr>
-          <w:ilvl w:val="0"/>
-          <w:numId w:val="1007"/>
-        </w:numPr>
-        <w:pStyle w:val="Compact"/>
-      </w:pPr>
-      <w:r>
-        <w:t xml:space="preserve">Click Run to execute the pipeline</w:t>
-      </w:r>
-    </w:p>
-    <w:p>
-      <w:pPr>
-        <w:numPr>
-          <w:ilvl w:val="0"/>
-          <w:numId w:val="1007"/>
-        </w:numPr>
-        <w:pStyle w:val="Compact"/>
-      </w:pPr>
-      <w:r>
-        <w:t xml:space="preserve">Wait for pipeline status (timeout: 10 min)</w:t>
-      </w:r>
-    </w:p>
-    <w:p>
-      <w:pPr>
-        <w:numPr>
-          <w:ilvl w:val="0"/>
-          <w:numId w:val="1007"/>
-        </w:numPr>
-        <w:pStyle w:val="Compact"/>
-      </w:pPr>
-      <w:r>
-        <w:t xml:space="preserve">Verify output file in OBS</w:t>
-      </w:r>
-    </w:p>
-    <w:p>
-      <w:pPr>
-        <w:numPr>
-          <w:ilvl w:val="0"/>
-          <w:numId w:val="1007"/>
-        </w:numPr>
-        <w:pStyle w:val="Compact"/>
-      </w:pPr>
-      <w:r>
-        <w:t xml:space="preserve">Download and verify row count</w:t>
+        <w:rPr>
+          <w:rStyle w:val="VerbatimChar"/>
+        </w:rPr>
+        <w:t xml:space="preserve">COUNT(*)</w:t>
+      </w:r>
+      <w:r>
+        <w:t xml:space="preserve"> </w:t>
+      </w:r>
+      <w:r>
+        <w:t xml:space="preserve">returns 10,000. - The sample query returns 5 rows with valid</w:t>
+      </w:r>
+      <w:r>
+        <w:t xml:space="preserve"> </w:t>
+      </w:r>
+      <w:r>
+        <w:rPr>
+          <w:rStyle w:val="VerbatimChar"/>
+        </w:rPr>
+        <w:t xml:space="preserve">customer_id</w:t>
+      </w:r>
+      <w:r>
+        <w:t xml:space="preserve"> </w:t>
+      </w:r>
+      <w:r>
+        <w:t xml:space="preserve">and</w:t>
+      </w:r>
+      <w:r>
+        <w:t xml:space="preserve"> </w:t>
+      </w:r>
+      <w:r>
+        <w:rPr>
+          <w:rStyle w:val="VerbatimChar"/>
+        </w:rPr>
+        <w:t xml:space="preserve">name</w:t>
+      </w:r>
+      <w:r>
+        <w:t xml:space="preserve"> </w:t>
+      </w:r>
+      <w:r>
+        <w:t xml:space="preserve">values.</w:t>
       </w:r>
     </w:p>
     <w:p>
@@ -2848,7 +3144,7 @@
         <w:pStyle w:val="DefinitionTerm"/>
       </w:pPr>
       <w:r>
-        <w:t xml:space="preserve">Expected Result</w:t>
+        <w:t xml:space="preserve">Test Result</w:t>
       </w:r>
     </w:p>
     <w:p>
@@ -2856,277 +3152,10 @@
         <w:pStyle w:val="Definition"/>
       </w:pPr>
       <w:r>
-        <w:t xml:space="preserve">testlist</w:t>
-      </w:r>
-      <w:r>
-        <w:t xml:space="preserve"> </w:t>
-      </w:r>
-      <w:r>
-        <w:t xml:space="preserve">Pipeline execution completes with status Success.</w:t>
-      </w:r>
-      <w:r>
-        <w:t xml:space="preserve"> </w:t>
-      </w:r>
-      <w:r>
-        <w:t xml:space="preserve">Output file is created in the target OBS path.</w:t>
-      </w:r>
-      <w:r>
-        <w:t xml:space="preserve"> </w:t>
-      </w:r>
-      <w:r>
-        <w:t xml:space="preserve">Row count of the output file matches the source file.</w:t>
-      </w:r>
-      <w:r>
-        <w:t xml:space="preserve"> </w:t>
-      </w:r>
-      <w:r>
-        <w:t xml:space="preserve">testlist</w:t>
-      </w:r>
-    </w:p>
-    <w:p>
-      <w:pPr>
-        <w:pStyle w:val="DefinitionTerm"/>
-      </w:pPr>
-      <w:r>
-        <w:t xml:space="preserve">Test Result</w:t>
-      </w:r>
-    </w:p>
-    <w:p>
-      <w:pPr>
-        <w:pStyle w:val="Definition"/>
-      </w:pPr>
-      <w:r>
-        <w:t xml:space="preserve">Pass</w:t>
-      </w:r>
-    </w:p>
-    <w:p>
-      <w:pPr>
-        <w:pStyle w:val="DefinitionTerm"/>
-      </w:pPr>
-      <w:r>
-        <w:t xml:space="preserve">Remarks</w:t>
-      </w:r>
-    </w:p>
-    <w:p>
-      <w:pPr>
-        <w:pStyle w:val="Definition"/>
-      </w:pPr>
-      <w:r>
-        <w:t xml:space="preserve">Pipeline execution time varies with data volume. For the POC, the source file contains approximately 10,000 rows.</w:t>
-      </w:r>
-    </w:p>
-    <w:p>
-      <w:pPr>
-        <w:pStyle w:val="Heading2"/>
-      </w:pPr>
-      <w:r>
-        <w:rPr>
-          <w:rStyle w:val="SectionNumber"/>
-        </w:rPr>
-        <w:t xml:space="preserve">0.6</w:t>
-      </w:r>
-      <w:r>
-        <w:tab/>
-      </w:r>
-      <w:r>
-        <w:t xml:space="preserve">TC-006: Verify Spark SQL query on MRS cluster</w:t>
-      </w:r>
-    </w:p>
-    <w:p>
-      <w:pPr>
-        <w:pStyle w:val="DefinitionTerm"/>
-      </w:pPr>
-      <w:r>
-        <w:t xml:space="preserve">Objective</w:t>
-      </w:r>
-    </w:p>
-    <w:p>
-      <w:pPr>
-        <w:pStyle w:val="Definition"/>
-      </w:pPr>
-      <w:r>
-        <w:t xml:space="preserve">Confirm that a Spark SQL query can be executed on the</w:t>
-      </w:r>
-      <w:r>
-        <w:t xml:space="preserve"> </w:t>
-      </w:r>
-      <w:r>
-        <w:t xml:space="preserve">MRS cluster to read data from a Hive table and return correct</w:t>
-      </w:r>
-      <w:r>
-        <w:t xml:space="preserve"> </w:t>
-      </w:r>
-      <w:r>
-        <w:t xml:space="preserve">results, validating the integration between MRS and the data lake.</w:t>
-      </w:r>
-    </w:p>
-    <w:p>
-      <w:pPr>
-        <w:pStyle w:val="DefinitionTerm"/>
-      </w:pPr>
-      <w:r>
-        <w:t xml:space="preserve">Prerequisites</w:t>
-      </w:r>
-    </w:p>
-    <w:p>
-      <w:pPr>
-        <w:pStyle w:val="Definition"/>
-      </w:pPr>
-      <w:r>
-        <w:t xml:space="preserve">testlist</w:t>
-      </w:r>
-      <w:r>
-        <w:t xml:space="preserve"> </w:t>
-      </w:r>
-      <w:r>
-        <w:t xml:space="preserve">TC-001 completed (MRS cluster healthy).</w:t>
-      </w:r>
-      <w:r>
-        <w:t xml:space="preserve"> </w:t>
-      </w:r>
-      <w:r>
-        <w:t xml:space="preserve">Hive table poc_db.customers exists and contains data loaded by the ingestion pipeline.</w:t>
-      </w:r>
-      <w:r>
-        <w:t xml:space="preserve"> </w:t>
-      </w:r>
-      <w:r>
-        <w:t xml:space="preserve">SSH access to the MRS master node is configured.</w:t>
-      </w:r>
-      <w:r>
-        <w:t xml:space="preserve"> </w:t>
-      </w:r>
-      <w:r>
-        <w:t xml:space="preserve">testlist</w:t>
-      </w:r>
-    </w:p>
-    <w:p>
-      <w:pPr>
-        <w:pStyle w:val="DefinitionTerm"/>
-      </w:pPr>
-      <w:r>
-        <w:t xml:space="preserve">Procedure</w:t>
-      </w:r>
-    </w:p>
-    <w:p>
-      <w:pPr>
-        <w:numPr>
-          <w:ilvl w:val="0"/>
-          <w:numId w:val="1008"/>
-        </w:numPr>
-        <w:pStyle w:val="Compact"/>
-      </w:pPr>
-      <w:r>
-        <w:t xml:space="preserve">SSH into the MRS master node</w:t>
-      </w:r>
-    </w:p>
-    <w:p>
-      <w:pPr>
-        <w:numPr>
-          <w:ilvl w:val="0"/>
-          <w:numId w:val="1008"/>
-        </w:numPr>
-        <w:pStyle w:val="Compact"/>
-      </w:pPr>
-      <w:r>
-        <w:t xml:space="preserve">Run the Spark SQL CLI: spark-sql –master yarn -{}-conf spark.sql.hive.convertMetastoreOrc=true -e “SELECT COUNT(*) FROM poc_db.customers;”</w:t>
-      </w:r>
-    </w:p>
-    <w:p>
-      <w:pPr>
-        <w:numPr>
-          <w:ilvl w:val="0"/>
-          <w:numId w:val="1008"/>
-        </w:numPr>
-        <w:pStyle w:val="Compact"/>
-      </w:pPr>
-      <w:r>
-        <w:t xml:space="preserve">Verify the returned count matches the expected row count (10,000)</w:t>
-      </w:r>
-    </w:p>
-    <w:p>
-      <w:pPr>
-        <w:numPr>
-          <w:ilvl w:val="0"/>
-          <w:numId w:val="1008"/>
-        </w:numPr>
-        <w:pStyle w:val="Compact"/>
-      </w:pPr>
-      <w:r>
-        <w:t xml:space="preserve">Run a sample query to verify data integrity: spark-sql –master yarn -e</w:t>
-      </w:r>
-      <w:r>
-        <w:t xml:space="preserve"> </w:t>
-      </w:r>
-      <w:r>
-        <w:t xml:space="preserve">“</w:t>
-      </w:r>
-      <w:r>
-        <w:t xml:space="preserve">SELECT customer_id, name FROM poc_db.customers LIMIT 5;</w:t>
-      </w:r>
-      <w:r>
-        <w:t xml:space="preserve">”</w:t>
-      </w:r>
-    </w:p>
-    <w:p>
-      <w:pPr>
-        <w:numPr>
-          <w:ilvl w:val="0"/>
-          <w:numId w:val="1008"/>
-        </w:numPr>
-        <w:pStyle w:val="Compact"/>
-      </w:pPr>
-      <w:r>
-        <w:t xml:space="preserve">Confirm the query returns 5 rows with non-null values</w:t>
-      </w:r>
-    </w:p>
-    <w:p>
-      <w:pPr>
-        <w:pStyle w:val="DefinitionTerm"/>
-      </w:pPr>
-      <w:r>
-        <w:t xml:space="preserve">Expected Result</w:t>
-      </w:r>
-    </w:p>
-    <w:p>
-      <w:pPr>
-        <w:pStyle w:val="Definition"/>
-      </w:pPr>
-      <w:r>
-        <w:t xml:space="preserve">testlist</w:t>
-      </w:r>
-      <w:r>
-        <w:t xml:space="preserve"> </w:t>
-      </w:r>
-      <w:r>
-        <w:t xml:space="preserve">COUNT(*) returns 10,000.</w:t>
-      </w:r>
-      <w:r>
-        <w:t xml:space="preserve"> </w:t>
-      </w:r>
-      <w:r>
-        <w:t xml:space="preserve">The sample query returns 5 rows with valid customer_id and name values.</w:t>
-      </w:r>
-      <w:r>
-        <w:t xml:space="preserve"> </w:t>
-      </w:r>
-      <w:r>
-        <w:t xml:space="preserve">testlist</w:t>
-      </w:r>
-    </w:p>
-    <w:p>
-      <w:pPr>
-        <w:pStyle w:val="DefinitionTerm"/>
-      </w:pPr>
-      <w:r>
-        <w:t xml:space="preserve">Test Result</w:t>
-      </w:r>
-    </w:p>
-    <w:p>
-      <w:pPr>
-        <w:pStyle w:val="Definition"/>
-      </w:pPr>
-      <w:r>
+        <w:rPr>
+          <w:bCs/>
+          <w:b/>
+        </w:rPr>
         <w:t xml:space="preserve">Pass</w:t>
       </w:r>
     </w:p>
@@ -3207,19 +3236,7 @@
         <w:pStyle w:val="Definition"/>
       </w:pPr>
       <w:r>
-        <w:t xml:space="preserve">Confirm that IAM policies correctly restrict OBS bucket</w:t>
-      </w:r>
-      <w:r>
-        <w:t xml:space="preserve"> </w:t>
-      </w:r>
-      <w:r>
-        <w:t xml:space="preserve">access — authorized users can read/write while unauthorized users are</w:t>
-      </w:r>
-      <w:r>
-        <w:t xml:space="preserve"> </w:t>
-      </w:r>
-      <w:r>
-        <w:t xml:space="preserve">denied, and the bucket policy matches the principle of least privilege.</w:t>
+        <w:t xml:space="preserve">Confirm that IAM policies correctly restrict OBS bucket access — authorized users can read/write while unauthorized users are denied, and the bucket policy matches the principle of least privilege.</w:t>
       </w:r>
     </w:p>
     <w:p>
@@ -3228,106 +3245,476 @@
       </w:pPr>
       <w:r>
         <w:t xml:space="preserve">Prerequisites</w:t>
-      </w:r>
-    </w:p>
-    <w:p>
-      <w:pPr>
-        <w:pStyle w:val="Definition"/>
-      </w:pPr>
-      <w:r>
-        <w:t xml:space="preserve">testlist</w:t>
-      </w:r>
-      <w:r>
-        <w:t xml:space="preserve"> </w:t>
-      </w:r>
-      <w:r>
-        <w:t xml:space="preserve">OBS bucket poc-datalake-raw exists with the designated IAM policy.</w:t>
-      </w:r>
-      <w:r>
-        <w:t xml:space="preserve"> </w:t>
-      </w:r>
-      <w:r>
-        <w:t xml:space="preserve">Two test IAM users: one with OBS_ReadWrite role, one with no OBS permissions.</w:t>
-      </w:r>
-      <w:r>
-        <w:t xml:space="preserve"> </w:t>
-      </w:r>
-      <w:r>
-        <w:t xml:space="preserve">obsutil CLI configured for both users.</w:t>
-      </w:r>
-      <w:r>
-        <w:t xml:space="preserve"> </w:t>
-      </w:r>
-      <w:r>
-        <w:t xml:space="preserve">testlist</w:t>
-      </w:r>
-    </w:p>
-    <w:p>
-      <w:pPr>
-        <w:pStyle w:val="DefinitionTerm"/>
-      </w:pPr>
-      <w:r>
-        <w:t xml:space="preserve">Procedure</w:t>
       </w:r>
     </w:p>
     <w:p>
       <w:pPr>
         <w:numPr>
           <w:ilvl w:val="0"/>
-          <w:numId w:val="1009"/>
+          <w:numId w:val="1015"/>
         </w:numPr>
         <w:pStyle w:val="Compact"/>
       </w:pPr>
       <w:r>
-        <w:t xml:space="preserve">Using the authorized user, upload a test file to poc-datalake-raw</w:t>
+        <w:t xml:space="preserve">OBS bucket</w:t>
+      </w:r>
+      <w:r>
+        <w:t xml:space="preserve"> </w:t>
+      </w:r>
+      <w:r>
+        <w:rPr>
+          <w:rStyle w:val="VerbatimChar"/>
+        </w:rPr>
+        <w:t xml:space="preserve">poc-datalake-raw</w:t>
+      </w:r>
+      <w:r>
+        <w:t xml:space="preserve"> </w:t>
+      </w:r>
+      <w:r>
+        <w:t xml:space="preserve">exists with the designated IAM policy. - Two test IAM users: one with</w:t>
+      </w:r>
+      <w:r>
+        <w:t xml:space="preserve"> </w:t>
+      </w:r>
+      <w:r>
+        <w:rPr>
+          <w:bCs/>
+          <w:b/>
+        </w:rPr>
+        <w:t xml:space="preserve">OBS_ReadWrite</w:t>
+      </w:r>
+      <w:r>
+        <w:t xml:space="preserve"> </w:t>
+      </w:r>
+      <w:r>
+        <w:t xml:space="preserve">role, one with no OBS permissions. -</w:t>
+      </w:r>
+      <w:r>
+        <w:t xml:space="preserve"> </w:t>
+      </w:r>
+      <w:r>
+        <w:rPr>
+          <w:rStyle w:val="VerbatimChar"/>
+        </w:rPr>
+        <w:t xml:space="preserve">obsutil</w:t>
+      </w:r>
+      <w:r>
+        <w:t xml:space="preserve"> </w:t>
+      </w:r>
+      <w:r>
+        <w:t xml:space="preserve">CLI configured for both users.</w:t>
+      </w:r>
+    </w:p>
+    <w:p>
+      <w:pPr>
+        <w:pStyle w:val="DefinitionTerm"/>
+      </w:pPr>
+      <w:r>
+        <w:t xml:space="preserve">Procedure</w:t>
+      </w:r>
+    </w:p>
+    <w:p>
+      <w:pPr>
+        <w:pStyle w:val="Definition"/>
+      </w:pPr>
+      <w:r>
+        <w:t xml:space="preserve">1. Using the authorized user, upload a test file to</w:t>
+      </w:r>
+      <w:r>
+        <w:t xml:space="preserve"> </w:t>
+      </w:r>
+      <w:r>
+        <w:rPr>
+          <w:rStyle w:val="VerbatimChar"/>
+        </w:rPr>
+        <w:t xml:space="preserve">poc-datalake-raw</w:t>
+      </w:r>
+      <w:r>
+        <w:t xml:space="preserve"> </w:t>
+      </w:r>
+      <w:r>
+        <w:t xml:space="preserve">2. Using the authorized user, download and verify the file content 3. Using the unauthorized user, attempt to upload a file — verify the request is denied (HTTP 403) 4. Using the unauthorized user, attempt to list objects in the bucket — verify the request is denied 5. Review the bucket policy in the Console at</w:t>
+      </w:r>
+      <w:r>
+        <w:t xml:space="preserve"> </w:t>
+      </w:r>
+      <w:r>
+        <w:rPr>
+          <w:bCs/>
+          <w:b/>
+        </w:rPr>
+        <w:t xml:space="preserve">Console</w:t>
+      </w:r>
+      <w:r>
+        <w:t xml:space="preserve"> </w:t>
+      </w:r>
+      <w:r>
+        <w:rPr>
+          <w:bCs/>
+          <w:b/>
+        </w:rPr>
+        <w:t xml:space="preserve">→</w:t>
+      </w:r>
+      <w:r>
+        <w:t xml:space="preserve"> </w:t>
+      </w:r>
+      <w:r>
+        <w:rPr>
+          <w:bCs/>
+          <w:b/>
+        </w:rPr>
+        <w:t xml:space="preserve">Object Storage Service</w:t>
+      </w:r>
+      <w:r>
+        <w:t xml:space="preserve"> </w:t>
+      </w:r>
+      <w:r>
+        <w:rPr>
+          <w:bCs/>
+          <w:b/>
+        </w:rPr>
+        <w:t xml:space="preserve">→</w:t>
+      </w:r>
+      <w:r>
+        <w:t xml:space="preserve"> </w:t>
+      </w:r>
+      <w:r>
+        <w:rPr>
+          <w:bCs/>
+          <w:b/>
+        </w:rPr>
+        <w:t xml:space="preserve">Bucket Policies</w:t>
+      </w:r>
+      <w:r>
+        <w:t xml:space="preserve"> </w:t>
+      </w:r>
+      <w:r>
+        <w:t xml:space="preserve">and confirm it grants only the intended permissions</w:t>
+      </w:r>
+    </w:p>
+    <w:p>
+      <w:pPr>
+        <w:pStyle w:val="DefinitionTerm"/>
+      </w:pPr>
+      <w:r>
+        <w:t xml:space="preserve">Expected Result</w:t>
       </w:r>
     </w:p>
     <w:p>
       <w:pPr>
         <w:numPr>
           <w:ilvl w:val="0"/>
-          <w:numId w:val="1009"/>
+          <w:numId w:val="1016"/>
         </w:numPr>
         <w:pStyle w:val="Compact"/>
       </w:pPr>
       <w:r>
-        <w:t xml:space="preserve">Using the authorized user, download and verify the file content</w:t>
+        <w:t xml:space="preserve">Authorized user can upload and download successfully. - Unauthorized user receives HTTP 403 on both upload and list operations. - Bucket policy grants only the intended read/write permissions to the designated roles.</w:t>
+      </w:r>
+    </w:p>
+    <w:p>
+      <w:pPr>
+        <w:pStyle w:val="DefinitionTerm"/>
+      </w:pPr>
+      <w:r>
+        <w:t xml:space="preserve">Test Result</w:t>
+      </w:r>
+    </w:p>
+    <w:p>
+      <w:pPr>
+        <w:pStyle w:val="Definition"/>
+      </w:pPr>
+      <w:r>
+        <w:rPr>
+          <w:bCs/>
+          <w:b/>
+        </w:rPr>
+        <w:t xml:space="preserve">Pass</w:t>
+      </w:r>
+    </w:p>
+    <w:p>
+      <w:pPr>
+        <w:pStyle w:val="DefinitionTerm"/>
+      </w:pPr>
+      <w:r>
+        <w:t xml:space="preserve">Remarks</w:t>
+      </w:r>
+    </w:p>
+    <w:p>
+      <w:pPr>
+        <w:pStyle w:val="Definition"/>
+      </w:pPr>
+      <w:r>
+        <w:t xml:space="preserve">Check the Cloud Trail logs if access denial is not returned as expected — there may be a policy inheritance from the project or domain level.</w:t>
+      </w:r>
+    </w:p>
+    <w:p>
+      <w:pPr>
+        <w:pStyle w:val="Heading2"/>
+      </w:pPr>
+      <w:r>
+        <w:rPr>
+          <w:rStyle w:val="SectionNumber"/>
+        </w:rPr>
+        <w:t xml:space="preserve">0.8</w:t>
+      </w:r>
+      <w:r>
+        <w:tab/>
+      </w:r>
+      <w:r>
+        <w:t xml:space="preserve">TC-008: Verify DataArts Studio data masking rule</w:t>
+      </w:r>
+    </w:p>
+    <w:p>
+      <w:pPr>
+        <w:pStyle w:val="DefinitionTerm"/>
+      </w:pPr>
+      <w:r>
+        <w:t xml:space="preserve">Objective</w:t>
+      </w:r>
+    </w:p>
+    <w:p>
+      <w:pPr>
+        <w:pStyle w:val="Definition"/>
+      </w:pPr>
+      <w:r>
+        <w:t xml:space="preserve">Confirm that sensitive data columns (e.g. PII fields) are masked according to the DataArts Studio data masking rule when queried by non-admin users.</w:t>
+      </w:r>
+    </w:p>
+    <w:p>
+      <w:pPr>
+        <w:pStyle w:val="DefinitionTerm"/>
+      </w:pPr>
+      <w:r>
+        <w:t xml:space="preserve">Prerequisites</w:t>
       </w:r>
     </w:p>
     <w:p>
       <w:pPr>
         <w:numPr>
           <w:ilvl w:val="0"/>
-          <w:numId w:val="1009"/>
+          <w:numId w:val="1017"/>
         </w:numPr>
         <w:pStyle w:val="Compact"/>
       </w:pPr>
       <w:r>
-        <w:t xml:space="preserve">Using the unauthorized user, attempt to upload a file — verify the request is denied (HTTP 403)</w:t>
+        <w:t xml:space="preserve">TC-004 completed (DataArts Studio workspace accessible). - Data masking rule configured for column</w:t>
+      </w:r>
+      <w:r>
+        <w:t xml:space="preserve"> </w:t>
+      </w:r>
+      <w:r>
+        <w:rPr>
+          <w:rStyle w:val="VerbatimChar"/>
+        </w:rPr>
+        <w:t xml:space="preserve">customers.ssn</w:t>
+      </w:r>
+      <w:r>
+        <w:t xml:space="preserve"> </w:t>
+      </w:r>
+      <w:r>
+        <w:t xml:space="preserve">(Social Security Number). - Test user has</w:t>
+      </w:r>
+      <w:r>
+        <w:t xml:space="preserve"> </w:t>
+      </w:r>
+      <w:r>
+        <w:rPr>
+          <w:bCs/>
+          <w:b/>
+        </w:rPr>
+        <w:t xml:space="preserve">Dayu_User</w:t>
+      </w:r>
+      <w:r>
+        <w:t xml:space="preserve"> </w:t>
+      </w:r>
+      <w:r>
+        <w:t xml:space="preserve">role (not admin).</w:t>
+      </w:r>
+    </w:p>
+    <w:p>
+      <w:pPr>
+        <w:pStyle w:val="DefinitionTerm"/>
+      </w:pPr>
+      <w:r>
+        <w:t xml:space="preserve">Procedure</w:t>
+      </w:r>
+    </w:p>
+    <w:p>
+      <w:pPr>
+        <w:pStyle w:val="Definition"/>
+      </w:pPr>
+      <w:r>
+        <w:t xml:space="preserve">1. In the DataArts Studio console, navigate to</w:t>
+      </w:r>
+      <w:r>
+        <w:t xml:space="preserve"> </w:t>
+      </w:r>
+      <w:r>
+        <w:rPr>
+          <w:bCs/>
+          <w:b/>
+        </w:rPr>
+        <w:t xml:space="preserve">Data Architecture</w:t>
+      </w:r>
+      <w:r>
+        <w:t xml:space="preserve"> </w:t>
+      </w:r>
+      <m:oMath>
+        <m:r>
+          <m:rPr>
+            <m:sty m:val="p"/>
+          </m:rPr>
+          <m:t>→</m:t>
+        </m:r>
+      </m:oMath>
+      <w:r>
+        <w:t xml:space="preserve"> </w:t>
+      </w:r>
+      <w:r>
+        <w:rPr>
+          <w:bCs/>
+          <w:b/>
+        </w:rPr>
+        <w:t xml:space="preserve">Data Masking</w:t>
+      </w:r>
+      <w:r>
+        <w:t xml:space="preserve"> </w:t>
+      </w:r>
+      <w:r>
+        <w:t xml:space="preserve">2. Verify the masking rule for</w:t>
+      </w:r>
+      <w:r>
+        <w:t xml:space="preserve"> </w:t>
+      </w:r>
+      <w:r>
+        <w:rPr>
+          <w:rStyle w:val="VerbatimChar"/>
+        </w:rPr>
+        <w:t xml:space="preserve">customers.ssn</w:t>
+      </w:r>
+      <w:r>
+        <w:t xml:space="preserve"> </w:t>
+      </w:r>
+      <w:r>
+        <w:t xml:space="preserve">is active and uses the</w:t>
+      </w:r>
+      <w:r>
+        <w:t xml:space="preserve"> </w:t>
+      </w:r>
+      <w:r>
+        <w:rPr>
+          <w:bCs/>
+          <w:b/>
+        </w:rPr>
+        <w:t xml:space="preserve">Mask All</w:t>
+      </w:r>
+      <w:r>
+        <w:t xml:space="preserve"> </w:t>
+      </w:r>
+      <w:r>
+        <w:t xml:space="preserve">strategy 3. Query the</w:t>
+      </w:r>
+      <w:r>
+        <w:t xml:space="preserve"> </w:t>
+      </w:r>
+      <w:r>
+        <w:rPr>
+          <w:rStyle w:val="VerbatimChar"/>
+        </w:rPr>
+        <w:t xml:space="preserve">customers</w:t>
+      </w:r>
+      <w:r>
+        <w:t xml:space="preserve"> </w:t>
+      </w:r>
+      <w:r>
+        <w:t xml:space="preserve">table as the test user via DataArts Studio SQL console 4. Verify the</w:t>
+      </w:r>
+      <w:r>
+        <w:t xml:space="preserve"> </w:t>
+      </w:r>
+      <w:r>
+        <w:rPr>
+          <w:rStyle w:val="VerbatimChar"/>
+        </w:rPr>
+        <w:t xml:space="preserve">ssn</w:t>
+      </w:r>
+      <w:r>
+        <w:t xml:space="preserve"> </w:t>
+      </w:r>
+      <w:r>
+        <w:t xml:space="preserve">column returns masked values (e.g. </w:t>
+      </w:r>
+      <w:r>
+        <w:rPr>
+          <w:rStyle w:val="VerbatimChar"/>
+        </w:rPr>
+        <w:t xml:space="preserve">*********</w:t>
+      </w:r>
+      <w:r>
+        <w:t xml:space="preserve">) instead of real data 5. Query the same table as an admin user and verify real values are returned</w:t>
+      </w:r>
+    </w:p>
+    <w:p>
+      <w:pPr>
+        <w:pStyle w:val="DefinitionTerm"/>
+      </w:pPr>
+      <w:r>
+        <w:t xml:space="preserve">Expected Result</w:t>
       </w:r>
     </w:p>
     <w:p>
       <w:pPr>
         <w:numPr>
           <w:ilvl w:val="0"/>
-          <w:numId w:val="1009"/>
+          <w:numId w:val="1018"/>
         </w:numPr>
         <w:pStyle w:val="Compact"/>
       </w:pPr>
       <w:r>
-        <w:t xml:space="preserve">Using the unauthorized user, attempt to list objects in the bucket — verify the request is denied</w:t>
-      </w:r>
-    </w:p>
-    <w:p>
-      <w:pPr>
-        <w:numPr>
-          <w:ilvl w:val="0"/>
-          <w:numId w:val="1009"/>
-        </w:numPr>
-        <w:pStyle w:val="Compact"/>
-      </w:pPr>
-      <w:r>
-        <w:t xml:space="preserve">Review the bucket policy in the Console at Console, Object Storage Service, Bucket Policies and confirm it grants only the intended permissions</w:t>
+        <w:t xml:space="preserve">Masking rule is active for</w:t>
+      </w:r>
+      <w:r>
+        <w:t xml:space="preserve"> </w:t>
+      </w:r>
+      <w:r>
+        <w:rPr>
+          <w:rStyle w:val="VerbatimChar"/>
+        </w:rPr>
+        <w:t xml:space="preserve">customers.ssn</w:t>
+      </w:r>
+      <w:r>
+        <w:t xml:space="preserve">. - Non-admin user sees masked values in the</w:t>
+      </w:r>
+      <w:r>
+        <w:t xml:space="preserve"> </w:t>
+      </w:r>
+      <w:r>
+        <w:rPr>
+          <w:rStyle w:val="VerbatimChar"/>
+        </w:rPr>
+        <w:t xml:space="preserve">ssn</w:t>
+      </w:r>
+      <w:r>
+        <w:t xml:space="preserve"> </w:t>
+      </w:r>
+      <w:r>
+        <w:t xml:space="preserve">column. - Admin user sees real values in the</w:t>
+      </w:r>
+      <w:r>
+        <w:t xml:space="preserve"> </w:t>
+      </w:r>
+      <w:r>
+        <w:rPr>
+          <w:rStyle w:val="VerbatimChar"/>
+        </w:rPr>
+        <w:t xml:space="preserve">ssn</w:t>
+      </w:r>
+      <w:r>
+        <w:t xml:space="preserve"> </w:t>
+      </w:r>
+      <w:r>
+        <w:t xml:space="preserve">column.</w:t>
       </w:r>
     </w:p>
     <w:p>
@@ -3335,7 +3722,7 @@
         <w:pStyle w:val="DefinitionTerm"/>
       </w:pPr>
       <w:r>
-        <w:t xml:space="preserve">Expected Result</w:t>
+        <w:t xml:space="preserve">Test Result</w:t>
       </w:r>
     </w:p>
     <w:p>
@@ -3343,271 +3730,10 @@
         <w:pStyle w:val="Definition"/>
       </w:pPr>
       <w:r>
-        <w:t xml:space="preserve">testlist</w:t>
-      </w:r>
-      <w:r>
-        <w:t xml:space="preserve"> </w:t>
-      </w:r>
-      <w:r>
-        <w:t xml:space="preserve">Authorized user can upload and download successfully.</w:t>
-      </w:r>
-      <w:r>
-        <w:t xml:space="preserve"> </w:t>
-      </w:r>
-      <w:r>
-        <w:t xml:space="preserve">Unauthorized user receives HTTP 403 on both upload and list operations.</w:t>
-      </w:r>
-      <w:r>
-        <w:t xml:space="preserve"> </w:t>
-      </w:r>
-      <w:r>
-        <w:t xml:space="preserve">Bucket policy grants only the intended read/write permissions to the designated roles.</w:t>
-      </w:r>
-      <w:r>
-        <w:t xml:space="preserve"> </w:t>
-      </w:r>
-      <w:r>
-        <w:t xml:space="preserve">testlist</w:t>
-      </w:r>
-    </w:p>
-    <w:p>
-      <w:pPr>
-        <w:pStyle w:val="DefinitionTerm"/>
-      </w:pPr>
-      <w:r>
-        <w:t xml:space="preserve">Test Result</w:t>
-      </w:r>
-    </w:p>
-    <w:p>
-      <w:pPr>
-        <w:pStyle w:val="Definition"/>
-      </w:pPr>
-      <w:r>
-        <w:t xml:space="preserve">Pass</w:t>
-      </w:r>
-    </w:p>
-    <w:p>
-      <w:pPr>
-        <w:pStyle w:val="DefinitionTerm"/>
-      </w:pPr>
-      <w:r>
-        <w:t xml:space="preserve">Remarks</w:t>
-      </w:r>
-    </w:p>
-    <w:p>
-      <w:pPr>
-        <w:pStyle w:val="Definition"/>
-      </w:pPr>
-      <w:r>
-        <w:t xml:space="preserve">Check the Cloud Trail logs if access denial is not returned as expected — there may be a policy inheritance from the project or domain level.</w:t>
-      </w:r>
-    </w:p>
-    <w:p>
-      <w:pPr>
-        <w:pStyle w:val="Heading2"/>
-      </w:pPr>
-      <w:r>
-        <w:rPr>
-          <w:rStyle w:val="SectionNumber"/>
-        </w:rPr>
-        <w:t xml:space="preserve">0.8</w:t>
-      </w:r>
-      <w:r>
-        <w:tab/>
-      </w:r>
-      <w:r>
-        <w:t xml:space="preserve">TC-008: Verify DataArts Studio data masking rule</w:t>
-      </w:r>
-    </w:p>
-    <w:p>
-      <w:pPr>
-        <w:pStyle w:val="DefinitionTerm"/>
-      </w:pPr>
-      <w:r>
-        <w:t xml:space="preserve">Objective</w:t>
-      </w:r>
-    </w:p>
-    <w:p>
-      <w:pPr>
-        <w:pStyle w:val="Definition"/>
-      </w:pPr>
-      <w:r>
-        <w:t xml:space="preserve">Confirm that sensitive data columns (e.g. PII fields) are</w:t>
-      </w:r>
-      <w:r>
-        <w:t xml:space="preserve"> </w:t>
-      </w:r>
-      <w:r>
-        <w:t xml:space="preserve">masked according to the DataArts Studio data masking rule when queried</w:t>
-      </w:r>
-      <w:r>
-        <w:t xml:space="preserve"> </w:t>
-      </w:r>
-      <w:r>
-        <w:t xml:space="preserve">by non-admin users.</w:t>
-      </w:r>
-    </w:p>
-    <w:p>
-      <w:pPr>
-        <w:pStyle w:val="DefinitionTerm"/>
-      </w:pPr>
-      <w:r>
-        <w:t xml:space="preserve">Prerequisites</w:t>
-      </w:r>
-    </w:p>
-    <w:p>
-      <w:pPr>
-        <w:pStyle w:val="Definition"/>
-      </w:pPr>
-      <w:r>
-        <w:t xml:space="preserve">testlist</w:t>
-      </w:r>
-      <w:r>
-        <w:t xml:space="preserve"> </w:t>
-      </w:r>
-      <w:r>
-        <w:t xml:space="preserve">TC-004 completed (DataArts Studio workspace accessible).</w:t>
-      </w:r>
-      <w:r>
-        <w:t xml:space="preserve"> </w:t>
-      </w:r>
-      <w:r>
-        <w:t xml:space="preserve">Data masking rule configured for column customers.ssn (Social Security Number).</w:t>
-      </w:r>
-      <w:r>
-        <w:t xml:space="preserve"> </w:t>
-      </w:r>
-      <w:r>
-        <w:t xml:space="preserve">Test user has Dayu_User role (not admin).</w:t>
-      </w:r>
-      <w:r>
-        <w:t xml:space="preserve"> </w:t>
-      </w:r>
-      <w:r>
-        <w:t xml:space="preserve">testlist</w:t>
-      </w:r>
-    </w:p>
-    <w:p>
-      <w:pPr>
-        <w:pStyle w:val="DefinitionTerm"/>
-      </w:pPr>
-      <w:r>
-        <w:t xml:space="preserve">Procedure</w:t>
-      </w:r>
-    </w:p>
-    <w:p>
-      <w:pPr>
-        <w:numPr>
-          <w:ilvl w:val="0"/>
-          <w:numId w:val="1010"/>
-        </w:numPr>
-        <w:pStyle w:val="Compact"/>
-      </w:pPr>
-      <w:r>
-        <w:t xml:space="preserve">In the DataArts Studio console, navigate to Data Architecture $$ Data Masking</w:t>
-      </w:r>
-    </w:p>
-    <w:p>
-      <w:pPr>
-        <w:numPr>
-          <w:ilvl w:val="0"/>
-          <w:numId w:val="1010"/>
-        </w:numPr>
-        <w:pStyle w:val="Compact"/>
-      </w:pPr>
-      <w:r>
-        <w:t xml:space="preserve">Verify the masking rule for customers.ssn is active and uses the Mask All strategy</w:t>
-      </w:r>
-    </w:p>
-    <w:p>
-      <w:pPr>
-        <w:numPr>
-          <w:ilvl w:val="0"/>
-          <w:numId w:val="1010"/>
-        </w:numPr>
-        <w:pStyle w:val="Compact"/>
-      </w:pPr>
-      <w:r>
-        <w:t xml:space="preserve">Query the customers table as the test user via DataArts Studio SQL console</w:t>
-      </w:r>
-    </w:p>
-    <w:p>
-      <w:pPr>
-        <w:numPr>
-          <w:ilvl w:val="0"/>
-          <w:numId w:val="1010"/>
-        </w:numPr>
-        <w:pStyle w:val="Compact"/>
-      </w:pPr>
-      <w:r>
-        <w:t xml:space="preserve">Verify the ssn column returns masked values (e.g. *********) instead of real data</w:t>
-      </w:r>
-    </w:p>
-    <w:p>
-      <w:pPr>
-        <w:numPr>
-          <w:ilvl w:val="0"/>
-          <w:numId w:val="1010"/>
-        </w:numPr>
-        <w:pStyle w:val="Compact"/>
-      </w:pPr>
-      <w:r>
-        <w:t xml:space="preserve">Query the same table as an admin user and verify real values are returned</w:t>
-      </w:r>
-    </w:p>
-    <w:p>
-      <w:pPr>
-        <w:pStyle w:val="DefinitionTerm"/>
-      </w:pPr>
-      <w:r>
-        <w:t xml:space="preserve">Expected Result</w:t>
-      </w:r>
-    </w:p>
-    <w:p>
-      <w:pPr>
-        <w:pStyle w:val="Definition"/>
-      </w:pPr>
-      <w:r>
-        <w:t xml:space="preserve">testlist</w:t>
-      </w:r>
-      <w:r>
-        <w:t xml:space="preserve"> </w:t>
-      </w:r>
-      <w:r>
-        <w:t xml:space="preserve">Masking rule is active for customers.ssn.</w:t>
-      </w:r>
-      <w:r>
-        <w:t xml:space="preserve"> </w:t>
-      </w:r>
-      <w:r>
-        <w:t xml:space="preserve">Non-admin user sees masked values in the ssn column.</w:t>
-      </w:r>
-      <w:r>
-        <w:t xml:space="preserve"> </w:t>
-      </w:r>
-      <w:r>
-        <w:t xml:space="preserve">Admin user sees real values in the ssn column.</w:t>
-      </w:r>
-      <w:r>
-        <w:t xml:space="preserve"> </w:t>
-      </w:r>
-      <w:r>
-        <w:t xml:space="preserve">testlist</w:t>
-      </w:r>
-    </w:p>
-    <w:p>
-      <w:pPr>
-        <w:pStyle w:val="DefinitionTerm"/>
-      </w:pPr>
-      <w:r>
-        <w:t xml:space="preserve">Test Result</w:t>
-      </w:r>
-    </w:p>
-    <w:p>
-      <w:pPr>
-        <w:pStyle w:val="Definition"/>
-      </w:pPr>
-      <w:r>
+        <w:rPr>
+          <w:bCs/>
+          <w:b/>
+        </w:rPr>
         <w:t xml:space="preserve">Pass</w:t>
       </w:r>
     </w:p>
@@ -3688,19 +3814,7 @@
         <w:pStyle w:val="Definition"/>
       </w:pPr>
       <w:r>
-        <w:t xml:space="preserve">Confirm that the Terraform configuration deploys all</w:t>
-      </w:r>
-      <w:r>
-        <w:t xml:space="preserve"> </w:t>
-      </w:r>
-      <w:r>
-        <w:t xml:space="preserve">required infrastructure resources (VPC, MRS, OBS, DataArts Studio)</w:t>
-      </w:r>
-      <w:r>
-        <w:t xml:space="preserve"> </w:t>
-      </w:r>
-      <w:r>
-        <w:t xml:space="preserve">without errors and the state file reflects the expected resources.</w:t>
+        <w:t xml:space="preserve">Confirm that the Terraform configuration deploys all required infrastructure resources (VPC, MRS, OBS, DataArts Studio) without errors and the state file reflects the expected resources.</w:t>
       </w:r>
     </w:p>
     <w:p>
@@ -3709,118 +3823,375 @@
       </w:pPr>
       <w:r>
         <w:t xml:space="preserve">Prerequisites</w:t>
-      </w:r>
-    </w:p>
-    <w:p>
-      <w:pPr>
-        <w:pStyle w:val="Definition"/>
-      </w:pPr>
-      <w:r>
-        <w:t xml:space="preserve">testlist</w:t>
-      </w:r>
-      <w:r>
-        <w:t xml:space="preserve"> </w:t>
-      </w:r>
-      <w:r>
-        <w:t xml:space="preserve">terraform CLI installed (version $$ 1.0).</w:t>
-      </w:r>
-      <w:r>
-        <w:t xml:space="preserve"> </w:t>
-      </w:r>
-      <w:r>
-        <w:t xml:space="preserve">AK/SK credentials configured via environment variables or provider.tf.</w:t>
-      </w:r>
-      <w:r>
-        <w:t xml:space="preserve"> </w:t>
-      </w:r>
-      <w:r>
-        <w:t xml:space="preserve">Terraform configuration files in the project directory.</w:t>
-      </w:r>
-      <w:r>
-        <w:t xml:space="preserve"> </w:t>
-      </w:r>
-      <w:r>
-        <w:t xml:space="preserve">testlist</w:t>
-      </w:r>
-    </w:p>
-    <w:p>
-      <w:pPr>
-        <w:pStyle w:val="DefinitionTerm"/>
-      </w:pPr>
-      <w:r>
-        <w:t xml:space="preserve">Procedure</w:t>
       </w:r>
     </w:p>
     <w:p>
       <w:pPr>
         <w:numPr>
           <w:ilvl w:val="0"/>
-          <w:numId w:val="1011"/>
+          <w:numId w:val="1019"/>
         </w:numPr>
         <w:pStyle w:val="Compact"/>
       </w:pPr>
       <w:r>
-        <w:t xml:space="preserve">Navigate to the Terraform project directory</w:t>
+        <w:rPr>
+          <w:rStyle w:val="VerbatimChar"/>
+        </w:rPr>
+        <w:t xml:space="preserve">terraform</w:t>
+      </w:r>
+      <w:r>
+        <w:t xml:space="preserve"> </w:t>
+      </w:r>
+      <w:r>
+        <w:t xml:space="preserve">CLI installed (version</w:t>
+      </w:r>
+      <w:r>
+        <w:t xml:space="preserve"> </w:t>
+      </w:r>
+      <m:oMath>
+        <m:r>
+          <m:rPr>
+            <m:sty m:val="p"/>
+          </m:rPr>
+          <m:t>≥</m:t>
+        </m:r>
+      </m:oMath>
+      <w:r>
+        <w:t xml:space="preserve"> </w:t>
+      </w:r>
+      <w:r>
+        <w:t xml:space="preserve">1.0). - AK/SK credentials configured via environment variables or</w:t>
+      </w:r>
+      <w:r>
+        <w:t xml:space="preserve"> </w:t>
+      </w:r>
+      <w:r>
+        <w:rPr>
+          <w:iCs/>
+          <w:i/>
+        </w:rPr>
+        <w:t xml:space="preserve">provider.tf</w:t>
+      </w:r>
+      <w:r>
+        <w:t xml:space="preserve">. - Terraform configuration files in the project directory.</w:t>
+      </w:r>
+    </w:p>
+    <w:p>
+      <w:pPr>
+        <w:pStyle w:val="DefinitionTerm"/>
+      </w:pPr>
+      <w:r>
+        <w:t xml:space="preserve">Procedure</w:t>
+      </w:r>
+    </w:p>
+    <w:p>
+      <w:pPr>
+        <w:pStyle w:val="Definition"/>
+      </w:pPr>
+      <w:r>
+        <w:t xml:space="preserve">1. Navigate to the Terraform project directory 2. Run</w:t>
+      </w:r>
+      <w:r>
+        <w:t xml:space="preserve"> </w:t>
+      </w:r>
+      <w:r>
+        <w:rPr>
+          <w:rStyle w:val="VerbatimChar"/>
+        </w:rPr>
+        <w:t xml:space="preserve">terraform init</w:t>
+      </w:r>
+      <w:r>
+        <w:t xml:space="preserve"> </w:t>
+      </w:r>
+      <w:r>
+        <w:t xml:space="preserve">to initialize the working directory 3. Run</w:t>
+      </w:r>
+      <w:r>
+        <w:t xml:space="preserve"> </w:t>
+      </w:r>
+      <w:r>
+        <w:rPr>
+          <w:rStyle w:val="VerbatimChar"/>
+        </w:rPr>
+        <w:t xml:space="preserve">terraform plan</w:t>
+      </w:r>
+      <w:r>
+        <w:t xml:space="preserve"> </w:t>
+      </w:r>
+      <w:r>
+        <w:t xml:space="preserve">and review the planned changes — confirm all expected resources are listed 4. Run</w:t>
+      </w:r>
+      <w:r>
+        <w:t xml:space="preserve"> </w:t>
+      </w:r>
+      <w:r>
+        <w:rPr>
+          <w:rStyle w:val="VerbatimChar"/>
+        </w:rPr>
+        <w:t xml:space="preserve">terraform apply -auto-approve</w:t>
+      </w:r>
+      <w:r>
+        <w:t xml:space="preserve"> </w:t>
+      </w:r>
+      <w:r>
+        <w:t xml:space="preserve">and wait for completion 5. Run</w:t>
+      </w:r>
+      <w:r>
+        <w:t xml:space="preserve"> </w:t>
+      </w:r>
+      <w:r>
+        <w:rPr>
+          <w:rStyle w:val="VerbatimChar"/>
+        </w:rPr>
+        <w:t xml:space="preserve">terraform output</w:t>
+      </w:r>
+      <w:r>
+        <w:t xml:space="preserve"> </w:t>
+      </w:r>
+      <w:r>
+        <w:t xml:space="preserve">and verify all output values are populated 6. Run</w:t>
+      </w:r>
+      <w:r>
+        <w:t xml:space="preserve"> </w:t>
+      </w:r>
+      <w:r>
+        <w:rPr>
+          <w:rStyle w:val="VerbatimChar"/>
+        </w:rPr>
+        <w:t xml:space="preserve">terraform state list</w:t>
+      </w:r>
+      <w:r>
+        <w:t xml:space="preserve"> </w:t>
+      </w:r>
+      <w:r>
+        <w:t xml:space="preserve">and confirm the resource count matches the architecture</w:t>
+      </w:r>
+    </w:p>
+    <w:p>
+      <w:pPr>
+        <w:pStyle w:val="DefinitionTerm"/>
+      </w:pPr>
+      <w:r>
+        <w:t xml:space="preserve">Expected Result</w:t>
       </w:r>
     </w:p>
     <w:p>
       <w:pPr>
         <w:numPr>
           <w:ilvl w:val="0"/>
-          <w:numId w:val="1011"/>
+          <w:numId w:val="1020"/>
         </w:numPr>
         <w:pStyle w:val="Compact"/>
       </w:pPr>
       <w:r>
-        <w:t xml:space="preserve">Run terraform init to initialize the working directory</w:t>
+        <w:rPr>
+          <w:rStyle w:val="VerbatimChar"/>
+        </w:rPr>
+        <w:t xml:space="preserve">terraform apply</w:t>
+      </w:r>
+      <w:r>
+        <w:t xml:space="preserve"> </w:t>
+      </w:r>
+      <w:r>
+        <w:t xml:space="preserve">completes with no errors. - All output values are populated (cluster ID, bucket name, VPC ID). - Resource count in state matches the architecture specification.</w:t>
+      </w:r>
+    </w:p>
+    <w:p>
+      <w:pPr>
+        <w:pStyle w:val="DefinitionTerm"/>
+      </w:pPr>
+      <w:r>
+        <w:t xml:space="preserve">Test Result</w:t>
+      </w:r>
+    </w:p>
+    <w:p>
+      <w:pPr>
+        <w:pStyle w:val="Definition"/>
+      </w:pPr>
+      <w:r>
+        <w:rPr>
+          <w:bCs/>
+          <w:b/>
+        </w:rPr>
+        <w:t xml:space="preserve">Pass</w:t>
+      </w:r>
+    </w:p>
+    <w:p>
+      <w:pPr>
+        <w:pStyle w:val="DefinitionTerm"/>
+      </w:pPr>
+      <w:r>
+        <w:t xml:space="preserve">Remarks</w:t>
+      </w:r>
+    </w:p>
+    <w:p>
+      <w:pPr>
+        <w:pStyle w:val="Definition"/>
+      </w:pPr>
+      <w:r>
+        <w:t xml:space="preserve">If</w:t>
+      </w:r>
+      <w:r>
+        <w:t xml:space="preserve"> </w:t>
+      </w:r>
+      <w:r>
+        <w:rPr>
+          <w:rStyle w:val="VerbatimChar"/>
+        </w:rPr>
+        <w:t xml:space="preserve">terraform apply</w:t>
+      </w:r>
+      <w:r>
+        <w:t xml:space="preserve"> </w:t>
+      </w:r>
+      <w:r>
+        <w:t xml:space="preserve">fails, check the AK/SK credentials and the</w:t>
+      </w:r>
+      <w:r>
+        <w:t xml:space="preserve"> </w:t>
+      </w:r>
+      <w:r>
+        <w:rPr>
+          <w:rStyle w:val="VerbatimChar"/>
+        </w:rPr>
+        <w:t xml:space="preserve">sa-brazil-1</w:t>
+      </w:r>
+      <w:r>
+        <w:t xml:space="preserve"> </w:t>
+      </w:r>
+      <w:r>
+        <w:t xml:space="preserve">region quota limits.</w:t>
+      </w:r>
+    </w:p>
+    <w:p>
+      <w:pPr>
+        <w:pStyle w:val="Heading2"/>
+      </w:pPr>
+      <w:r>
+        <w:rPr>
+          <w:rStyle w:val="SectionNumber"/>
+        </w:rPr>
+        <w:t xml:space="preserve">0.10</w:t>
+      </w:r>
+      <w:r>
+        <w:tab/>
+      </w:r>
+      <w:r>
+        <w:t xml:space="preserve">TC-010: Verify test data upload to OBS</w:t>
+      </w:r>
+    </w:p>
+    <w:p>
+      <w:pPr>
+        <w:pStyle w:val="DefinitionTerm"/>
+      </w:pPr>
+      <w:r>
+        <w:t xml:space="preserve">Objective</w:t>
+      </w:r>
+    </w:p>
+    <w:p>
+      <w:pPr>
+        <w:pStyle w:val="Definition"/>
+      </w:pPr>
+      <w:r>
+        <w:t xml:space="preserve">Confirm that all required test data files (CSV, JSON) can be uploaded to the designated OBS bucket and are accessible by the DataArts Studio pipeline.</w:t>
+      </w:r>
+    </w:p>
+    <w:p>
+      <w:pPr>
+        <w:pStyle w:val="DefinitionTerm"/>
+      </w:pPr>
+      <w:r>
+        <w:t xml:space="preserve">Prerequisites</w:t>
       </w:r>
     </w:p>
     <w:p>
       <w:pPr>
         <w:numPr>
           <w:ilvl w:val="0"/>
-          <w:numId w:val="1011"/>
+          <w:numId w:val="1021"/>
         </w:numPr>
         <w:pStyle w:val="Compact"/>
       </w:pPr>
       <w:r>
-        <w:t xml:space="preserve">Run terraform plan and review the planned changes — confirm all expected resources are listed</w:t>
+        <w:t xml:space="preserve">TC-002 completed (OBS bucket accessible). - Test data files prepared in the local directory</w:t>
+      </w:r>
+      <w:r>
+        <w:t xml:space="preserve"> </w:t>
+      </w:r>
+      <w:r>
+        <w:rPr>
+          <w:iCs/>
+          <w:i/>
+        </w:rPr>
+        <w:t xml:space="preserve">./test-data/</w:t>
+      </w:r>
+      <w:r>
+        <w:t xml:space="preserve">. -</w:t>
+      </w:r>
+      <w:r>
+        <w:t xml:space="preserve"> </w:t>
+      </w:r>
+      <w:r>
+        <w:rPr>
+          <w:rStyle w:val="VerbatimChar"/>
+        </w:rPr>
+        <w:t xml:space="preserve">obsutil</w:t>
+      </w:r>
+      <w:r>
+        <w:t xml:space="preserve"> </w:t>
+      </w:r>
+      <w:r>
+        <w:t xml:space="preserve">CLI configured with the test user credentials.</w:t>
+      </w:r>
+    </w:p>
+    <w:p>
+      <w:pPr>
+        <w:pStyle w:val="DefinitionTerm"/>
+      </w:pPr>
+      <w:r>
+        <w:t xml:space="preserve">Procedure</w:t>
+      </w:r>
+    </w:p>
+    <w:p>
+      <w:pPr>
+        <w:pStyle w:val="Definition"/>
+      </w:pPr>
+      <w:r>
+        <w:t xml:space="preserve">1. List the local test data files and verify their integrity (row count, schema) 2. Upload all files to the OBS raw bucket using</w:t>
+      </w:r>
+      <w:r>
+        <w:t xml:space="preserve"> </w:t>
+      </w:r>
+      <w:r>
+        <w:rPr>
+          <w:rStyle w:val="VerbatimChar"/>
+        </w:rPr>
+        <w:t xml:space="preserve">obsutil</w:t>
+      </w:r>
+      <w:r>
+        <w:t xml:space="preserve"> </w:t>
+      </w:r>
+      <w:r>
+        <w:t xml:space="preserve">3. Verify each file exists in OBS by listing the bucket contents 4. Download a sample file from OBS and compare it with the local original (checksum) 5. In DataArts Studio, verify the data source connection can read the uploaded files</w:t>
+      </w:r>
+    </w:p>
+    <w:p>
+      <w:pPr>
+        <w:pStyle w:val="DefinitionTerm"/>
+      </w:pPr>
+      <w:r>
+        <w:t xml:space="preserve">Expected Result</w:t>
       </w:r>
     </w:p>
     <w:p>
       <w:pPr>
         <w:numPr>
           <w:ilvl w:val="0"/>
-          <w:numId w:val="1011"/>
+          <w:numId w:val="1022"/>
         </w:numPr>
         <w:pStyle w:val="Compact"/>
       </w:pPr>
       <w:r>
-        <w:t xml:space="preserve">Run terraform apply -auto-approve and wait for completion</w:t>
-      </w:r>
-    </w:p>
-    <w:p>
-      <w:pPr>
-        <w:numPr>
-          <w:ilvl w:val="0"/>
-          <w:numId w:val="1011"/>
-        </w:numPr>
-        <w:pStyle w:val="Compact"/>
-      </w:pPr>
-      <w:r>
-        <w:t xml:space="preserve">Run terraform output and verify all output values are populated</w:t>
-      </w:r>
-    </w:p>
-    <w:p>
-      <w:pPr>
-        <w:numPr>
-          <w:ilvl w:val="0"/>
-          <w:numId w:val="1011"/>
-        </w:numPr>
-        <w:pStyle w:val="Compact"/>
-      </w:pPr>
-      <w:r>
-        <w:t xml:space="preserve">Run terraform state list and confirm the resource count matches the architecture</w:t>
+        <w:t xml:space="preserve">All test data files are uploaded without errors. - Bucket listing shows all uploaded files with correct sizes. - Downloaded file checksum matches the local original. - DataArts Studio data source connection can read the files.</w:t>
       </w:r>
     </w:p>
     <w:p>
@@ -3828,7 +4199,7 @@
         <w:pStyle w:val="DefinitionTerm"/>
       </w:pPr>
       <w:r>
-        <w:t xml:space="preserve">Expected Result</w:t>
+        <w:t xml:space="preserve">Test Result</w:t>
       </w:r>
     </w:p>
     <w:p>
@@ -3836,31 +4207,11 @@
         <w:pStyle w:val="Definition"/>
       </w:pPr>
       <w:r>
-        <w:t xml:space="preserve">testlist</w:t>
-      </w:r>
-      <w:r>
-        <w:t xml:space="preserve"> </w:t>
-      </w:r>
-      <w:r>
-        <w:t xml:space="preserve">terraform apply completes with no errors.</w:t>
-      </w:r>
-      <w:r>
-        <w:t xml:space="preserve"> </w:t>
-      </w:r>
-      <w:r>
-        <w:t xml:space="preserve">All output values are populated (cluster ID, bucket name, VPC ID).</w:t>
-      </w:r>
-      <w:r>
-        <w:t xml:space="preserve"> </w:t>
-      </w:r>
-      <w:r>
-        <w:t xml:space="preserve">Resource count in state matches the architecture specification.</w:t>
-      </w:r>
-      <w:r>
-        <w:t xml:space="preserve"> </w:t>
-      </w:r>
-      <w:r>
-        <w:t xml:space="preserve">testlist</w:t>
+        <w:rPr>
+          <w:bCs/>
+          <w:b/>
+        </w:rPr>
+        <w:t xml:space="preserve">Pass</w:t>
       </w:r>
     </w:p>
     <w:p>
@@ -3868,7 +4219,7 @@
         <w:pStyle w:val="DefinitionTerm"/>
       </w:pPr>
       <w:r>
-        <w:t xml:space="preserve">Test Result</w:t>
+        <w:t xml:space="preserve">Remarks</w:t>
       </w:r>
     </w:p>
     <w:p>
@@ -3876,254 +4227,18 @@
         <w:pStyle w:val="Definition"/>
       </w:pPr>
       <w:r>
-        <w:t xml:space="preserve">Pass</w:t>
-      </w:r>
-    </w:p>
-    <w:p>
-      <w:pPr>
-        <w:pStyle w:val="DefinitionTerm"/>
-      </w:pPr>
-      <w:r>
-        <w:t xml:space="preserve">Remarks</w:t>
-      </w:r>
-    </w:p>
-    <w:p>
-      <w:pPr>
-        <w:pStyle w:val="Definition"/>
-      </w:pPr>
-      <w:r>
-        <w:t xml:space="preserve">If terraform apply fails, check the AK/SK credentials and the sa-brazil-1 region quota limits.</w:t>
-      </w:r>
-    </w:p>
-    <w:p>
-      <w:pPr>
-        <w:pStyle w:val="Heading2"/>
-      </w:pPr>
-      <w:r>
-        <w:rPr>
-          <w:rStyle w:val="SectionNumber"/>
-        </w:rPr>
-        <w:t xml:space="preserve">0.10</w:t>
-      </w:r>
-      <w:r>
-        <w:tab/>
-      </w:r>
-      <w:r>
-        <w:t xml:space="preserve">TC-010: Verify test data upload to OBS</w:t>
-      </w:r>
-    </w:p>
-    <w:p>
-      <w:pPr>
-        <w:pStyle w:val="DefinitionTerm"/>
-      </w:pPr>
-      <w:r>
-        <w:t xml:space="preserve">Objective</w:t>
-      </w:r>
-    </w:p>
-    <w:p>
-      <w:pPr>
-        <w:pStyle w:val="Definition"/>
-      </w:pPr>
-      <w:r>
-        <w:t xml:space="preserve">Confirm that all required test data files (CSV, JSON) can</w:t>
-      </w:r>
-      <w:r>
-        <w:t xml:space="preserve"> </w:t>
-      </w:r>
-      <w:r>
-        <w:t xml:space="preserve">be uploaded to the designated OBS bucket and are accessible by the</w:t>
-      </w:r>
-      <w:r>
-        <w:t xml:space="preserve"> </w:t>
-      </w:r>
-      <w:r>
-        <w:t xml:space="preserve">DataArts Studio pipeline.</w:t>
-      </w:r>
-    </w:p>
-    <w:p>
-      <w:pPr>
-        <w:pStyle w:val="DefinitionTerm"/>
-      </w:pPr>
-      <w:r>
-        <w:t xml:space="preserve">Prerequisites</w:t>
-      </w:r>
-    </w:p>
-    <w:p>
-      <w:pPr>
-        <w:pStyle w:val="Definition"/>
-      </w:pPr>
-      <w:r>
-        <w:t xml:space="preserve">testlist</w:t>
-      </w:r>
-      <w:r>
-        <w:t xml:space="preserve"> </w:t>
-      </w:r>
-      <w:r>
-        <w:t xml:space="preserve">TC-002 completed (OBS bucket accessible).</w:t>
-      </w:r>
-      <w:r>
-        <w:t xml:space="preserve"> </w:t>
-      </w:r>
-      <w:r>
-        <w:t xml:space="preserve">Test data files prepared in the local directory ./test-data/.</w:t>
-      </w:r>
-      <w:r>
-        <w:t xml:space="preserve"> </w:t>
-      </w:r>
-      <w:r>
-        <w:t xml:space="preserve">obsutil CLI configured with the test user credentials.</w:t>
-      </w:r>
-      <w:r>
-        <w:t xml:space="preserve"> </w:t>
-      </w:r>
-      <w:r>
-        <w:t xml:space="preserve">testlist</w:t>
-      </w:r>
-    </w:p>
-    <w:p>
-      <w:pPr>
-        <w:pStyle w:val="DefinitionTerm"/>
-      </w:pPr>
-      <w:r>
-        <w:t xml:space="preserve">Procedure</w:t>
-      </w:r>
-    </w:p>
-    <w:p>
-      <w:pPr>
-        <w:numPr>
-          <w:ilvl w:val="0"/>
-          <w:numId w:val="1012"/>
-        </w:numPr>
-        <w:pStyle w:val="Compact"/>
-      </w:pPr>
-      <w:r>
-        <w:t xml:space="preserve">List the local test data files and verify their integrity (row count, schema)</w:t>
-      </w:r>
-    </w:p>
-    <w:p>
-      <w:pPr>
-        <w:numPr>
-          <w:ilvl w:val="0"/>
-          <w:numId w:val="1012"/>
-        </w:numPr>
-        <w:pStyle w:val="Compact"/>
-      </w:pPr>
-      <w:r>
-        <w:t xml:space="preserve">Upload all files to the OBS raw bucket using obsutil</w:t>
-      </w:r>
-    </w:p>
-    <w:p>
-      <w:pPr>
-        <w:numPr>
-          <w:ilvl w:val="0"/>
-          <w:numId w:val="1012"/>
-        </w:numPr>
-        <w:pStyle w:val="Compact"/>
-      </w:pPr>
-      <w:r>
-        <w:t xml:space="preserve">Verify each file exists in OBS by listing the bucket contents</w:t>
-      </w:r>
-    </w:p>
-    <w:p>
-      <w:pPr>
-        <w:numPr>
-          <w:ilvl w:val="0"/>
-          <w:numId w:val="1012"/>
-        </w:numPr>
-        <w:pStyle w:val="Compact"/>
-      </w:pPr>
-      <w:r>
-        <w:t xml:space="preserve">Download a sample file from OBS and compare it with the local original (checksum)</w:t>
-      </w:r>
-    </w:p>
-    <w:p>
-      <w:pPr>
-        <w:numPr>
-          <w:ilvl w:val="0"/>
-          <w:numId w:val="1012"/>
-        </w:numPr>
-        <w:pStyle w:val="Compact"/>
-      </w:pPr>
-      <w:r>
-        <w:t xml:space="preserve">In DataArts Studio, verify the data source connection can read the uploaded files</w:t>
-      </w:r>
-    </w:p>
-    <w:p>
-      <w:pPr>
-        <w:pStyle w:val="DefinitionTerm"/>
-      </w:pPr>
-      <w:r>
-        <w:t xml:space="preserve">Expected Result</w:t>
-      </w:r>
-    </w:p>
-    <w:p>
-      <w:pPr>
-        <w:pStyle w:val="Definition"/>
-      </w:pPr>
-      <w:r>
-        <w:t xml:space="preserve">testlist</w:t>
-      </w:r>
-      <w:r>
-        <w:t xml:space="preserve"> </w:t>
-      </w:r>
-      <w:r>
-        <w:t xml:space="preserve">All test data files are uploaded without errors.</w:t>
-      </w:r>
-      <w:r>
-        <w:t xml:space="preserve"> </w:t>
-      </w:r>
-      <w:r>
-        <w:t xml:space="preserve">Bucket listing shows all uploaded files with correct sizes.</w:t>
-      </w:r>
-      <w:r>
-        <w:t xml:space="preserve"> </w:t>
-      </w:r>
-      <w:r>
-        <w:t xml:space="preserve">Downloaded file checksum matches the local original.</w:t>
-      </w:r>
-      <w:r>
-        <w:t xml:space="preserve"> </w:t>
-      </w:r>
-      <w:r>
-        <w:t xml:space="preserve">DataArts Studio data source connection can read the files.</w:t>
-      </w:r>
-      <w:r>
-        <w:t xml:space="preserve"> </w:t>
-      </w:r>
-      <w:r>
-        <w:t xml:space="preserve">testlist</w:t>
-      </w:r>
-    </w:p>
-    <w:p>
-      <w:pPr>
-        <w:pStyle w:val="DefinitionTerm"/>
-      </w:pPr>
-      <w:r>
-        <w:t xml:space="preserve">Test Result</w:t>
-      </w:r>
-    </w:p>
-    <w:p>
-      <w:pPr>
-        <w:pStyle w:val="Definition"/>
-      </w:pPr>
-      <w:r>
-        <w:t xml:space="preserve">Pass</w:t>
-      </w:r>
-    </w:p>
-    <w:p>
-      <w:pPr>
-        <w:pStyle w:val="DefinitionTerm"/>
-      </w:pPr>
-      <w:r>
-        <w:t xml:space="preserve">Remarks</w:t>
-      </w:r>
-    </w:p>
-    <w:p>
-      <w:pPr>
-        <w:pStyle w:val="Definition"/>
-      </w:pPr>
-      <w:r>
-        <w:t xml:space="preserve">Large files ($&gt;$1 GB) should be uploaded using the OBS multipart upload feature for better reliability.</w:t>
+        <w:t xml:space="preserve">Large files (</w:t>
+      </w:r>
+      <m:oMath>
+        <m:r>
+          <m:rPr>
+            <m:sty m:val="p"/>
+          </m:rPr>
+          <m:t>&gt;</m:t>
+        </m:r>
+      </m:oMath>
+      <w:r>
+        <w:t xml:space="preserve">1 GB) should be uploaded using the OBS multipart upload feature for better reliability.</w:t>
       </w:r>
     </w:p>
     <w:p>
@@ -4791,91 +4906,6 @@
       </w:pPr>
     </w:lvl>
   </w:abstractNum>
-  <w:abstractNum w:abstractNumId="99411">
-    <w:nsid w:val="A99411"/>
-    <w:multiLevelType w:val="multilevel"/>
-    <w:lvl w:ilvl="0">
-      <w:start w:val="1"/>
-      <w:numFmt w:val="decimal"/>
-      <w:lvlText w:val="%1."/>
-      <w:lvlJc w:val="left"/>
-      <w:pPr>
-        <w:ind w:left="480" w:hanging="240"/>
-      </w:pPr>
-    </w:lvl>
-    <w:lvl w:ilvl="1">
-      <w:start w:val="1"/>
-      <w:numFmt w:val="decimal"/>
-      <w:lvlText w:val="%2."/>
-      <w:lvlJc w:val="left"/>
-      <w:pPr>
-        <w:ind w:left="960" w:hanging="240"/>
-      </w:pPr>
-    </w:lvl>
-    <w:lvl w:ilvl="2">
-      <w:start w:val="1"/>
-      <w:numFmt w:val="decimal"/>
-      <w:lvlText w:val="%3."/>
-      <w:lvlJc w:val="left"/>
-      <w:pPr>
-        <w:ind w:left="1440" w:hanging="240"/>
-      </w:pPr>
-    </w:lvl>
-    <w:lvl w:ilvl="3">
-      <w:start w:val="1"/>
-      <w:numFmt w:val="decimal"/>
-      <w:lvlText w:val="%4."/>
-      <w:lvlJc w:val="left"/>
-      <w:pPr>
-        <w:ind w:left="2880" w:hanging="480"/>
-      </w:pPr>
-    </w:lvl>
-    <w:lvl w:ilvl="4">
-      <w:start w:val="1"/>
-      <w:numFmt w:val="decimal"/>
-      <w:lvlText w:val="%5."/>
-      <w:lvlJc w:val="left"/>
-      <w:pPr>
-        <w:ind w:left="3600" w:hanging="480"/>
-      </w:pPr>
-    </w:lvl>
-    <w:lvl w:ilvl="5">
-      <w:start w:val="1"/>
-      <w:numFmt w:val="decimal"/>
-      <w:lvlText w:val="%6."/>
-      <w:lvlJc w:val="left"/>
-      <w:pPr>
-        <w:ind w:left="4320" w:hanging="480"/>
-      </w:pPr>
-    </w:lvl>
-    <w:lvl w:ilvl="6">
-      <w:start w:val="1"/>
-      <w:numFmt w:val="decimal"/>
-      <w:lvlText w:val="%7."/>
-      <w:lvlJc w:val="left"/>
-      <w:pPr>
-        <w:ind w:left="5040" w:hanging="480"/>
-      </w:pPr>
-    </w:lvl>
-    <w:lvl w:ilvl="7">
-      <w:start w:val="1"/>
-      <w:numFmt w:val="decimal"/>
-      <w:lvlText w:val="%8."/>
-      <w:lvlJc w:val="left"/>
-      <w:pPr>
-        <w:ind w:left="5760" w:hanging="480"/>
-      </w:pPr>
-    </w:lvl>
-    <w:lvl w:ilvl="8">
-      <w:start w:val="1"/>
-      <w:numFmt w:val="decimal"/>
-      <w:lvlText w:val="%9."/>
-      <w:lvlJc w:val="left"/>
-      <w:pPr>
-        <w:ind w:left="6480" w:hanging="480"/>
-      </w:pPr>
-    </w:lvl>
-  </w:abstractNum>
   <w:num w:numId="1000">
     <w:abstractNumId w:val="990"/>
   </w:num>
@@ -4886,304 +4916,64 @@
     <w:abstractNumId w:val="991"/>
   </w:num>
   <w:num w:numId="1003">
-    <w:abstractNumId w:val="99411"/>
-    <w:lvlOverride w:ilvl="0">
-      <w:startOverride w:val="1"/>
-    </w:lvlOverride>
-    <w:lvlOverride w:ilvl="1">
-      <w:startOverride w:val="1"/>
-    </w:lvlOverride>
-    <w:lvlOverride w:ilvl="2">
-      <w:startOverride w:val="1"/>
-    </w:lvlOverride>
-    <w:lvlOverride w:ilvl="3">
-      <w:startOverride w:val="1"/>
-    </w:lvlOverride>
-    <w:lvlOverride w:ilvl="4">
-      <w:startOverride w:val="1"/>
-    </w:lvlOverride>
-    <w:lvlOverride w:ilvl="5">
-      <w:startOverride w:val="1"/>
-    </w:lvlOverride>
-    <w:lvlOverride w:ilvl="6">
-      <w:startOverride w:val="1"/>
-    </w:lvlOverride>
-    <w:lvlOverride w:ilvl="7">
-      <w:startOverride w:val="1"/>
-    </w:lvlOverride>
-    <w:lvlOverride w:ilvl="8">
-      <w:startOverride w:val="1"/>
-    </w:lvlOverride>
+    <w:abstractNumId w:val="991"/>
   </w:num>
   <w:num w:numId="1004">
-    <w:abstractNumId w:val="99411"/>
-    <w:lvlOverride w:ilvl="0">
-      <w:startOverride w:val="1"/>
-    </w:lvlOverride>
-    <w:lvlOverride w:ilvl="1">
-      <w:startOverride w:val="1"/>
-    </w:lvlOverride>
-    <w:lvlOverride w:ilvl="2">
-      <w:startOverride w:val="1"/>
-    </w:lvlOverride>
-    <w:lvlOverride w:ilvl="3">
-      <w:startOverride w:val="1"/>
-    </w:lvlOverride>
-    <w:lvlOverride w:ilvl="4">
-      <w:startOverride w:val="1"/>
-    </w:lvlOverride>
-    <w:lvlOverride w:ilvl="5">
-      <w:startOverride w:val="1"/>
-    </w:lvlOverride>
-    <w:lvlOverride w:ilvl="6">
-      <w:startOverride w:val="1"/>
-    </w:lvlOverride>
-    <w:lvlOverride w:ilvl="7">
-      <w:startOverride w:val="1"/>
-    </w:lvlOverride>
-    <w:lvlOverride w:ilvl="8">
-      <w:startOverride w:val="1"/>
-    </w:lvlOverride>
+    <w:abstractNumId w:val="991"/>
   </w:num>
   <w:num w:numId="1005">
-    <w:abstractNumId w:val="99411"/>
-    <w:lvlOverride w:ilvl="0">
-      <w:startOverride w:val="1"/>
-    </w:lvlOverride>
-    <w:lvlOverride w:ilvl="1">
-      <w:startOverride w:val="1"/>
-    </w:lvlOverride>
-    <w:lvlOverride w:ilvl="2">
-      <w:startOverride w:val="1"/>
-    </w:lvlOverride>
-    <w:lvlOverride w:ilvl="3">
-      <w:startOverride w:val="1"/>
-    </w:lvlOverride>
-    <w:lvlOverride w:ilvl="4">
-      <w:startOverride w:val="1"/>
-    </w:lvlOverride>
-    <w:lvlOverride w:ilvl="5">
-      <w:startOverride w:val="1"/>
-    </w:lvlOverride>
-    <w:lvlOverride w:ilvl="6">
-      <w:startOverride w:val="1"/>
-    </w:lvlOverride>
-    <w:lvlOverride w:ilvl="7">
-      <w:startOverride w:val="1"/>
-    </w:lvlOverride>
-    <w:lvlOverride w:ilvl="8">
-      <w:startOverride w:val="1"/>
-    </w:lvlOverride>
+    <w:abstractNumId w:val="991"/>
   </w:num>
   <w:num w:numId="1006">
-    <w:abstractNumId w:val="99411"/>
-    <w:lvlOverride w:ilvl="0">
-      <w:startOverride w:val="1"/>
-    </w:lvlOverride>
-    <w:lvlOverride w:ilvl="1">
-      <w:startOverride w:val="1"/>
-    </w:lvlOverride>
-    <w:lvlOverride w:ilvl="2">
-      <w:startOverride w:val="1"/>
-    </w:lvlOverride>
-    <w:lvlOverride w:ilvl="3">
-      <w:startOverride w:val="1"/>
-    </w:lvlOverride>
-    <w:lvlOverride w:ilvl="4">
-      <w:startOverride w:val="1"/>
-    </w:lvlOverride>
-    <w:lvlOverride w:ilvl="5">
-      <w:startOverride w:val="1"/>
-    </w:lvlOverride>
-    <w:lvlOverride w:ilvl="6">
-      <w:startOverride w:val="1"/>
-    </w:lvlOverride>
-    <w:lvlOverride w:ilvl="7">
-      <w:startOverride w:val="1"/>
-    </w:lvlOverride>
-    <w:lvlOverride w:ilvl="8">
-      <w:startOverride w:val="1"/>
-    </w:lvlOverride>
+    <w:abstractNumId w:val="991"/>
   </w:num>
   <w:num w:numId="1007">
-    <w:abstractNumId w:val="99411"/>
-    <w:lvlOverride w:ilvl="0">
-      <w:startOverride w:val="1"/>
-    </w:lvlOverride>
-    <w:lvlOverride w:ilvl="1">
-      <w:startOverride w:val="1"/>
-    </w:lvlOverride>
-    <w:lvlOverride w:ilvl="2">
-      <w:startOverride w:val="1"/>
-    </w:lvlOverride>
-    <w:lvlOverride w:ilvl="3">
-      <w:startOverride w:val="1"/>
-    </w:lvlOverride>
-    <w:lvlOverride w:ilvl="4">
-      <w:startOverride w:val="1"/>
-    </w:lvlOverride>
-    <w:lvlOverride w:ilvl="5">
-      <w:startOverride w:val="1"/>
-    </w:lvlOverride>
-    <w:lvlOverride w:ilvl="6">
-      <w:startOverride w:val="1"/>
-    </w:lvlOverride>
-    <w:lvlOverride w:ilvl="7">
-      <w:startOverride w:val="1"/>
-    </w:lvlOverride>
-    <w:lvlOverride w:ilvl="8">
-      <w:startOverride w:val="1"/>
-    </w:lvlOverride>
+    <w:abstractNumId w:val="991"/>
   </w:num>
   <w:num w:numId="1008">
-    <w:abstractNumId w:val="99411"/>
-    <w:lvlOverride w:ilvl="0">
-      <w:startOverride w:val="1"/>
-    </w:lvlOverride>
-    <w:lvlOverride w:ilvl="1">
-      <w:startOverride w:val="1"/>
-    </w:lvlOverride>
-    <w:lvlOverride w:ilvl="2">
-      <w:startOverride w:val="1"/>
-    </w:lvlOverride>
-    <w:lvlOverride w:ilvl="3">
-      <w:startOverride w:val="1"/>
-    </w:lvlOverride>
-    <w:lvlOverride w:ilvl="4">
-      <w:startOverride w:val="1"/>
-    </w:lvlOverride>
-    <w:lvlOverride w:ilvl="5">
-      <w:startOverride w:val="1"/>
-    </w:lvlOverride>
-    <w:lvlOverride w:ilvl="6">
-      <w:startOverride w:val="1"/>
-    </w:lvlOverride>
-    <w:lvlOverride w:ilvl="7">
-      <w:startOverride w:val="1"/>
-    </w:lvlOverride>
-    <w:lvlOverride w:ilvl="8">
-      <w:startOverride w:val="1"/>
-    </w:lvlOverride>
+    <w:abstractNumId w:val="991"/>
   </w:num>
   <w:num w:numId="1009">
-    <w:abstractNumId w:val="99411"/>
-    <w:lvlOverride w:ilvl="0">
-      <w:startOverride w:val="1"/>
-    </w:lvlOverride>
-    <w:lvlOverride w:ilvl="1">
-      <w:startOverride w:val="1"/>
-    </w:lvlOverride>
-    <w:lvlOverride w:ilvl="2">
-      <w:startOverride w:val="1"/>
-    </w:lvlOverride>
-    <w:lvlOverride w:ilvl="3">
-      <w:startOverride w:val="1"/>
-    </w:lvlOverride>
-    <w:lvlOverride w:ilvl="4">
-      <w:startOverride w:val="1"/>
-    </w:lvlOverride>
-    <w:lvlOverride w:ilvl="5">
-      <w:startOverride w:val="1"/>
-    </w:lvlOverride>
-    <w:lvlOverride w:ilvl="6">
-      <w:startOverride w:val="1"/>
-    </w:lvlOverride>
-    <w:lvlOverride w:ilvl="7">
-      <w:startOverride w:val="1"/>
-    </w:lvlOverride>
-    <w:lvlOverride w:ilvl="8">
-      <w:startOverride w:val="1"/>
-    </w:lvlOverride>
+    <w:abstractNumId w:val="991"/>
   </w:num>
   <w:num w:numId="1010">
-    <w:abstractNumId w:val="99411"/>
-    <w:lvlOverride w:ilvl="0">
-      <w:startOverride w:val="1"/>
-    </w:lvlOverride>
-    <w:lvlOverride w:ilvl="1">
-      <w:startOverride w:val="1"/>
-    </w:lvlOverride>
-    <w:lvlOverride w:ilvl="2">
-      <w:startOverride w:val="1"/>
-    </w:lvlOverride>
-    <w:lvlOverride w:ilvl="3">
-      <w:startOverride w:val="1"/>
-    </w:lvlOverride>
-    <w:lvlOverride w:ilvl="4">
-      <w:startOverride w:val="1"/>
-    </w:lvlOverride>
-    <w:lvlOverride w:ilvl="5">
-      <w:startOverride w:val="1"/>
-    </w:lvlOverride>
-    <w:lvlOverride w:ilvl="6">
-      <w:startOverride w:val="1"/>
-    </w:lvlOverride>
-    <w:lvlOverride w:ilvl="7">
-      <w:startOverride w:val="1"/>
-    </w:lvlOverride>
-    <w:lvlOverride w:ilvl="8">
-      <w:startOverride w:val="1"/>
-    </w:lvlOverride>
+    <w:abstractNumId w:val="991"/>
   </w:num>
   <w:num w:numId="1011">
-    <w:abstractNumId w:val="99411"/>
-    <w:lvlOverride w:ilvl="0">
-      <w:startOverride w:val="1"/>
-    </w:lvlOverride>
-    <w:lvlOverride w:ilvl="1">
-      <w:startOverride w:val="1"/>
-    </w:lvlOverride>
-    <w:lvlOverride w:ilvl="2">
-      <w:startOverride w:val="1"/>
-    </w:lvlOverride>
-    <w:lvlOverride w:ilvl="3">
-      <w:startOverride w:val="1"/>
-    </w:lvlOverride>
-    <w:lvlOverride w:ilvl="4">
-      <w:startOverride w:val="1"/>
-    </w:lvlOverride>
-    <w:lvlOverride w:ilvl="5">
-      <w:startOverride w:val="1"/>
-    </w:lvlOverride>
-    <w:lvlOverride w:ilvl="6">
-      <w:startOverride w:val="1"/>
-    </w:lvlOverride>
-    <w:lvlOverride w:ilvl="7">
-      <w:startOverride w:val="1"/>
-    </w:lvlOverride>
-    <w:lvlOverride w:ilvl="8">
-      <w:startOverride w:val="1"/>
-    </w:lvlOverride>
+    <w:abstractNumId w:val="991"/>
   </w:num>
   <w:num w:numId="1012">
-    <w:abstractNumId w:val="99411"/>
-    <w:lvlOverride w:ilvl="0">
-      <w:startOverride w:val="1"/>
-    </w:lvlOverride>
-    <w:lvlOverride w:ilvl="1">
-      <w:startOverride w:val="1"/>
-    </w:lvlOverride>
-    <w:lvlOverride w:ilvl="2">
-      <w:startOverride w:val="1"/>
-    </w:lvlOverride>
-    <w:lvlOverride w:ilvl="3">
-      <w:startOverride w:val="1"/>
-    </w:lvlOverride>
-    <w:lvlOverride w:ilvl="4">
-      <w:startOverride w:val="1"/>
-    </w:lvlOverride>
-    <w:lvlOverride w:ilvl="5">
-      <w:startOverride w:val="1"/>
-    </w:lvlOverride>
-    <w:lvlOverride w:ilvl="6">
-      <w:startOverride w:val="1"/>
-    </w:lvlOverride>
-    <w:lvlOverride w:ilvl="7">
-      <w:startOverride w:val="1"/>
-    </w:lvlOverride>
-    <w:lvlOverride w:ilvl="8">
-      <w:startOverride w:val="1"/>
-    </w:lvlOverride>
+    <w:abstractNumId w:val="991"/>
+  </w:num>
+  <w:num w:numId="1013">
+    <w:abstractNumId w:val="991"/>
+  </w:num>
+  <w:num w:numId="1014">
+    <w:abstractNumId w:val="991"/>
+  </w:num>
+  <w:num w:numId="1015">
+    <w:abstractNumId w:val="991"/>
+  </w:num>
+  <w:num w:numId="1016">
+    <w:abstractNumId w:val="991"/>
+  </w:num>
+  <w:num w:numId="1017">
+    <w:abstractNumId w:val="991"/>
+  </w:num>
+  <w:num w:numId="1018">
+    <w:abstractNumId w:val="991"/>
+  </w:num>
+  <w:num w:numId="1019">
+    <w:abstractNumId w:val="991"/>
+  </w:num>
+  <w:num w:numId="1020">
+    <w:abstractNumId w:val="991"/>
+  </w:num>
+  <w:num w:numId="1021">
+    <w:abstractNumId w:val="991"/>
+  </w:num>
+  <w:num w:numId="1022">
+    <w:abstractNumId w:val="991"/>
   </w:num>
 </w:numbering>
 </file>

</xml_diff>

<commit_message>
v4.5.0: unify prerequisites, procedure, expected as environments
Breaking API change:
- \testprerequisites and \testexpected changed from commands to environments
- All three fields (prerequisites, procedure, expected) now use the same
  pattern: environment + \teststep for auto-numbered items
- Uniform code, same visual style, same capabilities (images, code, callouts)

Migration: replace \testprerequisites{\begin{testlist}...\end{testlist}}
with \begin{testprerequisites}...\teststep{...}...\end{testprerequisites}

Updated: Lua filter, both samples, SKILL.md, README.md
</commit_message>
<xml_diff>
--- a/examples/testbook/en/main.docx
+++ b/examples/testbook/en/main.docx
@@ -70,7 +70,7 @@
         <w:pStyle w:val="CoverMeta"/>
       </w:pPr>
       <w:r>
-        <w:t xml:space="preserve">v2.1.0 — 2026-09-13 11:50</w:t>
+        <w:t xml:space="preserve">v2.1.0 — 2026-09-13 12:13</w:t>
       </w:r>
     </w:p>
     <w:p>
@@ -1782,14 +1782,10 @@
     </w:p>
     <w:p>
       <w:pPr>
-        <w:numPr>
-          <w:ilvl w:val="0"/>
-          <w:numId w:val="1003"/>
-        </w:numPr>
-        <w:pStyle w:val="Compact"/>
-      </w:pPr>
-      <w:r>
-        <w:t xml:space="preserve">Terraform infrastructure apply completed successfully. - MRS cluster ID is available in the Terraform output. - IAM user has</w:t>
+        <w:pStyle w:val="Definition"/>
+      </w:pPr>
+      <w:r>
+        <w:t xml:space="preserve">1. Terraform infrastructure apply completed successfully. 2. MRS cluster ID is available in the Terraform output. 3. IAM user has</w:t>
       </w:r>
       <w:r>
         <w:t xml:space="preserve"> </w:t>
@@ -1905,14 +1901,10 @@
     </w:p>
     <w:p>
       <w:pPr>
-        <w:numPr>
-          <w:ilvl w:val="0"/>
-          <w:numId w:val="1004"/>
-        </w:numPr>
-        <w:pStyle w:val="Compact"/>
-      </w:pPr>
-      <w:r>
-        <w:t xml:space="preserve">Cluster status is</w:t>
+        <w:pStyle w:val="Definition"/>
+      </w:pPr>
+      <w:r>
+        <w:t xml:space="preserve">1. Cluster status is</w:t>
       </w:r>
       <w:r>
         <w:t xml:space="preserve"> </w:t>
@@ -1925,7 +1917,7 @@
         <w:t xml:space="preserve">Running</w:t>
       </w:r>
       <w:r>
-        <w:t xml:space="preserve">. - All four components (HDFS, YARN, Spark, Hive) are listed with status</w:t>
+        <w:t xml:space="preserve">. 2. All four components (HDFS, YARN, Spark, Hive) are listed with status</w:t>
       </w:r>
       <w:r>
         <w:t xml:space="preserve"> </w:t>
@@ -1938,7 +1930,7 @@
         <w:t xml:space="preserve">Normal</w:t>
       </w:r>
       <w:r>
-        <w:t xml:space="preserve">. - All nodes report status</w:t>
+        <w:t xml:space="preserve">. 3. All nodes report status</w:t>
       </w:r>
       <w:r>
         <w:t xml:space="preserve"> </w:t>
@@ -2049,14 +2041,10 @@
     </w:p>
     <w:p>
       <w:pPr>
-        <w:numPr>
-          <w:ilvl w:val="0"/>
-          <w:numId w:val="1005"/>
-        </w:numPr>
-        <w:pStyle w:val="Compact"/>
-      </w:pPr>
-      <w:r>
-        <w:t xml:space="preserve">OBS bucket name is defined in the Terraform configuration. - IAM policy granting read/write access to the bucket is attached to the test user.</w:t>
+        <w:pStyle w:val="Definition"/>
+      </w:pPr>
+      <w:r>
+        <w:t xml:space="preserve">1. OBS bucket name is defined in the Terraform configuration. 2. IAM policy granting read/write access to the bucket is attached to the test user.</w:t>
       </w:r>
     </w:p>
     <w:p>
@@ -2155,14 +2143,10 @@
     </w:p>
     <w:p>
       <w:pPr>
-        <w:numPr>
-          <w:ilvl w:val="0"/>
-          <w:numId w:val="1006"/>
-        </w:numPr>
-        <w:pStyle w:val="Compact"/>
-      </w:pPr>
-      <w:r>
-        <w:t xml:space="preserve">Bucket exists with storage class</w:t>
+        <w:pStyle w:val="Definition"/>
+      </w:pPr>
+      <w:r>
+        <w:t xml:space="preserve">1. Bucket exists with storage class</w:t>
       </w:r>
       <w:r>
         <w:t xml:space="preserve"> </w:t>
@@ -2175,7 +2159,7 @@
         <w:t xml:space="preserve">Standard</w:t>
       </w:r>
       <w:r>
-        <w:t xml:space="preserve">. - File upload completes without error. - Downloaded file content matches the original. - File deletion succeeds.</w:t>
+        <w:t xml:space="preserve">. 2. File upload completes without error. 3. Downloaded file content matches the original. 4. File deletion succeeds.</w:t>
       </w:r>
     </w:p>
     <w:p>
@@ -2257,14 +2241,10 @@
     </w:p>
     <w:p>
       <w:pPr>
-        <w:numPr>
-          <w:ilvl w:val="0"/>
-          <w:numId w:val="1007"/>
-        </w:numPr>
-        <w:pStyle w:val="Compact"/>
-      </w:pPr>
-      <w:r>
-        <w:t xml:space="preserve">VPC and subnet IDs are available from the Terraform output. - Security group names are documented in the solution architecture.</w:t>
+        <w:pStyle w:val="Definition"/>
+      </w:pPr>
+      <w:r>
+        <w:t xml:space="preserve">1. VPC and subnet IDs are available from the Terraform output. 2. Security group names are documented in the solution architecture.</w:t>
       </w:r>
     </w:p>
     <w:p>
@@ -2392,14 +2372,10 @@
     </w:p>
     <w:p>
       <w:pPr>
-        <w:numPr>
-          <w:ilvl w:val="0"/>
-          <w:numId w:val="1008"/>
-        </w:numPr>
-        <w:pStyle w:val="Compact"/>
-      </w:pPr>
-      <w:r>
-        <w:t xml:space="preserve">VPC CIDR is</w:t>
+        <w:pStyle w:val="Definition"/>
+      </w:pPr>
+      <w:r>
+        <w:t xml:space="preserve">1. VPC CIDR is</w:t>
       </w:r>
       <w:r>
         <w:t xml:space="preserve"> </w:t>
@@ -2411,7 +2387,7 @@
         <w:t xml:space="preserve">10.0.0.0/16</w:t>
       </w:r>
       <w:r>
-        <w:t xml:space="preserve">. - Subnet CIDR is</w:t>
+        <w:t xml:space="preserve">. 2. Subnet CIDR is</w:t>
       </w:r>
       <w:r>
         <w:t xml:space="preserve"> </w:t>
@@ -2423,7 +2399,7 @@
         <w:t xml:space="preserve">10.0.1.0/24</w:t>
       </w:r>
       <w:r>
-        <w:t xml:space="preserve">. - Inbound rules match the architecture: TCP 22 and TCP 443 from the specified sources. - Outbound allows all traffic.</w:t>
+        <w:t xml:space="preserve">. 3. Inbound rules match the architecture: TCP 22 and TCP 443 from the specified sources. 4. Outbound allows all traffic.</w:t>
       </w:r>
     </w:p>
     <w:p>
@@ -2552,14 +2528,10 @@
     </w:p>
     <w:p>
       <w:pPr>
-        <w:numPr>
-          <w:ilvl w:val="0"/>
-          <w:numId w:val="1009"/>
-        </w:numPr>
-        <w:pStyle w:val="Compact"/>
-      </w:pPr>
-      <w:r>
-        <w:t xml:space="preserve">DataArts Studio instance is provisioned and its status is</w:t>
+        <w:pStyle w:val="Definition"/>
+      </w:pPr>
+      <w:r>
+        <w:t xml:space="preserve">1. DataArts Studio instance is provisioned and its status is</w:t>
       </w:r>
       <w:r>
         <w:t xml:space="preserve"> </w:t>
@@ -2572,7 +2544,7 @@
         <w:t xml:space="preserve">Running</w:t>
       </w:r>
       <w:r>
-        <w:t xml:space="preserve">. - Test IAM user has the</w:t>
+        <w:t xml:space="preserve">. 2. Test IAM user has the</w:t>
       </w:r>
       <w:r>
         <w:t xml:space="preserve"> </w:t>
@@ -2734,14 +2706,10 @@
     </w:p>
     <w:p>
       <w:pPr>
-        <w:numPr>
-          <w:ilvl w:val="0"/>
-          <w:numId w:val="1010"/>
-        </w:numPr>
-        <w:pStyle w:val="Compact"/>
-      </w:pPr>
-      <w:r>
-        <w:t xml:space="preserve">Workspace is listed and accessible. - DataArts Studio console opens without errors. - All three modules (Data Integration, Data Development, Data Architecture) are visible in the navigation.</w:t>
+        <w:pStyle w:val="Definition"/>
+      </w:pPr>
+      <w:r>
+        <w:t xml:space="preserve">1. Workspace is listed and accessible. 2. DataArts Studio console opens without errors. 3. All three modules (Data Integration, Data Development, Data Architecture) are visible in the navigation.</w:t>
       </w:r>
     </w:p>
     <w:p>
@@ -2823,14 +2791,10 @@
     </w:p>
     <w:p>
       <w:pPr>
-        <w:numPr>
-          <w:ilvl w:val="0"/>
-          <w:numId w:val="1011"/>
-        </w:numPr>
-        <w:pStyle w:val="Compact"/>
-      </w:pPr>
-      <w:r>
-        <w:t xml:space="preserve">TC-004 completed (DataArts Studio workspace accessible). - Source CSV file (</w:t>
+        <w:pStyle w:val="Definition"/>
+      </w:pPr>
+      <w:r>
+        <w:t xml:space="preserve">1. TC-004 completed (DataArts Studio workspace accessible). 2. Source CSV file (</w:t>
       </w:r>
       <w:r>
         <w:rPr>
@@ -2839,7 +2803,7 @@
         <w:t xml:space="preserve">customers.csv</w:t>
       </w:r>
       <w:r>
-        <w:t xml:space="preserve">) exists in the OBS raw bucket. - Target OBS path (</w:t>
+        <w:t xml:space="preserve">) exists in the OBS raw bucket. 3. Target OBS path (</w:t>
       </w:r>
       <w:r>
         <w:rPr>
@@ -2848,7 +2812,7 @@
         <w:t xml:space="preserve">poc-datalake-curated/customers/</w:t>
       </w:r>
       <w:r>
-        <w:t xml:space="preserve">) is configured. - Pipeline</w:t>
+        <w:t xml:space="preserve">) is configured. 4. Pipeline</w:t>
       </w:r>
       <w:r>
         <w:t xml:space="preserve"> </w:t>
@@ -2907,14 +2871,10 @@
     </w:p>
     <w:p>
       <w:pPr>
-        <w:numPr>
-          <w:ilvl w:val="0"/>
-          <w:numId w:val="1012"/>
-        </w:numPr>
-        <w:pStyle w:val="Compact"/>
-      </w:pPr>
-      <w:r>
-        <w:t xml:space="preserve">Pipeline execution completes with status</w:t>
+        <w:pStyle w:val="Definition"/>
+      </w:pPr>
+      <w:r>
+        <w:t xml:space="preserve">1. Pipeline execution completes with status</w:t>
       </w:r>
       <w:r>
         <w:t xml:space="preserve"> </w:t>
@@ -2927,7 +2887,7 @@
         <w:t xml:space="preserve">Success</w:t>
       </w:r>
       <w:r>
-        <w:t xml:space="preserve">. - Output file is created in the target OBS path. - Row count of the output file matches the source file.</w:t>
+        <w:t xml:space="preserve">. 2. Output file is created in the target OBS path. 3. Row count of the output file matches the source file.</w:t>
       </w:r>
     </w:p>
     <w:p>
@@ -3009,14 +2969,10 @@
     </w:p>
     <w:p>
       <w:pPr>
-        <w:numPr>
-          <w:ilvl w:val="0"/>
-          <w:numId w:val="1013"/>
-        </w:numPr>
-        <w:pStyle w:val="Compact"/>
-      </w:pPr>
-      <w:r>
-        <w:t xml:space="preserve">TC-001 completed (MRS cluster healthy). - Hive table</w:t>
+        <w:pStyle w:val="Definition"/>
+      </w:pPr>
+      <w:r>
+        <w:t xml:space="preserve">1. TC-001 completed (MRS cluster healthy). 2. Hive table</w:t>
       </w:r>
       <w:r>
         <w:t xml:space="preserve"> </w:t>
@@ -3031,7 +2987,7 @@
         <w:t xml:space="preserve"> </w:t>
       </w:r>
       <w:r>
-        <w:t xml:space="preserve">exists and contains data loaded by the ingestion pipeline. - SSH access to the MRS master node is configured.</w:t>
+        <w:t xml:space="preserve">exists and contains data loaded by the ingestion pipeline. 3. SSH access to the MRS master node is configured.</w:t>
       </w:r>
     </w:p>
     <w:p>
@@ -3090,12 +3046,14 @@
     </w:p>
     <w:p>
       <w:pPr>
-        <w:numPr>
-          <w:ilvl w:val="0"/>
-          <w:numId w:val="1014"/>
-        </w:numPr>
-        <w:pStyle w:val="Compact"/>
-      </w:pPr>
+        <w:pStyle w:val="Definition"/>
+      </w:pPr>
+      <w:r>
+        <w:t xml:space="preserve">1.</w:t>
+      </w:r>
+      <w:r>
+        <w:t xml:space="preserve"> </w:t>
+      </w:r>
       <w:r>
         <w:rPr>
           <w:rStyle w:val="VerbatimChar"/>
@@ -3106,7 +3064,7 @@
         <w:t xml:space="preserve"> </w:t>
       </w:r>
       <w:r>
-        <w:t xml:space="preserve">returns 10,000. - The sample query returns 5 rows with valid</w:t>
+        <w:t xml:space="preserve">returns 10,000. 2. The sample query returns 5 rows with valid</w:t>
       </w:r>
       <w:r>
         <w:t xml:space="preserve"> </w:t>
@@ -3249,14 +3207,10 @@
     </w:p>
     <w:p>
       <w:pPr>
-        <w:numPr>
-          <w:ilvl w:val="0"/>
-          <w:numId w:val="1015"/>
-        </w:numPr>
-        <w:pStyle w:val="Compact"/>
-      </w:pPr>
-      <w:r>
-        <w:t xml:space="preserve">OBS bucket</w:t>
+        <w:pStyle w:val="Definition"/>
+      </w:pPr>
+      <w:r>
+        <w:t xml:space="preserve">1. OBS bucket</w:t>
       </w:r>
       <w:r>
         <w:t xml:space="preserve"> </w:t>
@@ -3271,7 +3225,7 @@
         <w:t xml:space="preserve"> </w:t>
       </w:r>
       <w:r>
-        <w:t xml:space="preserve">exists with the designated IAM policy. - Two test IAM users: one with</w:t>
+        <w:t xml:space="preserve">exists with the designated IAM policy. 2. Two test IAM users: one with</w:t>
       </w:r>
       <w:r>
         <w:t xml:space="preserve"> </w:t>
@@ -3287,7 +3241,7 @@
         <w:t xml:space="preserve"> </w:t>
       </w:r>
       <w:r>
-        <w:t xml:space="preserve">role, one with no OBS permissions. -</w:t>
+        <w:t xml:space="preserve">role, one with no OBS permissions. 3.</w:t>
       </w:r>
       <w:r>
         <w:t xml:space="preserve"> </w:t>
@@ -3402,14 +3356,10 @@
     </w:p>
     <w:p>
       <w:pPr>
-        <w:numPr>
-          <w:ilvl w:val="0"/>
-          <w:numId w:val="1016"/>
-        </w:numPr>
-        <w:pStyle w:val="Compact"/>
-      </w:pPr>
-      <w:r>
-        <w:t xml:space="preserve">Authorized user can upload and download successfully. - Unauthorized user receives HTTP 403 on both upload and list operations. - Bucket policy grants only the intended read/write permissions to the designated roles.</w:t>
+        <w:pStyle w:val="Definition"/>
+      </w:pPr>
+      <w:r>
+        <w:t xml:space="preserve">1. Authorized user can upload and download successfully. 2. Unauthorized user receives HTTP 403 on both upload and list operations. 3. Bucket policy grants only the intended read/write permissions to the designated roles.</w:t>
       </w:r>
     </w:p>
     <w:p>
@@ -3491,14 +3441,10 @@
     </w:p>
     <w:p>
       <w:pPr>
-        <w:numPr>
-          <w:ilvl w:val="0"/>
-          <w:numId w:val="1017"/>
-        </w:numPr>
-        <w:pStyle w:val="Compact"/>
-      </w:pPr>
-      <w:r>
-        <w:t xml:space="preserve">TC-004 completed (DataArts Studio workspace accessible). - Data masking rule configured for column</w:t>
+        <w:pStyle w:val="Definition"/>
+      </w:pPr>
+      <w:r>
+        <w:t xml:space="preserve">1. TC-004 completed (DataArts Studio workspace accessible). 2. Data masking rule configured for column</w:t>
       </w:r>
       <w:r>
         <w:t xml:space="preserve"> </w:t>
@@ -3513,7 +3459,7 @@
         <w:t xml:space="preserve"> </w:t>
       </w:r>
       <w:r>
-        <w:t xml:space="preserve">(Social Security Number). - Test user has</w:t>
+        <w:t xml:space="preserve">(Social Security Number). 3. Test user has</w:t>
       </w:r>
       <w:r>
         <w:t xml:space="preserve"> </w:t>
@@ -3665,14 +3611,10 @@
     </w:p>
     <w:p>
       <w:pPr>
-        <w:numPr>
-          <w:ilvl w:val="0"/>
-          <w:numId w:val="1018"/>
-        </w:numPr>
-        <w:pStyle w:val="Compact"/>
-      </w:pPr>
-      <w:r>
-        <w:t xml:space="preserve">Masking rule is active for</w:t>
+        <w:pStyle w:val="Definition"/>
+      </w:pPr>
+      <w:r>
+        <w:t xml:space="preserve">1. Masking rule is active for</w:t>
       </w:r>
       <w:r>
         <w:t xml:space="preserve"> </w:t>
@@ -3684,7 +3626,7 @@
         <w:t xml:space="preserve">customers.ssn</w:t>
       </w:r>
       <w:r>
-        <w:t xml:space="preserve">. - Non-admin user sees masked values in the</w:t>
+        <w:t xml:space="preserve">. 2. Non-admin user sees masked values in the</w:t>
       </w:r>
       <w:r>
         <w:t xml:space="preserve"> </w:t>
@@ -3699,7 +3641,7 @@
         <w:t xml:space="preserve"> </w:t>
       </w:r>
       <w:r>
-        <w:t xml:space="preserve">column. - Admin user sees real values in the</w:t>
+        <w:t xml:space="preserve">column. 3. Admin user sees real values in the</w:t>
       </w:r>
       <w:r>
         <w:t xml:space="preserve"> </w:t>
@@ -3827,12 +3769,14 @@
     </w:p>
     <w:p>
       <w:pPr>
-        <w:numPr>
-          <w:ilvl w:val="0"/>
-          <w:numId w:val="1019"/>
-        </w:numPr>
-        <w:pStyle w:val="Compact"/>
-      </w:pPr>
+        <w:pStyle w:val="Definition"/>
+      </w:pPr>
+      <w:r>
+        <w:t xml:space="preserve">1.</w:t>
+      </w:r>
+      <w:r>
+        <w:t xml:space="preserve"> </w:t>
+      </w:r>
       <w:r>
         <w:rPr>
           <w:rStyle w:val="VerbatimChar"/>
@@ -3860,7 +3804,7 @@
         <w:t xml:space="preserve"> </w:t>
       </w:r>
       <w:r>
-        <w:t xml:space="preserve">1.0). - AK/SK credentials configured via environment variables or</w:t>
+        <w:t xml:space="preserve">1.0). 2. AK/SK credentials configured via environment variables or</w:t>
       </w:r>
       <w:r>
         <w:t xml:space="preserve"> </w:t>
@@ -3873,7 +3817,7 @@
         <w:t xml:space="preserve">provider.tf</w:t>
       </w:r>
       <w:r>
-        <w:t xml:space="preserve">. - Terraform configuration files in the project directory.</w:t>
+        <w:t xml:space="preserve">. 3. Terraform configuration files in the project directory.</w:t>
       </w:r>
     </w:p>
     <w:p>
@@ -3977,12 +3921,14 @@
     </w:p>
     <w:p>
       <w:pPr>
-        <w:numPr>
-          <w:ilvl w:val="0"/>
-          <w:numId w:val="1020"/>
-        </w:numPr>
-        <w:pStyle w:val="Compact"/>
-      </w:pPr>
+        <w:pStyle w:val="Definition"/>
+      </w:pPr>
+      <w:r>
+        <w:t xml:space="preserve">1.</w:t>
+      </w:r>
+      <w:r>
+        <w:t xml:space="preserve"> </w:t>
+      </w:r>
       <w:r>
         <w:rPr>
           <w:rStyle w:val="VerbatimChar"/>
@@ -3993,7 +3939,7 @@
         <w:t xml:space="preserve"> </w:t>
       </w:r>
       <w:r>
-        <w:t xml:space="preserve">completes with no errors. - All output values are populated (cluster ID, bucket name, VPC ID). - Resource count in state matches the architecture specification.</w:t>
+        <w:t xml:space="preserve">completes with no errors. 2. All output values are populated (cluster ID, bucket name, VPC ID). 3. Resource count in state matches the architecture specification.</w:t>
       </w:r>
     </w:p>
     <w:p>
@@ -4105,14 +4051,10 @@
     </w:p>
     <w:p>
       <w:pPr>
-        <w:numPr>
-          <w:ilvl w:val="0"/>
-          <w:numId w:val="1021"/>
-        </w:numPr>
-        <w:pStyle w:val="Compact"/>
-      </w:pPr>
-      <w:r>
-        <w:t xml:space="preserve">TC-002 completed (OBS bucket accessible). - Test data files prepared in the local directory</w:t>
+        <w:pStyle w:val="Definition"/>
+      </w:pPr>
+      <w:r>
+        <w:t xml:space="preserve">1. TC-002 completed (OBS bucket accessible). 2. Test data files prepared in the local directory</w:t>
       </w:r>
       <w:r>
         <w:t xml:space="preserve"> </w:t>
@@ -4125,7 +4067,7 @@
         <w:t xml:space="preserve">./test-data/</w:t>
       </w:r>
       <w:r>
-        <w:t xml:space="preserve">. -</w:t>
+        <w:t xml:space="preserve">. 3.</w:t>
       </w:r>
       <w:r>
         <w:t xml:space="preserve"> </w:t>
@@ -4184,14 +4126,10 @@
     </w:p>
     <w:p>
       <w:pPr>
-        <w:numPr>
-          <w:ilvl w:val="0"/>
-          <w:numId w:val="1022"/>
-        </w:numPr>
-        <w:pStyle w:val="Compact"/>
-      </w:pPr>
-      <w:r>
-        <w:t xml:space="preserve">All test data files are uploaded without errors. - Bucket listing shows all uploaded files with correct sizes. - Downloaded file checksum matches the local original. - DataArts Studio data source connection can read the files.</w:t>
+        <w:pStyle w:val="Definition"/>
+      </w:pPr>
+      <w:r>
+        <w:t xml:space="preserve">1. All test data files are uploaded without errors. 2. Bucket listing shows all uploaded files with correct sizes. 3. Downloaded file checksum matches the local original. 4. DataArts Studio data source connection can read the files.</w:t>
       </w:r>
     </w:p>
     <w:p>
@@ -4913,66 +4851,6 @@
     <w:abstractNumId w:val="991"/>
   </w:num>
   <w:num w:numId="1002">
-    <w:abstractNumId w:val="991"/>
-  </w:num>
-  <w:num w:numId="1003">
-    <w:abstractNumId w:val="991"/>
-  </w:num>
-  <w:num w:numId="1004">
-    <w:abstractNumId w:val="991"/>
-  </w:num>
-  <w:num w:numId="1005">
-    <w:abstractNumId w:val="991"/>
-  </w:num>
-  <w:num w:numId="1006">
-    <w:abstractNumId w:val="991"/>
-  </w:num>
-  <w:num w:numId="1007">
-    <w:abstractNumId w:val="991"/>
-  </w:num>
-  <w:num w:numId="1008">
-    <w:abstractNumId w:val="991"/>
-  </w:num>
-  <w:num w:numId="1009">
-    <w:abstractNumId w:val="991"/>
-  </w:num>
-  <w:num w:numId="1010">
-    <w:abstractNumId w:val="991"/>
-  </w:num>
-  <w:num w:numId="1011">
-    <w:abstractNumId w:val="991"/>
-  </w:num>
-  <w:num w:numId="1012">
-    <w:abstractNumId w:val="991"/>
-  </w:num>
-  <w:num w:numId="1013">
-    <w:abstractNumId w:val="991"/>
-  </w:num>
-  <w:num w:numId="1014">
-    <w:abstractNumId w:val="991"/>
-  </w:num>
-  <w:num w:numId="1015">
-    <w:abstractNumId w:val="991"/>
-  </w:num>
-  <w:num w:numId="1016">
-    <w:abstractNumId w:val="991"/>
-  </w:num>
-  <w:num w:numId="1017">
-    <w:abstractNumId w:val="991"/>
-  </w:num>
-  <w:num w:numId="1018">
-    <w:abstractNumId w:val="991"/>
-  </w:num>
-  <w:num w:numId="1019">
-    <w:abstractNumId w:val="991"/>
-  </w:num>
-  <w:num w:numId="1020">
-    <w:abstractNumId w:val="991"/>
-  </w:num>
-  <w:num w:numId="1021">
-    <w:abstractNumId w:val="991"/>
-  </w:num>
-  <w:num w:numId="1022">
     <w:abstractNumId w:val="991"/>
   </w:num>
 </w:numbering>

</xml_diff>

<commit_message>
v4.7.0: caption-style testcase headings
- Testcase titles now render as captions (like figures/tables):
  **Testcase N:** description (bold label+number, regular text title)
- Changed label from 'Test Case' to 'Testcase' (one word)
- Portuguese label unchanged ('Caso de Teste')
- Lua filter: Para with Strong prefix instead of Header(3)
- Updated SKILL.md and README.md
</commit_message>
<xml_diff>
--- a/examples/testbook/en/main.docx
+++ b/examples/testbook/en/main.docx
@@ -70,7 +70,7 @@
         <w:pStyle w:val="CoverMeta"/>
       </w:pPr>
       <w:r>
-        <w:t xml:space="preserve">v2.1.0 — 2026-09-13 12:54</w:t>
+        <w:t xml:space="preserve">v2.1.0 — 2026-09-13 14:08</w:t>
       </w:r>
     </w:p>
     <w:p>
@@ -1267,19 +1267,20 @@
     </w:p>
     <w:p>
       <w:pPr>
-        <w:pStyle w:val="Heading3"/>
-      </w:pPr>
-      <w:r>
-        <w:rPr>
-          <w:rStyle w:val="SectionNumber"/>
-        </w:rPr>
-        <w:t xml:space="preserve">0.0.1</w:t>
-      </w:r>
-      <w:r>
-        <w:tab/>
-      </w:r>
-      <w:r>
-        <w:t xml:space="preserve">Test Case 1: Verify MRS cluster deployment and health</w:t>
+        <w:pStyle w:val="BodyText"/>
+      </w:pPr>
+      <w:r>
+        <w:rPr>
+          <w:bCs/>
+          <w:b/>
+        </w:rPr>
+        <w:t xml:space="preserve">Testcase 1:</w:t>
+      </w:r>
+      <w:r>
+        <w:t xml:space="preserve"> </w:t>
+      </w:r>
+      <w:r>
+        <w:t xml:space="preserve">Verify MRS cluster deployment and health</w:t>
       </w:r>
     </w:p>
     <w:p>
@@ -1526,19 +1527,20 @@
     </w:p>
     <w:p>
       <w:pPr>
-        <w:pStyle w:val="Heading3"/>
-      </w:pPr>
-      <w:r>
-        <w:rPr>
-          <w:rStyle w:val="SectionNumber"/>
-        </w:rPr>
-        <w:t xml:space="preserve">0.0.2</w:t>
-      </w:r>
-      <w:r>
-        <w:tab/>
-      </w:r>
-      <w:r>
-        <w:t xml:space="preserve">Test Case 2: Verify OBS bucket creation and accessibility</w:t>
+        <w:pStyle w:val="FirstParagraph"/>
+      </w:pPr>
+      <w:r>
+        <w:rPr>
+          <w:bCs/>
+          <w:b/>
+        </w:rPr>
+        <w:t xml:space="preserve">Testcase 2:</w:t>
+      </w:r>
+      <w:r>
+        <w:t xml:space="preserve"> </w:t>
+      </w:r>
+      <w:r>
+        <w:t xml:space="preserve">Verify OBS bucket creation and accessibility</w:t>
       </w:r>
     </w:p>
     <w:p>
@@ -1726,19 +1728,20 @@
     </w:p>
     <w:p>
       <w:pPr>
-        <w:pStyle w:val="Heading3"/>
-      </w:pPr>
-      <w:r>
-        <w:rPr>
-          <w:rStyle w:val="SectionNumber"/>
-        </w:rPr>
-        <w:t xml:space="preserve">0.0.3</w:t>
-      </w:r>
-      <w:r>
-        <w:tab/>
-      </w:r>
-      <w:r>
-        <w:t xml:space="preserve">Test Case 3: Verify VPC and security group configuration</w:t>
+        <w:pStyle w:val="FirstParagraph"/>
+      </w:pPr>
+      <w:r>
+        <w:rPr>
+          <w:bCs/>
+          <w:b/>
+        </w:rPr>
+        <w:t xml:space="preserve">Testcase 3:</w:t>
+      </w:r>
+      <w:r>
+        <w:t xml:space="preserve"> </w:t>
+      </w:r>
+      <w:r>
+        <w:t xml:space="preserve">Verify VPC and security group configuration</w:t>
       </w:r>
     </w:p>
     <w:p>
@@ -1979,19 +1982,20 @@
     </w:p>
     <w:p>
       <w:pPr>
-        <w:pStyle w:val="Heading3"/>
-      </w:pPr>
-      <w:r>
-        <w:rPr>
-          <w:rStyle w:val="SectionNumber"/>
-        </w:rPr>
-        <w:t xml:space="preserve">0.0.4</w:t>
-      </w:r>
-      <w:r>
-        <w:tab/>
-      </w:r>
-      <w:r>
-        <w:t xml:space="preserve">Test Case 4: Verify DataArts Studio workspace creation</w:t>
+        <w:pStyle w:val="FirstParagraph"/>
+      </w:pPr>
+      <w:r>
+        <w:rPr>
+          <w:bCs/>
+          <w:b/>
+        </w:rPr>
+        <w:t xml:space="preserve">Testcase 4:</w:t>
+      </w:r>
+      <w:r>
+        <w:t xml:space="preserve"> </w:t>
+      </w:r>
+      <w:r>
+        <w:t xml:space="preserve">Verify DataArts Studio workspace creation</w:t>
       </w:r>
     </w:p>
     <w:p>
@@ -2258,19 +2262,20 @@
     </w:p>
     <w:p>
       <w:pPr>
-        <w:pStyle w:val="Heading3"/>
-      </w:pPr>
-      <w:r>
-        <w:rPr>
-          <w:rStyle w:val="SectionNumber"/>
-        </w:rPr>
-        <w:t xml:space="preserve">0.0.5</w:t>
-      </w:r>
-      <w:r>
-        <w:tab/>
-      </w:r>
-      <w:r>
-        <w:t xml:space="preserve">Test Case 5: Verify data ingestion pipeline execution</w:t>
+        <w:pStyle w:val="FirstParagraph"/>
+      </w:pPr>
+      <w:r>
+        <w:rPr>
+          <w:bCs/>
+          <w:b/>
+        </w:rPr>
+        <w:t xml:space="preserve">Testcase 5:</w:t>
+      </w:r>
+      <w:r>
+        <w:t xml:space="preserve"> </w:t>
+      </w:r>
+      <w:r>
+        <w:t xml:space="preserve">Verify data ingestion pipeline execution</w:t>
       </w:r>
     </w:p>
     <w:p>
@@ -2436,19 +2441,20 @@
     </w:p>
     <w:p>
       <w:pPr>
-        <w:pStyle w:val="Heading3"/>
-      </w:pPr>
-      <w:r>
-        <w:rPr>
-          <w:rStyle w:val="SectionNumber"/>
-        </w:rPr>
-        <w:t xml:space="preserve">0.0.6</w:t>
-      </w:r>
-      <w:r>
-        <w:tab/>
-      </w:r>
-      <w:r>
-        <w:t xml:space="preserve">Test Case 6: Verify Spark SQL query on MRS cluster</w:t>
+        <w:pStyle w:val="FirstParagraph"/>
+      </w:pPr>
+      <w:r>
+        <w:rPr>
+          <w:bCs/>
+          <w:b/>
+        </w:rPr>
+        <w:t xml:space="preserve">Testcase 6:</w:t>
+      </w:r>
+      <w:r>
+        <w:t xml:space="preserve"> </w:t>
+      </w:r>
+      <w:r>
+        <w:t xml:space="preserve">Verify Spark SQL query on MRS cluster</w:t>
       </w:r>
     </w:p>
     <w:p>
@@ -2656,19 +2662,20 @@
     </w:p>
     <w:p>
       <w:pPr>
-        <w:pStyle w:val="Heading3"/>
-      </w:pPr>
-      <w:r>
-        <w:rPr>
-          <w:rStyle w:val="SectionNumber"/>
-        </w:rPr>
-        <w:t xml:space="preserve">0.0.7</w:t>
-      </w:r>
-      <w:r>
-        <w:tab/>
-      </w:r>
-      <w:r>
-        <w:t xml:space="preserve">Test Case 7: Verify IAM policy enforcement on OBS buckets</w:t>
+        <w:pStyle w:val="FirstParagraph"/>
+      </w:pPr>
+      <w:r>
+        <w:rPr>
+          <w:bCs/>
+          <w:b/>
+        </w:rPr>
+        <w:t xml:space="preserve">Testcase 7:</w:t>
+      </w:r>
+      <w:r>
+        <w:t xml:space="preserve"> </w:t>
+      </w:r>
+      <w:r>
+        <w:t xml:space="preserve">Verify IAM policy enforcement on OBS buckets</w:t>
       </w:r>
     </w:p>
     <w:p>
@@ -2890,19 +2897,20 @@
     </w:p>
     <w:p>
       <w:pPr>
-        <w:pStyle w:val="Heading3"/>
-      </w:pPr>
-      <w:r>
-        <w:rPr>
-          <w:rStyle w:val="SectionNumber"/>
-        </w:rPr>
-        <w:t xml:space="preserve">0.0.8</w:t>
-      </w:r>
-      <w:r>
-        <w:tab/>
-      </w:r>
-      <w:r>
-        <w:t xml:space="preserve">Test Case 8: Verify DataArts Studio data masking rule</w:t>
+        <w:pStyle w:val="FirstParagraph"/>
+      </w:pPr>
+      <w:r>
+        <w:rPr>
+          <w:bCs/>
+          <w:b/>
+        </w:rPr>
+        <w:t xml:space="preserve">Testcase 8:</w:t>
+      </w:r>
+      <w:r>
+        <w:t xml:space="preserve"> </w:t>
+      </w:r>
+      <w:r>
+        <w:t xml:space="preserve">Verify DataArts Studio data masking rule</w:t>
       </w:r>
     </w:p>
     <w:p>
@@ -3200,19 +3208,20 @@
     </w:p>
     <w:p>
       <w:pPr>
-        <w:pStyle w:val="Heading3"/>
-      </w:pPr>
-      <w:r>
-        <w:rPr>
-          <w:rStyle w:val="SectionNumber"/>
-        </w:rPr>
-        <w:t xml:space="preserve">0.0.9</w:t>
-      </w:r>
-      <w:r>
-        <w:tab/>
-      </w:r>
-      <w:r>
-        <w:t xml:space="preserve">Test Case 9: Verify Terraform infrastructure deployment</w:t>
+        <w:pStyle w:val="FirstParagraph"/>
+      </w:pPr>
+      <w:r>
+        <w:rPr>
+          <w:bCs/>
+          <w:b/>
+        </w:rPr>
+        <w:t xml:space="preserve">Testcase 9:</w:t>
+      </w:r>
+      <w:r>
+        <w:t xml:space="preserve"> </w:t>
+      </w:r>
+      <w:r>
+        <w:t xml:space="preserve">Verify Terraform infrastructure deployment</w:t>
       </w:r>
     </w:p>
     <w:p>
@@ -3482,19 +3491,20 @@
     </w:p>
     <w:p>
       <w:pPr>
-        <w:pStyle w:val="Heading3"/>
-      </w:pPr>
-      <w:r>
-        <w:rPr>
-          <w:rStyle w:val="SectionNumber"/>
-        </w:rPr>
-        <w:t xml:space="preserve">0.0.10</w:t>
-      </w:r>
-      <w:r>
-        <w:tab/>
-      </w:r>
-      <w:r>
-        <w:t xml:space="preserve">Test Case 10: Verify test data upload to OBS</w:t>
+        <w:pStyle w:val="FirstParagraph"/>
+      </w:pPr>
+      <w:r>
+        <w:rPr>
+          <w:bCs/>
+          <w:b/>
+        </w:rPr>
+        <w:t xml:space="preserve">Testcase 10:</w:t>
+      </w:r>
+      <w:r>
+        <w:t xml:space="preserve"> </w:t>
+      </w:r>
+      <w:r>
+        <w:t xml:space="preserve">Verify test data upload to OBS</w:t>
       </w:r>
     </w:p>
     <w:p>

</xml_diff>

<commit_message>
v5.0.2: code blocks in test steps instead of inline code
- Long commands in teststep now use \begin{code}[bash]...\end{code}
  instead of \inlinecode{...} inside the paragraph
- Lua filter converts code environments to verbatim for DOCX/MD/HTML
- Restructured both samples to put code blocks inside testprocedure
</commit_message>
<xml_diff>
--- a/examples/testbook/en/main.docx
+++ b/examples/testbook/en/main.docx
@@ -62,7 +62,7 @@
         <w:pStyle w:val="CoverMeta"/>
       </w:pPr>
       <w:r>
-        <w:t xml:space="preserve">v2.1.0 — 2026-09-13 23:02</w:t>
+        <w:t xml:space="preserve">v2.1.0 — 2026-09-14 00:01</w:t>
       </w:r>
     </w:p>
     <w:p>
@@ -2509,31 +2509,19 @@
         <w:pStyle w:val="Definition"/>
       </w:pPr>
       <w:r>
-        <w:t xml:space="preserve">1. SSH into the MRS master node 2. Run the Spark SQL CLI:</w:t>
-      </w:r>
-      <w:r>
-        <w:t xml:space="preserve"> </w:t>
-      </w:r>
-      <w:r>
-        <w:rPr>
-          <w:rStyle w:val="VerbatimChar"/>
-        </w:rPr>
-        <w:t xml:space="preserve">spark-sql –master yarn --conf spark.sql.hive.convertMetastoreOrc=true -e "SELECT COUNT(*) FROM poc_db.customers;"</w:t>
-      </w:r>
-      <w:r>
-        <w:t xml:space="preserve"> </w:t>
-      </w:r>
-      <w:r>
-        <w:t xml:space="preserve">3. Verify the returned count matches the expected row count (10,000) 4. Run a sample query to verify data integrity:</w:t>
-      </w:r>
-      <w:r>
-        <w:t xml:space="preserve"> </w:t>
-      </w:r>
-      <w:r>
-        <w:rPr>
-          <w:rStyle w:val="VerbatimChar"/>
-        </w:rPr>
-        <w:t xml:space="preserve">spark-sql –master yarn -e "SELECT customer_id, name FROM poc_db.customers LIMIT 5;"</w:t>
+        <w:t xml:space="preserve">1. SSH into the MRS master node 2. Run the Spark SQL CLI: spark-sql –master yarn   –conf spark.sql.hive.convertMetastoreOrc=true   -e “SELECT COUNT(*) FROM poc_db.customers;” 3. Verify the returned count matches the expected row count (10,000) 4. Run a sample query to verify data integrity: spark-sql –master yarn   -e</w:t>
+      </w:r>
+      <w:r>
+        <w:t xml:space="preserve"> </w:t>
+      </w:r>
+      <w:r>
+        <w:t xml:space="preserve">“</w:t>
+      </w:r>
+      <w:r>
+        <w:t xml:space="preserve">SELECT customer_id, name FROM poc_db.customers LIMIT 5;</w:t>
+      </w:r>
+      <w:r>
+        <w:t xml:space="preserve">”</w:t>
       </w:r>
       <w:r>
         <w:t xml:space="preserve"> </w:t>
@@ -4228,7 +4216,7 @@
         <w:rPr>
           <w:i/>
         </w:rPr>
-        <w:t xml:space="preserve">2026-09-13</w:t>
+        <w:t xml:space="preserve">2026-09-14</w:t>
       </w:r>
     </w:p>
     <w:p>
@@ -4297,7 +4285,7 @@
         <w:rPr>
           <w:i/>
         </w:rPr>
-        <w:t xml:space="preserve">2026-09-13</w:t>
+        <w:t xml:space="preserve">2026-09-14</w:t>
       </w:r>
     </w:p>
     <w:p>
@@ -4327,7 +4315,7 @@
         <w:rPr>
           <w:i/>
         </w:rPr>
-        <w:t xml:space="preserve">2026-09-13</w:t>
+        <w:t xml:space="preserve">2026-09-14</w:t>
       </w:r>
     </w:p>
     <w:p>
@@ -4541,7 +4529,7 @@
         <w:rPr>
           <w:i/>
         </w:rPr>
-        <w:t xml:space="preserve">2026-09-13</w:t>
+        <w:t xml:space="preserve">2026-09-14</w:t>
       </w:r>
     </w:p>
     <w:p>

</xml_diff>